<commit_message>
parte final com todas as tabelas de caso de uso
</commit_message>
<xml_diff>
--- a/sleep_street.docx
+++ b/sleep_street.docx
@@ -201,7 +201,7 @@
           <w:szCs w:val="24"/>
           <w:rtl w:val="0"/>
         </w:rPr>
-        <w:t xml:space="preserve">Dhaniel Moreira - Analista de Requisitos / PO Gabriel Henrique de Lima Ferreira - Backend Developer / QA </w:t>
+        <w:t xml:space="preserve">Daniel Moreira - Analista de Requisitos / POR Gabriel Henrique de Lima Ferreira - Backend Developer / QA </w:t>
       </w:r>
     </w:p>
     <w:p>
@@ -357,7 +357,15 @@
           <w:szCs w:val="24"/>
           <w:rtl w:val="0"/>
         </w:rPr>
-        <w:t xml:space="preserve">çamentário.Registro e consolidação automatizada de despesas categorizadas (transporte,hospedagem, alimentação, passeios Busca e filtragem contextual de  estabelecimentos(restaurantes, mercados, hotéis, atrações) por Faixa de preço e avaliação.Gerador automático parametrizado de checklist de bagagem com base no destino, clima, duração e perfil da viagem.Módulo de registro e acompanhamento de solicitações de suporte e reembolso com consolidação de valores.</w:t>
+        <w:t xml:space="preserve">comentário.Registro</w:t>
+      </w:r>
+      <w:r>
+        <w:rPr>
+          <w:sz w:val="24"/>
+          <w:szCs w:val="24"/>
+          <w:rtl w:val="0"/>
+        </w:rPr>
+        <w:t xml:space="preserve"> e consolidação automatizada de despesas categorizadas (transporte,hospedagem, alimentação, passeios Busca e filtragem contextual de  estabelecimentos(restaurantes, mercados, hotéis, atrações) por Faixa de preço e avaliação.Gerador automático parametrizado de checklist de bagagem com base no destino, clima, duração e perfil da viagem.Módulo de registro e acompanhamento de solicitações de suporte e reembolso com consolidação de valores.</w:t>
       </w:r>
     </w:p>
     <w:p>
@@ -403,15 +411,15 @@
           <w:szCs w:val="24"/>
           <w:rtl w:val="0"/>
         </w:rPr>
-        <w:t xml:space="preserve">RF02 -Gestão do Ciclo de Vida das Viagens: Permitir criar, editar, parametrizar (lazer/negócios) e cancelar viagens, estipulando orçamentos totais</w:t>
-      </w:r>
-      <w:r>
-        <w:rPr>
-          <w:sz w:val="24"/>
-          <w:szCs w:val="24"/>
-          <w:rtl w:val="0"/>
-        </w:rPr>
-        <w:t xml:space="preserve">Proporcionar uma plataforma mobile completa para gestão inteligente de viagens, permitindo o controle rigoroso de orçamentos, busca preditiva de estabelecimentos/atrações por faixa de preço, geração automática de checklist de bagagem e gerenciamento de solicitações de suporte/reembolso. </w:t>
+        <w:t xml:space="preserve">RF02 -Gestão do Ciclo de Vida das Viagens: Permitir criar, editar, parametrizar (lazer/negócios) e cancelar viagens, estipulando orçamentos totais Proporcionar</w:t>
+      </w:r>
+      <w:r>
+        <w:rPr>
+          <w:sz w:val="24"/>
+          <w:szCs w:val="24"/>
+          <w:rtl w:val="0"/>
+        </w:rPr>
+        <w:t xml:space="preserve"> uma plataforma mobile completa para gestão inteligente de viagens, permitindo o controle rigoroso de orçamentos, busca preditiva de estabelecimentos/atrações por faixa de preço, geração automática de checklist de bagagem e gerenciamento de solicitações de suporte/reembolso. </w:t>
       </w:r>
     </w:p>
     <w:p>
@@ -1616,6 +1624,7 @@
           <w:bCs w:val="1"/>
         </w:rPr>
         <w:sectPr>
+          <w:headerReference r:id="rId6" w:type="default"/>
           <w:pgSz w:h="16834" w:w="11909" w:orient="portrait"/>
           <w:pgMar w:bottom="1440" w:top="1440" w:left="1440" w:right="1440" w:header="720" w:footer="720"/>
           <w:pgNumType w:start="1"/>
@@ -1627,7 +1636,7 @@
           <w:bCs w:val="1"/>
           <w:rtl w:val="0"/>
         </w:rPr>
-        <w:t xml:space="preserve">● RFN 03.03:O sistema deve garantir precisão de 100% na categorização dos filtros de preço estipulados pelo usuário. </w:t>
+        <w:t xml:space="preserve">● RFN 03.03:O sistema deve garantir precisão de 100% na categorização dos filtros de preço estipulados pelo usuário</w:t>
       </w:r>
     </w:p>
     <w:p>
@@ -1647,7 +1656,7 @@
     <w:tbl>
       <w:tblPr>
         <w:tblStyle w:val="Table1"/>
-        <w:tblW w:w="15855.0" w:type="dxa"/>
+        <w:tblW w:w="14790.0" w:type="dxa"/>
         <w:jc w:val="left"/>
         <w:tblInd w:w="-1020.0" w:type="dxa"/>
         <w:tblBorders>
@@ -1662,18 +1671,18 @@
         <w:tblLook w:val="0600"/>
       </w:tblPr>
       <w:tblGrid>
-        <w:gridCol w:w="6360"/>
-        <w:gridCol w:w="2190"/>
-        <w:gridCol w:w="2505"/>
-        <w:gridCol w:w="1920"/>
-        <w:gridCol w:w="2880"/>
+        <w:gridCol w:w="6150"/>
+        <w:gridCol w:w="2160"/>
+        <w:gridCol w:w="2355"/>
+        <w:gridCol w:w="1965"/>
+        <w:gridCol w:w="2160"/>
         <w:tblGridChange w:id="0">
           <w:tblGrid>
-            <w:gridCol w:w="6360"/>
-            <w:gridCol w:w="2190"/>
-            <w:gridCol w:w="2505"/>
-            <w:gridCol w:w="1920"/>
-            <w:gridCol w:w="2880"/>
+            <w:gridCol w:w="6150"/>
+            <w:gridCol w:w="2160"/>
+            <w:gridCol w:w="2355"/>
+            <w:gridCol w:w="1965"/>
+            <w:gridCol w:w="2160"/>
           </w:tblGrid>
         </w:tblGridChange>
       </w:tblGrid>
@@ -1734,7 +1743,7 @@
             <w:pPr>
               <w:widowControl w:val="0"/>
               <w:spacing w:line="240" w:lineRule="auto"/>
-              <w:jc w:val="center"/>
+              <w:jc w:val="left"/>
               <w:rPr>
                 <w:b w:val="1"/>
                 <w:bCs w:val="1"/>
@@ -1769,7 +1778,7 @@
             <w:pPr>
               <w:widowControl w:val="0"/>
               <w:spacing w:line="240" w:lineRule="auto"/>
-              <w:ind w:left="645" w:firstLine="0"/>
+              <w:ind w:left="0" w:firstLine="0"/>
               <w:rPr>
                 <w:b w:val="1"/>
                 <w:bCs w:val="1"/>
@@ -1812,7 +1821,7 @@
             <w:pPr>
               <w:widowControl w:val="0"/>
               <w:spacing w:line="229.88847255706787" w:lineRule="auto"/>
-              <w:ind w:left="851.6273498535156" w:right="2105.399169921875" w:firstLine="1.439971923828125"/>
+              <w:ind w:left="0" w:right="2105.399169921875" w:firstLine="0"/>
               <w:rPr>
                 <w:b w:val="1"/>
                 <w:bCs w:val="1"/>
@@ -1855,7 +1864,7 @@
             <w:pPr>
               <w:widowControl w:val="0"/>
               <w:spacing w:line="240" w:lineRule="auto"/>
-              <w:ind w:left="853.3073425292969" w:firstLine="0"/>
+              <w:ind w:left="0" w:firstLine="0"/>
               <w:rPr>
                 <w:b w:val="1"/>
                 <w:bCs w:val="1"/>
@@ -1897,7 +1906,7 @@
             <w:pPr>
               <w:widowControl w:val="0"/>
               <w:spacing w:line="240" w:lineRule="auto"/>
-              <w:ind w:left="853.54736328125" w:firstLine="0"/>
+              <w:ind w:left="0" w:firstLine="0"/>
               <w:rPr>
                 <w:b w:val="1"/>
                 <w:bCs w:val="1"/>
@@ -1932,7 +1941,7 @@
             <w:pPr>
               <w:widowControl w:val="0"/>
               <w:spacing w:line="240" w:lineRule="auto"/>
-              <w:ind w:left="858.3074951171875" w:firstLine="0"/>
+              <w:ind w:left="0" w:firstLine="0"/>
               <w:rPr>
                 <w:b w:val="1"/>
                 <w:bCs w:val="1"/>
@@ -1967,7 +1976,7 @@
             <w:pPr>
               <w:widowControl w:val="0"/>
               <w:spacing w:line="240" w:lineRule="auto"/>
-              <w:ind w:left="862.066650390625" w:firstLine="0"/>
+              <w:ind w:left="0" w:firstLine="0"/>
               <w:rPr>
                 <w:b w:val="1"/>
                 <w:bCs w:val="1"/>
@@ -2002,7 +2011,7 @@
             <w:pPr>
               <w:widowControl w:val="0"/>
               <w:spacing w:line="240" w:lineRule="auto"/>
-              <w:ind w:left="863.067626953125" w:firstLine="0"/>
+              <w:ind w:left="0" w:firstLine="0"/>
               <w:rPr>
                 <w:b w:val="1"/>
                 <w:bCs w:val="1"/>
@@ -2037,7 +2046,7 @@
             <w:pPr>
               <w:widowControl w:val="0"/>
               <w:spacing w:line="240" w:lineRule="auto"/>
-              <w:ind w:left="645" w:firstLine="0"/>
+              <w:ind w:left="0" w:firstLine="0"/>
               <w:rPr>
                 <w:b w:val="1"/>
                 <w:bCs w:val="1"/>
@@ -2061,7 +2070,7 @@
       <w:tr>
         <w:trPr>
           <w:cantSplit w:val="0"/>
-          <w:trHeight w:val="2440" w:hRule="atLeast"/>
+          <w:trHeight w:val="1080" w:hRule="atLeast"/>
           <w:tblHeader w:val="0"/>
         </w:trPr>
         <w:tc>
@@ -2079,7 +2088,7 @@
             <w:pPr>
               <w:widowControl w:val="0"/>
               <w:spacing w:line="229.88847255706787" w:lineRule="auto"/>
-              <w:ind w:left="844.4273376464844" w:right="42.1795654296875" w:firstLine="8.8800048828125"/>
+              <w:ind w:left="0" w:right="42.1795654296875" w:firstLine="0"/>
               <w:jc w:val="both"/>
               <w:rPr>
                 <w:b w:val="1"/>
@@ -2103,7 +2112,7 @@
             <w:pPr>
               <w:widowControl w:val="0"/>
               <w:spacing w:before="281.98486328125" w:line="240" w:lineRule="auto"/>
-              <w:ind w:left="854.747314453125" w:firstLine="0"/>
+              <w:ind w:left="0" w:firstLine="0"/>
               <w:rPr>
                 <w:b w:val="1"/>
                 <w:bCs w:val="1"/>
@@ -2167,8 +2176,8 @@
             <w:pPr>
               <w:widowControl w:val="0"/>
               <w:spacing w:line="229.88847255706787" w:lineRule="auto"/>
-              <w:ind w:left="889.6929931640625" w:right="78.675537109375" w:firstLine="0"/>
-              <w:jc w:val="center"/>
+              <w:ind w:left="0" w:right="78.675537109375" w:firstLine="0"/>
+              <w:jc w:val="left"/>
               <w:rPr>
                 <w:b w:val="1"/>
                 <w:bCs w:val="1"/>
@@ -2203,24 +2212,24 @@
             <w:pPr>
               <w:widowControl w:val="0"/>
               <w:spacing w:line="240" w:lineRule="auto"/>
-              <w:ind w:left="720" w:right="677.51220703125" w:firstLine="0"/>
-              <w:jc w:val="right"/>
-              <w:rPr>
-                <w:b w:val="1"/>
-                <w:bCs w:val="1"/>
-                <w:sz w:val="24"/>
-                <w:szCs w:val="24"/>
-              </w:rPr>
-            </w:pPr>
-            <w:r>
-              <w:rPr>
-                <w:b w:val="1"/>
-                <w:bCs w:val="1"/>
-                <w:sz w:val="24"/>
-                <w:szCs w:val="24"/>
-                <w:rtl w:val="0"/>
-              </w:rPr>
-              <w:t xml:space="preserve">não </w:t>
+              <w:ind w:left="0" w:right="677.51220703125" w:firstLine="0"/>
+              <w:jc w:val="left"/>
+              <w:rPr>
+                <w:b w:val="1"/>
+                <w:bCs w:val="1"/>
+                <w:sz w:val="24"/>
+                <w:szCs w:val="24"/>
+              </w:rPr>
+            </w:pPr>
+            <w:r>
+              <w:rPr>
+                <w:b w:val="1"/>
+                <w:bCs w:val="1"/>
+                <w:sz w:val="24"/>
+                <w:szCs w:val="24"/>
+                <w:rtl w:val="0"/>
+              </w:rPr>
+              <w:t xml:space="preserve">não</w:t>
             </w:r>
           </w:p>
         </w:tc>
@@ -2239,8 +2248,8 @@
             <w:pPr>
               <w:widowControl w:val="0"/>
               <w:spacing w:line="240" w:lineRule="auto"/>
-              <w:ind w:left="645" w:firstLine="0"/>
-              <w:jc w:val="center"/>
+              <w:ind w:left="0" w:firstLine="0"/>
+              <w:jc w:val="left"/>
               <w:rPr>
                 <w:b w:val="1"/>
                 <w:bCs w:val="1"/>
@@ -2282,7 +2291,7 @@
             <w:pPr>
               <w:widowControl w:val="0"/>
               <w:spacing w:line="229.88847255706787" w:lineRule="auto"/>
-              <w:ind w:left="839.3873596191406" w:right="27.392578125" w:firstLine="13.91998291015625"/>
+              <w:ind w:left="0" w:right="27.392578125" w:firstLine="0"/>
               <w:jc w:val="both"/>
               <w:rPr>
                 <w:b w:val="1"/>
@@ -2306,7 +2315,7 @@
             <w:pPr>
               <w:widowControl w:val="0"/>
               <w:spacing w:before="281.98455810546875" w:line="240" w:lineRule="auto"/>
-              <w:ind w:left="854.747314453125" w:firstLine="0"/>
+              <w:ind w:left="0" w:firstLine="0"/>
               <w:rPr>
                 <w:b w:val="1"/>
                 <w:bCs w:val="1"/>
@@ -2446,7 +2455,6 @@
       <w:tr>
         <w:trPr>
           <w:cantSplit w:val="0"/>
-          <w:trHeight w:val="1340" w:hRule="atLeast"/>
           <w:tblHeader w:val="0"/>
         </w:trPr>
         <w:tc>
@@ -2464,7 +2472,7 @@
             <w:pPr>
               <w:widowControl w:val="0"/>
               <w:spacing w:line="229.88847255706787" w:lineRule="auto"/>
-              <w:ind w:left="843.4674072265625" w:right="45.556640625" w:firstLine="9.839935302734375"/>
+              <w:ind w:left="0" w:right="45.556640625" w:firstLine="0"/>
               <w:jc w:val="both"/>
               <w:rPr>
                 <w:b w:val="1"/>
@@ -2630,222 +2638,6 @@
     <w:tbl>
       <w:tblPr>
         <w:tblStyle w:val="Table2"/>
-        <w:tblW w:w="15360.0" w:type="dxa"/>
-        <w:jc w:val="left"/>
-        <w:tblInd w:w="-720.0" w:type="dxa"/>
-        <w:tblBorders>
-          <w:top w:color="000000" w:space="0" w:sz="8" w:val="single"/>
-          <w:left w:color="000000" w:space="0" w:sz="8" w:val="single"/>
-          <w:bottom w:color="000000" w:space="0" w:sz="8" w:val="single"/>
-          <w:right w:color="000000" w:space="0" w:sz="8" w:val="single"/>
-          <w:insideH w:color="000000" w:space="0" w:sz="8" w:val="single"/>
-          <w:insideV w:color="000000" w:space="0" w:sz="8" w:val="single"/>
-        </w:tblBorders>
-        <w:tblLayout w:type="fixed"/>
-        <w:tblLook w:val="0600"/>
-      </w:tblPr>
-      <w:tblGrid>
-        <w:gridCol w:w="3480"/>
-        <w:gridCol w:w="3420"/>
-        <w:gridCol w:w="1500"/>
-        <w:gridCol w:w="4590"/>
-        <w:gridCol w:w="2370"/>
-        <w:tblGridChange w:id="0">
-          <w:tblGrid>
-            <w:gridCol w:w="3480"/>
-            <w:gridCol w:w="3420"/>
-            <w:gridCol w:w="1500"/>
-            <w:gridCol w:w="4590"/>
-            <w:gridCol w:w="2370"/>
-          </w:tblGrid>
-        </w:tblGridChange>
-      </w:tblGrid>
-      <w:tr>
-        <w:trPr>
-          <w:cantSplit w:val="0"/>
-          <w:trHeight w:val="1040" w:hRule="atLeast"/>
-          <w:tblHeader w:val="0"/>
-        </w:trPr>
-        <w:tc>
-          <w:tcPr>
-            <w:shd w:fill="auto" w:val="clear"/>
-            <w:tcMar>
-              <w:top w:w="100.0" w:type="dxa"/>
-              <w:left w:w="100.0" w:type="dxa"/>
-              <w:bottom w:w="100.0" w:type="dxa"/>
-              <w:right w:w="100.0" w:type="dxa"/>
-            </w:tcMar>
-            <w:vAlign w:val="top"/>
-          </w:tcPr>
-          <w:p>
-            <w:pPr>
-              <w:widowControl w:val="0"/>
-              <w:spacing w:line="240" w:lineRule="auto"/>
-              <w:ind w:left="841.307373046875" w:firstLine="0"/>
-              <w:rPr>
-                <w:b w:val="1"/>
-                <w:bCs w:val="1"/>
-                <w:sz w:val="24"/>
-                <w:szCs w:val="24"/>
-              </w:rPr>
-            </w:pPr>
-            <w:r>
-              <w:rPr>
-                <w:b w:val="1"/>
-                <w:bCs w:val="1"/>
-                <w:sz w:val="24"/>
-                <w:szCs w:val="24"/>
-                <w:rtl w:val="0"/>
-              </w:rPr>
-              <w:t xml:space="preserve">sintaticamente inválidos.</w:t>
-            </w:r>
-          </w:p>
-        </w:tc>
-        <w:tc>
-          <w:tcPr>
-            <w:shd w:fill="auto" w:val="clear"/>
-            <w:tcMar>
-              <w:top w:w="100.0" w:type="dxa"/>
-              <w:left w:w="100.0" w:type="dxa"/>
-              <w:bottom w:w="100.0" w:type="dxa"/>
-              <w:right w:w="100.0" w:type="dxa"/>
-            </w:tcMar>
-            <w:vAlign w:val="top"/>
-          </w:tcPr>
-          <w:p>
-            <w:pPr>
-              <w:widowControl w:val="0"/>
-              <w:ind w:left="720" w:firstLine="0"/>
-              <w:rPr>
-                <w:b w:val="1"/>
-                <w:bCs w:val="1"/>
-                <w:sz w:val="24"/>
-                <w:szCs w:val="24"/>
-              </w:rPr>
-            </w:pPr>
-            <w:r>
-              <w:rPr>
-                <w:rtl w:val="0"/>
-              </w:rPr>
-            </w:r>
-          </w:p>
-        </w:tc>
-        <w:tc>
-          <w:tcPr>
-            <w:shd w:fill="auto" w:val="clear"/>
-            <w:tcMar>
-              <w:top w:w="100.0" w:type="dxa"/>
-              <w:left w:w="100.0" w:type="dxa"/>
-              <w:bottom w:w="100.0" w:type="dxa"/>
-              <w:right w:w="100.0" w:type="dxa"/>
-            </w:tcMar>
-            <w:vAlign w:val="top"/>
-          </w:tcPr>
-          <w:p>
-            <w:pPr>
-              <w:widowControl w:val="0"/>
-              <w:ind w:left="570" w:firstLine="0"/>
-              <w:rPr>
-                <w:b w:val="1"/>
-                <w:bCs w:val="1"/>
-                <w:sz w:val="24"/>
-                <w:szCs w:val="24"/>
-              </w:rPr>
-            </w:pPr>
-            <w:r>
-              <w:rPr>
-                <w:rtl w:val="0"/>
-              </w:rPr>
-            </w:r>
-          </w:p>
-        </w:tc>
-        <w:tc>
-          <w:tcPr>
-            <w:shd w:fill="auto" w:val="clear"/>
-            <w:tcMar>
-              <w:top w:w="100.0" w:type="dxa"/>
-              <w:left w:w="100.0" w:type="dxa"/>
-              <w:bottom w:w="100.0" w:type="dxa"/>
-              <w:right w:w="100.0" w:type="dxa"/>
-            </w:tcMar>
-            <w:vAlign w:val="top"/>
-          </w:tcPr>
-          <w:p>
-            <w:pPr>
-              <w:widowControl w:val="0"/>
-              <w:ind w:left="510" w:firstLine="0"/>
-              <w:rPr>
-                <w:b w:val="1"/>
-                <w:bCs w:val="1"/>
-                <w:sz w:val="24"/>
-                <w:szCs w:val="24"/>
-              </w:rPr>
-            </w:pPr>
-            <w:r>
-              <w:rPr>
-                <w:rtl w:val="0"/>
-              </w:rPr>
-            </w:r>
-          </w:p>
-        </w:tc>
-        <w:tc>
-          <w:tcPr>
-            <w:shd w:fill="auto" w:val="clear"/>
-            <w:tcMar>
-              <w:top w:w="100.0" w:type="dxa"/>
-              <w:left w:w="100.0" w:type="dxa"/>
-              <w:bottom w:w="100.0" w:type="dxa"/>
-              <w:right w:w="100.0" w:type="dxa"/>
-            </w:tcMar>
-            <w:vAlign w:val="top"/>
-          </w:tcPr>
-          <w:p>
-            <w:pPr>
-              <w:widowControl w:val="0"/>
-              <w:ind w:left="435" w:firstLine="0"/>
-              <w:rPr>
-                <w:b w:val="1"/>
-                <w:bCs w:val="1"/>
-                <w:sz w:val="24"/>
-                <w:szCs w:val="24"/>
-              </w:rPr>
-            </w:pPr>
-            <w:r>
-              <w:rPr>
-                <w:rtl w:val="0"/>
-              </w:rPr>
-            </w:r>
-          </w:p>
-        </w:tc>
-      </w:tr>
-    </w:tbl>
-    <w:p>
-      <w:pPr>
-        <w:widowControl w:val="0"/>
-        <w:ind w:left="720" w:firstLine="0"/>
-        <w:rPr/>
-      </w:pPr>
-      <w:r>
-        <w:rPr>
-          <w:rtl w:val="0"/>
-        </w:rPr>
-      </w:r>
-    </w:p>
-    <w:p>
-      <w:pPr>
-        <w:widowControl w:val="0"/>
-        <w:ind w:left="720" w:firstLine="0"/>
-        <w:rPr/>
-      </w:pPr>
-      <w:r>
-        <w:rPr>
-          <w:rtl w:val="0"/>
-        </w:rPr>
-      </w:r>
-    </w:p>
-    <w:tbl>
-      <w:tblPr>
-        <w:tblStyle w:val="Table3"/>
         <w:tblW w:w="15435.0" w:type="dxa"/>
         <w:jc w:val="left"/>
         <w:tblInd w:w="-915.0" w:type="dxa"/>
@@ -2862,16 +2654,16 @@
       </w:tblPr>
       <w:tblGrid>
         <w:gridCol w:w="4815"/>
-        <w:gridCol w:w="3960"/>
-        <w:gridCol w:w="4740"/>
-        <w:gridCol w:w="255"/>
+        <w:gridCol w:w="4425"/>
+        <w:gridCol w:w="2490"/>
+        <w:gridCol w:w="2040"/>
         <w:gridCol w:w="1665"/>
         <w:tblGridChange w:id="0">
           <w:tblGrid>
             <w:gridCol w:w="4815"/>
-            <w:gridCol w:w="3960"/>
-            <w:gridCol w:w="4740"/>
-            <w:gridCol w:w="255"/>
+            <w:gridCol w:w="4425"/>
+            <w:gridCol w:w="2490"/>
+            <w:gridCol w:w="2040"/>
             <w:gridCol w:w="1665"/>
           </w:tblGrid>
         </w:tblGridChange>
@@ -2933,8 +2725,8 @@
             <w:pPr>
               <w:widowControl w:val="0"/>
               <w:spacing w:line="240" w:lineRule="auto"/>
-              <w:ind w:left="510" w:firstLine="0"/>
-              <w:jc w:val="center"/>
+              <w:ind w:left="0" w:firstLine="0"/>
+              <w:jc w:val="left"/>
               <w:rPr>
                 <w:b w:val="1"/>
                 <w:bCs w:val="1"/>
@@ -2969,7 +2761,7 @@
             <w:pPr>
               <w:widowControl w:val="0"/>
               <w:spacing w:line="240" w:lineRule="auto"/>
-              <w:ind w:left="435" w:firstLine="0"/>
+              <w:ind w:left="0" w:firstLine="0"/>
               <w:rPr>
                 <w:b w:val="1"/>
                 <w:bCs w:val="1"/>
@@ -3012,23 +2804,23 @@
             <w:pPr>
               <w:widowControl w:val="0"/>
               <w:spacing w:line="229.88847255706787" w:lineRule="auto"/>
-              <w:ind w:left="850.6674194335938" w:right="21.650390625" w:firstLine="2.39990234375"/>
-              <w:rPr>
-                <w:b w:val="1"/>
-                <w:bCs w:val="1"/>
-                <w:sz w:val="24"/>
-                <w:szCs w:val="24"/>
-              </w:rPr>
-            </w:pPr>
-            <w:r>
-              <w:rPr>
-                <w:b w:val="1"/>
-                <w:bCs w:val="1"/>
-                <w:sz w:val="24"/>
-                <w:szCs w:val="24"/>
-                <w:rtl w:val="0"/>
-              </w:rPr>
-              <w:t xml:space="preserve">Descrição:viajante informa os preços desejados de hospedagens e atrações. O app sugere opções mais baratas ou com melhor</w:t>
+              <w:ind w:left="0" w:right="21.650390625" w:firstLine="0"/>
+              <w:rPr>
+                <w:b w:val="1"/>
+                <w:bCs w:val="1"/>
+                <w:sz w:val="24"/>
+                <w:szCs w:val="24"/>
+              </w:rPr>
+            </w:pPr>
+            <w:r>
+              <w:rPr>
+                <w:b w:val="1"/>
+                <w:bCs w:val="1"/>
+                <w:sz w:val="24"/>
+                <w:szCs w:val="24"/>
+                <w:rtl w:val="0"/>
+              </w:rPr>
+              <w:t xml:space="preserve">Descrição:O viajante informa os preços desejados de hospedagens e atrações. O app sugere opções mais baratas ou com melhor</w:t>
             </w:r>
           </w:p>
         </w:tc>
@@ -3055,7 +2847,7 @@
             <w:pPr>
               <w:widowControl w:val="0"/>
               <w:spacing w:line="240" w:lineRule="auto"/>
-              <w:ind w:left="853.3073425292969" w:firstLine="0"/>
+              <w:ind w:left="0" w:firstLine="0"/>
               <w:rPr>
                 <w:b w:val="1"/>
                 <w:bCs w:val="1"/>
@@ -3097,7 +2889,7 @@
             <w:pPr>
               <w:widowControl w:val="0"/>
               <w:spacing w:line="240" w:lineRule="auto"/>
-              <w:ind w:left="853.54736328125" w:firstLine="0"/>
+              <w:ind w:left="0" w:firstLine="0"/>
               <w:rPr>
                 <w:b w:val="1"/>
                 <w:bCs w:val="1"/>
@@ -3132,7 +2924,7 @@
             <w:pPr>
               <w:widowControl w:val="0"/>
               <w:spacing w:line="240" w:lineRule="auto"/>
-              <w:ind w:left="858.3074951171875" w:firstLine="0"/>
+              <w:ind w:left="0" w:firstLine="0"/>
               <w:rPr>
                 <w:b w:val="1"/>
                 <w:bCs w:val="1"/>
@@ -3167,7 +2959,7 @@
             <w:pPr>
               <w:widowControl w:val="0"/>
               <w:spacing w:line="240" w:lineRule="auto"/>
-              <w:ind w:left="570" w:firstLine="0"/>
+              <w:ind w:left="0" w:firstLine="0"/>
               <w:rPr>
                 <w:b w:val="1"/>
                 <w:bCs w:val="1"/>
@@ -3202,7 +2994,7 @@
             <w:pPr>
               <w:widowControl w:val="0"/>
               <w:spacing w:line="240" w:lineRule="auto"/>
-              <w:ind w:left="510" w:firstLine="0"/>
+              <w:ind w:left="0" w:firstLine="0"/>
               <w:rPr>
                 <w:b w:val="1"/>
                 <w:bCs w:val="1"/>
@@ -3237,7 +3029,7 @@
             <w:pPr>
               <w:widowControl w:val="0"/>
               <w:spacing w:line="240" w:lineRule="auto"/>
-              <w:ind w:left="435" w:firstLine="0"/>
+              <w:ind w:left="0" w:firstLine="0"/>
               <w:rPr>
                 <w:b w:val="1"/>
                 <w:bCs w:val="1"/>
@@ -3279,7 +3071,7 @@
             <w:pPr>
               <w:widowControl w:val="0"/>
               <w:spacing w:line="229.88847255706787" w:lineRule="auto"/>
-              <w:ind w:left="844.4273376464844" w:right="52.001953125" w:firstLine="8.8800048828125"/>
+              <w:ind w:left="0" w:right="52.001953125" w:firstLine="0"/>
               <w:jc w:val="both"/>
               <w:rPr>
                 <w:b w:val="1"/>
@@ -3303,7 +3095,7 @@
             <w:pPr>
               <w:widowControl w:val="0"/>
               <w:spacing w:before="6.00799560546875" w:line="240" w:lineRule="auto"/>
-              <w:ind w:left="852.8273010253906" w:firstLine="0"/>
+              <w:ind w:left="0" w:firstLine="0"/>
               <w:rPr>
                 <w:b w:val="1"/>
                 <w:bCs w:val="1"/>
@@ -3338,7 +3130,7 @@
             <w:pPr>
               <w:widowControl w:val="0"/>
               <w:spacing w:line="229.88847255706787" w:lineRule="auto"/>
-              <w:ind w:left="855.6671142578125" w:right="35.04638671875" w:hanging="4.5599365234375"/>
+              <w:ind w:left="0" w:right="35.04638671875" w:firstLine="0"/>
               <w:rPr>
                 <w:b w:val="1"/>
                 <w:bCs w:val="1"/>
@@ -3373,8 +3165,8 @@
             <w:pPr>
               <w:widowControl w:val="0"/>
               <w:spacing w:line="240" w:lineRule="auto"/>
-              <w:ind w:left="570" w:right="341.5576171875" w:firstLine="0"/>
-              <w:jc w:val="right"/>
+              <w:ind w:left="0" w:right="341.5576171875" w:firstLine="0"/>
+              <w:jc w:val="left"/>
               <w:rPr>
                 <w:b w:val="1"/>
                 <w:bCs w:val="1"/>
@@ -3396,9 +3188,9 @@
           <w:p>
             <w:pPr>
               <w:widowControl w:val="0"/>
-              <w:spacing w:line="229.88847255706787" w:lineRule="auto"/>
-              <w:ind w:left="570" w:right="181.3232421875" w:firstLine="0"/>
-              <w:jc w:val="center"/>
+              <w:spacing w:line="240" w:lineRule="auto"/>
+              <w:ind w:left="0" w:right="341.5576171875" w:firstLine="0"/>
+              <w:jc w:val="left"/>
               <w:rPr>
                 <w:b w:val="1"/>
                 <w:bCs w:val="1"/>
@@ -3433,8 +3225,8 @@
             <w:pPr>
               <w:widowControl w:val="0"/>
               <w:spacing w:line="240" w:lineRule="auto"/>
-              <w:ind w:left="510" w:right="663.99169921875" w:firstLine="0"/>
-              <w:jc w:val="right"/>
+              <w:ind w:left="0" w:right="663.99169921875" w:firstLine="0"/>
+              <w:jc w:val="left"/>
               <w:rPr>
                 <w:b w:val="1"/>
                 <w:bCs w:val="1"/>
@@ -3469,8 +3261,8 @@
             <w:pPr>
               <w:widowControl w:val="0"/>
               <w:spacing w:line="240" w:lineRule="auto"/>
-              <w:ind w:left="435" w:firstLine="0"/>
-              <w:jc w:val="center"/>
+              <w:ind w:left="0" w:firstLine="0"/>
+              <w:jc w:val="left"/>
               <w:rPr>
                 <w:b w:val="1"/>
                 <w:bCs w:val="1"/>
@@ -3512,7 +3304,7 @@
             <w:pPr>
               <w:widowControl w:val="0"/>
               <w:spacing w:line="229.88847255706787" w:lineRule="auto"/>
-              <w:ind w:left="843.4674072265625" w:right="48.11767578125" w:firstLine="9.839935302734375"/>
+              <w:ind w:left="0" w:right="48.11767578125" w:firstLine="0"/>
               <w:jc w:val="both"/>
               <w:rPr>
                 <w:b w:val="1"/>
@@ -3536,7 +3328,7 @@
             <w:pPr>
               <w:widowControl w:val="0"/>
               <w:spacing w:before="6.00799560546875" w:line="240" w:lineRule="auto"/>
-              <w:ind w:left="852.1073913574219" w:firstLine="0"/>
+              <w:ind w:left="0" w:firstLine="0"/>
               <w:rPr>
                 <w:b w:val="1"/>
                 <w:bCs w:val="1"/>
@@ -3694,7 +3486,7 @@
             <w:pPr>
               <w:widowControl w:val="0"/>
               <w:spacing w:line="240" w:lineRule="auto"/>
-              <w:ind w:left="853.3073425292969" w:firstLine="0"/>
+              <w:ind w:left="0" w:firstLine="0"/>
               <w:rPr>
                 <w:b w:val="1"/>
                 <w:bCs w:val="1"/>
@@ -3900,26 +3692,6 @@
     </w:p>
     <w:p>
       <w:pPr>
-        <w:rPr/>
-      </w:pPr>
-      <w:r>
-        <w:rPr>
-          <w:rtl w:val="0"/>
-        </w:rPr>
-      </w:r>
-    </w:p>
-    <w:p>
-      <w:pPr>
-        <w:rPr/>
-      </w:pPr>
-      <w:r>
-        <w:rPr>
-          <w:rtl w:val="0"/>
-        </w:rPr>
-      </w:r>
-    </w:p>
-    <w:p>
-      <w:pPr>
         <w:spacing w:line="360" w:lineRule="auto"/>
         <w:jc w:val="both"/>
         <w:rPr>
@@ -3935,7 +3707,7 @@
     </w:p>
     <w:tbl>
       <w:tblPr>
-        <w:tblStyle w:val="Table4"/>
+        <w:tblStyle w:val="Table3"/>
         <w:tblW w:w="14010.0" w:type="dxa"/>
         <w:jc w:val="left"/>
         <w:tblBorders>
@@ -4748,7 +4520,7 @@
               <w:widowControl w:val="0"/>
               <w:numPr>
                 <w:ilvl w:val="0"/>
-                <w:numId w:val="6"/>
+                <w:numId w:val="8"/>
               </w:numPr>
               <w:spacing w:line="240" w:lineRule="auto"/>
               <w:ind w:left="720" w:hanging="360"/>
@@ -4781,6 +4553,158 @@
               <w:rPr>
                 <w:rtl w:val="0"/>
               </w:rPr>
+            </w:r>
+          </w:p>
+          <w:p>
+            <w:pPr>
+              <w:widowControl w:val="0"/>
+              <w:spacing w:line="240" w:lineRule="auto"/>
+              <w:ind w:left="720" w:firstLine="0"/>
+              <w:rPr>
+                <w:sz w:val="24"/>
+                <w:szCs w:val="24"/>
+              </w:rPr>
+            </w:pPr>
+            <w:r>
+              <w:rPr>
+                <w:sz w:val="24"/>
+                <w:szCs w:val="24"/>
+                <w:rtl w:val="0"/>
+              </w:rPr>
+              <w:t xml:space="preserve">CREATE TABLE   avaliacao_estabelecimento( </w:t>
+            </w:r>
+          </w:p>
+          <w:p>
+            <w:pPr>
+              <w:widowControl w:val="0"/>
+              <w:spacing w:line="240" w:lineRule="auto"/>
+              <w:ind w:left="720" w:firstLine="0"/>
+              <w:rPr>
+                <w:sz w:val="24"/>
+                <w:szCs w:val="24"/>
+              </w:rPr>
+            </w:pPr>
+            <w:r>
+              <w:rPr>
+                <w:sz w:val="24"/>
+                <w:szCs w:val="24"/>
+                <w:rtl w:val="0"/>
+              </w:rPr>
+              <w:t xml:space="preserve">id_avaliacao  SERIAL PRIMARY KEY  ,</w:t>
+            </w:r>
+          </w:p>
+          <w:p>
+            <w:pPr>
+              <w:widowControl w:val="0"/>
+              <w:spacing w:line="240" w:lineRule="auto"/>
+              <w:ind w:left="720" w:firstLine="0"/>
+              <w:rPr>
+                <w:sz w:val="24"/>
+                <w:szCs w:val="24"/>
+              </w:rPr>
+            </w:pPr>
+            <w:r>
+              <w:rPr>
+                <w:sz w:val="24"/>
+                <w:szCs w:val="24"/>
+                <w:rtl w:val="0"/>
+              </w:rPr>
+              <w:t xml:space="preserve">id_usuarío INT NOT NULL,</w:t>
+            </w:r>
+          </w:p>
+          <w:p>
+            <w:pPr>
+              <w:widowControl w:val="0"/>
+              <w:spacing w:line="240" w:lineRule="auto"/>
+              <w:ind w:left="720" w:firstLine="0"/>
+              <w:rPr>
+                <w:sz w:val="24"/>
+                <w:szCs w:val="24"/>
+              </w:rPr>
+            </w:pPr>
+            <w:r>
+              <w:rPr>
+                <w:sz w:val="24"/>
+                <w:szCs w:val="24"/>
+                <w:rtl w:val="0"/>
+              </w:rPr>
+              <w:t xml:space="preserve">id_viagem        int not null,</w:t>
+            </w:r>
+          </w:p>
+          <w:p>
+            <w:pPr>
+              <w:widowControl w:val="0"/>
+              <w:spacing w:line="240" w:lineRule="auto"/>
+              <w:ind w:left="720" w:firstLine="0"/>
+              <w:rPr>
+                <w:sz w:val="24"/>
+                <w:szCs w:val="24"/>
+              </w:rPr>
+            </w:pPr>
+            <w:r>
+              <w:rPr>
+                <w:sz w:val="24"/>
+                <w:szCs w:val="24"/>
+                <w:rtl w:val="0"/>
+              </w:rPr>
+              <w:t xml:space="preserve">nome                int not null,</w:t>
+            </w:r>
+          </w:p>
+          <w:p>
+            <w:pPr>
+              <w:widowControl w:val="0"/>
+              <w:spacing w:line="240" w:lineRule="auto"/>
+              <w:ind w:left="720" w:firstLine="0"/>
+              <w:rPr>
+                <w:sz w:val="24"/>
+                <w:szCs w:val="24"/>
+              </w:rPr>
+            </w:pPr>
+            <w:r>
+              <w:rPr>
+                <w:sz w:val="24"/>
+                <w:szCs w:val="24"/>
+                <w:rtl w:val="0"/>
+              </w:rPr>
+              <w:t xml:space="preserve">comentario           text,</w:t>
+            </w:r>
+          </w:p>
+          <w:p>
+            <w:pPr>
+              <w:widowControl w:val="0"/>
+              <w:spacing w:line="240" w:lineRule="auto"/>
+              <w:ind w:left="720" w:firstLine="0"/>
+              <w:rPr>
+                <w:sz w:val="24"/>
+                <w:szCs w:val="24"/>
+              </w:rPr>
+            </w:pPr>
+            <w:r>
+              <w:rPr>
+                <w:sz w:val="24"/>
+                <w:szCs w:val="24"/>
+                <w:rtl w:val="0"/>
+              </w:rPr>
+              <w:t xml:space="preserve">data_avaliacao timestamp</w:t>
+            </w:r>
+          </w:p>
+          <w:p>
+            <w:pPr>
+              <w:widowControl w:val="0"/>
+              <w:spacing w:line="240" w:lineRule="auto"/>
+              <w:ind w:left="720" w:firstLine="0"/>
+              <w:rPr>
+                <w:sz w:val="24"/>
+                <w:szCs w:val="24"/>
+              </w:rPr>
+            </w:pPr>
+            <w:r>
+              <w:rPr>
+                <w:sz w:val="24"/>
+                <w:szCs w:val="24"/>
+                <w:rtl w:val="0"/>
+              </w:rPr>
+              <w:t xml:space="preserve">);</w:t>
             </w:r>
           </w:p>
           <w:p>
@@ -4788,7 +4712,7 @@
               <w:widowControl w:val="0"/>
               <w:numPr>
                 <w:ilvl w:val="0"/>
-                <w:numId w:val="6"/>
+                <w:numId w:val="8"/>
               </w:numPr>
               <w:spacing w:line="240" w:lineRule="auto"/>
               <w:ind w:left="720" w:hanging="360"/>
@@ -4827,7 +4751,7 @@
               <w:widowControl w:val="0"/>
               <w:numPr>
                 <w:ilvl w:val="0"/>
-                <w:numId w:val="6"/>
+                <w:numId w:val="8"/>
               </w:numPr>
               <w:spacing w:line="240" w:lineRule="auto"/>
               <w:ind w:left="720" w:hanging="360"/>
@@ -5363,6 +5287,1481 @@
         </w:tc>
       </w:tr>
     </w:tbl>
+    <w:p>
+      <w:pPr>
+        <w:spacing w:line="360" w:lineRule="auto"/>
+        <w:jc w:val="both"/>
+        <w:rPr>
+          <w:sz w:val="24"/>
+          <w:szCs w:val="24"/>
+        </w:rPr>
+      </w:pPr>
+      <w:r>
+        <w:rPr>
+          <w:rtl w:val="0"/>
+        </w:rPr>
+      </w:r>
+    </w:p>
+    <w:p>
+      <w:pPr>
+        <w:spacing w:line="360" w:lineRule="auto"/>
+        <w:jc w:val="both"/>
+        <w:rPr>
+          <w:sz w:val="24"/>
+          <w:szCs w:val="24"/>
+        </w:rPr>
+      </w:pPr>
+      <w:r>
+        <w:rPr>
+          <w:rtl w:val="0"/>
+        </w:rPr>
+      </w:r>
+    </w:p>
+    <w:tbl>
+      <w:tblPr>
+        <w:tblStyle w:val="Table4"/>
+        <w:tblpPr w:leftFromText="180" w:rightFromText="180" w:topFromText="180" w:bottomFromText="180" w:vertAnchor="text" w:horzAnchor="text" w:tblpX="0" w:tblpY="0"/>
+        <w:tblW w:w="10460.0" w:type="dxa"/>
+        <w:jc w:val="left"/>
+        <w:tblBorders>
+          <w:top w:color="000000" w:space="0" w:sz="8" w:val="single"/>
+          <w:left w:color="000000" w:space="0" w:sz="8" w:val="single"/>
+          <w:bottom w:color="000000" w:space="0" w:sz="8" w:val="single"/>
+          <w:right w:color="000000" w:space="0" w:sz="8" w:val="single"/>
+          <w:insideH w:color="000000" w:space="0" w:sz="8" w:val="single"/>
+          <w:insideV w:color="000000" w:space="0" w:sz="8" w:val="single"/>
+        </w:tblBorders>
+        <w:tblLayout w:type="fixed"/>
+        <w:tblLook w:val="0600"/>
+      </w:tblPr>
+      <w:tblGrid>
+        <w:gridCol w:w="1320"/>
+        <w:gridCol w:w="9140"/>
+        <w:tblGridChange w:id="0">
+          <w:tblGrid>
+            <w:gridCol w:w="1320"/>
+            <w:gridCol w:w="9140"/>
+          </w:tblGrid>
+        </w:tblGridChange>
+      </w:tblGrid>
+      <w:tr>
+        <w:trPr>
+          <w:cantSplit w:val="0"/>
+          <w:tblHeader w:val="0"/>
+        </w:trPr>
+        <w:tc>
+          <w:tcPr>
+            <w:shd w:fill="999999" w:val="clear"/>
+          </w:tcPr>
+          <w:p>
+            <w:pPr>
+              <w:widowControl w:val="0"/>
+              <w:spacing w:line="240" w:lineRule="auto"/>
+              <w:rPr>
+                <w:b w:val="1"/>
+                <w:bCs w:val="1"/>
+                <w:sz w:val="24"/>
+                <w:szCs w:val="24"/>
+              </w:rPr>
+            </w:pPr>
+            <w:r>
+              <w:rPr>
+                <w:b w:val="1"/>
+                <w:bCs w:val="1"/>
+                <w:sz w:val="24"/>
+                <w:szCs w:val="24"/>
+                <w:rtl w:val="0"/>
+              </w:rPr>
+              <w:t xml:space="preserve">CASO DE USO EXPANDIDO - 001</w:t>
+            </w:r>
+          </w:p>
+        </w:tc>
+        <w:tc>
+          <w:tcPr>
+            <w:shd w:fill="999999" w:val="clear"/>
+          </w:tcPr>
+          <w:p>
+            <w:pPr>
+              <w:widowControl w:val="0"/>
+              <w:spacing w:line="240" w:lineRule="auto"/>
+              <w:rPr>
+                <w:b w:val="1"/>
+                <w:bCs w:val="1"/>
+                <w:sz w:val="24"/>
+                <w:szCs w:val="24"/>
+              </w:rPr>
+            </w:pPr>
+            <w:r>
+              <w:rPr>
+                <w:b w:val="1"/>
+                <w:bCs w:val="1"/>
+                <w:sz w:val="24"/>
+                <w:szCs w:val="24"/>
+                <w:rtl w:val="0"/>
+              </w:rPr>
+              <w:t xml:space="preserve">gabriel henrique</w:t>
+            </w:r>
+          </w:p>
+        </w:tc>
+      </w:tr>
+      <w:tr>
+        <w:trPr>
+          <w:cantSplit w:val="0"/>
+          <w:tblHeader w:val="0"/>
+        </w:trPr>
+        <w:tc>
+          <w:tcPr>
+            <w:shd w:fill="999999" w:val="clear"/>
+          </w:tcPr>
+          <w:p>
+            <w:pPr>
+              <w:widowControl w:val="0"/>
+              <w:spacing w:line="240" w:lineRule="auto"/>
+              <w:rPr>
+                <w:b w:val="1"/>
+                <w:bCs w:val="1"/>
+                <w:sz w:val="24"/>
+                <w:szCs w:val="24"/>
+              </w:rPr>
+            </w:pPr>
+            <w:r>
+              <w:rPr>
+                <w:b w:val="1"/>
+                <w:bCs w:val="1"/>
+                <w:sz w:val="24"/>
+                <w:szCs w:val="24"/>
+                <w:rtl w:val="0"/>
+              </w:rPr>
+              <w:t xml:space="preserve">Ator Principal: </w:t>
+            </w:r>
+          </w:p>
+        </w:tc>
+        <w:tc>
+          <w:tcPr/>
+          <w:p>
+            <w:pPr>
+              <w:rPr/>
+            </w:pPr>
+            <w:r>
+              <w:rPr>
+                <w:rtl w:val="0"/>
+              </w:rPr>
+              <w:t xml:space="preserve">Viajante Solo (Cliente)</w:t>
+            </w:r>
+          </w:p>
+          <w:p>
+            <w:pPr>
+              <w:widowControl w:val="0"/>
+              <w:spacing w:line="240" w:lineRule="auto"/>
+              <w:rPr>
+                <w:sz w:val="24"/>
+                <w:szCs w:val="24"/>
+              </w:rPr>
+            </w:pPr>
+            <w:r>
+              <w:rPr>
+                <w:rtl w:val="0"/>
+              </w:rPr>
+            </w:r>
+          </w:p>
+        </w:tc>
+      </w:tr>
+      <w:tr>
+        <w:trPr>
+          <w:cantSplit w:val="0"/>
+          <w:tblHeader w:val="0"/>
+        </w:trPr>
+        <w:tc>
+          <w:tcPr>
+            <w:shd w:fill="999999" w:val="clear"/>
+          </w:tcPr>
+          <w:p>
+            <w:pPr>
+              <w:widowControl w:val="0"/>
+              <w:spacing w:line="240" w:lineRule="auto"/>
+              <w:rPr>
+                <w:b w:val="1"/>
+                <w:bCs w:val="1"/>
+                <w:sz w:val="24"/>
+                <w:szCs w:val="24"/>
+              </w:rPr>
+            </w:pPr>
+            <w:r>
+              <w:rPr>
+                <w:b w:val="1"/>
+                <w:bCs w:val="1"/>
+                <w:sz w:val="24"/>
+                <w:szCs w:val="24"/>
+                <w:rtl w:val="0"/>
+              </w:rPr>
+              <w:t xml:space="preserve">Resumo: </w:t>
+            </w:r>
+          </w:p>
+        </w:tc>
+        <w:tc>
+          <w:tcPr/>
+          <w:p>
+            <w:pPr>
+              <w:rPr/>
+            </w:pPr>
+            <w:r>
+              <w:rPr>
+                <w:rtl w:val="0"/>
+              </w:rPr>
+              <w:t xml:space="preserve">O viajante pode dar nota aos locais (hotéis, museus, lanchonetes) que está visitando. Pode ver o horário de abertura, fechamento e faixa de preço. O sistema permite solicitar reembolso em caso de problemas e informa o valor total ao usuário.</w:t>
+            </w:r>
+          </w:p>
+          <w:p>
+            <w:pPr>
+              <w:rPr/>
+            </w:pPr>
+            <w:r>
+              <w:rPr>
+                <w:rtl w:val="0"/>
+              </w:rPr>
+            </w:r>
+          </w:p>
+          <w:p>
+            <w:pPr>
+              <w:widowControl w:val="0"/>
+              <w:spacing w:line="240" w:lineRule="auto"/>
+              <w:rPr>
+                <w:sz w:val="24"/>
+                <w:szCs w:val="24"/>
+              </w:rPr>
+            </w:pPr>
+            <w:r>
+              <w:rPr>
+                <w:rtl w:val="0"/>
+              </w:rPr>
+            </w:r>
+          </w:p>
+        </w:tc>
+      </w:tr>
+      <w:tr>
+        <w:trPr>
+          <w:cantSplit w:val="0"/>
+          <w:tblHeader w:val="0"/>
+        </w:trPr>
+        <w:tc>
+          <w:tcPr>
+            <w:shd w:fill="999999" w:val="clear"/>
+          </w:tcPr>
+          <w:p>
+            <w:pPr>
+              <w:widowControl w:val="0"/>
+              <w:spacing w:line="240" w:lineRule="auto"/>
+              <w:rPr>
+                <w:b w:val="1"/>
+                <w:bCs w:val="1"/>
+                <w:sz w:val="24"/>
+                <w:szCs w:val="24"/>
+              </w:rPr>
+            </w:pPr>
+            <w:r>
+              <w:rPr>
+                <w:b w:val="1"/>
+                <w:bCs w:val="1"/>
+                <w:sz w:val="24"/>
+                <w:szCs w:val="24"/>
+                <w:rtl w:val="0"/>
+              </w:rPr>
+              <w:t xml:space="preserve">Pré-condições: </w:t>
+            </w:r>
+          </w:p>
+        </w:tc>
+        <w:tc>
+          <w:tcPr/>
+          <w:p>
+            <w:pPr>
+              <w:rPr/>
+            </w:pPr>
+            <w:r>
+              <w:rPr>
+                <w:rtl w:val="0"/>
+              </w:rPr>
+              <w:t xml:space="preserve">- O usuário está logado.</w:t>
+            </w:r>
+          </w:p>
+          <w:p>
+            <w:pPr>
+              <w:rPr/>
+            </w:pPr>
+            <w:r>
+              <w:rPr>
+                <w:rtl w:val="0"/>
+              </w:rPr>
+              <w:t xml:space="preserve">- Tem uma viagem em andamento.</w:t>
+            </w:r>
+          </w:p>
+          <w:p>
+            <w:pPr>
+              <w:widowControl w:val="0"/>
+              <w:spacing w:line="240" w:lineRule="auto"/>
+              <w:rPr>
+                <w:sz w:val="24"/>
+                <w:szCs w:val="24"/>
+              </w:rPr>
+            </w:pPr>
+            <w:r>
+              <w:rPr>
+                <w:rtl w:val="0"/>
+              </w:rPr>
+            </w:r>
+          </w:p>
+        </w:tc>
+      </w:tr>
+      <w:tr>
+        <w:trPr>
+          <w:cantSplit w:val="0"/>
+          <w:tblHeader w:val="0"/>
+        </w:trPr>
+        <w:tc>
+          <w:tcPr>
+            <w:shd w:fill="999999" w:val="clear"/>
+          </w:tcPr>
+          <w:p>
+            <w:pPr>
+              <w:widowControl w:val="0"/>
+              <w:spacing w:line="240" w:lineRule="auto"/>
+              <w:rPr>
+                <w:b w:val="1"/>
+                <w:bCs w:val="1"/>
+                <w:sz w:val="24"/>
+                <w:szCs w:val="24"/>
+              </w:rPr>
+            </w:pPr>
+            <w:r>
+              <w:rPr>
+                <w:b w:val="1"/>
+                <w:bCs w:val="1"/>
+                <w:sz w:val="24"/>
+                <w:szCs w:val="24"/>
+                <w:rtl w:val="0"/>
+              </w:rPr>
+              <w:t xml:space="preserve">Pós-condições: </w:t>
+            </w:r>
+          </w:p>
+        </w:tc>
+        <w:tc>
+          <w:tcPr/>
+          <w:p>
+            <w:pPr>
+              <w:rPr/>
+            </w:pPr>
+            <w:r>
+              <w:rPr>
+                <w:rtl w:val="0"/>
+              </w:rPr>
+              <w:t xml:space="preserve">- O reembolso é solicitado e o valor total é calculado.</w:t>
+            </w:r>
+          </w:p>
+          <w:p>
+            <w:pPr>
+              <w:rPr/>
+            </w:pPr>
+            <w:r>
+              <w:rPr>
+                <w:rtl w:val="0"/>
+              </w:rPr>
+              <w:t xml:space="preserve">- A nota e as informações do local são salvos.</w:t>
+            </w:r>
+          </w:p>
+          <w:p>
+            <w:pPr>
+              <w:widowControl w:val="0"/>
+              <w:spacing w:line="240" w:lineRule="auto"/>
+              <w:rPr>
+                <w:sz w:val="24"/>
+                <w:szCs w:val="24"/>
+              </w:rPr>
+            </w:pPr>
+            <w:r>
+              <w:rPr>
+                <w:rtl w:val="0"/>
+              </w:rPr>
+            </w:r>
+          </w:p>
+        </w:tc>
+      </w:tr>
+      <w:tr>
+        <w:trPr>
+          <w:cantSplit w:val="0"/>
+          <w:tblHeader w:val="0"/>
+        </w:trPr>
+        <w:tc>
+          <w:tcPr>
+            <w:shd w:fill="999999" w:val="clear"/>
+          </w:tcPr>
+          <w:p>
+            <w:pPr>
+              <w:widowControl w:val="0"/>
+              <w:spacing w:line="240" w:lineRule="auto"/>
+              <w:rPr>
+                <w:b w:val="1"/>
+                <w:bCs w:val="1"/>
+                <w:sz w:val="24"/>
+                <w:szCs w:val="24"/>
+              </w:rPr>
+            </w:pPr>
+            <w:r>
+              <w:rPr>
+                <w:b w:val="1"/>
+                <w:bCs w:val="1"/>
+                <w:sz w:val="24"/>
+                <w:szCs w:val="24"/>
+                <w:rtl w:val="0"/>
+              </w:rPr>
+              <w:t xml:space="preserve">Fluxo Principal: </w:t>
+            </w:r>
+          </w:p>
+        </w:tc>
+        <w:tc>
+          <w:tcPr/>
+          <w:p>
+            <w:pPr>
+              <w:rPr/>
+            </w:pPr>
+            <w:r>
+              <w:rPr>
+                <w:rtl w:val="0"/>
+              </w:rPr>
+              <w:t xml:space="preserve">1. Durante a viagem, o usuário clica em "Problemas" no card do local.</w:t>
+            </w:r>
+          </w:p>
+          <w:p>
+            <w:pPr>
+              <w:rPr/>
+            </w:pPr>
+            <w:r>
+              <w:rPr>
+                <w:rtl w:val="0"/>
+              </w:rPr>
+              <w:t xml:space="preserve">2. Escolha o motivo do problema.</w:t>
+            </w:r>
+          </w:p>
+          <w:p>
+            <w:pPr>
+              <w:rPr/>
+            </w:pPr>
+            <w:r>
+              <w:rPr>
+                <w:rtl w:val="0"/>
+              </w:rPr>
+              <w:t xml:space="preserve">3. Enviar foto e descrição.</w:t>
+            </w:r>
+          </w:p>
+          <w:p>
+            <w:pPr>
+              <w:rPr/>
+            </w:pPr>
+            <w:r>
+              <w:rPr>
+                <w:rtl w:val="0"/>
+              </w:rPr>
+              <w:t xml:space="preserve">4. O sistema calcula o reembolso e mostra valor total.</w:t>
+            </w:r>
+          </w:p>
+          <w:p>
+            <w:pPr>
+              <w:rPr/>
+            </w:pPr>
+            <w:r>
+              <w:rPr>
+                <w:rtl w:val="0"/>
+              </w:rPr>
+              <w:t xml:space="preserve">5. Clica em "Solicitar".</w:t>
+            </w:r>
+          </w:p>
+          <w:p>
+            <w:pPr>
+              <w:rPr/>
+            </w:pPr>
+            <w:r>
+              <w:rPr>
+                <w:rtl w:val="0"/>
+              </w:rPr>
+              <w:t xml:space="preserve">6. O usuário acessa o cartão do local na viagem.</w:t>
+            </w:r>
+          </w:p>
+          <w:p>
+            <w:pPr>
+              <w:rPr/>
+            </w:pPr>
+            <w:r>
+              <w:rPr>
+                <w:rtl w:val="0"/>
+              </w:rPr>
+              <w:t xml:space="preserve">7. Clica em "Dar nota".</w:t>
+            </w:r>
+          </w:p>
+          <w:p>
+            <w:pPr>
+              <w:rPr/>
+            </w:pPr>
+            <w:r>
+              <w:rPr>
+                <w:rtl w:val="0"/>
+              </w:rPr>
+              <w:t xml:space="preserve">8. Escolhe nota de 1 a 5.</w:t>
+            </w:r>
+          </w:p>
+          <w:p>
+            <w:pPr>
+              <w:rPr/>
+            </w:pPr>
+            <w:r>
+              <w:rPr>
+                <w:rtl w:val="0"/>
+              </w:rPr>
+              <w:t xml:space="preserve">9. Clica em "Salvar".</w:t>
+            </w:r>
+          </w:p>
+          <w:p>
+            <w:pPr>
+              <w:rPr/>
+            </w:pPr>
+            <w:r>
+              <w:rPr>
+                <w:rtl w:val="0"/>
+              </w:rPr>
+              <w:t xml:space="preserve">10. O sistema mostra horário, fechamento e faixa de preço.</w:t>
+            </w:r>
+          </w:p>
+          <w:p>
+            <w:pPr>
+              <w:rPr/>
+            </w:pPr>
+            <w:r>
+              <w:rPr>
+                <w:rtl w:val="0"/>
+              </w:rPr>
+            </w:r>
+          </w:p>
+          <w:p>
+            <w:pPr>
+              <w:rPr/>
+            </w:pPr>
+            <w:r>
+              <w:rPr>
+                <w:rtl w:val="0"/>
+              </w:rPr>
+            </w:r>
+          </w:p>
+        </w:tc>
+      </w:tr>
+      <w:tr>
+        <w:trPr>
+          <w:cantSplit w:val="0"/>
+          <w:tblHeader w:val="0"/>
+        </w:trPr>
+        <w:tc>
+          <w:tcPr>
+            <w:shd w:fill="999999" w:val="clear"/>
+          </w:tcPr>
+          <w:p>
+            <w:pPr>
+              <w:widowControl w:val="0"/>
+              <w:spacing w:line="240" w:lineRule="auto"/>
+              <w:rPr>
+                <w:b w:val="1"/>
+                <w:bCs w:val="1"/>
+                <w:sz w:val="24"/>
+                <w:szCs w:val="24"/>
+              </w:rPr>
+            </w:pPr>
+            <w:r>
+              <w:rPr>
+                <w:b w:val="1"/>
+                <w:bCs w:val="1"/>
+                <w:sz w:val="24"/>
+                <w:szCs w:val="24"/>
+                <w:rtl w:val="0"/>
+              </w:rPr>
+              <w:t xml:space="preserve">Fluxos Alternativos: </w:t>
+            </w:r>
+          </w:p>
+        </w:tc>
+        <w:tc>
+          <w:tcPr/>
+          <w:p>
+            <w:pPr>
+              <w:widowControl w:val="0"/>
+              <w:spacing w:line="240" w:lineRule="auto"/>
+              <w:rPr>
+                <w:b w:val="1"/>
+                <w:bCs w:val="1"/>
+                <w:sz w:val="24"/>
+                <w:szCs w:val="24"/>
+              </w:rPr>
+            </w:pPr>
+            <w:r>
+              <w:rPr>
+                <w:b w:val="1"/>
+                <w:bCs w:val="1"/>
+                <w:sz w:val="24"/>
+                <w:szCs w:val="24"/>
+                <w:rtl w:val="0"/>
+              </w:rPr>
+              <w:t xml:space="preserve">FA01 - Aplicação de Frete Grátis:</w:t>
+            </w:r>
+          </w:p>
+          <w:p>
+            <w:pPr>
+              <w:widowControl w:val="0"/>
+              <w:spacing w:line="240" w:lineRule="auto"/>
+              <w:rPr>
+                <w:sz w:val="24"/>
+                <w:szCs w:val="24"/>
+              </w:rPr>
+            </w:pPr>
+            <w:r>
+              <w:rPr>
+                <w:rtl w:val="0"/>
+              </w:rPr>
+            </w:r>
+          </w:p>
+          <w:p>
+            <w:pPr>
+              <w:widowControl w:val="0"/>
+              <w:numPr>
+                <w:ilvl w:val="0"/>
+                <w:numId w:val="6"/>
+              </w:numPr>
+              <w:spacing w:line="240" w:lineRule="auto"/>
+              <w:ind w:left="720" w:hanging="360"/>
+              <w:rPr>
+                <w:sz w:val="24"/>
+                <w:szCs w:val="24"/>
+              </w:rPr>
+            </w:pPr>
+            <w:r>
+              <w:rPr>
+                <w:b w:val="1"/>
+                <w:bCs w:val="1"/>
+                <w:sz w:val="24"/>
+                <w:szCs w:val="24"/>
+                <w:rtl w:val="0"/>
+              </w:rPr>
+              <w:t xml:space="preserve">3a.</w:t>
+            </w:r>
+            <w:r>
+              <w:rPr>
+                <w:sz w:val="24"/>
+                <w:szCs w:val="24"/>
+                <w:rtl w:val="0"/>
+              </w:rPr>
+              <w:t xml:space="preserve"> O sistema identifica que o CEP pertence à mesma região metropolitana do CD ou que o cliente é membro ativo do programa de fidelidade. </w:t>
+            </w:r>
+          </w:p>
+          <w:p>
+            <w:pPr>
+              <w:widowControl w:val="0"/>
+              <w:spacing w:line="240" w:lineRule="auto"/>
+              <w:ind w:left="720" w:firstLine="0"/>
+              <w:rPr>
+                <w:sz w:val="24"/>
+                <w:szCs w:val="24"/>
+              </w:rPr>
+            </w:pPr>
+            <w:r>
+              <w:rPr>
+                <w:rtl w:val="0"/>
+              </w:rPr>
+            </w:r>
+          </w:p>
+          <w:p>
+            <w:pPr>
+              <w:widowControl w:val="0"/>
+              <w:numPr>
+                <w:ilvl w:val="0"/>
+                <w:numId w:val="6"/>
+              </w:numPr>
+              <w:spacing w:line="240" w:lineRule="auto"/>
+              <w:ind w:left="720" w:hanging="360"/>
+              <w:rPr>
+                <w:sz w:val="24"/>
+                <w:szCs w:val="24"/>
+              </w:rPr>
+            </w:pPr>
+            <w:r>
+              <w:rPr>
+                <w:b w:val="1"/>
+                <w:bCs w:val="1"/>
+                <w:sz w:val="24"/>
+                <w:szCs w:val="24"/>
+                <w:rtl w:val="0"/>
+              </w:rPr>
+              <w:t xml:space="preserve">3b.</w:t>
+            </w:r>
+            <w:r>
+              <w:rPr>
+                <w:sz w:val="24"/>
+                <w:szCs w:val="24"/>
+                <w:rtl w:val="0"/>
+              </w:rPr>
+              <w:t xml:space="preserve"> O sistema aplica isenção total de frete (R$0,00) ao carrinho. </w:t>
+            </w:r>
+          </w:p>
+          <w:p>
+            <w:pPr>
+              <w:widowControl w:val="0"/>
+              <w:spacing w:line="240" w:lineRule="auto"/>
+              <w:rPr>
+                <w:sz w:val="24"/>
+                <w:szCs w:val="24"/>
+              </w:rPr>
+            </w:pPr>
+            <w:r>
+              <w:rPr>
+                <w:rtl w:val="0"/>
+              </w:rPr>
+            </w:r>
+          </w:p>
+        </w:tc>
+      </w:tr>
+      <w:tr>
+        <w:trPr>
+          <w:cantSplit w:val="0"/>
+          <w:tblHeader w:val="0"/>
+        </w:trPr>
+        <w:tc>
+          <w:tcPr>
+            <w:shd w:fill="999999" w:val="clear"/>
+          </w:tcPr>
+          <w:p>
+            <w:pPr>
+              <w:widowControl w:val="0"/>
+              <w:spacing w:line="240" w:lineRule="auto"/>
+              <w:rPr>
+                <w:b w:val="1"/>
+                <w:bCs w:val="1"/>
+                <w:sz w:val="24"/>
+                <w:szCs w:val="24"/>
+              </w:rPr>
+            </w:pPr>
+            <w:r>
+              <w:rPr>
+                <w:b w:val="1"/>
+                <w:bCs w:val="1"/>
+                <w:sz w:val="24"/>
+                <w:szCs w:val="24"/>
+                <w:rtl w:val="0"/>
+              </w:rPr>
+              <w:t xml:space="preserve">Fluxos de Exceção: </w:t>
+            </w:r>
+          </w:p>
+        </w:tc>
+        <w:tc>
+          <w:tcPr/>
+          <w:p>
+            <w:pPr>
+              <w:widowControl w:val="0"/>
+              <w:spacing w:line="240" w:lineRule="auto"/>
+              <w:rPr>
+                <w:b w:val="1"/>
+                <w:bCs w:val="1"/>
+                <w:sz w:val="24"/>
+                <w:szCs w:val="24"/>
+              </w:rPr>
+            </w:pPr>
+            <w:r>
+              <w:rPr>
+                <w:b w:val="1"/>
+                <w:bCs w:val="1"/>
+                <w:sz w:val="24"/>
+                <w:szCs w:val="24"/>
+                <w:rtl w:val="0"/>
+              </w:rPr>
+              <w:t xml:space="preserve">FE01 - Indisponibilidade na API da Transportadora:</w:t>
+            </w:r>
+          </w:p>
+          <w:p>
+            <w:pPr>
+              <w:widowControl w:val="0"/>
+              <w:spacing w:line="240" w:lineRule="auto"/>
+              <w:rPr>
+                <w:sz w:val="24"/>
+                <w:szCs w:val="24"/>
+              </w:rPr>
+            </w:pPr>
+            <w:r>
+              <w:rPr>
+                <w:rtl w:val="0"/>
+              </w:rPr>
+            </w:r>
+          </w:p>
+          <w:p>
+            <w:pPr>
+              <w:widowControl w:val="0"/>
+              <w:numPr>
+                <w:ilvl w:val="0"/>
+                <w:numId w:val="7"/>
+              </w:numPr>
+              <w:spacing w:line="240" w:lineRule="auto"/>
+              <w:ind w:left="720" w:hanging="360"/>
+              <w:rPr>
+                <w:sz w:val="24"/>
+                <w:szCs w:val="24"/>
+              </w:rPr>
+            </w:pPr>
+            <w:r>
+              <w:rPr>
+                <w:b w:val="1"/>
+                <w:bCs w:val="1"/>
+                <w:sz w:val="24"/>
+                <w:szCs w:val="24"/>
+                <w:rtl w:val="0"/>
+              </w:rPr>
+              <w:t xml:space="preserve">2a.</w:t>
+            </w:r>
+            <w:r>
+              <w:rPr>
+                <w:sz w:val="24"/>
+                <w:szCs w:val="24"/>
+                <w:rtl w:val="0"/>
+              </w:rPr>
+              <w:t xml:space="preserve"> A API de cálculo da transportadora não responde no tempo limite. </w:t>
+            </w:r>
+          </w:p>
+          <w:p>
+            <w:pPr>
+              <w:widowControl w:val="0"/>
+              <w:spacing w:line="240" w:lineRule="auto"/>
+              <w:ind w:left="720" w:firstLine="0"/>
+              <w:rPr>
+                <w:sz w:val="24"/>
+                <w:szCs w:val="24"/>
+              </w:rPr>
+            </w:pPr>
+            <w:r>
+              <w:rPr>
+                <w:rtl w:val="0"/>
+              </w:rPr>
+            </w:r>
+          </w:p>
+          <w:p>
+            <w:pPr>
+              <w:widowControl w:val="0"/>
+              <w:numPr>
+                <w:ilvl w:val="0"/>
+                <w:numId w:val="7"/>
+              </w:numPr>
+              <w:spacing w:line="240" w:lineRule="auto"/>
+              <w:ind w:left="720" w:hanging="360"/>
+              <w:rPr>
+                <w:sz w:val="24"/>
+                <w:szCs w:val="24"/>
+              </w:rPr>
+            </w:pPr>
+            <w:r>
+              <w:rPr>
+                <w:b w:val="1"/>
+                <w:bCs w:val="1"/>
+                <w:sz w:val="24"/>
+                <w:szCs w:val="24"/>
+                <w:rtl w:val="0"/>
+              </w:rPr>
+              <w:t xml:space="preserve">2b.</w:t>
+            </w:r>
+            <w:r>
+              <w:rPr>
+                <w:sz w:val="24"/>
+                <w:szCs w:val="24"/>
+                <w:rtl w:val="0"/>
+              </w:rPr>
+              <w:t xml:space="preserve"> O sistema utiliza a tabela de contingência offline de frete estimado e exibe aviso ao usuário. (Pode ter alteração no valor - Deve ser consultado posteriormente)</w:t>
+            </w:r>
+          </w:p>
+        </w:tc>
+      </w:tr>
+      <w:tr>
+        <w:trPr>
+          <w:cantSplit w:val="0"/>
+          <w:tblHeader w:val="0"/>
+        </w:trPr>
+        <w:tc>
+          <w:tcPr>
+            <w:shd w:fill="999999" w:val="clear"/>
+          </w:tcPr>
+          <w:p>
+            <w:pPr>
+              <w:widowControl w:val="0"/>
+              <w:spacing w:line="240" w:lineRule="auto"/>
+              <w:rPr>
+                <w:b w:val="1"/>
+                <w:bCs w:val="1"/>
+                <w:sz w:val="24"/>
+                <w:szCs w:val="24"/>
+              </w:rPr>
+            </w:pPr>
+            <w:r>
+              <w:rPr>
+                <w:b w:val="1"/>
+                <w:bCs w:val="1"/>
+                <w:sz w:val="24"/>
+                <w:szCs w:val="24"/>
+                <w:rtl w:val="0"/>
+              </w:rPr>
+              <w:t xml:space="preserve">Relações de Regras de Negócio: </w:t>
+            </w:r>
+          </w:p>
+        </w:tc>
+        <w:tc>
+          <w:tcPr/>
+          <w:p>
+            <w:pPr>
+              <w:widowControl w:val="0"/>
+              <w:numPr>
+                <w:ilvl w:val="0"/>
+                <w:numId w:val="9"/>
+              </w:numPr>
+              <w:spacing w:line="240" w:lineRule="auto"/>
+              <w:ind w:left="720" w:hanging="360"/>
+              <w:rPr>
+                <w:sz w:val="24"/>
+                <w:szCs w:val="24"/>
+              </w:rPr>
+            </w:pPr>
+            <w:r>
+              <w:rPr>
+                <w:b w:val="1"/>
+                <w:bCs w:val="1"/>
+                <w:sz w:val="24"/>
+                <w:szCs w:val="24"/>
+                <w:rtl w:val="0"/>
+              </w:rPr>
+              <w:t xml:space="preserve">RN01</w:t>
+            </w:r>
+            <w:r>
+              <w:rPr>
+                <w:sz w:val="24"/>
+                <w:szCs w:val="24"/>
+                <w:rtl w:val="0"/>
+              </w:rPr>
+              <w:t xml:space="preserve">  </w:t>
+            </w:r>
+            <w:r>
+              <w:rPr>
+                <w:rtl w:val="0"/>
+              </w:rPr>
+              <w:t xml:space="preserve"> - Valor total sempre inclui todos os gastos.</w:t>
+            </w:r>
+            <w:r>
+              <w:rPr>
+                <w:rtl w:val="0"/>
+              </w:rPr>
+            </w:r>
+          </w:p>
+          <w:p>
+            <w:pPr>
+              <w:widowControl w:val="0"/>
+              <w:spacing w:line="240" w:lineRule="auto"/>
+              <w:ind w:left="720" w:firstLine="0"/>
+              <w:rPr>
+                <w:sz w:val="24"/>
+                <w:szCs w:val="24"/>
+              </w:rPr>
+            </w:pPr>
+            <w:r>
+              <w:rPr>
+                <w:rtl w:val="0"/>
+              </w:rPr>
+            </w:r>
+          </w:p>
+          <w:p>
+            <w:pPr>
+              <w:widowControl w:val="0"/>
+              <w:numPr>
+                <w:ilvl w:val="0"/>
+                <w:numId w:val="9"/>
+              </w:numPr>
+              <w:spacing w:line="240" w:lineRule="auto"/>
+              <w:ind w:left="720" w:hanging="360"/>
+              <w:rPr>
+                <w:b w:val="1"/>
+                <w:bCs w:val="1"/>
+                <w:sz w:val="24"/>
+                <w:szCs w:val="24"/>
+              </w:rPr>
+            </w:pPr>
+            <w:r>
+              <w:rPr>
+                <w:b w:val="1"/>
+                <w:bCs w:val="1"/>
+                <w:sz w:val="24"/>
+                <w:szCs w:val="24"/>
+                <w:rtl w:val="0"/>
+              </w:rPr>
+              <w:t xml:space="preserve">RF02  </w:t>
+            </w:r>
+            <w:r>
+              <w:rPr>
+                <w:rtl w:val="0"/>
+              </w:rPr>
+              <w:t xml:space="preserve"> - A nota de localização deve ser entre 1 e 5.</w:t>
+            </w:r>
+            <w:r>
+              <w:rPr>
+                <w:rtl w:val="0"/>
+              </w:rPr>
+            </w:r>
+          </w:p>
+        </w:tc>
+      </w:tr>
+    </w:tbl>
+    <w:p>
+      <w:pPr>
+        <w:spacing w:line="360" w:lineRule="auto"/>
+        <w:jc w:val="both"/>
+        <w:rPr>
+          <w:sz w:val="24"/>
+          <w:szCs w:val="24"/>
+        </w:rPr>
+      </w:pPr>
+      <w:r>
+        <w:rPr>
+          <w:rtl w:val="0"/>
+        </w:rPr>
+      </w:r>
+    </w:p>
+    <w:p>
+      <w:pPr>
+        <w:rPr/>
+      </w:pPr>
+      <w:r>
+        <w:rPr>
+          <w:rtl w:val="0"/>
+        </w:rPr>
+      </w:r>
+    </w:p>
+    <w:p>
+      <w:pPr>
+        <w:rPr/>
+      </w:pPr>
+      <w:r>
+        <w:rPr>
+          <w:rtl w:val="0"/>
+        </w:rPr>
+      </w:r>
+    </w:p>
+    <w:p>
+      <w:pPr>
+        <w:rPr/>
+      </w:pPr>
+      <w:r>
+        <w:rPr>
+          <w:rtl w:val="0"/>
+        </w:rPr>
+      </w:r>
+    </w:p>
+    <w:p>
+      <w:pPr>
+        <w:rPr/>
+      </w:pPr>
+      <w:r>
+        <w:rPr>
+          <w:rtl w:val="0"/>
+        </w:rPr>
+      </w:r>
+    </w:p>
+    <w:p>
+      <w:pPr>
+        <w:rPr/>
+      </w:pPr>
+      <w:r>
+        <w:rPr>
+          <w:rtl w:val="0"/>
+        </w:rPr>
+      </w:r>
+    </w:p>
+    <w:p>
+      <w:pPr>
+        <w:rPr/>
+      </w:pPr>
+      <w:r>
+        <w:rPr>
+          <w:rtl w:val="0"/>
+        </w:rPr>
+      </w:r>
+    </w:p>
+    <w:p>
+      <w:pPr>
+        <w:rPr/>
+      </w:pPr>
+      <w:r>
+        <w:rPr>
+          <w:rtl w:val="0"/>
+        </w:rPr>
+      </w:r>
+    </w:p>
+    <w:p>
+      <w:pPr>
+        <w:rPr/>
+      </w:pPr>
+      <w:r>
+        <w:rPr>
+          <w:rtl w:val="0"/>
+        </w:rPr>
+      </w:r>
+    </w:p>
+    <w:p>
+      <w:pPr>
+        <w:rPr/>
+      </w:pPr>
+      <w:r>
+        <w:rPr>
+          <w:rtl w:val="0"/>
+        </w:rPr>
+      </w:r>
+    </w:p>
+    <w:p>
+      <w:pPr>
+        <w:rPr/>
+      </w:pPr>
+      <w:r>
+        <w:rPr>
+          <w:rtl w:val="0"/>
+        </w:rPr>
+      </w:r>
+    </w:p>
+    <w:p>
+      <w:pPr>
+        <w:rPr/>
+      </w:pPr>
+      <w:r>
+        <w:rPr>
+          <w:rtl w:val="0"/>
+        </w:rPr>
+      </w:r>
+    </w:p>
+    <w:p>
+      <w:pPr>
+        <w:rPr/>
+      </w:pPr>
+      <w:r>
+        <w:rPr>
+          <w:rtl w:val="0"/>
+        </w:rPr>
+      </w:r>
+    </w:p>
+    <w:p>
+      <w:pPr>
+        <w:rPr/>
+      </w:pPr>
+      <w:r>
+        <w:rPr>
+          <w:rtl w:val="0"/>
+        </w:rPr>
+      </w:r>
+    </w:p>
+    <w:p>
+      <w:pPr>
+        <w:rPr/>
+      </w:pPr>
+      <w:r>
+        <w:rPr>
+          <w:rtl w:val="0"/>
+        </w:rPr>
+      </w:r>
+    </w:p>
+    <w:p>
+      <w:pPr>
+        <w:rPr/>
+      </w:pPr>
+      <w:r>
+        <w:rPr>
+          <w:rtl w:val="0"/>
+        </w:rPr>
+      </w:r>
+    </w:p>
+    <w:p>
+      <w:pPr>
+        <w:rPr/>
+      </w:pPr>
+      <w:r>
+        <w:rPr>
+          <w:rtl w:val="0"/>
+        </w:rPr>
+      </w:r>
+    </w:p>
+    <w:p>
+      <w:pPr>
+        <w:rPr/>
+      </w:pPr>
+      <w:r>
+        <w:rPr>
+          <w:rtl w:val="0"/>
+        </w:rPr>
+      </w:r>
+    </w:p>
+    <w:p>
+      <w:pPr>
+        <w:rPr/>
+      </w:pPr>
+      <w:r>
+        <w:rPr>
+          <w:rtl w:val="0"/>
+        </w:rPr>
+      </w:r>
+    </w:p>
+    <w:p>
+      <w:pPr>
+        <w:rPr/>
+      </w:pPr>
+      <w:r>
+        <w:rPr>
+          <w:rtl w:val="0"/>
+        </w:rPr>
+      </w:r>
+    </w:p>
+    <w:p>
+      <w:pPr>
+        <w:rPr/>
+      </w:pPr>
+      <w:r>
+        <w:rPr>
+          <w:rtl w:val="0"/>
+        </w:rPr>
+      </w:r>
+    </w:p>
+    <w:p>
+      <w:pPr>
+        <w:rPr/>
+      </w:pPr>
+      <w:r>
+        <w:rPr>
+          <w:rtl w:val="0"/>
+        </w:rPr>
+      </w:r>
+    </w:p>
+    <w:p>
+      <w:pPr>
+        <w:rPr/>
+      </w:pPr>
+      <w:r>
+        <w:rPr>
+          <w:rtl w:val="0"/>
+        </w:rPr>
+      </w:r>
+    </w:p>
+    <w:p>
+      <w:pPr>
+        <w:rPr/>
+      </w:pPr>
+      <w:r>
+        <w:rPr>
+          <w:rtl w:val="0"/>
+        </w:rPr>
+      </w:r>
+    </w:p>
+    <w:p>
+      <w:pPr>
+        <w:rPr/>
+      </w:pPr>
+      <w:r>
+        <w:rPr>
+          <w:rtl w:val="0"/>
+        </w:rPr>
+      </w:r>
+    </w:p>
+    <w:p>
+      <w:pPr>
+        <w:spacing w:line="360" w:lineRule="auto"/>
+        <w:jc w:val="both"/>
+        <w:rPr>
+          <w:sz w:val="24"/>
+          <w:szCs w:val="24"/>
+        </w:rPr>
+      </w:pPr>
+      <w:r>
+        <w:rPr>
+          <w:rtl w:val="0"/>
+        </w:rPr>
+      </w:r>
+    </w:p>
+    <w:p>
+      <w:pPr>
+        <w:spacing w:line="360" w:lineRule="auto"/>
+        <w:jc w:val="both"/>
+        <w:rPr>
+          <w:sz w:val="24"/>
+          <w:szCs w:val="24"/>
+        </w:rPr>
+      </w:pPr>
+      <w:r>
+        <w:rPr>
+          <w:rtl w:val="0"/>
+        </w:rPr>
+      </w:r>
+    </w:p>
+    <w:p>
+      <w:pPr>
+        <w:spacing w:line="360" w:lineRule="auto"/>
+        <w:jc w:val="both"/>
+        <w:rPr>
+          <w:sz w:val="24"/>
+          <w:szCs w:val="24"/>
+        </w:rPr>
+      </w:pPr>
+      <w:r>
+        <w:rPr>
+          <w:rtl w:val="0"/>
+        </w:rPr>
+      </w:r>
+    </w:p>
+    <w:p>
+      <w:pPr>
+        <w:spacing w:line="360" w:lineRule="auto"/>
+        <w:jc w:val="both"/>
+        <w:rPr>
+          <w:sz w:val="24"/>
+          <w:szCs w:val="24"/>
+        </w:rPr>
+      </w:pPr>
+      <w:r>
+        <w:rPr>
+          <w:sz w:val="24"/>
+          <w:szCs w:val="24"/>
+          <w:rtl w:val="0"/>
+        </w:rPr>
+        <w:tab/>
+        <w:t xml:space="preserve"> </w:t>
+        <w:tab/>
+      </w:r>
+    </w:p>
+    <w:p>
+      <w:pPr>
+        <w:spacing w:line="360" w:lineRule="auto"/>
+        <w:jc w:val="both"/>
+        <w:rPr>
+          <w:sz w:val="24"/>
+          <w:szCs w:val="24"/>
+        </w:rPr>
+      </w:pPr>
+      <w:r>
+        <w:rPr>
+          <w:sz w:val="24"/>
+          <w:szCs w:val="24"/>
+          <w:rtl w:val="0"/>
+        </w:rPr>
+        <w:tab/>
+        <w:t xml:space="preserve"> </w:t>
+        <w:tab/>
+        <w:t xml:space="preserve"> </w:t>
+        <w:tab/>
+        <w:t xml:space="preserve"> </w:t>
+        <w:tab/>
+      </w:r>
+    </w:p>
+    <w:p>
+      <w:pPr>
+        <w:spacing w:before="240" w:line="360" w:lineRule="auto"/>
+        <w:jc w:val="both"/>
+        <w:rPr>
+          <w:sz w:val="24"/>
+          <w:szCs w:val="24"/>
+        </w:rPr>
+      </w:pPr>
+      <w:r>
+        <w:rPr>
+          <w:sz w:val="24"/>
+          <w:szCs w:val="24"/>
+          <w:rtl w:val="0"/>
+        </w:rPr>
+        <w:br w:type="textWrapping"/>
+      </w:r>
+    </w:p>
+    <w:p>
+      <w:pPr>
+        <w:spacing w:line="360" w:lineRule="auto"/>
+        <w:jc w:val="both"/>
+        <w:rPr>
+          <w:sz w:val="24"/>
+          <w:szCs w:val="24"/>
+        </w:rPr>
+      </w:pPr>
+      <w:r>
+        <w:rPr>
+          <w:rtl w:val="0"/>
+        </w:rPr>
+      </w:r>
+    </w:p>
+    <w:p>
+      <w:pPr>
+        <w:spacing w:line="360" w:lineRule="auto"/>
+        <w:jc w:val="both"/>
+        <w:rPr>
+          <w:sz w:val="24"/>
+          <w:szCs w:val="24"/>
+        </w:rPr>
+      </w:pPr>
+      <w:r>
+        <w:rPr>
+          <w:rtl w:val="0"/>
+        </w:rPr>
+      </w:r>
+    </w:p>
+    <w:p>
+      <w:pPr>
+        <w:spacing w:line="360" w:lineRule="auto"/>
+        <w:jc w:val="both"/>
+        <w:rPr>
+          <w:sz w:val="24"/>
+          <w:szCs w:val="24"/>
+        </w:rPr>
+      </w:pPr>
+      <w:r>
+        <w:rPr>
+          <w:rtl w:val="0"/>
+        </w:rPr>
+      </w:r>
+    </w:p>
+    <w:p>
+      <w:pPr>
+        <w:spacing w:line="360" w:lineRule="auto"/>
+        <w:jc w:val="both"/>
+        <w:rPr>
+          <w:sz w:val="24"/>
+          <w:szCs w:val="24"/>
+        </w:rPr>
+      </w:pPr>
+      <w:r>
+        <w:rPr>
+          <w:rtl w:val="0"/>
+        </w:rPr>
+      </w:r>
+    </w:p>
+    <w:p>
+      <w:pPr>
+        <w:spacing w:line="360" w:lineRule="auto"/>
+        <w:jc w:val="both"/>
+        <w:rPr>
+          <w:sz w:val="24"/>
+          <w:szCs w:val="24"/>
+        </w:rPr>
+      </w:pPr>
+      <w:r>
+        <w:rPr>
+          <w:rtl w:val="0"/>
+        </w:rPr>
+      </w:r>
+    </w:p>
+    <w:p>
+      <w:pPr>
+        <w:spacing w:line="360" w:lineRule="auto"/>
+        <w:jc w:val="both"/>
+        <w:rPr>
+          <w:sz w:val="24"/>
+          <w:szCs w:val="24"/>
+        </w:rPr>
+      </w:pPr>
+      <w:r>
+        <w:rPr>
+          <w:rtl w:val="0"/>
+        </w:rPr>
+      </w:r>
+    </w:p>
     <w:p>
       <w:pPr>
         <w:spacing w:line="360" w:lineRule="auto"/>
@@ -5515,6 +6914,21 @@
 </w:document>
 </file>
 
+<file path=word/header1.xml><?xml version="1.0" encoding="utf-8"?>
+<w:hdr xmlns:mc="http://schemas.openxmlformats.org/markup-compatibility/2006" xmlns:o="urn:schemas-microsoft-com:office:office" xmlns:r="http://schemas.openxmlformats.org/officeDocument/2006/relationships" xmlns:m="http://schemas.openxmlformats.org/officeDocument/2006/math" xmlns:v="urn:schemas-microsoft-com:vml" xmlns:wp="http://schemas.openxmlformats.org/drawingml/2006/wordprocessingDrawing" xmlns:w10="urn:schemas-microsoft-com:office:word" xmlns:w="http://schemas.openxmlformats.org/wordprocessingml/2006/main" xmlns:wne="http://schemas.microsoft.com/office/word/2006/wordml" xmlns:sl="http://schemas.openxmlformats.org/schemaLibrary/2006/main" xmlns:a="http://schemas.openxmlformats.org/drawingml/2006/main" xmlns:pic="http://schemas.openxmlformats.org/drawingml/2006/picture" xmlns:c="http://schemas.openxmlformats.org/drawingml/2006/chart" xmlns:lc="http://schemas.openxmlformats.org/drawingml/2006/lockedCanvas" xmlns:dgm="http://schemas.openxmlformats.org/drawingml/2006/diagram" xmlns:wps="http://schemas.microsoft.com/office/word/2010/wordprocessingShape" xmlns:wpg="http://schemas.microsoft.com/office/word/2010/wordprocessingGroup" xmlns:w14="http://schemas.microsoft.com/office/word/2010/wordml" xmlns:w15="http://schemas.microsoft.com/office/word/2012/wordml" xmlns:w16="http://schemas.microsoft.com/office/word/2018/wordml" xmlns:w16cex="http://schemas.microsoft.com/office/word/2018/wordml/cex" xmlns:w16cid="http://schemas.microsoft.com/office/word/2016/wordml/cid" xmlns="http://schemas.microsoft.com/office/tasks/2019/documenttasks" xmlns:cr="http://schemas.microsoft.com/office/comments/2020/reactions">
+  <w:p>
+    <w:pPr>
+      <w:rPr/>
+    </w:pPr>
+    <w:r>
+      <w:rPr>
+        <w:rtl w:val="0"/>
+      </w:rPr>
+    </w:r>
+  </w:p>
+</w:hdr>
+</file>
+
 <file path=word/numbering.xml><?xml version="1.0" encoding="utf-8"?>
 <w:numbering xmlns:mc="http://schemas.openxmlformats.org/markup-compatibility/2006" xmlns:o="urn:schemas-microsoft-com:office:office" xmlns:r="http://schemas.openxmlformats.org/officeDocument/2006/relationships" xmlns:m="http://schemas.openxmlformats.org/officeDocument/2006/math" xmlns:v="urn:schemas-microsoft-com:vml" xmlns:wp="http://schemas.openxmlformats.org/drawingml/2006/wordprocessingDrawing" xmlns:w10="urn:schemas-microsoft-com:office:word" xmlns:w="http://schemas.openxmlformats.org/wordprocessingml/2006/main" xmlns:wne="http://schemas.microsoft.com/office/word/2006/wordml" xmlns:sl="http://schemas.openxmlformats.org/schemaLibrary/2006/main" xmlns:a="http://schemas.openxmlformats.org/drawingml/2006/main" xmlns:pic="http://schemas.openxmlformats.org/drawingml/2006/picture" xmlns:c="http://schemas.openxmlformats.org/drawingml/2006/chart" xmlns:lc="http://schemas.openxmlformats.org/drawingml/2006/lockedCanvas" xmlns:dgm="http://schemas.openxmlformats.org/drawingml/2006/diagram" xmlns:wps="http://schemas.microsoft.com/office/word/2010/wordprocessingShape" xmlns:wpg="http://schemas.microsoft.com/office/word/2010/wordprocessingGroup" xmlns:w14="http://schemas.microsoft.com/office/word/2010/wordml" xmlns:w15="http://schemas.microsoft.com/office/word/2012/wordml" xmlns:w16="http://schemas.microsoft.com/office/word/2018/wordml" xmlns:w16cex="http://schemas.microsoft.com/office/word/2018/wordml/cex" xmlns:w16cid="http://schemas.microsoft.com/office/word/2016/wordml/cid" xmlns="http://schemas.microsoft.com/office/tasks/2019/documenttasks" xmlns:cr="http://schemas.microsoft.com/office/comments/2020/reactions">
   <w:abstractNum w:abstractNumId="1">
@@ -6068,6 +7482,336 @@
     </w:lvl>
   </w:abstractNum>
   <w:abstractNum w:abstractNumId="6">
+    <w:lvl w:ilvl="0">
+      <w:start w:val="1"/>
+      <w:numFmt w:val="bullet"/>
+      <w:lvlText w:val="●"/>
+      <w:lvlJc w:val="left"/>
+      <w:pPr>
+        <w:ind w:left="720" w:hanging="360"/>
+      </w:pPr>
+      <w:rPr>
+        <w:u w:val="none"/>
+      </w:rPr>
+    </w:lvl>
+    <w:lvl w:ilvl="1">
+      <w:start w:val="1"/>
+      <w:numFmt w:val="bullet"/>
+      <w:lvlText w:val="○"/>
+      <w:lvlJc w:val="left"/>
+      <w:pPr>
+        <w:ind w:left="1440" w:hanging="360"/>
+      </w:pPr>
+      <w:rPr>
+        <w:u w:val="none"/>
+      </w:rPr>
+    </w:lvl>
+    <w:lvl w:ilvl="2">
+      <w:start w:val="1"/>
+      <w:numFmt w:val="bullet"/>
+      <w:lvlText w:val="■"/>
+      <w:lvlJc w:val="left"/>
+      <w:pPr>
+        <w:ind w:left="2160" w:hanging="360"/>
+      </w:pPr>
+      <w:rPr>
+        <w:u w:val="none"/>
+      </w:rPr>
+    </w:lvl>
+    <w:lvl w:ilvl="3">
+      <w:start w:val="1"/>
+      <w:numFmt w:val="bullet"/>
+      <w:lvlText w:val="●"/>
+      <w:lvlJc w:val="left"/>
+      <w:pPr>
+        <w:ind w:left="2880" w:hanging="360"/>
+      </w:pPr>
+      <w:rPr>
+        <w:u w:val="none"/>
+      </w:rPr>
+    </w:lvl>
+    <w:lvl w:ilvl="4">
+      <w:start w:val="1"/>
+      <w:numFmt w:val="bullet"/>
+      <w:lvlText w:val="○"/>
+      <w:lvlJc w:val="left"/>
+      <w:pPr>
+        <w:ind w:left="3600" w:hanging="360"/>
+      </w:pPr>
+      <w:rPr>
+        <w:u w:val="none"/>
+      </w:rPr>
+    </w:lvl>
+    <w:lvl w:ilvl="5">
+      <w:start w:val="1"/>
+      <w:numFmt w:val="bullet"/>
+      <w:lvlText w:val="■"/>
+      <w:lvlJc w:val="left"/>
+      <w:pPr>
+        <w:ind w:left="4320" w:hanging="360"/>
+      </w:pPr>
+      <w:rPr>
+        <w:u w:val="none"/>
+      </w:rPr>
+    </w:lvl>
+    <w:lvl w:ilvl="6">
+      <w:start w:val="1"/>
+      <w:numFmt w:val="bullet"/>
+      <w:lvlText w:val="●"/>
+      <w:lvlJc w:val="left"/>
+      <w:pPr>
+        <w:ind w:left="5040" w:hanging="360"/>
+      </w:pPr>
+      <w:rPr>
+        <w:u w:val="none"/>
+      </w:rPr>
+    </w:lvl>
+    <w:lvl w:ilvl="7">
+      <w:start w:val="1"/>
+      <w:numFmt w:val="bullet"/>
+      <w:lvlText w:val="○"/>
+      <w:lvlJc w:val="left"/>
+      <w:pPr>
+        <w:ind w:left="5760" w:hanging="360"/>
+      </w:pPr>
+      <w:rPr>
+        <w:u w:val="none"/>
+      </w:rPr>
+    </w:lvl>
+    <w:lvl w:ilvl="8">
+      <w:start w:val="1"/>
+      <w:numFmt w:val="bullet"/>
+      <w:lvlText w:val="■"/>
+      <w:lvlJc w:val="left"/>
+      <w:pPr>
+        <w:ind w:left="6480" w:hanging="360"/>
+      </w:pPr>
+      <w:rPr>
+        <w:u w:val="none"/>
+      </w:rPr>
+    </w:lvl>
+  </w:abstractNum>
+  <w:abstractNum w:abstractNumId="7">
+    <w:lvl w:ilvl="0">
+      <w:start w:val="1"/>
+      <w:numFmt w:val="bullet"/>
+      <w:lvlText w:val="●"/>
+      <w:lvlJc w:val="left"/>
+      <w:pPr>
+        <w:ind w:left="720" w:hanging="360"/>
+      </w:pPr>
+      <w:rPr>
+        <w:u w:val="none"/>
+      </w:rPr>
+    </w:lvl>
+    <w:lvl w:ilvl="1">
+      <w:start w:val="1"/>
+      <w:numFmt w:val="bullet"/>
+      <w:lvlText w:val="○"/>
+      <w:lvlJc w:val="left"/>
+      <w:pPr>
+        <w:ind w:left="1440" w:hanging="360"/>
+      </w:pPr>
+      <w:rPr>
+        <w:u w:val="none"/>
+      </w:rPr>
+    </w:lvl>
+    <w:lvl w:ilvl="2">
+      <w:start w:val="1"/>
+      <w:numFmt w:val="bullet"/>
+      <w:lvlText w:val="■"/>
+      <w:lvlJc w:val="left"/>
+      <w:pPr>
+        <w:ind w:left="2160" w:hanging="360"/>
+      </w:pPr>
+      <w:rPr>
+        <w:u w:val="none"/>
+      </w:rPr>
+    </w:lvl>
+    <w:lvl w:ilvl="3">
+      <w:start w:val="1"/>
+      <w:numFmt w:val="bullet"/>
+      <w:lvlText w:val="●"/>
+      <w:lvlJc w:val="left"/>
+      <w:pPr>
+        <w:ind w:left="2880" w:hanging="360"/>
+      </w:pPr>
+      <w:rPr>
+        <w:u w:val="none"/>
+      </w:rPr>
+    </w:lvl>
+    <w:lvl w:ilvl="4">
+      <w:start w:val="1"/>
+      <w:numFmt w:val="bullet"/>
+      <w:lvlText w:val="○"/>
+      <w:lvlJc w:val="left"/>
+      <w:pPr>
+        <w:ind w:left="3600" w:hanging="360"/>
+      </w:pPr>
+      <w:rPr>
+        <w:u w:val="none"/>
+      </w:rPr>
+    </w:lvl>
+    <w:lvl w:ilvl="5">
+      <w:start w:val="1"/>
+      <w:numFmt w:val="bullet"/>
+      <w:lvlText w:val="■"/>
+      <w:lvlJc w:val="left"/>
+      <w:pPr>
+        <w:ind w:left="4320" w:hanging="360"/>
+      </w:pPr>
+      <w:rPr>
+        <w:u w:val="none"/>
+      </w:rPr>
+    </w:lvl>
+    <w:lvl w:ilvl="6">
+      <w:start w:val="1"/>
+      <w:numFmt w:val="bullet"/>
+      <w:lvlText w:val="●"/>
+      <w:lvlJc w:val="left"/>
+      <w:pPr>
+        <w:ind w:left="5040" w:hanging="360"/>
+      </w:pPr>
+      <w:rPr>
+        <w:u w:val="none"/>
+      </w:rPr>
+    </w:lvl>
+    <w:lvl w:ilvl="7">
+      <w:start w:val="1"/>
+      <w:numFmt w:val="bullet"/>
+      <w:lvlText w:val="○"/>
+      <w:lvlJc w:val="left"/>
+      <w:pPr>
+        <w:ind w:left="5760" w:hanging="360"/>
+      </w:pPr>
+      <w:rPr>
+        <w:u w:val="none"/>
+      </w:rPr>
+    </w:lvl>
+    <w:lvl w:ilvl="8">
+      <w:start w:val="1"/>
+      <w:numFmt w:val="bullet"/>
+      <w:lvlText w:val="■"/>
+      <w:lvlJc w:val="left"/>
+      <w:pPr>
+        <w:ind w:left="6480" w:hanging="360"/>
+      </w:pPr>
+      <w:rPr>
+        <w:u w:val="none"/>
+      </w:rPr>
+    </w:lvl>
+  </w:abstractNum>
+  <w:abstractNum w:abstractNumId="8">
+    <w:lvl w:ilvl="0">
+      <w:start w:val="1"/>
+      <w:numFmt w:val="bullet"/>
+      <w:lvlText w:val="●"/>
+      <w:lvlJc w:val="left"/>
+      <w:pPr>
+        <w:ind w:left="720" w:hanging="360"/>
+      </w:pPr>
+      <w:rPr>
+        <w:u w:val="none"/>
+      </w:rPr>
+    </w:lvl>
+    <w:lvl w:ilvl="1">
+      <w:start w:val="1"/>
+      <w:numFmt w:val="bullet"/>
+      <w:lvlText w:val="○"/>
+      <w:lvlJc w:val="left"/>
+      <w:pPr>
+        <w:ind w:left="1440" w:hanging="360"/>
+      </w:pPr>
+      <w:rPr>
+        <w:u w:val="none"/>
+      </w:rPr>
+    </w:lvl>
+    <w:lvl w:ilvl="2">
+      <w:start w:val="1"/>
+      <w:numFmt w:val="bullet"/>
+      <w:lvlText w:val="■"/>
+      <w:lvlJc w:val="left"/>
+      <w:pPr>
+        <w:ind w:left="2160" w:hanging="360"/>
+      </w:pPr>
+      <w:rPr>
+        <w:u w:val="none"/>
+      </w:rPr>
+    </w:lvl>
+    <w:lvl w:ilvl="3">
+      <w:start w:val="1"/>
+      <w:numFmt w:val="bullet"/>
+      <w:lvlText w:val="●"/>
+      <w:lvlJc w:val="left"/>
+      <w:pPr>
+        <w:ind w:left="2880" w:hanging="360"/>
+      </w:pPr>
+      <w:rPr>
+        <w:u w:val="none"/>
+      </w:rPr>
+    </w:lvl>
+    <w:lvl w:ilvl="4">
+      <w:start w:val="1"/>
+      <w:numFmt w:val="bullet"/>
+      <w:lvlText w:val="○"/>
+      <w:lvlJc w:val="left"/>
+      <w:pPr>
+        <w:ind w:left="3600" w:hanging="360"/>
+      </w:pPr>
+      <w:rPr>
+        <w:u w:val="none"/>
+      </w:rPr>
+    </w:lvl>
+    <w:lvl w:ilvl="5">
+      <w:start w:val="1"/>
+      <w:numFmt w:val="bullet"/>
+      <w:lvlText w:val="■"/>
+      <w:lvlJc w:val="left"/>
+      <w:pPr>
+        <w:ind w:left="4320" w:hanging="360"/>
+      </w:pPr>
+      <w:rPr>
+        <w:u w:val="none"/>
+      </w:rPr>
+    </w:lvl>
+    <w:lvl w:ilvl="6">
+      <w:start w:val="1"/>
+      <w:numFmt w:val="bullet"/>
+      <w:lvlText w:val="●"/>
+      <w:lvlJc w:val="left"/>
+      <w:pPr>
+        <w:ind w:left="5040" w:hanging="360"/>
+      </w:pPr>
+      <w:rPr>
+        <w:u w:val="none"/>
+      </w:rPr>
+    </w:lvl>
+    <w:lvl w:ilvl="7">
+      <w:start w:val="1"/>
+      <w:numFmt w:val="bullet"/>
+      <w:lvlText w:val="○"/>
+      <w:lvlJc w:val="left"/>
+      <w:pPr>
+        <w:ind w:left="5760" w:hanging="360"/>
+      </w:pPr>
+      <w:rPr>
+        <w:u w:val="none"/>
+      </w:rPr>
+    </w:lvl>
+    <w:lvl w:ilvl="8">
+      <w:start w:val="1"/>
+      <w:numFmt w:val="bullet"/>
+      <w:lvlText w:val="■"/>
+      <w:lvlJc w:val="left"/>
+      <w:pPr>
+        <w:ind w:left="6480" w:hanging="360"/>
+      </w:pPr>
+      <w:rPr>
+        <w:u w:val="none"/>
+      </w:rPr>
+    </w:lvl>
+  </w:abstractNum>
+  <w:abstractNum w:abstractNumId="9">
     <w:lvl w:ilvl="0">
       <w:start w:val="1"/>
       <w:numFmt w:val="bullet"/>
@@ -6194,6 +7938,15 @@
   </w:num>
   <w:num w:numId="6">
     <w:abstractNumId w:val="6"/>
+  </w:num>
+  <w:num w:numId="7">
+    <w:abstractNumId w:val="7"/>
+  </w:num>
+  <w:num w:numId="8">
+    <w:abstractNumId w:val="8"/>
+  </w:num>
+  <w:num w:numId="9">
+    <w:abstractNumId w:val="9"/>
   </w:num>
 </w:numbering>
 </file>

</xml_diff>

<commit_message>
colocando tabela do dhaniel faltando preencher a da sarah
</commit_message>
<xml_diff>
--- a/sleep_street.docx
+++ b/sleep_street.docx
@@ -4030,7 +4030,7 @@
               <w:widowControl w:val="0"/>
               <w:numPr>
                 <w:ilvl w:val="0"/>
-                <w:numId w:val="5"/>
+                <w:numId w:val="10"/>
               </w:numPr>
               <w:spacing w:line="240" w:lineRule="auto"/>
               <w:ind w:left="720" w:hanging="360"/>
@@ -4054,7 +4054,7 @@
               <w:widowControl w:val="0"/>
               <w:numPr>
                 <w:ilvl w:val="0"/>
-                <w:numId w:val="5"/>
+                <w:numId w:val="10"/>
               </w:numPr>
               <w:spacing w:line="240" w:lineRule="auto"/>
               <w:ind w:left="720" w:hanging="360"/>
@@ -4145,7 +4145,7 @@
               <w:widowControl w:val="0"/>
               <w:numPr>
                 <w:ilvl w:val="0"/>
-                <w:numId w:val="3"/>
+                <w:numId w:val="4"/>
               </w:numPr>
               <w:spacing w:line="240" w:lineRule="auto"/>
               <w:ind w:left="720" w:hanging="360"/>
@@ -4169,7 +4169,7 @@
               <w:widowControl w:val="0"/>
               <w:numPr>
                 <w:ilvl w:val="0"/>
-                <w:numId w:val="3"/>
+                <w:numId w:val="4"/>
               </w:numPr>
               <w:spacing w:line="240" w:lineRule="auto"/>
               <w:ind w:left="720" w:hanging="360"/>
@@ -4193,7 +4193,7 @@
               <w:widowControl w:val="0"/>
               <w:numPr>
                 <w:ilvl w:val="0"/>
-                <w:numId w:val="3"/>
+                <w:numId w:val="4"/>
               </w:numPr>
               <w:spacing w:line="240" w:lineRule="auto"/>
               <w:ind w:left="720" w:hanging="360"/>
@@ -4217,7 +4217,7 @@
               <w:widowControl w:val="0"/>
               <w:numPr>
                 <w:ilvl w:val="0"/>
-                <w:numId w:val="3"/>
+                <w:numId w:val="4"/>
               </w:numPr>
               <w:spacing w:line="240" w:lineRule="auto"/>
               <w:ind w:left="720" w:hanging="360"/>
@@ -4308,7 +4308,7 @@
               <w:widowControl w:val="0"/>
               <w:numPr>
                 <w:ilvl w:val="0"/>
-                <w:numId w:val="2"/>
+                <w:numId w:val="3"/>
               </w:numPr>
               <w:spacing w:line="240" w:lineRule="auto"/>
               <w:ind w:left="720" w:hanging="360"/>
@@ -4332,7 +4332,7 @@
               <w:widowControl w:val="0"/>
               <w:numPr>
                 <w:ilvl w:val="0"/>
-                <w:numId w:val="2"/>
+                <w:numId w:val="3"/>
               </w:numPr>
               <w:spacing w:line="240" w:lineRule="auto"/>
               <w:ind w:left="720" w:hanging="360"/>
@@ -4356,7 +4356,7 @@
               <w:widowControl w:val="0"/>
               <w:numPr>
                 <w:ilvl w:val="0"/>
-                <w:numId w:val="2"/>
+                <w:numId w:val="3"/>
               </w:numPr>
               <w:spacing w:line="240" w:lineRule="auto"/>
               <w:ind w:left="720" w:hanging="360"/>
@@ -4380,7 +4380,7 @@
               <w:widowControl w:val="0"/>
               <w:numPr>
                 <w:ilvl w:val="0"/>
-                <w:numId w:val="2"/>
+                <w:numId w:val="3"/>
               </w:numPr>
               <w:spacing w:line="240" w:lineRule="auto"/>
               <w:ind w:left="720" w:hanging="360"/>
@@ -4404,7 +4404,7 @@
               <w:widowControl w:val="0"/>
               <w:numPr>
                 <w:ilvl w:val="0"/>
-                <w:numId w:val="2"/>
+                <w:numId w:val="3"/>
               </w:numPr>
               <w:spacing w:line="240" w:lineRule="auto"/>
               <w:ind w:left="720" w:hanging="360"/>
@@ -4428,7 +4428,7 @@
               <w:widowControl w:val="0"/>
               <w:numPr>
                 <w:ilvl w:val="0"/>
-                <w:numId w:val="2"/>
+                <w:numId w:val="3"/>
               </w:numPr>
               <w:spacing w:line="240" w:lineRule="auto"/>
               <w:ind w:left="720" w:hanging="360"/>
@@ -4520,7 +4520,7 @@
               <w:widowControl w:val="0"/>
               <w:numPr>
                 <w:ilvl w:val="0"/>
-                <w:numId w:val="8"/>
+                <w:numId w:val="15"/>
               </w:numPr>
               <w:spacing w:line="240" w:lineRule="auto"/>
               <w:ind w:left="720" w:hanging="360"/>
@@ -4553,158 +4553,6 @@
               <w:rPr>
                 <w:rtl w:val="0"/>
               </w:rPr>
-            </w:r>
-          </w:p>
-          <w:p>
-            <w:pPr>
-              <w:widowControl w:val="0"/>
-              <w:spacing w:line="240" w:lineRule="auto"/>
-              <w:ind w:left="720" w:firstLine="0"/>
-              <w:rPr>
-                <w:sz w:val="24"/>
-                <w:szCs w:val="24"/>
-              </w:rPr>
-            </w:pPr>
-            <w:r>
-              <w:rPr>
-                <w:sz w:val="24"/>
-                <w:szCs w:val="24"/>
-                <w:rtl w:val="0"/>
-              </w:rPr>
-              <w:t xml:space="preserve">CREATE TABLE   avaliacao_estabelecimento( </w:t>
-            </w:r>
-          </w:p>
-          <w:p>
-            <w:pPr>
-              <w:widowControl w:val="0"/>
-              <w:spacing w:line="240" w:lineRule="auto"/>
-              <w:ind w:left="720" w:firstLine="0"/>
-              <w:rPr>
-                <w:sz w:val="24"/>
-                <w:szCs w:val="24"/>
-              </w:rPr>
-            </w:pPr>
-            <w:r>
-              <w:rPr>
-                <w:sz w:val="24"/>
-                <w:szCs w:val="24"/>
-                <w:rtl w:val="0"/>
-              </w:rPr>
-              <w:t xml:space="preserve">id_avaliacao  SERIAL PRIMARY KEY  ,</w:t>
-            </w:r>
-          </w:p>
-          <w:p>
-            <w:pPr>
-              <w:widowControl w:val="0"/>
-              <w:spacing w:line="240" w:lineRule="auto"/>
-              <w:ind w:left="720" w:firstLine="0"/>
-              <w:rPr>
-                <w:sz w:val="24"/>
-                <w:szCs w:val="24"/>
-              </w:rPr>
-            </w:pPr>
-            <w:r>
-              <w:rPr>
-                <w:sz w:val="24"/>
-                <w:szCs w:val="24"/>
-                <w:rtl w:val="0"/>
-              </w:rPr>
-              <w:t xml:space="preserve">id_usuarío INT NOT NULL,</w:t>
-            </w:r>
-          </w:p>
-          <w:p>
-            <w:pPr>
-              <w:widowControl w:val="0"/>
-              <w:spacing w:line="240" w:lineRule="auto"/>
-              <w:ind w:left="720" w:firstLine="0"/>
-              <w:rPr>
-                <w:sz w:val="24"/>
-                <w:szCs w:val="24"/>
-              </w:rPr>
-            </w:pPr>
-            <w:r>
-              <w:rPr>
-                <w:sz w:val="24"/>
-                <w:szCs w:val="24"/>
-                <w:rtl w:val="0"/>
-              </w:rPr>
-              <w:t xml:space="preserve">id_viagem        int not null,</w:t>
-            </w:r>
-          </w:p>
-          <w:p>
-            <w:pPr>
-              <w:widowControl w:val="0"/>
-              <w:spacing w:line="240" w:lineRule="auto"/>
-              <w:ind w:left="720" w:firstLine="0"/>
-              <w:rPr>
-                <w:sz w:val="24"/>
-                <w:szCs w:val="24"/>
-              </w:rPr>
-            </w:pPr>
-            <w:r>
-              <w:rPr>
-                <w:sz w:val="24"/>
-                <w:szCs w:val="24"/>
-                <w:rtl w:val="0"/>
-              </w:rPr>
-              <w:t xml:space="preserve">nome                int not null,</w:t>
-            </w:r>
-          </w:p>
-          <w:p>
-            <w:pPr>
-              <w:widowControl w:val="0"/>
-              <w:spacing w:line="240" w:lineRule="auto"/>
-              <w:ind w:left="720" w:firstLine="0"/>
-              <w:rPr>
-                <w:sz w:val="24"/>
-                <w:szCs w:val="24"/>
-              </w:rPr>
-            </w:pPr>
-            <w:r>
-              <w:rPr>
-                <w:sz w:val="24"/>
-                <w:szCs w:val="24"/>
-                <w:rtl w:val="0"/>
-              </w:rPr>
-              <w:t xml:space="preserve">comentario           text,</w:t>
-            </w:r>
-          </w:p>
-          <w:p>
-            <w:pPr>
-              <w:widowControl w:val="0"/>
-              <w:spacing w:line="240" w:lineRule="auto"/>
-              <w:ind w:left="720" w:firstLine="0"/>
-              <w:rPr>
-                <w:sz w:val="24"/>
-                <w:szCs w:val="24"/>
-              </w:rPr>
-            </w:pPr>
-            <w:r>
-              <w:rPr>
-                <w:sz w:val="24"/>
-                <w:szCs w:val="24"/>
-                <w:rtl w:val="0"/>
-              </w:rPr>
-              <w:t xml:space="preserve">data_avaliacao timestamp</w:t>
-            </w:r>
-          </w:p>
-          <w:p>
-            <w:pPr>
-              <w:widowControl w:val="0"/>
-              <w:spacing w:line="240" w:lineRule="auto"/>
-              <w:ind w:left="720" w:firstLine="0"/>
-              <w:rPr>
-                <w:sz w:val="24"/>
-                <w:szCs w:val="24"/>
-              </w:rPr>
-            </w:pPr>
-            <w:r>
-              <w:rPr>
-                <w:sz w:val="24"/>
-                <w:szCs w:val="24"/>
-                <w:rtl w:val="0"/>
-              </w:rPr>
-              <w:t xml:space="preserve">);</w:t>
             </w:r>
           </w:p>
           <w:p>
@@ -4712,7 +4560,7 @@
               <w:widowControl w:val="0"/>
               <w:numPr>
                 <w:ilvl w:val="0"/>
-                <w:numId w:val="8"/>
+                <w:numId w:val="5"/>
               </w:numPr>
               <w:spacing w:line="240" w:lineRule="auto"/>
               <w:ind w:left="720" w:hanging="360"/>
@@ -4728,7 +4576,7 @@
                 <w:szCs w:val="24"/>
                 <w:rtl w:val="0"/>
               </w:rPr>
-              <w:t xml:space="preserve"> FA02 - Usuário clica em "Cancelar": exibe confirmação.</w:t>
+              <w:t xml:space="preserve">  FA02 - Usuário clica em "Cancelar": exibe confirmação.</w:t>
             </w:r>
           </w:p>
           <w:p>
@@ -4751,7 +4599,7 @@
               <w:widowControl w:val="0"/>
               <w:numPr>
                 <w:ilvl w:val="0"/>
-                <w:numId w:val="8"/>
+                <w:numId w:val="15"/>
               </w:numPr>
               <w:spacing w:line="240" w:lineRule="auto"/>
               <w:ind w:left="720" w:hanging="360"/>
@@ -4858,7 +4706,7 @@
               <w:widowControl w:val="0"/>
               <w:numPr>
                 <w:ilvl w:val="0"/>
-                <w:numId w:val="4"/>
+                <w:numId w:val="9"/>
               </w:numPr>
               <w:spacing w:line="240" w:lineRule="auto"/>
               <w:ind w:left="720" w:hanging="360"/>
@@ -4898,7 +4746,7 @@
               <w:widowControl w:val="0"/>
               <w:numPr>
                 <w:ilvl w:val="0"/>
-                <w:numId w:val="4"/>
+                <w:numId w:val="9"/>
               </w:numPr>
               <w:spacing w:line="240" w:lineRule="auto"/>
               <w:ind w:left="720" w:hanging="360"/>
@@ -4938,7 +4786,7 @@
               <w:widowControl w:val="0"/>
               <w:numPr>
                 <w:ilvl w:val="0"/>
-                <w:numId w:val="4"/>
+                <w:numId w:val="9"/>
               </w:numPr>
               <w:spacing w:line="240" w:lineRule="auto"/>
               <w:ind w:left="720" w:hanging="360"/>
@@ -4978,7 +4826,7 @@
               <w:widowControl w:val="0"/>
               <w:numPr>
                 <w:ilvl w:val="0"/>
-                <w:numId w:val="4"/>
+                <w:numId w:val="9"/>
               </w:numPr>
               <w:spacing w:line="240" w:lineRule="auto"/>
               <w:ind w:left="720" w:hanging="360"/>
@@ -5070,7 +4918,7 @@
               <w:widowControl w:val="0"/>
               <w:numPr>
                 <w:ilvl w:val="0"/>
-                <w:numId w:val="1"/>
+                <w:numId w:val="2"/>
               </w:numPr>
               <w:spacing w:line="240" w:lineRule="auto"/>
               <w:ind w:left="720" w:hanging="360"/>
@@ -5098,7 +4946,7 @@
               <w:widowControl w:val="0"/>
               <w:numPr>
                 <w:ilvl w:val="0"/>
-                <w:numId w:val="1"/>
+                <w:numId w:val="2"/>
               </w:numPr>
               <w:spacing w:line="240" w:lineRule="auto"/>
               <w:ind w:left="720" w:hanging="360"/>
@@ -5121,7 +4969,7 @@
               <w:widowControl w:val="0"/>
               <w:numPr>
                 <w:ilvl w:val="0"/>
-                <w:numId w:val="1"/>
+                <w:numId w:val="2"/>
               </w:numPr>
               <w:spacing w:line="240" w:lineRule="auto"/>
               <w:ind w:left="720" w:hanging="360"/>
@@ -5149,7 +4997,7 @@
               <w:widowControl w:val="0"/>
               <w:numPr>
                 <w:ilvl w:val="0"/>
-                <w:numId w:val="1"/>
+                <w:numId w:val="2"/>
               </w:numPr>
               <w:spacing w:line="240" w:lineRule="auto"/>
               <w:ind w:left="720" w:hanging="360"/>
@@ -5177,7 +5025,7 @@
               <w:widowControl w:val="0"/>
               <w:numPr>
                 <w:ilvl w:val="0"/>
-                <w:numId w:val="1"/>
+                <w:numId w:val="2"/>
               </w:numPr>
               <w:spacing w:line="240" w:lineRule="auto"/>
               <w:ind w:left="720" w:hanging="360"/>
@@ -5205,7 +5053,7 @@
               <w:widowControl w:val="0"/>
               <w:numPr>
                 <w:ilvl w:val="0"/>
-                <w:numId w:val="1"/>
+                <w:numId w:val="2"/>
               </w:numPr>
               <w:spacing w:line="240" w:lineRule="auto"/>
               <w:ind w:left="720" w:hanging="360"/>
@@ -5233,7 +5081,7 @@
               <w:widowControl w:val="0"/>
               <w:numPr>
                 <w:ilvl w:val="0"/>
-                <w:numId w:val="1"/>
+                <w:numId w:val="2"/>
               </w:numPr>
               <w:spacing w:line="240" w:lineRule="auto"/>
               <w:ind w:left="720" w:hanging="360"/>
@@ -5261,7 +5109,7 @@
               <w:widowControl w:val="0"/>
               <w:numPr>
                 <w:ilvl w:val="0"/>
-                <w:numId w:val="1"/>
+                <w:numId w:val="2"/>
               </w:numPr>
               <w:spacing w:line="240" w:lineRule="auto"/>
               <w:ind w:left="720" w:hanging="360"/>
@@ -5321,7 +5169,7 @@
       <w:tblPr>
         <w:tblStyle w:val="Table4"/>
         <w:tblpPr w:leftFromText="180" w:rightFromText="180" w:topFromText="180" w:bottomFromText="180" w:vertAnchor="text" w:horzAnchor="text" w:tblpX="0" w:tblpY="0"/>
-        <w:tblW w:w="10460.0" w:type="dxa"/>
+        <w:tblW w:w="10455.0" w:type="dxa"/>
         <w:jc w:val="left"/>
         <w:tblBorders>
           <w:top w:color="000000" w:space="0" w:sz="8" w:val="single"/>
@@ -5335,12 +5183,12 @@
         <w:tblLook w:val="0600"/>
       </w:tblPr>
       <w:tblGrid>
-        <w:gridCol w:w="1320"/>
-        <w:gridCol w:w="9140"/>
+        <w:gridCol w:w="2985"/>
+        <w:gridCol w:w="7470"/>
         <w:tblGridChange w:id="0">
           <w:tblGrid>
-            <w:gridCol w:w="1320"/>
-            <w:gridCol w:w="9140"/>
+            <w:gridCol w:w="2985"/>
+            <w:gridCol w:w="7470"/>
           </w:tblGrid>
         </w:tblGridChange>
       </w:tblGrid>
@@ -5399,7 +5247,7 @@
                 <w:szCs w:val="24"/>
                 <w:rtl w:val="0"/>
               </w:rPr>
-              <w:t xml:space="preserve">gabriel henrique</w:t>
+              <w:t xml:space="preserve">gabriel henrique N:20</w:t>
             </w:r>
           </w:p>
         </w:tc>
@@ -5720,7 +5568,14 @@
           <w:tcPr/>
           <w:p>
             <w:pPr>
-              <w:rPr/>
+              <w:numPr>
+                <w:ilvl w:val="0"/>
+                <w:numId w:val="13"/>
+              </w:numPr>
+              <w:ind w:left="720" w:hanging="360"/>
+              <w:rPr>
+                <w:u w:val="none"/>
+              </w:rPr>
             </w:pPr>
             <w:r>
               <w:rPr>
@@ -5731,7 +5586,14 @@
           </w:p>
           <w:p>
             <w:pPr>
-              <w:rPr/>
+              <w:numPr>
+                <w:ilvl w:val="0"/>
+                <w:numId w:val="13"/>
+              </w:numPr>
+              <w:ind w:left="720" w:hanging="360"/>
+              <w:rPr>
+                <w:u w:val="none"/>
+              </w:rPr>
             </w:pPr>
             <w:r>
               <w:rPr>
@@ -5742,7 +5604,14 @@
           </w:p>
           <w:p>
             <w:pPr>
-              <w:rPr/>
+              <w:numPr>
+                <w:ilvl w:val="0"/>
+                <w:numId w:val="13"/>
+              </w:numPr>
+              <w:ind w:left="720" w:hanging="360"/>
+              <w:rPr>
+                <w:u w:val="none"/>
+              </w:rPr>
             </w:pPr>
             <w:r>
               <w:rPr>
@@ -5753,7 +5622,14 @@
           </w:p>
           <w:p>
             <w:pPr>
-              <w:rPr/>
+              <w:numPr>
+                <w:ilvl w:val="0"/>
+                <w:numId w:val="13"/>
+              </w:numPr>
+              <w:ind w:left="720" w:hanging="360"/>
+              <w:rPr>
+                <w:u w:val="none"/>
+              </w:rPr>
             </w:pPr>
             <w:r>
               <w:rPr>
@@ -5764,7 +5640,14 @@
           </w:p>
           <w:p>
             <w:pPr>
-              <w:rPr/>
+              <w:numPr>
+                <w:ilvl w:val="0"/>
+                <w:numId w:val="13"/>
+              </w:numPr>
+              <w:ind w:left="720" w:hanging="360"/>
+              <w:rPr>
+                <w:u w:val="none"/>
+              </w:rPr>
             </w:pPr>
             <w:r>
               <w:rPr>
@@ -5775,7 +5658,14 @@
           </w:p>
           <w:p>
             <w:pPr>
-              <w:rPr/>
+              <w:numPr>
+                <w:ilvl w:val="0"/>
+                <w:numId w:val="13"/>
+              </w:numPr>
+              <w:ind w:left="720" w:hanging="360"/>
+              <w:rPr>
+                <w:u w:val="none"/>
+              </w:rPr>
             </w:pPr>
             <w:r>
               <w:rPr>
@@ -5786,7 +5676,14 @@
           </w:p>
           <w:p>
             <w:pPr>
-              <w:rPr/>
+              <w:numPr>
+                <w:ilvl w:val="0"/>
+                <w:numId w:val="13"/>
+              </w:numPr>
+              <w:ind w:left="720" w:hanging="360"/>
+              <w:rPr>
+                <w:u w:val="none"/>
+              </w:rPr>
             </w:pPr>
             <w:r>
               <w:rPr>
@@ -5797,7 +5694,14 @@
           </w:p>
           <w:p>
             <w:pPr>
-              <w:rPr/>
+              <w:numPr>
+                <w:ilvl w:val="0"/>
+                <w:numId w:val="13"/>
+              </w:numPr>
+              <w:ind w:left="720" w:hanging="360"/>
+              <w:rPr>
+                <w:u w:val="none"/>
+              </w:rPr>
             </w:pPr>
             <w:r>
               <w:rPr>
@@ -5808,7 +5712,14 @@
           </w:p>
           <w:p>
             <w:pPr>
-              <w:rPr/>
+              <w:numPr>
+                <w:ilvl w:val="0"/>
+                <w:numId w:val="13"/>
+              </w:numPr>
+              <w:ind w:left="720" w:hanging="360"/>
+              <w:rPr>
+                <w:u w:val="none"/>
+              </w:rPr>
             </w:pPr>
             <w:r>
               <w:rPr>
@@ -5819,7 +5730,14 @@
           </w:p>
           <w:p>
             <w:pPr>
-              <w:rPr/>
+              <w:numPr>
+                <w:ilvl w:val="0"/>
+                <w:numId w:val="13"/>
+              </w:numPr>
+              <w:ind w:left="720" w:hanging="360"/>
+              <w:rPr>
+                <w:u w:val="none"/>
+              </w:rPr>
             </w:pPr>
             <w:r>
               <w:rPr>
@@ -5926,7 +5844,7 @@
               <w:widowControl w:val="0"/>
               <w:numPr>
                 <w:ilvl w:val="0"/>
-                <w:numId w:val="6"/>
+                <w:numId w:val="11"/>
               </w:numPr>
               <w:spacing w:line="240" w:lineRule="auto"/>
               <w:ind w:left="720" w:hanging="360"/>
@@ -5975,7 +5893,7 @@
               <w:widowControl w:val="0"/>
               <w:numPr>
                 <w:ilvl w:val="0"/>
-                <w:numId w:val="6"/>
+                <w:numId w:val="11"/>
               </w:numPr>
               <w:spacing w:line="240" w:lineRule="auto"/>
               <w:ind w:left="720" w:hanging="360"/>
@@ -6096,7 +6014,7 @@
               <w:widowControl w:val="0"/>
               <w:numPr>
                 <w:ilvl w:val="0"/>
-                <w:numId w:val="7"/>
+                <w:numId w:val="12"/>
               </w:numPr>
               <w:spacing w:line="240" w:lineRule="auto"/>
               <w:ind w:left="720" w:hanging="360"/>
@@ -6145,7 +6063,7 @@
               <w:widowControl w:val="0"/>
               <w:numPr>
                 <w:ilvl w:val="0"/>
-                <w:numId w:val="7"/>
+                <w:numId w:val="12"/>
               </w:numPr>
               <w:spacing w:line="240" w:lineRule="auto"/>
               <w:ind w:left="720" w:hanging="360"/>
@@ -6214,7 +6132,7 @@
               <w:widowControl w:val="0"/>
               <w:numPr>
                 <w:ilvl w:val="0"/>
-                <w:numId w:val="9"/>
+                <w:numId w:val="16"/>
               </w:numPr>
               <w:spacing w:line="240" w:lineRule="auto"/>
               <w:ind w:left="720" w:hanging="360"/>
@@ -6274,7 +6192,7 @@
               <w:widowControl w:val="0"/>
               <w:numPr>
                 <w:ilvl w:val="0"/>
-                <w:numId w:val="9"/>
+                <w:numId w:val="16"/>
               </w:numPr>
               <w:spacing w:line="240" w:lineRule="auto"/>
               <w:ind w:left="720" w:hanging="360"/>
@@ -6403,6 +6321,9 @@
         <w:rPr>
           <w:rtl w:val="0"/>
         </w:rPr>
+        <w:tab/>
+        <w:t xml:space="preserve"> </w:t>
+        <w:tab/>
       </w:r>
     </w:p>
     <w:p>
@@ -6413,20 +6334,27 @@
         <w:rPr>
           <w:rtl w:val="0"/>
         </w:rPr>
-      </w:r>
-    </w:p>
-    <w:p>
-      <w:pPr>
+        <w:tab/>
+        <w:t xml:space="preserve"> </w:t>
+        <w:tab/>
+      </w:r>
+    </w:p>
+    <w:p>
+      <w:pPr>
+        <w:spacing w:before="240" w:lineRule="auto"/>
         <w:rPr/>
       </w:pPr>
       <w:r>
         <w:rPr>
           <w:rtl w:val="0"/>
         </w:rPr>
-      </w:r>
-    </w:p>
-    <w:p>
-      <w:pPr>
+        <w:br w:type="textWrapping"/>
+      </w:r>
+    </w:p>
+    <w:p>
+      <w:pPr>
+        <w:spacing w:before="240" w:line="360" w:lineRule="auto"/>
+        <w:jc w:val="both"/>
         <w:rPr/>
       </w:pPr>
       <w:r>
@@ -6437,6 +6365,8 @@
     </w:p>
     <w:p>
       <w:pPr>
+        <w:spacing w:before="240" w:line="360" w:lineRule="auto"/>
+        <w:jc w:val="both"/>
         <w:rPr/>
       </w:pPr>
       <w:r>
@@ -6447,6 +6377,8 @@
     </w:p>
     <w:p>
       <w:pPr>
+        <w:spacing w:before="240" w:line="360" w:lineRule="auto"/>
+        <w:jc w:val="both"/>
         <w:rPr/>
       </w:pPr>
       <w:r>
@@ -6457,6 +6389,8 @@
     </w:p>
     <w:p>
       <w:pPr>
+        <w:spacing w:before="240" w:line="360" w:lineRule="auto"/>
+        <w:jc w:val="both"/>
         <w:rPr/>
       </w:pPr>
       <w:r>
@@ -6467,16 +6401,21 @@
     </w:p>
     <w:p>
       <w:pPr>
+        <w:spacing w:before="240" w:line="360" w:lineRule="auto"/>
+        <w:jc w:val="both"/>
         <w:rPr/>
       </w:pPr>
       <w:r>
         <w:rPr>
           <w:rtl w:val="0"/>
         </w:rPr>
-      </w:r>
-    </w:p>
-    <w:p>
-      <w:pPr>
+        <w:br w:type="textWrapping"/>
+      </w:r>
+    </w:p>
+    <w:p>
+      <w:pPr>
+        <w:spacing w:before="240" w:line="360" w:lineRule="auto"/>
+        <w:jc w:val="both"/>
         <w:rPr/>
       </w:pPr>
       <w:r>
@@ -6487,6 +6426,8 @@
     </w:p>
     <w:p>
       <w:pPr>
+        <w:spacing w:before="240" w:line="360" w:lineRule="auto"/>
+        <w:jc w:val="both"/>
         <w:rPr/>
       </w:pPr>
       <w:r>
@@ -6497,12 +6438,946 @@
     </w:p>
     <w:p>
       <w:pPr>
+        <w:spacing w:line="360" w:lineRule="auto"/>
+        <w:jc w:val="both"/>
+        <w:rPr>
+          <w:sz w:val="24"/>
+          <w:szCs w:val="24"/>
+        </w:rPr>
+      </w:pPr>
+      <w:r>
+        <w:rPr>
+          <w:rtl w:val="0"/>
+        </w:rPr>
+      </w:r>
+    </w:p>
+    <w:tbl>
+      <w:tblPr>
+        <w:tblStyle w:val="Table5"/>
+        <w:tblW w:w="14010.0" w:type="dxa"/>
+        <w:jc w:val="left"/>
+        <w:tblBorders>
+          <w:top w:color="000000" w:space="0" w:sz="8" w:val="single"/>
+          <w:left w:color="000000" w:space="0" w:sz="8" w:val="single"/>
+          <w:bottom w:color="000000" w:space="0" w:sz="8" w:val="single"/>
+          <w:right w:color="000000" w:space="0" w:sz="8" w:val="single"/>
+          <w:insideH w:color="000000" w:space="0" w:sz="8" w:val="single"/>
+          <w:insideV w:color="000000" w:space="0" w:sz="8" w:val="single"/>
+        </w:tblBorders>
+        <w:tblLayout w:type="fixed"/>
+        <w:tblLook w:val="0600"/>
+      </w:tblPr>
+      <w:tblGrid>
+        <w:gridCol w:w="2535"/>
+        <w:gridCol w:w="11475"/>
+        <w:tblGridChange w:id="0">
+          <w:tblGrid>
+            <w:gridCol w:w="2535"/>
+            <w:gridCol w:w="11475"/>
+          </w:tblGrid>
+        </w:tblGridChange>
+      </w:tblGrid>
+      <w:tr>
+        <w:trPr>
+          <w:cantSplit w:val="0"/>
+          <w:tblHeader w:val="0"/>
+        </w:trPr>
+        <w:tc>
+          <w:tcPr>
+            <w:shd w:fill="999999" w:val="clear"/>
+            <w:tcMar>
+              <w:top w:w="100.0" w:type="dxa"/>
+              <w:left w:w="100.0" w:type="dxa"/>
+              <w:bottom w:w="100.0" w:type="dxa"/>
+              <w:right w:w="100.0" w:type="dxa"/>
+            </w:tcMar>
+            <w:vAlign w:val="top"/>
+          </w:tcPr>
+          <w:p>
+            <w:pPr>
+              <w:widowControl w:val="0"/>
+              <w:spacing w:line="240" w:lineRule="auto"/>
+              <w:rPr>
+                <w:b w:val="1"/>
+                <w:bCs w:val="1"/>
+                <w:sz w:val="24"/>
+                <w:szCs w:val="24"/>
+              </w:rPr>
+            </w:pPr>
+            <w:r>
+              <w:rPr>
+                <w:b w:val="1"/>
+                <w:bCs w:val="1"/>
+                <w:sz w:val="24"/>
+                <w:szCs w:val="24"/>
+                <w:rtl w:val="0"/>
+              </w:rPr>
+              <w:t xml:space="preserve">CASO DE USO EXPANDIDO - 001</w:t>
+            </w:r>
+          </w:p>
+        </w:tc>
+        <w:tc>
+          <w:tcPr>
+            <w:shd w:fill="999999" w:val="clear"/>
+            <w:tcMar>
+              <w:top w:w="100.0" w:type="dxa"/>
+              <w:left w:w="100.0" w:type="dxa"/>
+              <w:bottom w:w="100.0" w:type="dxa"/>
+              <w:right w:w="100.0" w:type="dxa"/>
+            </w:tcMar>
+            <w:vAlign w:val="top"/>
+          </w:tcPr>
+          <w:p>
+            <w:pPr>
+              <w:widowControl w:val="0"/>
+              <w:spacing w:line="240" w:lineRule="auto"/>
+              <w:rPr>
+                <w:b w:val="1"/>
+                <w:bCs w:val="1"/>
+                <w:sz w:val="24"/>
+                <w:szCs w:val="24"/>
+              </w:rPr>
+            </w:pPr>
+            <w:r>
+              <w:rPr>
+                <w:b w:val="1"/>
+                <w:bCs w:val="1"/>
+                <w:sz w:val="24"/>
+                <w:szCs w:val="24"/>
+                <w:rtl w:val="0"/>
+              </w:rPr>
+              <w:t xml:space="preserve">   Dhaniel Moreira N:10</w:t>
+            </w:r>
+          </w:p>
+        </w:tc>
+      </w:tr>
+      <w:tr>
+        <w:trPr>
+          <w:cantSplit w:val="0"/>
+          <w:tblHeader w:val="0"/>
+        </w:trPr>
+        <w:tc>
+          <w:tcPr>
+            <w:shd w:fill="999999" w:val="clear"/>
+            <w:tcMar>
+              <w:top w:w="100.0" w:type="dxa"/>
+              <w:left w:w="100.0" w:type="dxa"/>
+              <w:bottom w:w="100.0" w:type="dxa"/>
+              <w:right w:w="100.0" w:type="dxa"/>
+            </w:tcMar>
+            <w:vAlign w:val="top"/>
+          </w:tcPr>
+          <w:p>
+            <w:pPr>
+              <w:widowControl w:val="0"/>
+              <w:spacing w:line="240" w:lineRule="auto"/>
+              <w:rPr>
+                <w:b w:val="1"/>
+                <w:bCs w:val="1"/>
+                <w:sz w:val="24"/>
+                <w:szCs w:val="24"/>
+              </w:rPr>
+            </w:pPr>
+            <w:r>
+              <w:rPr>
+                <w:b w:val="1"/>
+                <w:bCs w:val="1"/>
+                <w:sz w:val="24"/>
+                <w:szCs w:val="24"/>
+                <w:rtl w:val="0"/>
+              </w:rPr>
+              <w:t xml:space="preserve">Ator Principal: </w:t>
+            </w:r>
+          </w:p>
+        </w:tc>
+        <w:tc>
+          <w:tcPr>
+            <w:shd w:fill="auto" w:val="clear"/>
+            <w:tcMar>
+              <w:top w:w="100.0" w:type="dxa"/>
+              <w:left w:w="100.0" w:type="dxa"/>
+              <w:bottom w:w="100.0" w:type="dxa"/>
+              <w:right w:w="100.0" w:type="dxa"/>
+            </w:tcMar>
+            <w:vAlign w:val="top"/>
+          </w:tcPr>
+          <w:p>
+            <w:pPr>
+              <w:rPr>
+                <w:sz w:val="24"/>
+                <w:szCs w:val="24"/>
+              </w:rPr>
+            </w:pPr>
+            <w:r>
+              <w:rPr>
+                <w:rtl w:val="0"/>
+              </w:rPr>
+              <w:t xml:space="preserve">Viajante Solo (Cliente)</w:t>
+            </w:r>
+            <w:r>
+              <w:rPr>
+                <w:rtl w:val="0"/>
+              </w:rPr>
+            </w:r>
+          </w:p>
+        </w:tc>
+      </w:tr>
+      <w:tr>
+        <w:trPr>
+          <w:cantSplit w:val="0"/>
+          <w:tblHeader w:val="0"/>
+        </w:trPr>
+        <w:tc>
+          <w:tcPr>
+            <w:shd w:fill="999999" w:val="clear"/>
+            <w:tcMar>
+              <w:top w:w="100.0" w:type="dxa"/>
+              <w:left w:w="100.0" w:type="dxa"/>
+              <w:bottom w:w="100.0" w:type="dxa"/>
+              <w:right w:w="100.0" w:type="dxa"/>
+            </w:tcMar>
+            <w:vAlign w:val="top"/>
+          </w:tcPr>
+          <w:p>
+            <w:pPr>
+              <w:widowControl w:val="0"/>
+              <w:spacing w:line="240" w:lineRule="auto"/>
+              <w:rPr>
+                <w:b w:val="1"/>
+                <w:bCs w:val="1"/>
+                <w:sz w:val="24"/>
+                <w:szCs w:val="24"/>
+              </w:rPr>
+            </w:pPr>
+            <w:r>
+              <w:rPr>
+                <w:b w:val="1"/>
+                <w:bCs w:val="1"/>
+                <w:sz w:val="24"/>
+                <w:szCs w:val="24"/>
+                <w:rtl w:val="0"/>
+              </w:rPr>
+              <w:t xml:space="preserve">Resumo: </w:t>
+            </w:r>
+          </w:p>
+        </w:tc>
+        <w:tc>
+          <w:tcPr>
+            <w:shd w:fill="auto" w:val="clear"/>
+            <w:tcMar>
+              <w:top w:w="100.0" w:type="dxa"/>
+              <w:left w:w="100.0" w:type="dxa"/>
+              <w:bottom w:w="100.0" w:type="dxa"/>
+              <w:right w:w="100.0" w:type="dxa"/>
+            </w:tcMar>
+            <w:vAlign w:val="top"/>
+          </w:tcPr>
+          <w:p>
+            <w:pPr>
+              <w:rPr>
+                <w:sz w:val="24"/>
+                <w:szCs w:val="24"/>
+              </w:rPr>
+            </w:pPr>
+            <w:r>
+              <w:rPr>
+                <w:rtl w:val="0"/>
+              </w:rPr>
+              <w:t xml:space="preserve">O viajante informa os preços desejados de hospedagens e atrações. O app sugere opções mais baratas ou com melhor avaliação baseado no perfil de gastos. O sistema mostra locais turísticos próximos à hospedagem, como parques, shoppings, praças e zoológicos, com informações básicas. Gera automaticamente uma lista de itens para bagagem baseada no destino, clima, duração da viagem e perfil do usuário (lazer ou negócios).</w:t>
+            </w:r>
+            <w:r>
+              <w:rPr>
+                <w:rtl w:val="0"/>
+              </w:rPr>
+            </w:r>
+          </w:p>
+        </w:tc>
+      </w:tr>
+      <w:tr>
+        <w:trPr>
+          <w:cantSplit w:val="0"/>
+          <w:tblHeader w:val="0"/>
+        </w:trPr>
+        <w:tc>
+          <w:tcPr>
+            <w:shd w:fill="999999" w:val="clear"/>
+            <w:tcMar>
+              <w:top w:w="100.0" w:type="dxa"/>
+              <w:left w:w="100.0" w:type="dxa"/>
+              <w:bottom w:w="100.0" w:type="dxa"/>
+              <w:right w:w="100.0" w:type="dxa"/>
+            </w:tcMar>
+            <w:vAlign w:val="top"/>
+          </w:tcPr>
+          <w:p>
+            <w:pPr>
+              <w:widowControl w:val="0"/>
+              <w:spacing w:line="240" w:lineRule="auto"/>
+              <w:rPr>
+                <w:b w:val="1"/>
+                <w:bCs w:val="1"/>
+                <w:sz w:val="24"/>
+                <w:szCs w:val="24"/>
+              </w:rPr>
+            </w:pPr>
+            <w:r>
+              <w:rPr>
+                <w:b w:val="1"/>
+                <w:bCs w:val="1"/>
+                <w:sz w:val="24"/>
+                <w:szCs w:val="24"/>
+                <w:rtl w:val="0"/>
+              </w:rPr>
+              <w:t xml:space="preserve">Pré-condições: </w:t>
+            </w:r>
+          </w:p>
+        </w:tc>
+        <w:tc>
+          <w:tcPr>
+            <w:shd w:fill="auto" w:val="clear"/>
+            <w:tcMar>
+              <w:top w:w="100.0" w:type="dxa"/>
+              <w:left w:w="100.0" w:type="dxa"/>
+              <w:bottom w:w="100.0" w:type="dxa"/>
+              <w:right w:w="100.0" w:type="dxa"/>
+            </w:tcMar>
+            <w:vAlign w:val="top"/>
+          </w:tcPr>
+          <w:p>
+            <w:pPr>
+              <w:rPr/>
+            </w:pPr>
+            <w:r>
+              <w:rPr>
+                <w:rtl w:val="0"/>
+              </w:rPr>
+              <w:t xml:space="preserve">- O usuário está logado.</w:t>
+            </w:r>
+          </w:p>
+          <w:p>
+            <w:pPr>
+              <w:rPr>
+                <w:sz w:val="24"/>
+                <w:szCs w:val="24"/>
+              </w:rPr>
+            </w:pPr>
+            <w:r>
+              <w:rPr>
+                <w:rtl w:val="0"/>
+              </w:rPr>
+              <w:t xml:space="preserve">- Tem uma viagem selecionada.</w:t>
+            </w:r>
+            <w:r>
+              <w:rPr>
+                <w:rtl w:val="0"/>
+              </w:rPr>
+            </w:r>
+          </w:p>
+          <w:p>
+            <w:pPr>
+              <w:widowControl w:val="0"/>
+              <w:spacing w:line="240" w:lineRule="auto"/>
+              <w:rPr>
+                <w:sz w:val="24"/>
+                <w:szCs w:val="24"/>
+              </w:rPr>
+            </w:pPr>
+            <w:r>
+              <w:rPr>
+                <w:rtl w:val="0"/>
+              </w:rPr>
+            </w:r>
+          </w:p>
+        </w:tc>
+      </w:tr>
+      <w:tr>
+        <w:trPr>
+          <w:cantSplit w:val="0"/>
+          <w:tblHeader w:val="0"/>
+        </w:trPr>
+        <w:tc>
+          <w:tcPr>
+            <w:shd w:fill="999999" w:val="clear"/>
+            <w:tcMar>
+              <w:top w:w="100.0" w:type="dxa"/>
+              <w:left w:w="100.0" w:type="dxa"/>
+              <w:bottom w:w="100.0" w:type="dxa"/>
+              <w:right w:w="100.0" w:type="dxa"/>
+            </w:tcMar>
+            <w:vAlign w:val="top"/>
+          </w:tcPr>
+          <w:p>
+            <w:pPr>
+              <w:widowControl w:val="0"/>
+              <w:spacing w:line="240" w:lineRule="auto"/>
+              <w:rPr>
+                <w:b w:val="1"/>
+                <w:bCs w:val="1"/>
+                <w:sz w:val="24"/>
+                <w:szCs w:val="24"/>
+              </w:rPr>
+            </w:pPr>
+            <w:r>
+              <w:rPr>
+                <w:b w:val="1"/>
+                <w:bCs w:val="1"/>
+                <w:sz w:val="24"/>
+                <w:szCs w:val="24"/>
+                <w:rtl w:val="0"/>
+              </w:rPr>
+              <w:t xml:space="preserve">Pós-condições: </w:t>
+            </w:r>
+          </w:p>
+        </w:tc>
+        <w:tc>
+          <w:tcPr>
+            <w:shd w:fill="auto" w:val="clear"/>
+            <w:tcMar>
+              <w:top w:w="100.0" w:type="dxa"/>
+              <w:left w:w="100.0" w:type="dxa"/>
+              <w:bottom w:w="100.0" w:type="dxa"/>
+              <w:right w:w="100.0" w:type="dxa"/>
+            </w:tcMar>
+            <w:vAlign w:val="top"/>
+          </w:tcPr>
+          <w:p>
+            <w:pPr>
+              <w:rPr/>
+            </w:pPr>
+            <w:r>
+              <w:rPr>
+                <w:sz w:val="24"/>
+                <w:szCs w:val="24"/>
+                <w:rtl w:val="0"/>
+              </w:rPr>
+              <w:t xml:space="preserve">- </w:t>
+            </w:r>
+            <w:r>
+              <w:rPr>
+                <w:rtl w:val="0"/>
+              </w:rPr>
+              <w:t xml:space="preserve">As sugestões são exibidas com filtros de preço e avaliação.</w:t>
+            </w:r>
+          </w:p>
+          <w:p>
+            <w:pPr>
+              <w:rPr>
+                <w:sz w:val="24"/>
+                <w:szCs w:val="24"/>
+              </w:rPr>
+            </w:pPr>
+            <w:r>
+              <w:rPr>
+                <w:rtl w:val="0"/>
+              </w:rPr>
+              <w:t xml:space="preserve">- A lista de bagagem é gerada e salva.</w:t>
+            </w:r>
+            <w:r>
+              <w:rPr>
+                <w:rtl w:val="0"/>
+              </w:rPr>
+            </w:r>
+          </w:p>
+        </w:tc>
+      </w:tr>
+      <w:tr>
+        <w:trPr>
+          <w:cantSplit w:val="0"/>
+          <w:trHeight w:val="3074.2529296875" w:hRule="atLeast"/>
+          <w:tblHeader w:val="0"/>
+        </w:trPr>
+        <w:tc>
+          <w:tcPr>
+            <w:shd w:fill="999999" w:val="clear"/>
+            <w:tcMar>
+              <w:top w:w="100.0" w:type="dxa"/>
+              <w:left w:w="100.0" w:type="dxa"/>
+              <w:bottom w:w="100.0" w:type="dxa"/>
+              <w:right w:w="100.0" w:type="dxa"/>
+            </w:tcMar>
+            <w:vAlign w:val="top"/>
+          </w:tcPr>
+          <w:p>
+            <w:pPr>
+              <w:widowControl w:val="0"/>
+              <w:spacing w:line="240" w:lineRule="auto"/>
+              <w:rPr>
+                <w:b w:val="1"/>
+                <w:bCs w:val="1"/>
+                <w:sz w:val="24"/>
+                <w:szCs w:val="24"/>
+              </w:rPr>
+            </w:pPr>
+            <w:r>
+              <w:rPr>
+                <w:b w:val="1"/>
+                <w:bCs w:val="1"/>
+                <w:sz w:val="24"/>
+                <w:szCs w:val="24"/>
+                <w:rtl w:val="0"/>
+              </w:rPr>
+              <w:t xml:space="preserve">Fluxo Principal: </w:t>
+            </w:r>
+          </w:p>
+        </w:tc>
+        <w:tc>
+          <w:tcPr>
+            <w:shd w:fill="auto" w:val="clear"/>
+            <w:tcMar>
+              <w:top w:w="100.0" w:type="dxa"/>
+              <w:left w:w="100.0" w:type="dxa"/>
+              <w:bottom w:w="100.0" w:type="dxa"/>
+              <w:right w:w="100.0" w:type="dxa"/>
+            </w:tcMar>
+            <w:vAlign w:val="top"/>
+          </w:tcPr>
+          <w:p>
+            <w:pPr>
+              <w:numPr>
+                <w:ilvl w:val="0"/>
+                <w:numId w:val="14"/>
+              </w:numPr>
+              <w:ind w:left="720" w:hanging="360"/>
+              <w:rPr>
+                <w:u w:val="none"/>
+              </w:rPr>
+            </w:pPr>
+            <w:r>
+              <w:rPr>
+                <w:rtl w:val="0"/>
+              </w:rPr>
+              <w:t xml:space="preserve">1. O usuário seleciona uma viagem.</w:t>
+            </w:r>
+          </w:p>
+          <w:p>
+            <w:pPr>
+              <w:numPr>
+                <w:ilvl w:val="0"/>
+                <w:numId w:val="14"/>
+              </w:numPr>
+              <w:ind w:left="720" w:hanging="360"/>
+              <w:rPr>
+                <w:u w:val="none"/>
+              </w:rPr>
+            </w:pPr>
+            <w:r>
+              <w:rPr>
+                <w:rtl w:val="0"/>
+              </w:rPr>
+              <w:t xml:space="preserve">2. Clica na aba "Hospedagem" ou "Atrações".</w:t>
+            </w:r>
+          </w:p>
+          <w:p>
+            <w:pPr>
+              <w:numPr>
+                <w:ilvl w:val="0"/>
+                <w:numId w:val="14"/>
+              </w:numPr>
+              <w:ind w:left="720" w:hanging="360"/>
+              <w:rPr>
+                <w:u w:val="none"/>
+              </w:rPr>
+            </w:pPr>
+            <w:r>
+              <w:rPr>
+                <w:rtl w:val="0"/>
+              </w:rPr>
+              <w:t xml:space="preserve">3. Informa preço máximo e avaliação desejada.</w:t>
+            </w:r>
+          </w:p>
+          <w:p>
+            <w:pPr>
+              <w:numPr>
+                <w:ilvl w:val="0"/>
+                <w:numId w:val="14"/>
+              </w:numPr>
+              <w:ind w:left="720" w:hanging="360"/>
+              <w:rPr>
+                <w:u w:val="none"/>
+              </w:rPr>
+            </w:pPr>
+            <w:r>
+              <w:rPr>
+                <w:rtl w:val="0"/>
+              </w:rPr>
+              <w:t xml:space="preserve">4. O sistema filtra e sugere opções.</w:t>
+            </w:r>
+          </w:p>
+          <w:p>
+            <w:pPr>
+              <w:numPr>
+                <w:ilvl w:val="0"/>
+                <w:numId w:val="14"/>
+              </w:numPr>
+              <w:ind w:left="720" w:hanging="360"/>
+              <w:rPr>
+                <w:u w:val="none"/>
+              </w:rPr>
+            </w:pPr>
+            <w:r>
+              <w:rPr>
+                <w:rtl w:val="0"/>
+              </w:rPr>
+              <w:t xml:space="preserve">5. Exibe mapa e fotos + avaliações.</w:t>
+            </w:r>
+          </w:p>
+          <w:p>
+            <w:pPr>
+              <w:numPr>
+                <w:ilvl w:val="0"/>
+                <w:numId w:val="14"/>
+              </w:numPr>
+              <w:ind w:left="720" w:hanging="360"/>
+              <w:rPr>
+                <w:u w:val="none"/>
+              </w:rPr>
+            </w:pPr>
+            <w:r>
+              <w:rPr>
+                <w:rtl w:val="0"/>
+              </w:rPr>
+              <w:t xml:space="preserve">6. O usuário acessa a aba "Bagagem".</w:t>
+            </w:r>
+          </w:p>
+          <w:p>
+            <w:pPr>
+              <w:numPr>
+                <w:ilvl w:val="0"/>
+                <w:numId w:val="14"/>
+              </w:numPr>
+              <w:ind w:left="720" w:hanging="360"/>
+              <w:rPr>
+                <w:u w:val="none"/>
+              </w:rPr>
+            </w:pPr>
+            <w:r>
+              <w:rPr>
+                <w:rtl w:val="0"/>
+              </w:rPr>
+              <w:t xml:space="preserve">7. Seleciona tipo de viagem (lazer ou negócios).</w:t>
+            </w:r>
+          </w:p>
+          <w:p>
+            <w:pPr>
+              <w:numPr>
+                <w:ilvl w:val="0"/>
+                <w:numId w:val="14"/>
+              </w:numPr>
+              <w:ind w:left="720" w:hanging="360"/>
+              <w:rPr>
+                <w:u w:val="none"/>
+              </w:rPr>
+            </w:pPr>
+            <w:r>
+              <w:rPr>
+                <w:rtl w:val="0"/>
+              </w:rPr>
+              <w:t xml:space="preserve">8. Clica em "Gerar lista de bagagem".</w:t>
+            </w:r>
+          </w:p>
+          <w:p>
+            <w:pPr>
+              <w:numPr>
+                <w:ilvl w:val="0"/>
+                <w:numId w:val="14"/>
+              </w:numPr>
+              <w:ind w:left="720" w:hanging="360"/>
+              <w:rPr>
+                <w:u w:val="none"/>
+              </w:rPr>
+            </w:pPr>
+            <w:r>
+              <w:rPr>
+                <w:rtl w:val="0"/>
+              </w:rPr>
+              <w:t xml:space="preserve">9. Marque itens organizados e adicione lembretes.</w:t>
+            </w:r>
+          </w:p>
+          <w:p>
+            <w:pPr>
+              <w:numPr>
+                <w:ilvl w:val="0"/>
+                <w:numId w:val="14"/>
+              </w:numPr>
+              <w:ind w:left="720" w:hanging="360"/>
+              <w:rPr>
+                <w:u w:val="none"/>
+              </w:rPr>
+            </w:pPr>
+            <w:r>
+              <w:rPr>
+                <w:rtl w:val="0"/>
+              </w:rPr>
+              <w:t xml:space="preserve">10. Salva a lista.</w:t>
+            </w:r>
+            <w:r>
+              <w:rPr>
+                <w:rtl w:val="0"/>
+              </w:rPr>
+            </w:r>
+          </w:p>
+        </w:tc>
+      </w:tr>
+      <w:tr>
+        <w:trPr>
+          <w:cantSplit w:val="0"/>
+          <w:tblHeader w:val="0"/>
+        </w:trPr>
+        <w:tc>
+          <w:tcPr>
+            <w:shd w:fill="999999" w:val="clear"/>
+            <w:tcMar>
+              <w:top w:w="100.0" w:type="dxa"/>
+              <w:left w:w="100.0" w:type="dxa"/>
+              <w:bottom w:w="100.0" w:type="dxa"/>
+              <w:right w:w="100.0" w:type="dxa"/>
+            </w:tcMar>
+            <w:vAlign w:val="top"/>
+          </w:tcPr>
+          <w:p>
+            <w:pPr>
+              <w:widowControl w:val="0"/>
+              <w:spacing w:line="240" w:lineRule="auto"/>
+              <w:rPr>
+                <w:b w:val="1"/>
+                <w:bCs w:val="1"/>
+                <w:sz w:val="24"/>
+                <w:szCs w:val="24"/>
+              </w:rPr>
+            </w:pPr>
+            <w:r>
+              <w:rPr>
+                <w:b w:val="1"/>
+                <w:bCs w:val="1"/>
+                <w:sz w:val="24"/>
+                <w:szCs w:val="24"/>
+                <w:rtl w:val="0"/>
+              </w:rPr>
+              <w:t xml:space="preserve">Fluxos Alternativos: </w:t>
+            </w:r>
+          </w:p>
+        </w:tc>
+        <w:tc>
+          <w:tcPr>
+            <w:shd w:fill="auto" w:val="clear"/>
+            <w:tcMar>
+              <w:top w:w="100.0" w:type="dxa"/>
+              <w:left w:w="100.0" w:type="dxa"/>
+              <w:bottom w:w="100.0" w:type="dxa"/>
+              <w:right w:w="100.0" w:type="dxa"/>
+            </w:tcMar>
+            <w:vAlign w:val="top"/>
+          </w:tcPr>
+          <w:p>
+            <w:pPr>
+              <w:rPr/>
+            </w:pPr>
+            <w:r>
+              <w:rPr>
+                <w:rtl w:val="0"/>
+              </w:rPr>
+              <w:t xml:space="preserve">- FA01 - Sem opções disponíveis: exibe mensagem "Nenhuma opção encontrada".</w:t>
+            </w:r>
+          </w:p>
+          <w:p>
+            <w:pPr>
+              <w:rPr>
+                <w:sz w:val="24"/>
+                <w:szCs w:val="24"/>
+              </w:rPr>
+            </w:pPr>
+            <w:r>
+              <w:rPr>
+                <w:rtl w:val="0"/>
+              </w:rPr>
+              <w:t xml:space="preserve">- FA02 - Sem resultados: exibe mensagem "Nenhuma opção encontrada".</w:t>
+            </w:r>
+            <w:r>
+              <w:rPr>
+                <w:rtl w:val="0"/>
+              </w:rPr>
+            </w:r>
+          </w:p>
+        </w:tc>
+      </w:tr>
+      <w:tr>
+        <w:trPr>
+          <w:cantSplit w:val="0"/>
+          <w:tblHeader w:val="0"/>
+        </w:trPr>
+        <w:tc>
+          <w:tcPr>
+            <w:shd w:fill="999999" w:val="clear"/>
+            <w:tcMar>
+              <w:top w:w="100.0" w:type="dxa"/>
+              <w:left w:w="100.0" w:type="dxa"/>
+              <w:bottom w:w="100.0" w:type="dxa"/>
+              <w:right w:w="100.0" w:type="dxa"/>
+            </w:tcMar>
+            <w:vAlign w:val="top"/>
+          </w:tcPr>
+          <w:p>
+            <w:pPr>
+              <w:widowControl w:val="0"/>
+              <w:spacing w:line="240" w:lineRule="auto"/>
+              <w:rPr>
+                <w:b w:val="1"/>
+                <w:bCs w:val="1"/>
+                <w:sz w:val="24"/>
+                <w:szCs w:val="24"/>
+              </w:rPr>
+            </w:pPr>
+            <w:r>
+              <w:rPr>
+                <w:b w:val="1"/>
+                <w:bCs w:val="1"/>
+                <w:sz w:val="24"/>
+                <w:szCs w:val="24"/>
+                <w:rtl w:val="0"/>
+              </w:rPr>
+              <w:t xml:space="preserve">Fluxos de Exceção: </w:t>
+            </w:r>
+          </w:p>
+        </w:tc>
+        <w:tc>
+          <w:tcPr>
+            <w:shd w:fill="auto" w:val="clear"/>
+            <w:tcMar>
+              <w:top w:w="100.0" w:type="dxa"/>
+              <w:left w:w="100.0" w:type="dxa"/>
+              <w:bottom w:w="100.0" w:type="dxa"/>
+              <w:right w:w="100.0" w:type="dxa"/>
+            </w:tcMar>
+            <w:vAlign w:val="top"/>
+          </w:tcPr>
+          <w:p>
+            <w:pPr>
+              <w:rPr>
+                <w:sz w:val="24"/>
+                <w:szCs w:val="24"/>
+              </w:rPr>
+            </w:pPr>
+            <w:r>
+              <w:rPr>
+                <w:rtl w:val="0"/>
+              </w:rPr>
+              <w:t xml:space="preserve">- FE01 - Falha na API de localização: exibe erro "Verifique sua conexão".</w:t>
+            </w:r>
+            <w:r>
+              <w:rPr>
+                <w:rtl w:val="0"/>
+              </w:rPr>
+            </w:r>
+          </w:p>
+        </w:tc>
+      </w:tr>
+      <w:tr>
+        <w:trPr>
+          <w:cantSplit w:val="0"/>
+          <w:tblHeader w:val="0"/>
+        </w:trPr>
+        <w:tc>
+          <w:tcPr>
+            <w:shd w:fill="999999" w:val="clear"/>
+            <w:tcMar>
+              <w:top w:w="100.0" w:type="dxa"/>
+              <w:left w:w="100.0" w:type="dxa"/>
+              <w:bottom w:w="100.0" w:type="dxa"/>
+              <w:right w:w="100.0" w:type="dxa"/>
+            </w:tcMar>
+            <w:vAlign w:val="top"/>
+          </w:tcPr>
+          <w:p>
+            <w:pPr>
+              <w:widowControl w:val="0"/>
+              <w:spacing w:line="240" w:lineRule="auto"/>
+              <w:rPr>
+                <w:b w:val="1"/>
+                <w:bCs w:val="1"/>
+                <w:sz w:val="24"/>
+                <w:szCs w:val="24"/>
+              </w:rPr>
+            </w:pPr>
+            <w:r>
+              <w:rPr>
+                <w:b w:val="1"/>
+                <w:bCs w:val="1"/>
+                <w:sz w:val="24"/>
+                <w:szCs w:val="24"/>
+                <w:rtl w:val="0"/>
+              </w:rPr>
+              <w:t xml:space="preserve">Relações de Regras de Negócio: </w:t>
+            </w:r>
+          </w:p>
+        </w:tc>
+        <w:tc>
+          <w:tcPr>
+            <w:shd w:fill="auto" w:val="clear"/>
+            <w:tcMar>
+              <w:top w:w="100.0" w:type="dxa"/>
+              <w:left w:w="100.0" w:type="dxa"/>
+              <w:bottom w:w="100.0" w:type="dxa"/>
+              <w:right w:w="100.0" w:type="dxa"/>
+            </w:tcMar>
+            <w:vAlign w:val="top"/>
+          </w:tcPr>
+          <w:p>
+            <w:pPr>
+              <w:rPr/>
+            </w:pPr>
+            <w:r>
+              <w:rPr>
+                <w:rtl w:val="0"/>
+              </w:rPr>
+              <w:t xml:space="preserve">- RN01 - Sugestões baseadas no perfil de gastos do usuário.</w:t>
+            </w:r>
+          </w:p>
+          <w:p>
+            <w:pPr>
+              <w:rPr/>
+            </w:pPr>
+            <w:r>
+              <w:rPr>
+                <w:rtl w:val="0"/>
+              </w:rPr>
+              <w:t xml:space="preserve">- RN02 - Filtro por preço e avaliação deve ser dinâmico.</w:t>
+            </w:r>
+          </w:p>
+          <w:p>
+            <w:pPr>
+              <w:rPr>
+                <w:b w:val="1"/>
+                <w:bCs w:val="1"/>
+                <w:sz w:val="24"/>
+                <w:szCs w:val="24"/>
+              </w:rPr>
+            </w:pPr>
+            <w:r>
+              <w:rPr>
+                <w:rtl w:val="0"/>
+              </w:rPr>
+              <w:t xml:space="preserve">- RN03 - Lista é gerada automaticamente conforme perfil </w:t>
+            </w:r>
+            <w:r>
+              <w:rPr>
+                <w:rtl w:val="0"/>
+              </w:rPr>
+            </w:r>
+          </w:p>
+        </w:tc>
+      </w:tr>
+    </w:tbl>
+    <w:p>
+      <w:pPr>
+        <w:spacing w:before="240" w:line="360" w:lineRule="auto"/>
+        <w:jc w:val="both"/>
         <w:rPr/>
       </w:pPr>
       <w:r>
         <w:rPr>
           <w:rtl w:val="0"/>
         </w:rPr>
+        <w:br w:type="textWrapping"/>
       </w:r>
     </w:p>
     <w:p>
@@ -6538,6 +7413,925 @@
     <w:p>
       <w:pPr>
         <w:rPr/>
+      </w:pPr>
+      <w:r>
+        <w:rPr>
+          <w:rtl w:val="0"/>
+        </w:rPr>
+      </w:r>
+    </w:p>
+    <w:p>
+      <w:pPr>
+        <w:rPr/>
+      </w:pPr>
+      <w:r>
+        <w:rPr>
+          <w:rtl w:val="0"/>
+        </w:rPr>
+      </w:r>
+    </w:p>
+    <w:p>
+      <w:pPr>
+        <w:rPr/>
+      </w:pPr>
+      <w:r>
+        <w:rPr>
+          <w:rtl w:val="0"/>
+        </w:rPr>
+      </w:r>
+    </w:p>
+    <w:p>
+      <w:pPr>
+        <w:rPr/>
+      </w:pPr>
+      <w:r>
+        <w:rPr>
+          <w:rtl w:val="0"/>
+        </w:rPr>
+      </w:r>
+    </w:p>
+    <w:p>
+      <w:pPr>
+        <w:rPr/>
+      </w:pPr>
+      <w:r>
+        <w:rPr>
+          <w:rtl w:val="0"/>
+        </w:rPr>
+      </w:r>
+    </w:p>
+    <w:p>
+      <w:pPr>
+        <w:rPr/>
+      </w:pPr>
+      <w:r>
+        <w:rPr>
+          <w:rtl w:val="0"/>
+        </w:rPr>
+      </w:r>
+    </w:p>
+    <w:p>
+      <w:pPr>
+        <w:rPr/>
+      </w:pPr>
+      <w:r>
+        <w:rPr>
+          <w:rtl w:val="0"/>
+        </w:rPr>
+      </w:r>
+    </w:p>
+    <w:p>
+      <w:pPr>
+        <w:rPr/>
+      </w:pPr>
+      <w:r>
+        <w:rPr>
+          <w:rtl w:val="0"/>
+        </w:rPr>
+      </w:r>
+    </w:p>
+    <w:p>
+      <w:pPr>
+        <w:rPr/>
+      </w:pPr>
+      <w:r>
+        <w:rPr>
+          <w:rtl w:val="0"/>
+        </w:rPr>
+      </w:r>
+    </w:p>
+    <w:p>
+      <w:pPr>
+        <w:rPr/>
+      </w:pPr>
+      <w:r>
+        <w:rPr>
+          <w:rtl w:val="0"/>
+        </w:rPr>
+      </w:r>
+    </w:p>
+    <w:p>
+      <w:pPr>
+        <w:rPr/>
+      </w:pPr>
+      <w:r>
+        <w:rPr>
+          <w:rtl w:val="0"/>
+        </w:rPr>
+      </w:r>
+    </w:p>
+    <w:p>
+      <w:pPr>
+        <w:rPr/>
+      </w:pPr>
+      <w:r>
+        <w:rPr>
+          <w:rtl w:val="0"/>
+        </w:rPr>
+      </w:r>
+    </w:p>
+    <w:p>
+      <w:pPr>
+        <w:rPr/>
+      </w:pPr>
+      <w:r>
+        <w:rPr>
+          <w:rtl w:val="0"/>
+        </w:rPr>
+      </w:r>
+    </w:p>
+    <w:p>
+      <w:pPr>
+        <w:rPr/>
+      </w:pPr>
+      <w:r>
+        <w:rPr>
+          <w:rtl w:val="0"/>
+        </w:rPr>
+      </w:r>
+    </w:p>
+    <w:p>
+      <w:pPr>
+        <w:spacing w:line="360" w:lineRule="auto"/>
+        <w:jc w:val="both"/>
+        <w:rPr>
+          <w:sz w:val="24"/>
+          <w:szCs w:val="24"/>
+        </w:rPr>
+      </w:pPr>
+      <w:r>
+        <w:rPr>
+          <w:rtl w:val="0"/>
+        </w:rPr>
+      </w:r>
+    </w:p>
+    <w:tbl>
+      <w:tblPr>
+        <w:tblStyle w:val="Table6"/>
+        <w:tblW w:w="14010.0" w:type="dxa"/>
+        <w:jc w:val="left"/>
+        <w:tblBorders>
+          <w:top w:color="000000" w:space="0" w:sz="8" w:val="single"/>
+          <w:left w:color="000000" w:space="0" w:sz="8" w:val="single"/>
+          <w:bottom w:color="000000" w:space="0" w:sz="8" w:val="single"/>
+          <w:right w:color="000000" w:space="0" w:sz="8" w:val="single"/>
+          <w:insideH w:color="000000" w:space="0" w:sz="8" w:val="single"/>
+          <w:insideV w:color="000000" w:space="0" w:sz="8" w:val="single"/>
+        </w:tblBorders>
+        <w:tblLayout w:type="fixed"/>
+        <w:tblLook w:val="0600"/>
+      </w:tblPr>
+      <w:tblGrid>
+        <w:gridCol w:w="2535"/>
+        <w:gridCol w:w="11475"/>
+        <w:tblGridChange w:id="0">
+          <w:tblGrid>
+            <w:gridCol w:w="2535"/>
+            <w:gridCol w:w="11475"/>
+          </w:tblGrid>
+        </w:tblGridChange>
+      </w:tblGrid>
+      <w:tr>
+        <w:trPr>
+          <w:cantSplit w:val="0"/>
+          <w:tblHeader w:val="0"/>
+        </w:trPr>
+        <w:tc>
+          <w:tcPr>
+            <w:shd w:fill="999999" w:val="clear"/>
+            <w:tcMar>
+              <w:top w:w="100.0" w:type="dxa"/>
+              <w:left w:w="100.0" w:type="dxa"/>
+              <w:bottom w:w="100.0" w:type="dxa"/>
+              <w:right w:w="100.0" w:type="dxa"/>
+            </w:tcMar>
+            <w:vAlign w:val="top"/>
+          </w:tcPr>
+          <w:p>
+            <w:pPr>
+              <w:widowControl w:val="0"/>
+              <w:spacing w:line="240" w:lineRule="auto"/>
+              <w:rPr>
+                <w:b w:val="1"/>
+                <w:bCs w:val="1"/>
+                <w:sz w:val="24"/>
+                <w:szCs w:val="24"/>
+              </w:rPr>
+            </w:pPr>
+            <w:r>
+              <w:rPr>
+                <w:b w:val="1"/>
+                <w:bCs w:val="1"/>
+                <w:sz w:val="24"/>
+                <w:szCs w:val="24"/>
+                <w:rtl w:val="0"/>
+              </w:rPr>
+              <w:t xml:space="preserve">CASO DE USO EXPANDIDO - 001</w:t>
+            </w:r>
+          </w:p>
+        </w:tc>
+        <w:tc>
+          <w:tcPr>
+            <w:shd w:fill="999999" w:val="clear"/>
+            <w:tcMar>
+              <w:top w:w="100.0" w:type="dxa"/>
+              <w:left w:w="100.0" w:type="dxa"/>
+              <w:bottom w:w="100.0" w:type="dxa"/>
+              <w:right w:w="100.0" w:type="dxa"/>
+            </w:tcMar>
+            <w:vAlign w:val="top"/>
+          </w:tcPr>
+          <w:p>
+            <w:pPr>
+              <w:widowControl w:val="0"/>
+              <w:spacing w:line="240" w:lineRule="auto"/>
+              <w:rPr>
+                <w:b w:val="1"/>
+                <w:bCs w:val="1"/>
+                <w:sz w:val="24"/>
+                <w:szCs w:val="24"/>
+              </w:rPr>
+            </w:pPr>
+            <w:r>
+              <w:rPr>
+                <w:b w:val="1"/>
+                <w:bCs w:val="1"/>
+                <w:sz w:val="24"/>
+                <w:szCs w:val="24"/>
+                <w:rtl w:val="0"/>
+              </w:rPr>
+              <w:t xml:space="preserve">SARAH EMANUELLY </w:t>
+            </w:r>
+          </w:p>
+        </w:tc>
+      </w:tr>
+      <w:tr>
+        <w:trPr>
+          <w:cantSplit w:val="0"/>
+          <w:tblHeader w:val="0"/>
+        </w:trPr>
+        <w:tc>
+          <w:tcPr>
+            <w:shd w:fill="999999" w:val="clear"/>
+            <w:tcMar>
+              <w:top w:w="100.0" w:type="dxa"/>
+              <w:left w:w="100.0" w:type="dxa"/>
+              <w:bottom w:w="100.0" w:type="dxa"/>
+              <w:right w:w="100.0" w:type="dxa"/>
+            </w:tcMar>
+            <w:vAlign w:val="top"/>
+          </w:tcPr>
+          <w:p>
+            <w:pPr>
+              <w:widowControl w:val="0"/>
+              <w:spacing w:line="240" w:lineRule="auto"/>
+              <w:rPr>
+                <w:b w:val="1"/>
+                <w:bCs w:val="1"/>
+                <w:sz w:val="24"/>
+                <w:szCs w:val="24"/>
+              </w:rPr>
+            </w:pPr>
+            <w:r>
+              <w:rPr>
+                <w:b w:val="1"/>
+                <w:bCs w:val="1"/>
+                <w:sz w:val="24"/>
+                <w:szCs w:val="24"/>
+                <w:rtl w:val="0"/>
+              </w:rPr>
+              <w:t xml:space="preserve">Ator Principal: </w:t>
+            </w:r>
+          </w:p>
+        </w:tc>
+        <w:tc>
+          <w:tcPr>
+            <w:shd w:fill="auto" w:val="clear"/>
+            <w:tcMar>
+              <w:top w:w="100.0" w:type="dxa"/>
+              <w:left w:w="100.0" w:type="dxa"/>
+              <w:bottom w:w="100.0" w:type="dxa"/>
+              <w:right w:w="100.0" w:type="dxa"/>
+            </w:tcMar>
+            <w:vAlign w:val="top"/>
+          </w:tcPr>
+          <w:p>
+            <w:pPr>
+              <w:widowControl w:val="0"/>
+              <w:spacing w:after="240" w:before="240" w:line="240" w:lineRule="auto"/>
+              <w:rPr>
+                <w:sz w:val="24"/>
+                <w:szCs w:val="24"/>
+              </w:rPr>
+            </w:pPr>
+            <w:r>
+              <w:rPr>
+                <w:sz w:val="24"/>
+                <w:szCs w:val="24"/>
+                <w:rtl w:val="0"/>
+              </w:rPr>
+              <w:t xml:space="preserve">Viajante (Usuário Final)</w:t>
+            </w:r>
+          </w:p>
+        </w:tc>
+      </w:tr>
+      <w:tr>
+        <w:trPr>
+          <w:cantSplit w:val="0"/>
+          <w:tblHeader w:val="0"/>
+        </w:trPr>
+        <w:tc>
+          <w:tcPr>
+            <w:shd w:fill="999999" w:val="clear"/>
+            <w:tcMar>
+              <w:top w:w="100.0" w:type="dxa"/>
+              <w:left w:w="100.0" w:type="dxa"/>
+              <w:bottom w:w="100.0" w:type="dxa"/>
+              <w:right w:w="100.0" w:type="dxa"/>
+            </w:tcMar>
+            <w:vAlign w:val="top"/>
+          </w:tcPr>
+          <w:p>
+            <w:pPr>
+              <w:widowControl w:val="0"/>
+              <w:spacing w:line="240" w:lineRule="auto"/>
+              <w:rPr>
+                <w:b w:val="1"/>
+                <w:bCs w:val="1"/>
+                <w:sz w:val="24"/>
+                <w:szCs w:val="24"/>
+              </w:rPr>
+            </w:pPr>
+            <w:r>
+              <w:rPr>
+                <w:b w:val="1"/>
+                <w:bCs w:val="1"/>
+                <w:sz w:val="24"/>
+                <w:szCs w:val="24"/>
+                <w:rtl w:val="0"/>
+              </w:rPr>
+              <w:t xml:space="preserve">Resumo: </w:t>
+            </w:r>
+          </w:p>
+        </w:tc>
+        <w:tc>
+          <w:tcPr>
+            <w:shd w:fill="auto" w:val="clear"/>
+            <w:tcMar>
+              <w:top w:w="100.0" w:type="dxa"/>
+              <w:left w:w="100.0" w:type="dxa"/>
+              <w:bottom w:w="100.0" w:type="dxa"/>
+              <w:right w:w="100.0" w:type="dxa"/>
+            </w:tcMar>
+            <w:vAlign w:val="top"/>
+          </w:tcPr>
+          <w:p>
+            <w:pPr>
+              <w:widowControl w:val="0"/>
+              <w:spacing w:after="240" w:before="240" w:line="240" w:lineRule="auto"/>
+              <w:rPr>
+                <w:sz w:val="24"/>
+                <w:szCs w:val="24"/>
+              </w:rPr>
+            </w:pPr>
+            <w:r>
+              <w:rPr>
+                <w:sz w:val="24"/>
+                <w:szCs w:val="24"/>
+                <w:rtl w:val="0"/>
+              </w:rPr>
+              <w:t xml:space="preserve">Permitir que o viajante escolha o tipo de viagem (lazer ou negócios) para personalizar todas as sugestões, bagagem e recomendações do sistema</w:t>
+            </w:r>
+          </w:p>
+          <w:p>
+            <w:pPr>
+              <w:widowControl w:val="0"/>
+              <w:spacing w:after="240" w:before="240" w:line="240" w:lineRule="auto"/>
+              <w:rPr>
+                <w:sz w:val="24"/>
+                <w:szCs w:val="24"/>
+              </w:rPr>
+            </w:pPr>
+            <w:r>
+              <w:rPr>
+                <w:rtl w:val="0"/>
+              </w:rPr>
+            </w:r>
+          </w:p>
+        </w:tc>
+      </w:tr>
+      <w:tr>
+        <w:trPr>
+          <w:cantSplit w:val="0"/>
+          <w:tblHeader w:val="0"/>
+        </w:trPr>
+        <w:tc>
+          <w:tcPr>
+            <w:shd w:fill="999999" w:val="clear"/>
+            <w:tcMar>
+              <w:top w:w="100.0" w:type="dxa"/>
+              <w:left w:w="100.0" w:type="dxa"/>
+              <w:bottom w:w="100.0" w:type="dxa"/>
+              <w:right w:w="100.0" w:type="dxa"/>
+            </w:tcMar>
+            <w:vAlign w:val="top"/>
+          </w:tcPr>
+          <w:p>
+            <w:pPr>
+              <w:widowControl w:val="0"/>
+              <w:spacing w:line="240" w:lineRule="auto"/>
+              <w:rPr>
+                <w:b w:val="1"/>
+                <w:bCs w:val="1"/>
+                <w:sz w:val="24"/>
+                <w:szCs w:val="24"/>
+              </w:rPr>
+            </w:pPr>
+            <w:r>
+              <w:rPr>
+                <w:b w:val="1"/>
+                <w:bCs w:val="1"/>
+                <w:sz w:val="24"/>
+                <w:szCs w:val="24"/>
+                <w:rtl w:val="0"/>
+              </w:rPr>
+              <w:t xml:space="preserve">Pré-condições: </w:t>
+            </w:r>
+          </w:p>
+        </w:tc>
+        <w:tc>
+          <w:tcPr>
+            <w:shd w:fill="auto" w:val="clear"/>
+            <w:tcMar>
+              <w:top w:w="100.0" w:type="dxa"/>
+              <w:left w:w="100.0" w:type="dxa"/>
+              <w:bottom w:w="100.0" w:type="dxa"/>
+              <w:right w:w="100.0" w:type="dxa"/>
+            </w:tcMar>
+            <w:vAlign w:val="top"/>
+          </w:tcPr>
+          <w:p>
+            <w:pPr>
+              <w:widowControl w:val="0"/>
+              <w:spacing w:line="240" w:lineRule="auto"/>
+              <w:rPr>
+                <w:sz w:val="24"/>
+                <w:szCs w:val="24"/>
+              </w:rPr>
+            </w:pPr>
+            <w:r>
+              <w:rPr>
+                <w:rtl w:val="0"/>
+              </w:rPr>
+            </w:r>
+          </w:p>
+        </w:tc>
+      </w:tr>
+      <w:tr>
+        <w:trPr>
+          <w:cantSplit w:val="0"/>
+          <w:tblHeader w:val="0"/>
+        </w:trPr>
+        <w:tc>
+          <w:tcPr>
+            <w:shd w:fill="999999" w:val="clear"/>
+            <w:tcMar>
+              <w:top w:w="100.0" w:type="dxa"/>
+              <w:left w:w="100.0" w:type="dxa"/>
+              <w:bottom w:w="100.0" w:type="dxa"/>
+              <w:right w:w="100.0" w:type="dxa"/>
+            </w:tcMar>
+            <w:vAlign w:val="top"/>
+          </w:tcPr>
+          <w:p>
+            <w:pPr>
+              <w:widowControl w:val="0"/>
+              <w:spacing w:line="240" w:lineRule="auto"/>
+              <w:rPr>
+                <w:b w:val="1"/>
+                <w:bCs w:val="1"/>
+                <w:sz w:val="24"/>
+                <w:szCs w:val="24"/>
+              </w:rPr>
+            </w:pPr>
+            <w:r>
+              <w:rPr>
+                <w:b w:val="1"/>
+                <w:bCs w:val="1"/>
+                <w:sz w:val="24"/>
+                <w:szCs w:val="24"/>
+                <w:rtl w:val="0"/>
+              </w:rPr>
+              <w:t xml:space="preserve">Pós-condições: </w:t>
+            </w:r>
+          </w:p>
+        </w:tc>
+        <w:tc>
+          <w:tcPr>
+            <w:shd w:fill="auto" w:val="clear"/>
+            <w:tcMar>
+              <w:top w:w="100.0" w:type="dxa"/>
+              <w:left w:w="100.0" w:type="dxa"/>
+              <w:bottom w:w="100.0" w:type="dxa"/>
+              <w:right w:w="100.0" w:type="dxa"/>
+            </w:tcMar>
+            <w:vAlign w:val="top"/>
+          </w:tcPr>
+          <w:p>
+            <w:pPr>
+              <w:widowControl w:val="0"/>
+              <w:spacing w:line="240" w:lineRule="auto"/>
+              <w:rPr>
+                <w:sz w:val="24"/>
+                <w:szCs w:val="24"/>
+              </w:rPr>
+            </w:pPr>
+            <w:r>
+              <w:rPr>
+                <w:rtl w:val="0"/>
+              </w:rPr>
+            </w:r>
+          </w:p>
+        </w:tc>
+      </w:tr>
+      <w:tr>
+        <w:trPr>
+          <w:cantSplit w:val="0"/>
+          <w:tblHeader w:val="0"/>
+        </w:trPr>
+        <w:tc>
+          <w:tcPr>
+            <w:shd w:fill="999999" w:val="clear"/>
+            <w:tcMar>
+              <w:top w:w="100.0" w:type="dxa"/>
+              <w:left w:w="100.0" w:type="dxa"/>
+              <w:bottom w:w="100.0" w:type="dxa"/>
+              <w:right w:w="100.0" w:type="dxa"/>
+            </w:tcMar>
+            <w:vAlign w:val="top"/>
+          </w:tcPr>
+          <w:p>
+            <w:pPr>
+              <w:widowControl w:val="0"/>
+              <w:spacing w:line="240" w:lineRule="auto"/>
+              <w:rPr>
+                <w:b w:val="1"/>
+                <w:bCs w:val="1"/>
+                <w:sz w:val="24"/>
+                <w:szCs w:val="24"/>
+              </w:rPr>
+            </w:pPr>
+            <w:r>
+              <w:rPr>
+                <w:b w:val="1"/>
+                <w:bCs w:val="1"/>
+                <w:sz w:val="24"/>
+                <w:szCs w:val="24"/>
+                <w:rtl w:val="0"/>
+              </w:rPr>
+              <w:t xml:space="preserve">Fluxo Principal: </w:t>
+            </w:r>
+          </w:p>
+        </w:tc>
+        <w:tc>
+          <w:tcPr>
+            <w:shd w:fill="auto" w:val="clear"/>
+            <w:tcMar>
+              <w:top w:w="100.0" w:type="dxa"/>
+              <w:left w:w="100.0" w:type="dxa"/>
+              <w:bottom w:w="100.0" w:type="dxa"/>
+              <w:right w:w="100.0" w:type="dxa"/>
+            </w:tcMar>
+            <w:vAlign w:val="top"/>
+          </w:tcPr>
+          <w:p>
+            <w:pPr>
+              <w:widowControl w:val="0"/>
+              <w:numPr>
+                <w:ilvl w:val="0"/>
+                <w:numId w:val="8"/>
+              </w:numPr>
+              <w:spacing w:line="240" w:lineRule="auto"/>
+              <w:ind w:left="720" w:hanging="360"/>
+              <w:rPr>
+                <w:sz w:val="24"/>
+                <w:szCs w:val="24"/>
+                <w:u w:val="none"/>
+              </w:rPr>
+            </w:pPr>
+            <w:r>
+              <w:rPr>
+                <w:rtl w:val="0"/>
+              </w:rPr>
+            </w:r>
+          </w:p>
+        </w:tc>
+      </w:tr>
+      <w:tr>
+        <w:trPr>
+          <w:cantSplit w:val="0"/>
+          <w:tblHeader w:val="0"/>
+        </w:trPr>
+        <w:tc>
+          <w:tcPr>
+            <w:shd w:fill="999999" w:val="clear"/>
+            <w:tcMar>
+              <w:top w:w="100.0" w:type="dxa"/>
+              <w:left w:w="100.0" w:type="dxa"/>
+              <w:bottom w:w="100.0" w:type="dxa"/>
+              <w:right w:w="100.0" w:type="dxa"/>
+            </w:tcMar>
+            <w:vAlign w:val="top"/>
+          </w:tcPr>
+          <w:p>
+            <w:pPr>
+              <w:widowControl w:val="0"/>
+              <w:spacing w:line="240" w:lineRule="auto"/>
+              <w:rPr>
+                <w:b w:val="1"/>
+                <w:bCs w:val="1"/>
+                <w:sz w:val="24"/>
+                <w:szCs w:val="24"/>
+              </w:rPr>
+            </w:pPr>
+            <w:r>
+              <w:rPr>
+                <w:b w:val="1"/>
+                <w:bCs w:val="1"/>
+                <w:sz w:val="24"/>
+                <w:szCs w:val="24"/>
+                <w:rtl w:val="0"/>
+              </w:rPr>
+              <w:t xml:space="preserve">Fluxos Alternativos: </w:t>
+            </w:r>
+          </w:p>
+        </w:tc>
+        <w:tc>
+          <w:tcPr>
+            <w:shd w:fill="auto" w:val="clear"/>
+            <w:tcMar>
+              <w:top w:w="100.0" w:type="dxa"/>
+              <w:left w:w="100.0" w:type="dxa"/>
+              <w:bottom w:w="100.0" w:type="dxa"/>
+              <w:right w:w="100.0" w:type="dxa"/>
+            </w:tcMar>
+            <w:vAlign w:val="top"/>
+          </w:tcPr>
+          <w:p>
+            <w:pPr>
+              <w:widowControl w:val="0"/>
+              <w:numPr>
+                <w:ilvl w:val="0"/>
+                <w:numId w:val="6"/>
+              </w:numPr>
+              <w:spacing w:line="240" w:lineRule="auto"/>
+              <w:ind w:left="720" w:hanging="360"/>
+              <w:rPr>
+                <w:sz w:val="24"/>
+                <w:szCs w:val="24"/>
+              </w:rPr>
+            </w:pPr>
+            <w:r>
+              <w:rPr>
+                <w:rtl w:val="0"/>
+              </w:rPr>
+            </w:r>
+          </w:p>
+          <w:p>
+            <w:pPr>
+              <w:widowControl w:val="0"/>
+              <w:spacing w:line="240" w:lineRule="auto"/>
+              <w:rPr>
+                <w:sz w:val="24"/>
+                <w:szCs w:val="24"/>
+              </w:rPr>
+            </w:pPr>
+            <w:r>
+              <w:rPr>
+                <w:rtl w:val="0"/>
+              </w:rPr>
+            </w:r>
+          </w:p>
+        </w:tc>
+      </w:tr>
+      <w:tr>
+        <w:trPr>
+          <w:cantSplit w:val="0"/>
+          <w:tblHeader w:val="0"/>
+        </w:trPr>
+        <w:tc>
+          <w:tcPr>
+            <w:shd w:fill="999999" w:val="clear"/>
+            <w:tcMar>
+              <w:top w:w="100.0" w:type="dxa"/>
+              <w:left w:w="100.0" w:type="dxa"/>
+              <w:bottom w:w="100.0" w:type="dxa"/>
+              <w:right w:w="100.0" w:type="dxa"/>
+            </w:tcMar>
+            <w:vAlign w:val="top"/>
+          </w:tcPr>
+          <w:p>
+            <w:pPr>
+              <w:widowControl w:val="0"/>
+              <w:spacing w:line="240" w:lineRule="auto"/>
+              <w:rPr>
+                <w:b w:val="1"/>
+                <w:bCs w:val="1"/>
+                <w:sz w:val="24"/>
+                <w:szCs w:val="24"/>
+              </w:rPr>
+            </w:pPr>
+            <w:r>
+              <w:rPr>
+                <w:b w:val="1"/>
+                <w:bCs w:val="1"/>
+                <w:sz w:val="24"/>
+                <w:szCs w:val="24"/>
+                <w:rtl w:val="0"/>
+              </w:rPr>
+              <w:t xml:space="preserve">Fluxos de Exceção: </w:t>
+            </w:r>
+          </w:p>
+        </w:tc>
+        <w:tc>
+          <w:tcPr>
+            <w:shd w:fill="auto" w:val="clear"/>
+            <w:tcMar>
+              <w:top w:w="100.0" w:type="dxa"/>
+              <w:left w:w="100.0" w:type="dxa"/>
+              <w:bottom w:w="100.0" w:type="dxa"/>
+              <w:right w:w="100.0" w:type="dxa"/>
+            </w:tcMar>
+            <w:vAlign w:val="top"/>
+          </w:tcPr>
+          <w:p>
+            <w:pPr>
+              <w:widowControl w:val="0"/>
+              <w:spacing w:line="240" w:lineRule="auto"/>
+              <w:rPr>
+                <w:b w:val="1"/>
+                <w:bCs w:val="1"/>
+                <w:sz w:val="24"/>
+                <w:szCs w:val="24"/>
+              </w:rPr>
+            </w:pPr>
+            <w:r>
+              <w:rPr>
+                <w:rtl w:val="0"/>
+              </w:rPr>
+            </w:r>
+          </w:p>
+          <w:p>
+            <w:pPr>
+              <w:widowControl w:val="0"/>
+              <w:spacing w:line="240" w:lineRule="auto"/>
+              <w:rPr>
+                <w:sz w:val="24"/>
+                <w:szCs w:val="24"/>
+              </w:rPr>
+            </w:pPr>
+            <w:r>
+              <w:rPr>
+                <w:rtl w:val="0"/>
+              </w:rPr>
+            </w:r>
+          </w:p>
+          <w:p>
+            <w:pPr>
+              <w:widowControl w:val="0"/>
+              <w:spacing w:line="240" w:lineRule="auto"/>
+              <w:ind w:left="720" w:firstLine="0"/>
+              <w:rPr>
+                <w:sz w:val="24"/>
+                <w:szCs w:val="24"/>
+              </w:rPr>
+            </w:pPr>
+            <w:r>
+              <w:rPr>
+                <w:rtl w:val="0"/>
+              </w:rPr>
+            </w:r>
+          </w:p>
+          <w:p>
+            <w:pPr>
+              <w:widowControl w:val="0"/>
+              <w:numPr>
+                <w:ilvl w:val="0"/>
+                <w:numId w:val="1"/>
+              </w:numPr>
+              <w:spacing w:line="240" w:lineRule="auto"/>
+              <w:ind w:left="720" w:hanging="360"/>
+              <w:rPr>
+                <w:sz w:val="24"/>
+                <w:szCs w:val="24"/>
+              </w:rPr>
+            </w:pPr>
+            <w:r>
+              <w:rPr>
+                <w:rtl w:val="0"/>
+              </w:rPr>
+            </w:r>
+          </w:p>
+        </w:tc>
+      </w:tr>
+      <w:tr>
+        <w:trPr>
+          <w:cantSplit w:val="0"/>
+          <w:tblHeader w:val="0"/>
+        </w:trPr>
+        <w:tc>
+          <w:tcPr>
+            <w:shd w:fill="999999" w:val="clear"/>
+            <w:tcMar>
+              <w:top w:w="100.0" w:type="dxa"/>
+              <w:left w:w="100.0" w:type="dxa"/>
+              <w:bottom w:w="100.0" w:type="dxa"/>
+              <w:right w:w="100.0" w:type="dxa"/>
+            </w:tcMar>
+            <w:vAlign w:val="top"/>
+          </w:tcPr>
+          <w:p>
+            <w:pPr>
+              <w:widowControl w:val="0"/>
+              <w:spacing w:line="240" w:lineRule="auto"/>
+              <w:rPr>
+                <w:b w:val="1"/>
+                <w:bCs w:val="1"/>
+                <w:sz w:val="24"/>
+                <w:szCs w:val="24"/>
+              </w:rPr>
+            </w:pPr>
+            <w:r>
+              <w:rPr>
+                <w:b w:val="1"/>
+                <w:bCs w:val="1"/>
+                <w:sz w:val="24"/>
+                <w:szCs w:val="24"/>
+                <w:rtl w:val="0"/>
+              </w:rPr>
+              <w:t xml:space="preserve">Relações de Regras de Negócio: </w:t>
+            </w:r>
+          </w:p>
+        </w:tc>
+        <w:tc>
+          <w:tcPr>
+            <w:shd w:fill="auto" w:val="clear"/>
+            <w:tcMar>
+              <w:top w:w="100.0" w:type="dxa"/>
+              <w:left w:w="100.0" w:type="dxa"/>
+              <w:bottom w:w="100.0" w:type="dxa"/>
+              <w:right w:w="100.0" w:type="dxa"/>
+            </w:tcMar>
+            <w:vAlign w:val="top"/>
+          </w:tcPr>
+          <w:p>
+            <w:pPr>
+              <w:widowControl w:val="0"/>
+              <w:numPr>
+                <w:ilvl w:val="0"/>
+                <w:numId w:val="7"/>
+              </w:numPr>
+              <w:spacing w:line="240" w:lineRule="auto"/>
+              <w:ind w:left="720" w:hanging="360"/>
+              <w:rPr>
+                <w:b w:val="1"/>
+                <w:bCs w:val="1"/>
+                <w:sz w:val="24"/>
+                <w:szCs w:val="24"/>
+              </w:rPr>
+            </w:pPr>
+            <w:r>
+              <w:rPr>
+                <w:rtl w:val="0"/>
+              </w:rPr>
+            </w:r>
+          </w:p>
+        </w:tc>
+      </w:tr>
+    </w:tbl>
+    <w:p>
+      <w:pPr>
+        <w:spacing w:line="360" w:lineRule="auto"/>
+        <w:jc w:val="both"/>
+        <w:rPr>
+          <w:sz w:val="24"/>
+          <w:szCs w:val="24"/>
+        </w:rPr>
+      </w:pPr>
+      <w:r>
+        <w:rPr>
+          <w:rtl w:val="0"/>
+        </w:rPr>
+      </w:r>
+    </w:p>
+    <w:p>
+      <w:pPr>
+        <w:spacing w:line="360" w:lineRule="auto"/>
+        <w:jc w:val="both"/>
+        <w:rPr>
+          <w:sz w:val="24"/>
+          <w:szCs w:val="24"/>
+        </w:rPr>
       </w:pPr>
       <w:r>
         <w:rPr>
@@ -7812,6 +9606,776 @@
     </w:lvl>
   </w:abstractNum>
   <w:abstractNum w:abstractNumId="9">
+    <w:lvl w:ilvl="0">
+      <w:start w:val="1"/>
+      <w:numFmt w:val="bullet"/>
+      <w:lvlText w:val="●"/>
+      <w:lvlJc w:val="left"/>
+      <w:pPr>
+        <w:ind w:left="720" w:hanging="360"/>
+      </w:pPr>
+      <w:rPr>
+        <w:u w:val="none"/>
+      </w:rPr>
+    </w:lvl>
+    <w:lvl w:ilvl="1">
+      <w:start w:val="1"/>
+      <w:numFmt w:val="bullet"/>
+      <w:lvlText w:val="○"/>
+      <w:lvlJc w:val="left"/>
+      <w:pPr>
+        <w:ind w:left="1440" w:hanging="360"/>
+      </w:pPr>
+      <w:rPr>
+        <w:u w:val="none"/>
+      </w:rPr>
+    </w:lvl>
+    <w:lvl w:ilvl="2">
+      <w:start w:val="1"/>
+      <w:numFmt w:val="bullet"/>
+      <w:lvlText w:val="■"/>
+      <w:lvlJc w:val="left"/>
+      <w:pPr>
+        <w:ind w:left="2160" w:hanging="360"/>
+      </w:pPr>
+      <w:rPr>
+        <w:u w:val="none"/>
+      </w:rPr>
+    </w:lvl>
+    <w:lvl w:ilvl="3">
+      <w:start w:val="1"/>
+      <w:numFmt w:val="bullet"/>
+      <w:lvlText w:val="●"/>
+      <w:lvlJc w:val="left"/>
+      <w:pPr>
+        <w:ind w:left="2880" w:hanging="360"/>
+      </w:pPr>
+      <w:rPr>
+        <w:u w:val="none"/>
+      </w:rPr>
+    </w:lvl>
+    <w:lvl w:ilvl="4">
+      <w:start w:val="1"/>
+      <w:numFmt w:val="bullet"/>
+      <w:lvlText w:val="○"/>
+      <w:lvlJc w:val="left"/>
+      <w:pPr>
+        <w:ind w:left="3600" w:hanging="360"/>
+      </w:pPr>
+      <w:rPr>
+        <w:u w:val="none"/>
+      </w:rPr>
+    </w:lvl>
+    <w:lvl w:ilvl="5">
+      <w:start w:val="1"/>
+      <w:numFmt w:val="bullet"/>
+      <w:lvlText w:val="■"/>
+      <w:lvlJc w:val="left"/>
+      <w:pPr>
+        <w:ind w:left="4320" w:hanging="360"/>
+      </w:pPr>
+      <w:rPr>
+        <w:u w:val="none"/>
+      </w:rPr>
+    </w:lvl>
+    <w:lvl w:ilvl="6">
+      <w:start w:val="1"/>
+      <w:numFmt w:val="bullet"/>
+      <w:lvlText w:val="●"/>
+      <w:lvlJc w:val="left"/>
+      <w:pPr>
+        <w:ind w:left="5040" w:hanging="360"/>
+      </w:pPr>
+      <w:rPr>
+        <w:u w:val="none"/>
+      </w:rPr>
+    </w:lvl>
+    <w:lvl w:ilvl="7">
+      <w:start w:val="1"/>
+      <w:numFmt w:val="bullet"/>
+      <w:lvlText w:val="○"/>
+      <w:lvlJc w:val="left"/>
+      <w:pPr>
+        <w:ind w:left="5760" w:hanging="360"/>
+      </w:pPr>
+      <w:rPr>
+        <w:u w:val="none"/>
+      </w:rPr>
+    </w:lvl>
+    <w:lvl w:ilvl="8">
+      <w:start w:val="1"/>
+      <w:numFmt w:val="bullet"/>
+      <w:lvlText w:val="■"/>
+      <w:lvlJc w:val="left"/>
+      <w:pPr>
+        <w:ind w:left="6480" w:hanging="360"/>
+      </w:pPr>
+      <w:rPr>
+        <w:u w:val="none"/>
+      </w:rPr>
+    </w:lvl>
+  </w:abstractNum>
+  <w:abstractNum w:abstractNumId="10">
+    <w:lvl w:ilvl="0">
+      <w:start w:val="1"/>
+      <w:numFmt w:val="bullet"/>
+      <w:lvlText w:val="●"/>
+      <w:lvlJc w:val="left"/>
+      <w:pPr>
+        <w:ind w:left="720" w:hanging="360"/>
+      </w:pPr>
+      <w:rPr>
+        <w:u w:val="none"/>
+      </w:rPr>
+    </w:lvl>
+    <w:lvl w:ilvl="1">
+      <w:start w:val="1"/>
+      <w:numFmt w:val="bullet"/>
+      <w:lvlText w:val="○"/>
+      <w:lvlJc w:val="left"/>
+      <w:pPr>
+        <w:ind w:left="1440" w:hanging="360"/>
+      </w:pPr>
+      <w:rPr>
+        <w:u w:val="none"/>
+      </w:rPr>
+    </w:lvl>
+    <w:lvl w:ilvl="2">
+      <w:start w:val="1"/>
+      <w:numFmt w:val="bullet"/>
+      <w:lvlText w:val="■"/>
+      <w:lvlJc w:val="left"/>
+      <w:pPr>
+        <w:ind w:left="2160" w:hanging="360"/>
+      </w:pPr>
+      <w:rPr>
+        <w:u w:val="none"/>
+      </w:rPr>
+    </w:lvl>
+    <w:lvl w:ilvl="3">
+      <w:start w:val="1"/>
+      <w:numFmt w:val="bullet"/>
+      <w:lvlText w:val="●"/>
+      <w:lvlJc w:val="left"/>
+      <w:pPr>
+        <w:ind w:left="2880" w:hanging="360"/>
+      </w:pPr>
+      <w:rPr>
+        <w:u w:val="none"/>
+      </w:rPr>
+    </w:lvl>
+    <w:lvl w:ilvl="4">
+      <w:start w:val="1"/>
+      <w:numFmt w:val="bullet"/>
+      <w:lvlText w:val="○"/>
+      <w:lvlJc w:val="left"/>
+      <w:pPr>
+        <w:ind w:left="3600" w:hanging="360"/>
+      </w:pPr>
+      <w:rPr>
+        <w:u w:val="none"/>
+      </w:rPr>
+    </w:lvl>
+    <w:lvl w:ilvl="5">
+      <w:start w:val="1"/>
+      <w:numFmt w:val="bullet"/>
+      <w:lvlText w:val="■"/>
+      <w:lvlJc w:val="left"/>
+      <w:pPr>
+        <w:ind w:left="4320" w:hanging="360"/>
+      </w:pPr>
+      <w:rPr>
+        <w:u w:val="none"/>
+      </w:rPr>
+    </w:lvl>
+    <w:lvl w:ilvl="6">
+      <w:start w:val="1"/>
+      <w:numFmt w:val="bullet"/>
+      <w:lvlText w:val="●"/>
+      <w:lvlJc w:val="left"/>
+      <w:pPr>
+        <w:ind w:left="5040" w:hanging="360"/>
+      </w:pPr>
+      <w:rPr>
+        <w:u w:val="none"/>
+      </w:rPr>
+    </w:lvl>
+    <w:lvl w:ilvl="7">
+      <w:start w:val="1"/>
+      <w:numFmt w:val="bullet"/>
+      <w:lvlText w:val="○"/>
+      <w:lvlJc w:val="left"/>
+      <w:pPr>
+        <w:ind w:left="5760" w:hanging="360"/>
+      </w:pPr>
+      <w:rPr>
+        <w:u w:val="none"/>
+      </w:rPr>
+    </w:lvl>
+    <w:lvl w:ilvl="8">
+      <w:start w:val="1"/>
+      <w:numFmt w:val="bullet"/>
+      <w:lvlText w:val="■"/>
+      <w:lvlJc w:val="left"/>
+      <w:pPr>
+        <w:ind w:left="6480" w:hanging="360"/>
+      </w:pPr>
+      <w:rPr>
+        <w:u w:val="none"/>
+      </w:rPr>
+    </w:lvl>
+  </w:abstractNum>
+  <w:abstractNum w:abstractNumId="11">
+    <w:lvl w:ilvl="0">
+      <w:start w:val="1"/>
+      <w:numFmt w:val="bullet"/>
+      <w:lvlText w:val="●"/>
+      <w:lvlJc w:val="left"/>
+      <w:pPr>
+        <w:ind w:left="720" w:hanging="360"/>
+      </w:pPr>
+      <w:rPr>
+        <w:u w:val="none"/>
+      </w:rPr>
+    </w:lvl>
+    <w:lvl w:ilvl="1">
+      <w:start w:val="1"/>
+      <w:numFmt w:val="bullet"/>
+      <w:lvlText w:val="○"/>
+      <w:lvlJc w:val="left"/>
+      <w:pPr>
+        <w:ind w:left="1440" w:hanging="360"/>
+      </w:pPr>
+      <w:rPr>
+        <w:u w:val="none"/>
+      </w:rPr>
+    </w:lvl>
+    <w:lvl w:ilvl="2">
+      <w:start w:val="1"/>
+      <w:numFmt w:val="bullet"/>
+      <w:lvlText w:val="■"/>
+      <w:lvlJc w:val="left"/>
+      <w:pPr>
+        <w:ind w:left="2160" w:hanging="360"/>
+      </w:pPr>
+      <w:rPr>
+        <w:u w:val="none"/>
+      </w:rPr>
+    </w:lvl>
+    <w:lvl w:ilvl="3">
+      <w:start w:val="1"/>
+      <w:numFmt w:val="bullet"/>
+      <w:lvlText w:val="●"/>
+      <w:lvlJc w:val="left"/>
+      <w:pPr>
+        <w:ind w:left="2880" w:hanging="360"/>
+      </w:pPr>
+      <w:rPr>
+        <w:u w:val="none"/>
+      </w:rPr>
+    </w:lvl>
+    <w:lvl w:ilvl="4">
+      <w:start w:val="1"/>
+      <w:numFmt w:val="bullet"/>
+      <w:lvlText w:val="○"/>
+      <w:lvlJc w:val="left"/>
+      <w:pPr>
+        <w:ind w:left="3600" w:hanging="360"/>
+      </w:pPr>
+      <w:rPr>
+        <w:u w:val="none"/>
+      </w:rPr>
+    </w:lvl>
+    <w:lvl w:ilvl="5">
+      <w:start w:val="1"/>
+      <w:numFmt w:val="bullet"/>
+      <w:lvlText w:val="■"/>
+      <w:lvlJc w:val="left"/>
+      <w:pPr>
+        <w:ind w:left="4320" w:hanging="360"/>
+      </w:pPr>
+      <w:rPr>
+        <w:u w:val="none"/>
+      </w:rPr>
+    </w:lvl>
+    <w:lvl w:ilvl="6">
+      <w:start w:val="1"/>
+      <w:numFmt w:val="bullet"/>
+      <w:lvlText w:val="●"/>
+      <w:lvlJc w:val="left"/>
+      <w:pPr>
+        <w:ind w:left="5040" w:hanging="360"/>
+      </w:pPr>
+      <w:rPr>
+        <w:u w:val="none"/>
+      </w:rPr>
+    </w:lvl>
+    <w:lvl w:ilvl="7">
+      <w:start w:val="1"/>
+      <w:numFmt w:val="bullet"/>
+      <w:lvlText w:val="○"/>
+      <w:lvlJc w:val="left"/>
+      <w:pPr>
+        <w:ind w:left="5760" w:hanging="360"/>
+      </w:pPr>
+      <w:rPr>
+        <w:u w:val="none"/>
+      </w:rPr>
+    </w:lvl>
+    <w:lvl w:ilvl="8">
+      <w:start w:val="1"/>
+      <w:numFmt w:val="bullet"/>
+      <w:lvlText w:val="■"/>
+      <w:lvlJc w:val="left"/>
+      <w:pPr>
+        <w:ind w:left="6480" w:hanging="360"/>
+      </w:pPr>
+      <w:rPr>
+        <w:u w:val="none"/>
+      </w:rPr>
+    </w:lvl>
+  </w:abstractNum>
+  <w:abstractNum w:abstractNumId="12">
+    <w:lvl w:ilvl="0">
+      <w:start w:val="1"/>
+      <w:numFmt w:val="bullet"/>
+      <w:lvlText w:val="●"/>
+      <w:lvlJc w:val="left"/>
+      <w:pPr>
+        <w:ind w:left="720" w:hanging="360"/>
+      </w:pPr>
+      <w:rPr>
+        <w:u w:val="none"/>
+      </w:rPr>
+    </w:lvl>
+    <w:lvl w:ilvl="1">
+      <w:start w:val="1"/>
+      <w:numFmt w:val="bullet"/>
+      <w:lvlText w:val="○"/>
+      <w:lvlJc w:val="left"/>
+      <w:pPr>
+        <w:ind w:left="1440" w:hanging="360"/>
+      </w:pPr>
+      <w:rPr>
+        <w:u w:val="none"/>
+      </w:rPr>
+    </w:lvl>
+    <w:lvl w:ilvl="2">
+      <w:start w:val="1"/>
+      <w:numFmt w:val="bullet"/>
+      <w:lvlText w:val="■"/>
+      <w:lvlJc w:val="left"/>
+      <w:pPr>
+        <w:ind w:left="2160" w:hanging="360"/>
+      </w:pPr>
+      <w:rPr>
+        <w:u w:val="none"/>
+      </w:rPr>
+    </w:lvl>
+    <w:lvl w:ilvl="3">
+      <w:start w:val="1"/>
+      <w:numFmt w:val="bullet"/>
+      <w:lvlText w:val="●"/>
+      <w:lvlJc w:val="left"/>
+      <w:pPr>
+        <w:ind w:left="2880" w:hanging="360"/>
+      </w:pPr>
+      <w:rPr>
+        <w:u w:val="none"/>
+      </w:rPr>
+    </w:lvl>
+    <w:lvl w:ilvl="4">
+      <w:start w:val="1"/>
+      <w:numFmt w:val="bullet"/>
+      <w:lvlText w:val="○"/>
+      <w:lvlJc w:val="left"/>
+      <w:pPr>
+        <w:ind w:left="3600" w:hanging="360"/>
+      </w:pPr>
+      <w:rPr>
+        <w:u w:val="none"/>
+      </w:rPr>
+    </w:lvl>
+    <w:lvl w:ilvl="5">
+      <w:start w:val="1"/>
+      <w:numFmt w:val="bullet"/>
+      <w:lvlText w:val="■"/>
+      <w:lvlJc w:val="left"/>
+      <w:pPr>
+        <w:ind w:left="4320" w:hanging="360"/>
+      </w:pPr>
+      <w:rPr>
+        <w:u w:val="none"/>
+      </w:rPr>
+    </w:lvl>
+    <w:lvl w:ilvl="6">
+      <w:start w:val="1"/>
+      <w:numFmt w:val="bullet"/>
+      <w:lvlText w:val="●"/>
+      <w:lvlJc w:val="left"/>
+      <w:pPr>
+        <w:ind w:left="5040" w:hanging="360"/>
+      </w:pPr>
+      <w:rPr>
+        <w:u w:val="none"/>
+      </w:rPr>
+    </w:lvl>
+    <w:lvl w:ilvl="7">
+      <w:start w:val="1"/>
+      <w:numFmt w:val="bullet"/>
+      <w:lvlText w:val="○"/>
+      <w:lvlJc w:val="left"/>
+      <w:pPr>
+        <w:ind w:left="5760" w:hanging="360"/>
+      </w:pPr>
+      <w:rPr>
+        <w:u w:val="none"/>
+      </w:rPr>
+    </w:lvl>
+    <w:lvl w:ilvl="8">
+      <w:start w:val="1"/>
+      <w:numFmt w:val="bullet"/>
+      <w:lvlText w:val="■"/>
+      <w:lvlJc w:val="left"/>
+      <w:pPr>
+        <w:ind w:left="6480" w:hanging="360"/>
+      </w:pPr>
+      <w:rPr>
+        <w:u w:val="none"/>
+      </w:rPr>
+    </w:lvl>
+  </w:abstractNum>
+  <w:abstractNum w:abstractNumId="13">
+    <w:lvl w:ilvl="0">
+      <w:start w:val="1"/>
+      <w:numFmt w:val="bullet"/>
+      <w:lvlText w:val="●"/>
+      <w:lvlJc w:val="left"/>
+      <w:pPr>
+        <w:ind w:left="720" w:hanging="360"/>
+      </w:pPr>
+      <w:rPr>
+        <w:u w:val="none"/>
+      </w:rPr>
+    </w:lvl>
+    <w:lvl w:ilvl="1">
+      <w:start w:val="1"/>
+      <w:numFmt w:val="bullet"/>
+      <w:lvlText w:val="○"/>
+      <w:lvlJc w:val="left"/>
+      <w:pPr>
+        <w:ind w:left="1440" w:hanging="360"/>
+      </w:pPr>
+      <w:rPr>
+        <w:u w:val="none"/>
+      </w:rPr>
+    </w:lvl>
+    <w:lvl w:ilvl="2">
+      <w:start w:val="1"/>
+      <w:numFmt w:val="bullet"/>
+      <w:lvlText w:val="■"/>
+      <w:lvlJc w:val="left"/>
+      <w:pPr>
+        <w:ind w:left="2160" w:hanging="360"/>
+      </w:pPr>
+      <w:rPr>
+        <w:u w:val="none"/>
+      </w:rPr>
+    </w:lvl>
+    <w:lvl w:ilvl="3">
+      <w:start w:val="1"/>
+      <w:numFmt w:val="bullet"/>
+      <w:lvlText w:val="●"/>
+      <w:lvlJc w:val="left"/>
+      <w:pPr>
+        <w:ind w:left="2880" w:hanging="360"/>
+      </w:pPr>
+      <w:rPr>
+        <w:u w:val="none"/>
+      </w:rPr>
+    </w:lvl>
+    <w:lvl w:ilvl="4">
+      <w:start w:val="1"/>
+      <w:numFmt w:val="bullet"/>
+      <w:lvlText w:val="○"/>
+      <w:lvlJc w:val="left"/>
+      <w:pPr>
+        <w:ind w:left="3600" w:hanging="360"/>
+      </w:pPr>
+      <w:rPr>
+        <w:u w:val="none"/>
+      </w:rPr>
+    </w:lvl>
+    <w:lvl w:ilvl="5">
+      <w:start w:val="1"/>
+      <w:numFmt w:val="bullet"/>
+      <w:lvlText w:val="■"/>
+      <w:lvlJc w:val="left"/>
+      <w:pPr>
+        <w:ind w:left="4320" w:hanging="360"/>
+      </w:pPr>
+      <w:rPr>
+        <w:u w:val="none"/>
+      </w:rPr>
+    </w:lvl>
+    <w:lvl w:ilvl="6">
+      <w:start w:val="1"/>
+      <w:numFmt w:val="bullet"/>
+      <w:lvlText w:val="●"/>
+      <w:lvlJc w:val="left"/>
+      <w:pPr>
+        <w:ind w:left="5040" w:hanging="360"/>
+      </w:pPr>
+      <w:rPr>
+        <w:u w:val="none"/>
+      </w:rPr>
+    </w:lvl>
+    <w:lvl w:ilvl="7">
+      <w:start w:val="1"/>
+      <w:numFmt w:val="bullet"/>
+      <w:lvlText w:val="○"/>
+      <w:lvlJc w:val="left"/>
+      <w:pPr>
+        <w:ind w:left="5760" w:hanging="360"/>
+      </w:pPr>
+      <w:rPr>
+        <w:u w:val="none"/>
+      </w:rPr>
+    </w:lvl>
+    <w:lvl w:ilvl="8">
+      <w:start w:val="1"/>
+      <w:numFmt w:val="bullet"/>
+      <w:lvlText w:val="■"/>
+      <w:lvlJc w:val="left"/>
+      <w:pPr>
+        <w:ind w:left="6480" w:hanging="360"/>
+      </w:pPr>
+      <w:rPr>
+        <w:u w:val="none"/>
+      </w:rPr>
+    </w:lvl>
+  </w:abstractNum>
+  <w:abstractNum w:abstractNumId="14">
+    <w:lvl w:ilvl="0">
+      <w:start w:val="1"/>
+      <w:numFmt w:val="bullet"/>
+      <w:lvlText w:val="●"/>
+      <w:lvlJc w:val="left"/>
+      <w:pPr>
+        <w:ind w:left="720" w:hanging="360"/>
+      </w:pPr>
+      <w:rPr>
+        <w:u w:val="none"/>
+      </w:rPr>
+    </w:lvl>
+    <w:lvl w:ilvl="1">
+      <w:start w:val="1"/>
+      <w:numFmt w:val="bullet"/>
+      <w:lvlText w:val="○"/>
+      <w:lvlJc w:val="left"/>
+      <w:pPr>
+        <w:ind w:left="1440" w:hanging="360"/>
+      </w:pPr>
+      <w:rPr>
+        <w:u w:val="none"/>
+      </w:rPr>
+    </w:lvl>
+    <w:lvl w:ilvl="2">
+      <w:start w:val="1"/>
+      <w:numFmt w:val="bullet"/>
+      <w:lvlText w:val="■"/>
+      <w:lvlJc w:val="left"/>
+      <w:pPr>
+        <w:ind w:left="2160" w:hanging="360"/>
+      </w:pPr>
+      <w:rPr>
+        <w:u w:val="none"/>
+      </w:rPr>
+    </w:lvl>
+    <w:lvl w:ilvl="3">
+      <w:start w:val="1"/>
+      <w:numFmt w:val="bullet"/>
+      <w:lvlText w:val="●"/>
+      <w:lvlJc w:val="left"/>
+      <w:pPr>
+        <w:ind w:left="2880" w:hanging="360"/>
+      </w:pPr>
+      <w:rPr>
+        <w:u w:val="none"/>
+      </w:rPr>
+    </w:lvl>
+    <w:lvl w:ilvl="4">
+      <w:start w:val="1"/>
+      <w:numFmt w:val="bullet"/>
+      <w:lvlText w:val="○"/>
+      <w:lvlJc w:val="left"/>
+      <w:pPr>
+        <w:ind w:left="3600" w:hanging="360"/>
+      </w:pPr>
+      <w:rPr>
+        <w:u w:val="none"/>
+      </w:rPr>
+    </w:lvl>
+    <w:lvl w:ilvl="5">
+      <w:start w:val="1"/>
+      <w:numFmt w:val="bullet"/>
+      <w:lvlText w:val="■"/>
+      <w:lvlJc w:val="left"/>
+      <w:pPr>
+        <w:ind w:left="4320" w:hanging="360"/>
+      </w:pPr>
+      <w:rPr>
+        <w:u w:val="none"/>
+      </w:rPr>
+    </w:lvl>
+    <w:lvl w:ilvl="6">
+      <w:start w:val="1"/>
+      <w:numFmt w:val="bullet"/>
+      <w:lvlText w:val="●"/>
+      <w:lvlJc w:val="left"/>
+      <w:pPr>
+        <w:ind w:left="5040" w:hanging="360"/>
+      </w:pPr>
+      <w:rPr>
+        <w:u w:val="none"/>
+      </w:rPr>
+    </w:lvl>
+    <w:lvl w:ilvl="7">
+      <w:start w:val="1"/>
+      <w:numFmt w:val="bullet"/>
+      <w:lvlText w:val="○"/>
+      <w:lvlJc w:val="left"/>
+      <w:pPr>
+        <w:ind w:left="5760" w:hanging="360"/>
+      </w:pPr>
+      <w:rPr>
+        <w:u w:val="none"/>
+      </w:rPr>
+    </w:lvl>
+    <w:lvl w:ilvl="8">
+      <w:start w:val="1"/>
+      <w:numFmt w:val="bullet"/>
+      <w:lvlText w:val="■"/>
+      <w:lvlJc w:val="left"/>
+      <w:pPr>
+        <w:ind w:left="6480" w:hanging="360"/>
+      </w:pPr>
+      <w:rPr>
+        <w:u w:val="none"/>
+      </w:rPr>
+    </w:lvl>
+  </w:abstractNum>
+  <w:abstractNum w:abstractNumId="15">
+    <w:lvl w:ilvl="0">
+      <w:start w:val="1"/>
+      <w:numFmt w:val="bullet"/>
+      <w:lvlText w:val="●"/>
+      <w:lvlJc w:val="left"/>
+      <w:pPr>
+        <w:ind w:left="720" w:hanging="360"/>
+      </w:pPr>
+      <w:rPr>
+        <w:u w:val="none"/>
+      </w:rPr>
+    </w:lvl>
+    <w:lvl w:ilvl="1">
+      <w:start w:val="1"/>
+      <w:numFmt w:val="bullet"/>
+      <w:lvlText w:val="○"/>
+      <w:lvlJc w:val="left"/>
+      <w:pPr>
+        <w:ind w:left="1440" w:hanging="360"/>
+      </w:pPr>
+      <w:rPr>
+        <w:u w:val="none"/>
+      </w:rPr>
+    </w:lvl>
+    <w:lvl w:ilvl="2">
+      <w:start w:val="1"/>
+      <w:numFmt w:val="bullet"/>
+      <w:lvlText w:val="■"/>
+      <w:lvlJc w:val="left"/>
+      <w:pPr>
+        <w:ind w:left="2160" w:hanging="360"/>
+      </w:pPr>
+      <w:rPr>
+        <w:u w:val="none"/>
+      </w:rPr>
+    </w:lvl>
+    <w:lvl w:ilvl="3">
+      <w:start w:val="1"/>
+      <w:numFmt w:val="bullet"/>
+      <w:lvlText w:val="●"/>
+      <w:lvlJc w:val="left"/>
+      <w:pPr>
+        <w:ind w:left="2880" w:hanging="360"/>
+      </w:pPr>
+      <w:rPr>
+        <w:u w:val="none"/>
+      </w:rPr>
+    </w:lvl>
+    <w:lvl w:ilvl="4">
+      <w:start w:val="1"/>
+      <w:numFmt w:val="bullet"/>
+      <w:lvlText w:val="○"/>
+      <w:lvlJc w:val="left"/>
+      <w:pPr>
+        <w:ind w:left="3600" w:hanging="360"/>
+      </w:pPr>
+      <w:rPr>
+        <w:u w:val="none"/>
+      </w:rPr>
+    </w:lvl>
+    <w:lvl w:ilvl="5">
+      <w:start w:val="1"/>
+      <w:numFmt w:val="bullet"/>
+      <w:lvlText w:val="■"/>
+      <w:lvlJc w:val="left"/>
+      <w:pPr>
+        <w:ind w:left="4320" w:hanging="360"/>
+      </w:pPr>
+      <w:rPr>
+        <w:u w:val="none"/>
+      </w:rPr>
+    </w:lvl>
+    <w:lvl w:ilvl="6">
+      <w:start w:val="1"/>
+      <w:numFmt w:val="bullet"/>
+      <w:lvlText w:val="●"/>
+      <w:lvlJc w:val="left"/>
+      <w:pPr>
+        <w:ind w:left="5040" w:hanging="360"/>
+      </w:pPr>
+      <w:rPr>
+        <w:u w:val="none"/>
+      </w:rPr>
+    </w:lvl>
+    <w:lvl w:ilvl="7">
+      <w:start w:val="1"/>
+      <w:numFmt w:val="bullet"/>
+      <w:lvlText w:val="○"/>
+      <w:lvlJc w:val="left"/>
+      <w:pPr>
+        <w:ind w:left="5760" w:hanging="360"/>
+      </w:pPr>
+      <w:rPr>
+        <w:u w:val="none"/>
+      </w:rPr>
+    </w:lvl>
+    <w:lvl w:ilvl="8">
+      <w:start w:val="1"/>
+      <w:numFmt w:val="bullet"/>
+      <w:lvlText w:val="■"/>
+      <w:lvlJc w:val="left"/>
+      <w:pPr>
+        <w:ind w:left="6480" w:hanging="360"/>
+      </w:pPr>
+      <w:rPr>
+        <w:u w:val="none"/>
+      </w:rPr>
+    </w:lvl>
+  </w:abstractNum>
+  <w:abstractNum w:abstractNumId="16">
     <w:lvl w:ilvl="0">
       <w:start w:val="1"/>
       <w:numFmt w:val="bullet"/>
@@ -7947,6 +10511,27 @@
   </w:num>
   <w:num w:numId="9">
     <w:abstractNumId w:val="9"/>
+  </w:num>
+  <w:num w:numId="10">
+    <w:abstractNumId w:val="10"/>
+  </w:num>
+  <w:num w:numId="11">
+    <w:abstractNumId w:val="11"/>
+  </w:num>
+  <w:num w:numId="12">
+    <w:abstractNumId w:val="12"/>
+  </w:num>
+  <w:num w:numId="13">
+    <w:abstractNumId w:val="13"/>
+  </w:num>
+  <w:num w:numId="14">
+    <w:abstractNumId w:val="14"/>
+  </w:num>
+  <w:num w:numId="15">
+    <w:abstractNumId w:val="15"/>
+  </w:num>
+  <w:num w:numId="16">
+    <w:abstractNumId w:val="16"/>
   </w:num>
 </w:numbering>
 </file>
@@ -8138,6 +10723,20 @@
     </w:tblPr>
   </w:style>
   <w:style w:type="table" w:styleId="Table4">
+    <w:basedOn w:val="TableNormal"/>
+    <w:tblPr>
+      <w:tblStyleRowBandSize w:val="1"/>
+      <w:tblStyleColBandSize w:val="1"/>
+    </w:tblPr>
+  </w:style>
+  <w:style w:type="table" w:styleId="Table5">
+    <w:basedOn w:val="TableNormal"/>
+    <w:tblPr>
+      <w:tblStyleRowBandSize w:val="1"/>
+      <w:tblStyleColBandSize w:val="1"/>
+    </w:tblPr>
+  </w:style>
+  <w:style w:type="table" w:styleId="Table6">
     <w:basedOn w:val="TableNormal"/>
     <w:tblPr>
       <w:tblStyleRowBandSize w:val="1"/>

</xml_diff>

<commit_message>
Colocando a tabela do Gabriel com os dados completos.
</commit_message>
<xml_diff>
--- a/sleep_street.docx
+++ b/sleep_street.docx
@@ -604,17 +604,17 @@
           <w:szCs w:val="24"/>
           <w:rtl w:val="0"/>
         </w:rPr>
-        <w:t xml:space="preserve">Cadastro e autenticação segura com validação obrigatória de maioridade (+18).Gerenciamento completo de viagens (lazer ou negócios) com estipulação de teto or</w:t>
-      </w:r>
-      <w:r>
-        <w:rPr>
-          <w:b w:val="1"/>
-          <w:bCs w:val="1"/>
-          <w:sz w:val="24"/>
-          <w:szCs w:val="24"/>
-          <w:rtl w:val="0"/>
-        </w:rPr>
-        <w:t xml:space="preserve"> por período. </w:t>
+        <w:t xml:space="preserve">Cadastro e autenticação segura com validação obrigatória de maioridade (+18).Gerenciamento completo de viagens (lazer ou negócios) com estipulação de teto por</w:t>
+      </w:r>
+      <w:r>
+        <w:rPr>
+          <w:b w:val="1"/>
+          <w:bCs w:val="1"/>
+          <w:sz w:val="24"/>
+          <w:szCs w:val="24"/>
+          <w:rtl w:val="0"/>
+        </w:rPr>
+        <w:t xml:space="preserve"> período. </w:t>
       </w:r>
     </w:p>
     <w:p>
@@ -662,7 +662,7 @@
           <w:szCs w:val="24"/>
           <w:rtl w:val="0"/>
         </w:rPr>
-        <w:t xml:space="preserve">RF04 - - Registro Financeiro e Consolidação de Despesas: Permitir o lançamento categorizado de gasto (transporte, hospedagem, alimentação, passeios) e calcular automaticamente o saldo do orçamento. </w:t>
+        <w:t xml:space="preserve">RF04– Registro Financeiro e Consolidação de Despesas: Permitir o lançamento categorizado de gasto (transporte, hospedagem, alimentação, passeios) e calcular automaticamente o saldo do orçamento. </w:t>
       </w:r>
     </w:p>
     <w:p>
@@ -913,7 +913,7 @@
           <w:szCs w:val="24"/>
           <w:rtl w:val="0"/>
         </w:rPr>
-        <w:t xml:space="preserve">descrição: O sistema deve permitir o cadastro e autenticação de usuários via e-mail e senha, validando rigorosamente a idade do viajante para autorizar viagens solo apenas a maiores de 18 anos. </w:t>
+        <w:t xml:space="preserve">descrição: O sistema deve permitir o cadastro autenticação de usuários via e-mail e senha, validando rigorosamente a idade do viajante para autorizar viagens solo apenas a maiores de 18 anos. </w:t>
       </w:r>
     </w:p>
     <w:p>
@@ -1381,8 +1381,8 @@
         <w:spacing w:before="12.921142578125" w:line="264.3717384338379" w:lineRule="auto"/>
         <w:ind w:left="982.9473876953125" w:right="45.054931640625" w:hanging="341.2800598144531"/>
         <w:rPr>
-          <w:sz w:val="24"/>
-          <w:szCs w:val="24"/>
+          <w:b w:val="1"/>
+          <w:bCs w:val="1"/>
         </w:rPr>
       </w:pPr>
       <w:r>
@@ -1409,45 +1409,7 @@
           <w:szCs w:val="24"/>
           <w:rtl w:val="0"/>
         </w:rPr>
-        <w:t xml:space="preserve">O sistema não deve perder as configurações e locais salvos como favoritos ao alterar ou editar os parâmetros da viagem. </w:t>
-      </w:r>
-    </w:p>
-    <w:p>
-      <w:pPr>
-        <w:widowControl w:val="0"/>
-        <w:spacing w:before="252.921142578125" w:line="240" w:lineRule="auto"/>
-        <w:ind w:left="999.747314453125" w:firstLine="0"/>
-        <w:rPr>
-          <w:sz w:val="24"/>
-          <w:szCs w:val="24"/>
-        </w:rPr>
-      </w:pPr>
-      <w:r>
-        <w:rPr>
-          <w:sz w:val="24"/>
-          <w:szCs w:val="24"/>
-          <w:rtl w:val="0"/>
-        </w:rPr>
-        <w:t xml:space="preserve">RF </w:t>
-      </w:r>
-    </w:p>
-    <w:p>
-      <w:pPr>
-        <w:widowControl w:val="0"/>
-        <w:spacing w:before="834.6661376953125" w:line="265.4048538208008" w:lineRule="auto"/>
-        <w:ind w:left="521.1659240722656" w:right="1607.5396728515625" w:hanging="260.3785705566406"/>
-        <w:rPr>
-          <w:b w:val="1"/>
-          <w:bCs w:val="1"/>
-        </w:rPr>
-      </w:pPr>
-      <w:r>
-        <w:rPr>
-          <w:sz w:val="24"/>
-          <w:szCs w:val="24"/>
-          <w:rtl w:val="0"/>
-        </w:rPr>
-        <w:t xml:space="preserve"> </w:t>
+        <w:t xml:space="preserve">O sistema não deve perder as configurações e locais salvos como favoritos ao alterar ou editar os parâmetros da viagem.  </w:t>
       </w:r>
       <w:r>
         <w:rPr>
@@ -1473,10 +1435,7 @@
         <w:widowControl w:val="0"/>
         <w:spacing w:before="5.438232421875" w:line="264.3739700317383" w:lineRule="auto"/>
         <w:ind w:left="996.4073181152344" w:right="248.857421875" w:hanging="356.4799499511719"/>
-        <w:rPr>
-          <w:b w:val="1"/>
-          <w:bCs w:val="1"/>
-        </w:rPr>
+        <w:rPr/>
       </w:pPr>
       <w:r>
         <w:rPr>
@@ -1492,19 +1451,10 @@
         </w:rPr>
         <w:t xml:space="preserve">Descrição: O sistema deve realizar buscas e sugerir restaurantes, mercados, hospedagens e atrações próximos, </w:t>
       </w:r>
-    </w:p>
-    <w:p>
-      <w:pPr>
-        <w:widowControl w:val="0"/>
-        <w:spacing w:before="11.8450927734375" w:line="240" w:lineRule="auto"/>
-        <w:ind w:left="639.9273681640625" w:firstLine="0"/>
-        <w:rPr/>
-      </w:pPr>
-      <w:r>
-        <w:rPr>
-          <w:rtl w:val="0"/>
-        </w:rPr>
-        <w:t xml:space="preserve">● </w:t>
+      <w:r>
+        <w:rPr>
+          <w:rtl w:val="0"/>
+        </w:rPr>
       </w:r>
     </w:p>
     <w:p>
@@ -1521,15 +1471,15 @@
         <w:rPr>
           <w:rtl w:val="0"/>
         </w:rPr>
-        <w:t xml:space="preserve">● </w:t>
-      </w:r>
-      <w:r>
-        <w:rPr>
-          <w:b w:val="1"/>
-          <w:bCs w:val="1"/>
-          <w:rtl w:val="0"/>
-        </w:rPr>
-        <w:t xml:space="preserve">filtrados pela faixa de preço informada e melhor avaliação. </w:t>
+        <w:t xml:space="preserve"> ● </w:t>
+      </w:r>
+      <w:r>
+        <w:rPr>
+          <w:b w:val="1"/>
+          <w:bCs w:val="1"/>
+          <w:rtl w:val="0"/>
+        </w:rPr>
+        <w:t xml:space="preserve">filtrados pela faixa de preço          informada e melhor avaliação. </w:t>
       </w:r>
     </w:p>
     <w:p>
@@ -1546,6 +1496,12 @@
         <w:rPr>
           <w:rtl w:val="0"/>
         </w:rPr>
+        <w:t xml:space="preserve"> </w:t>
+      </w:r>
+      <w:r>
+        <w:rPr>
+          <w:rtl w:val="0"/>
+        </w:rPr>
         <w:t xml:space="preserve">● </w:t>
       </w:r>
       <w:r>
@@ -1573,7 +1529,7 @@
           <w:bCs w:val="1"/>
           <w:rtl w:val="0"/>
         </w:rPr>
-        <w:t xml:space="preserve">● Desejável sim estável </w:t>
+        <w:t xml:space="preserve"> ● Desejável sim estável </w:t>
       </w:r>
     </w:p>
     <w:p>
@@ -1592,7 +1548,7 @@
           <w:bCs w:val="1"/>
           <w:rtl w:val="0"/>
         </w:rPr>
-        <w:t xml:space="preserve">● RFN 03.01:O algoritmo de sugestão de estabelecimentos deve retornar os resultados formatados em um tempo máximo de 2,0 segundos sob carga normal. </w:t>
+        <w:t xml:space="preserve"> ● RFN 03.01:O algoritmo de sugestão de estabelecimentos deve retornar os resultados formatados em um tempo máximo de 2,0 segundos sob carga normal. </w:t>
       </w:r>
     </w:p>
     <w:p>
@@ -1611,7 +1567,7 @@
           <w:bCs w:val="1"/>
           <w:rtl w:val="0"/>
         </w:rPr>
-        <w:t xml:space="preserve">● RFN 03.02:A busca geolocalizada deve restringir a exibição de locais turísticos a um raio máximo personalizável de até 15 km da hospedagem para evitar distâncias excessivas. </w:t>
+        <w:t xml:space="preserve"> ● RFN 03.02:A busca geolocalizada deve restringir a exibição de locais turísticos a um raio máximo personalizável de até 15 km da hospedagem para evitar distâncias excessivas. </w:t>
       </w:r>
     </w:p>
     <w:p>
@@ -1636,7 +1592,7 @@
           <w:bCs w:val="1"/>
           <w:rtl w:val="0"/>
         </w:rPr>
-        <w:t xml:space="preserve">● RFN 03.03:O sistema deve garantir precisão de 100% na categorização dos filtros de preço estipulados pelo usuário</w:t>
+        <w:t xml:space="preserve"> ● RFN 03.03:O sistema deve garantir precisão de 100% na categorização dos filtros de preço estipulados pelo usuário.</w:t>
       </w:r>
     </w:p>
     <w:p>
@@ -1924,6 +1880,25 @@
               </w:rPr>
               <w:t xml:space="preserve">Nome </w:t>
             </w:r>
+            <w:hyperlink r:id="rId7">
+              <w:r>
+                <w:rPr>
+                  <w:b w:val="1"/>
+                  <w:bCs w:val="1"/>
+                  <w:color w:val="0000ee"/>
+                  <w:sz w:val="24"/>
+                  <w:szCs w:val="24"/>
+                  <w:u w:val="single"/>
+                  <w:rtl w:val="0"/>
+                </w:rPr>
+                <w:t xml:space="preserve">Emanuel Carvalho correria</w:t>
+              </w:r>
+            </w:hyperlink>
+            <w:r>
+              <w:rPr>
+                <w:rtl w:val="0"/>
+              </w:rPr>
+            </w:r>
           </w:p>
         </w:tc>
         <w:tc>
@@ -2905,7 +2880,7 @@
                 <w:szCs w:val="24"/>
                 <w:rtl w:val="0"/>
               </w:rPr>
-              <w:t xml:space="preserve">Nome </w:t>
+              <w:t xml:space="preserve">Nome : Daniel Moreira </w:t>
             </w:r>
           </w:p>
         </w:tc>
@@ -4030,7 +4005,7 @@
               <w:widowControl w:val="0"/>
               <w:numPr>
                 <w:ilvl w:val="0"/>
-                <w:numId w:val="10"/>
+                <w:numId w:val="6"/>
               </w:numPr>
               <w:spacing w:line="240" w:lineRule="auto"/>
               <w:ind w:left="720" w:hanging="360"/>
@@ -4054,7 +4029,7 @@
               <w:widowControl w:val="0"/>
               <w:numPr>
                 <w:ilvl w:val="0"/>
-                <w:numId w:val="10"/>
+                <w:numId w:val="6"/>
               </w:numPr>
               <w:spacing w:line="240" w:lineRule="auto"/>
               <w:ind w:left="720" w:hanging="360"/>
@@ -4145,7 +4120,7 @@
               <w:widowControl w:val="0"/>
               <w:numPr>
                 <w:ilvl w:val="0"/>
-                <w:numId w:val="4"/>
+                <w:numId w:val="3"/>
               </w:numPr>
               <w:spacing w:line="240" w:lineRule="auto"/>
               <w:ind w:left="720" w:hanging="360"/>
@@ -4169,7 +4144,7 @@
               <w:widowControl w:val="0"/>
               <w:numPr>
                 <w:ilvl w:val="0"/>
-                <w:numId w:val="4"/>
+                <w:numId w:val="3"/>
               </w:numPr>
               <w:spacing w:line="240" w:lineRule="auto"/>
               <w:ind w:left="720" w:hanging="360"/>
@@ -4193,7 +4168,7 @@
               <w:widowControl w:val="0"/>
               <w:numPr>
                 <w:ilvl w:val="0"/>
-                <w:numId w:val="4"/>
+                <w:numId w:val="3"/>
               </w:numPr>
               <w:spacing w:line="240" w:lineRule="auto"/>
               <w:ind w:left="720" w:hanging="360"/>
@@ -4217,7 +4192,7 @@
               <w:widowControl w:val="0"/>
               <w:numPr>
                 <w:ilvl w:val="0"/>
-                <w:numId w:val="4"/>
+                <w:numId w:val="3"/>
               </w:numPr>
               <w:spacing w:line="240" w:lineRule="auto"/>
               <w:ind w:left="720" w:hanging="360"/>
@@ -4308,7 +4283,7 @@
               <w:widowControl w:val="0"/>
               <w:numPr>
                 <w:ilvl w:val="0"/>
-                <w:numId w:val="3"/>
+                <w:numId w:val="2"/>
               </w:numPr>
               <w:spacing w:line="240" w:lineRule="auto"/>
               <w:ind w:left="720" w:hanging="360"/>
@@ -4324,7 +4299,7 @@
                 <w:szCs w:val="24"/>
                 <w:rtl w:val="0"/>
               </w:rPr>
-              <w:t xml:space="preserve"> 1. O usuário preenche um cadastro (nome, e-mail, senha forte) é válida idade 18+.</w:t>
+              <w:t xml:space="preserve">1.O usuário preenche um cadastro (nome, e-mail, senha forte) é válida idade 18+.</w:t>
             </w:r>
           </w:p>
           <w:p>
@@ -4332,7 +4307,7 @@
               <w:widowControl w:val="0"/>
               <w:numPr>
                 <w:ilvl w:val="0"/>
-                <w:numId w:val="3"/>
+                <w:numId w:val="2"/>
               </w:numPr>
               <w:spacing w:line="240" w:lineRule="auto"/>
               <w:ind w:left="720" w:hanging="360"/>
@@ -4356,7 +4331,7 @@
               <w:widowControl w:val="0"/>
               <w:numPr>
                 <w:ilvl w:val="0"/>
-                <w:numId w:val="3"/>
+                <w:numId w:val="2"/>
               </w:numPr>
               <w:spacing w:line="240" w:lineRule="auto"/>
               <w:ind w:left="720" w:hanging="360"/>
@@ -4380,7 +4355,7 @@
               <w:widowControl w:val="0"/>
               <w:numPr>
                 <w:ilvl w:val="0"/>
-                <w:numId w:val="3"/>
+                <w:numId w:val="2"/>
               </w:numPr>
               <w:spacing w:line="240" w:lineRule="auto"/>
               <w:ind w:left="720" w:hanging="360"/>
@@ -4404,7 +4379,7 @@
               <w:widowControl w:val="0"/>
               <w:numPr>
                 <w:ilvl w:val="0"/>
-                <w:numId w:val="3"/>
+                <w:numId w:val="2"/>
               </w:numPr>
               <w:spacing w:line="240" w:lineRule="auto"/>
               <w:ind w:left="720" w:hanging="360"/>
@@ -4428,7 +4403,7 @@
               <w:widowControl w:val="0"/>
               <w:numPr>
                 <w:ilvl w:val="0"/>
-                <w:numId w:val="3"/>
+                <w:numId w:val="2"/>
               </w:numPr>
               <w:spacing w:line="240" w:lineRule="auto"/>
               <w:ind w:left="720" w:hanging="360"/>
@@ -4520,7 +4495,7 @@
               <w:widowControl w:val="0"/>
               <w:numPr>
                 <w:ilvl w:val="0"/>
-                <w:numId w:val="15"/>
+                <w:numId w:val="10"/>
               </w:numPr>
               <w:spacing w:line="240" w:lineRule="auto"/>
               <w:ind w:left="720" w:hanging="360"/>
@@ -4560,7 +4535,7 @@
               <w:widowControl w:val="0"/>
               <w:numPr>
                 <w:ilvl w:val="0"/>
-                <w:numId w:val="5"/>
+                <w:numId w:val="4"/>
               </w:numPr>
               <w:spacing w:line="240" w:lineRule="auto"/>
               <w:ind w:left="720" w:hanging="360"/>
@@ -4576,7 +4551,7 @@
                 <w:szCs w:val="24"/>
                 <w:rtl w:val="0"/>
               </w:rPr>
-              <w:t xml:space="preserve">  FA02 - Usuário clica em "Cancelar": exibe confirmação.</w:t>
+              <w:t xml:space="preserve"> FA02 - Usuário clica em "Cancelar": exibe confirmação.</w:t>
             </w:r>
           </w:p>
           <w:p>
@@ -4599,7 +4574,7 @@
               <w:widowControl w:val="0"/>
               <w:numPr>
                 <w:ilvl w:val="0"/>
-                <w:numId w:val="15"/>
+                <w:numId w:val="10"/>
               </w:numPr>
               <w:spacing w:line="240" w:lineRule="auto"/>
               <w:ind w:left="720" w:hanging="360"/>
@@ -4706,7 +4681,7 @@
               <w:widowControl w:val="0"/>
               <w:numPr>
                 <w:ilvl w:val="0"/>
-                <w:numId w:val="9"/>
+                <w:numId w:val="5"/>
               </w:numPr>
               <w:spacing w:line="240" w:lineRule="auto"/>
               <w:ind w:left="720" w:hanging="360"/>
@@ -4746,7 +4721,7 @@
               <w:widowControl w:val="0"/>
               <w:numPr>
                 <w:ilvl w:val="0"/>
-                <w:numId w:val="9"/>
+                <w:numId w:val="5"/>
               </w:numPr>
               <w:spacing w:line="240" w:lineRule="auto"/>
               <w:ind w:left="720" w:hanging="360"/>
@@ -4786,7 +4761,7 @@
               <w:widowControl w:val="0"/>
               <w:numPr>
                 <w:ilvl w:val="0"/>
-                <w:numId w:val="9"/>
+                <w:numId w:val="5"/>
               </w:numPr>
               <w:spacing w:line="240" w:lineRule="auto"/>
               <w:ind w:left="720" w:hanging="360"/>
@@ -4826,7 +4801,7 @@
               <w:widowControl w:val="0"/>
               <w:numPr>
                 <w:ilvl w:val="0"/>
-                <w:numId w:val="9"/>
+                <w:numId w:val="5"/>
               </w:numPr>
               <w:spacing w:line="240" w:lineRule="auto"/>
               <w:ind w:left="720" w:hanging="360"/>
@@ -4918,7 +4893,7 @@
               <w:widowControl w:val="0"/>
               <w:numPr>
                 <w:ilvl w:val="0"/>
-                <w:numId w:val="2"/>
+                <w:numId w:val="1"/>
               </w:numPr>
               <w:spacing w:line="240" w:lineRule="auto"/>
               <w:ind w:left="720" w:hanging="360"/>
@@ -4938,7 +4913,7 @@
                 <w:szCs w:val="24"/>
                 <w:rtl w:val="0"/>
               </w:rPr>
-              <w:t xml:space="preserve">- RN01 - Cadastro só para maiores de 18 anos.</w:t>
+              <w:t xml:space="preserve">- RN01 - Cadastro só para maiores de 18 anos;</w:t>
             </w:r>
           </w:p>
           <w:p>
@@ -4946,7 +4921,7 @@
               <w:widowControl w:val="0"/>
               <w:numPr>
                 <w:ilvl w:val="0"/>
-                <w:numId w:val="2"/>
+                <w:numId w:val="1"/>
               </w:numPr>
               <w:spacing w:line="240" w:lineRule="auto"/>
               <w:ind w:left="720" w:hanging="360"/>
@@ -4960,8 +4935,13 @@
             </w:pPr>
             <w:r>
               <w:rPr>
-                <w:rtl w:val="0"/>
-              </w:rPr>
+                <w:b w:val="1"/>
+                <w:bCs w:val="1"/>
+                <w:sz w:val="24"/>
+                <w:szCs w:val="24"/>
+                <w:rtl w:val="0"/>
+              </w:rPr>
+              <w:t xml:space="preserve">- RN02 - Senhas devem ter no mínimo 8 caracteres, 1 número e 1 caractere especial;</w:t>
             </w:r>
           </w:p>
           <w:p>
@@ -4969,7 +4949,7 @@
               <w:widowControl w:val="0"/>
               <w:numPr>
                 <w:ilvl w:val="0"/>
-                <w:numId w:val="2"/>
+                <w:numId w:val="1"/>
               </w:numPr>
               <w:spacing w:line="240" w:lineRule="auto"/>
               <w:ind w:left="720" w:hanging="360"/>
@@ -4989,7 +4969,7 @@
                 <w:szCs w:val="24"/>
                 <w:rtl w:val="0"/>
               </w:rPr>
-              <w:t xml:space="preserve">- RN02 - Senhas devem ter no mínimo 8 caracteres, 1 número e 1 caractere especial.</w:t>
+              <w:t xml:space="preserve">- RN03 - Uma viagem deve ter data de início e fim;</w:t>
             </w:r>
           </w:p>
           <w:p>
@@ -4997,7 +4977,7 @@
               <w:widowControl w:val="0"/>
               <w:numPr>
                 <w:ilvl w:val="0"/>
-                <w:numId w:val="2"/>
+                <w:numId w:val="1"/>
               </w:numPr>
               <w:spacing w:line="240" w:lineRule="auto"/>
               <w:ind w:left="720" w:hanging="360"/>
@@ -5017,7 +4997,7 @@
                 <w:szCs w:val="24"/>
                 <w:rtl w:val="0"/>
               </w:rPr>
-              <w:t xml:space="preserve">- RN03 - Uma viagem deve ter data de início e fim.</w:t>
+              <w:t xml:space="preserve">- RN04 - O orçamento total não pode ser negativo;</w:t>
             </w:r>
           </w:p>
           <w:p>
@@ -5025,7 +5005,7 @@
               <w:widowControl w:val="0"/>
               <w:numPr>
                 <w:ilvl w:val="0"/>
-                <w:numId w:val="2"/>
+                <w:numId w:val="1"/>
               </w:numPr>
               <w:spacing w:line="240" w:lineRule="auto"/>
               <w:ind w:left="720" w:hanging="360"/>
@@ -5045,7 +5025,7 @@
                 <w:szCs w:val="24"/>
                 <w:rtl w:val="0"/>
               </w:rPr>
-              <w:t xml:space="preserve">- RN04 - O orçamento total não pode ser negativo.</w:t>
+              <w:t xml:space="preserve">- RN05 - Custo por categoria deve ser somado automaticamente;</w:t>
             </w:r>
           </w:p>
           <w:p>
@@ -5053,7 +5033,7 @@
               <w:widowControl w:val="0"/>
               <w:numPr>
                 <w:ilvl w:val="0"/>
-                <w:numId w:val="2"/>
+                <w:numId w:val="1"/>
               </w:numPr>
               <w:spacing w:line="240" w:lineRule="auto"/>
               <w:ind w:left="720" w:hanging="360"/>
@@ -5073,7 +5053,7 @@
                 <w:szCs w:val="24"/>
                 <w:rtl w:val="0"/>
               </w:rPr>
-              <w:t xml:space="preserve">- RN05 - Custo por categoria deve ser somado automaticamente.</w:t>
+              <w:t xml:space="preserve">- RN06 - O tipo de viagem influencia todas as sugestões e bagagem;</w:t>
             </w:r>
           </w:p>
           <w:p>
@@ -5081,35 +5061,7 @@
               <w:widowControl w:val="0"/>
               <w:numPr>
                 <w:ilvl w:val="0"/>
-                <w:numId w:val="2"/>
-              </w:numPr>
-              <w:spacing w:line="240" w:lineRule="auto"/>
-              <w:ind w:left="720" w:hanging="360"/>
-              <w:rPr>
-                <w:b w:val="1"/>
-                <w:bCs w:val="1"/>
-                <w:sz w:val="24"/>
-                <w:szCs w:val="24"/>
-                <w:u w:val="none"/>
-              </w:rPr>
-            </w:pPr>
-            <w:r>
-              <w:rPr>
-                <w:b w:val="1"/>
-                <w:bCs w:val="1"/>
-                <w:sz w:val="24"/>
-                <w:szCs w:val="24"/>
-                <w:rtl w:val="0"/>
-              </w:rPr>
-              <w:t xml:space="preserve">- RN06 - O tipo de viagem influencia todas as sugestões e bagagem.</w:t>
-            </w:r>
-          </w:p>
-          <w:p>
-            <w:pPr>
-              <w:widowControl w:val="0"/>
-              <w:numPr>
-                <w:ilvl w:val="0"/>
-                <w:numId w:val="2"/>
+                <w:numId w:val="1"/>
               </w:numPr>
               <w:spacing w:line="240" w:lineRule="auto"/>
               <w:ind w:left="720" w:hanging="360"/>
@@ -5148,6 +5100,24 @@
         <w:rPr>
           <w:rtl w:val="0"/>
         </w:rPr>
+      </w:r>
+    </w:p>
+    <w:p>
+      <w:pPr>
+        <w:spacing w:line="360" w:lineRule="auto"/>
+        <w:jc w:val="both"/>
+        <w:rPr>
+          <w:sz w:val="24"/>
+          <w:szCs w:val="24"/>
+        </w:rPr>
+      </w:pPr>
+      <w:r>
+        <w:rPr>
+          <w:sz w:val="24"/>
+          <w:szCs w:val="24"/>
+          <w:rtl w:val="0"/>
+        </w:rPr>
+        <w:t xml:space="preserve">-</w:t>
       </w:r>
     </w:p>
     <w:p>
@@ -5220,7 +5190,7 @@
                 <w:szCs w:val="24"/>
                 <w:rtl w:val="0"/>
               </w:rPr>
-              <w:t xml:space="preserve">CASO DE USO EXPANDIDO - 001</w:t>
+              <w:t xml:space="preserve">CASO DE USO EXPANDIDO - 002</w:t>
             </w:r>
           </w:p>
         </w:tc>
@@ -5570,7 +5540,7 @@
             <w:pPr>
               <w:numPr>
                 <w:ilvl w:val="0"/>
-                <w:numId w:val="13"/>
+                <w:numId w:val="9"/>
               </w:numPr>
               <w:ind w:left="720" w:hanging="360"/>
               <w:rPr>
@@ -5581,14 +5551,14 @@
               <w:rPr>
                 <w:rtl w:val="0"/>
               </w:rPr>
-              <w:t xml:space="preserve">1. Durante a viagem, o usuário clica em "Problemas" no card do local.</w:t>
+              <w:t xml:space="preserve">1. Durante a viagem, o usuário clica em "Problemas" no card local.</w:t>
             </w:r>
           </w:p>
           <w:p>
             <w:pPr>
               <w:numPr>
                 <w:ilvl w:val="0"/>
-                <w:numId w:val="13"/>
+                <w:numId w:val="9"/>
               </w:numPr>
               <w:ind w:left="720" w:hanging="360"/>
               <w:rPr>
@@ -5606,7 +5576,7 @@
             <w:pPr>
               <w:numPr>
                 <w:ilvl w:val="0"/>
-                <w:numId w:val="13"/>
+                <w:numId w:val="9"/>
               </w:numPr>
               <w:ind w:left="720" w:hanging="360"/>
               <w:rPr>
@@ -5624,7 +5594,7 @@
             <w:pPr>
               <w:numPr>
                 <w:ilvl w:val="0"/>
-                <w:numId w:val="13"/>
+                <w:numId w:val="9"/>
               </w:numPr>
               <w:ind w:left="720" w:hanging="360"/>
               <w:rPr>
@@ -5642,7 +5612,7 @@
             <w:pPr>
               <w:numPr>
                 <w:ilvl w:val="0"/>
-                <w:numId w:val="13"/>
+                <w:numId w:val="9"/>
               </w:numPr>
               <w:ind w:left="720" w:hanging="360"/>
               <w:rPr>
@@ -5660,7 +5630,7 @@
             <w:pPr>
               <w:numPr>
                 <w:ilvl w:val="0"/>
-                <w:numId w:val="13"/>
+                <w:numId w:val="9"/>
               </w:numPr>
               <w:ind w:left="720" w:hanging="360"/>
               <w:rPr>
@@ -5678,7 +5648,7 @@
             <w:pPr>
               <w:numPr>
                 <w:ilvl w:val="0"/>
-                <w:numId w:val="13"/>
+                <w:numId w:val="9"/>
               </w:numPr>
               <w:ind w:left="720" w:hanging="360"/>
               <w:rPr>
@@ -5696,7 +5666,7 @@
             <w:pPr>
               <w:numPr>
                 <w:ilvl w:val="0"/>
-                <w:numId w:val="13"/>
+                <w:numId w:val="9"/>
               </w:numPr>
               <w:ind w:left="720" w:hanging="360"/>
               <w:rPr>
@@ -5714,7 +5684,7 @@
             <w:pPr>
               <w:numPr>
                 <w:ilvl w:val="0"/>
-                <w:numId w:val="13"/>
+                <w:numId w:val="9"/>
               </w:numPr>
               <w:ind w:left="720" w:hanging="360"/>
               <w:rPr>
@@ -5732,7 +5702,7 @@
             <w:pPr>
               <w:numPr>
                 <w:ilvl w:val="0"/>
-                <w:numId w:val="13"/>
+                <w:numId w:val="9"/>
               </w:numPr>
               <w:ind w:left="720" w:hanging="360"/>
               <w:rPr>
@@ -5844,7 +5814,7 @@
               <w:widowControl w:val="0"/>
               <w:numPr>
                 <w:ilvl w:val="0"/>
-                <w:numId w:val="11"/>
+                <w:numId w:val="7"/>
               </w:numPr>
               <w:spacing w:line="240" w:lineRule="auto"/>
               <w:ind w:left="720" w:hanging="360"/>
@@ -5893,7 +5863,7 @@
               <w:widowControl w:val="0"/>
               <w:numPr>
                 <w:ilvl w:val="0"/>
-                <w:numId w:val="11"/>
+                <w:numId w:val="7"/>
               </w:numPr>
               <w:spacing w:line="240" w:lineRule="auto"/>
               <w:ind w:left="720" w:hanging="360"/>
@@ -6014,7 +5984,7 @@
               <w:widowControl w:val="0"/>
               <w:numPr>
                 <w:ilvl w:val="0"/>
-                <w:numId w:val="12"/>
+                <w:numId w:val="8"/>
               </w:numPr>
               <w:spacing w:line="240" w:lineRule="auto"/>
               <w:ind w:left="720" w:hanging="360"/>
@@ -6063,7 +6033,7 @@
               <w:widowControl w:val="0"/>
               <w:numPr>
                 <w:ilvl w:val="0"/>
-                <w:numId w:val="12"/>
+                <w:numId w:val="8"/>
               </w:numPr>
               <w:spacing w:line="240" w:lineRule="auto"/>
               <w:ind w:left="720" w:hanging="360"/>
@@ -6132,7 +6102,7 @@
               <w:widowControl w:val="0"/>
               <w:numPr>
                 <w:ilvl w:val="0"/>
-                <w:numId w:val="16"/>
+                <w:numId w:val="11"/>
               </w:numPr>
               <w:spacing w:line="240" w:lineRule="auto"/>
               <w:ind w:left="720" w:hanging="360"/>
@@ -6192,7 +6162,7 @@
               <w:widowControl w:val="0"/>
               <w:numPr>
                 <w:ilvl w:val="0"/>
-                <w:numId w:val="16"/>
+                <w:numId w:val="11"/>
               </w:numPr>
               <w:spacing w:line="240" w:lineRule="auto"/>
               <w:ind w:left="720" w:hanging="360"/>
@@ -6230,130 +6200,49 @@
     </w:tbl>
     <w:p>
       <w:pPr>
+        <w:rPr>
+          <w:sz w:val="24"/>
+          <w:szCs w:val="24"/>
+        </w:rPr>
+      </w:pPr>
+      <w:r>
+        <w:rPr>
+          <w:sz w:val="24"/>
+          <w:szCs w:val="24"/>
+          <w:rtl w:val="0"/>
+        </w:rPr>
+        <w:t xml:space="preserve">- </w:t>
+      </w:r>
+    </w:p>
+    <w:p>
+      <w:pPr>
+        <w:rPr>
+          <w:sz w:val="24"/>
+          <w:szCs w:val="24"/>
+        </w:rPr>
+      </w:pPr>
+      <w:r>
+        <w:rPr>
+          <w:rtl w:val="0"/>
+        </w:rPr>
+      </w:r>
+    </w:p>
+    <w:p>
+      <w:pPr>
         <w:spacing w:line="360" w:lineRule="auto"/>
         <w:jc w:val="both"/>
-        <w:rPr>
-          <w:sz w:val="24"/>
-          <w:szCs w:val="24"/>
-        </w:rPr>
-      </w:pPr>
-      <w:r>
-        <w:rPr>
-          <w:rtl w:val="0"/>
-        </w:rPr>
-      </w:r>
-    </w:p>
-    <w:p>
-      <w:pPr>
         <w:rPr/>
       </w:pPr>
       <w:r>
         <w:rPr>
           <w:rtl w:val="0"/>
         </w:rPr>
-      </w:r>
-    </w:p>
-    <w:p>
-      <w:pPr>
-        <w:rPr/>
-      </w:pPr>
-      <w:r>
-        <w:rPr>
-          <w:rtl w:val="0"/>
-        </w:rPr>
-      </w:r>
-    </w:p>
-    <w:p>
-      <w:pPr>
-        <w:rPr/>
-      </w:pPr>
-      <w:r>
-        <w:rPr>
-          <w:rtl w:val="0"/>
-        </w:rPr>
-      </w:r>
-    </w:p>
-    <w:p>
-      <w:pPr>
-        <w:rPr/>
-      </w:pPr>
-      <w:r>
-        <w:rPr>
-          <w:rtl w:val="0"/>
-        </w:rPr>
-      </w:r>
-    </w:p>
-    <w:p>
-      <w:pPr>
-        <w:rPr/>
-      </w:pPr>
-      <w:r>
-        <w:rPr>
-          <w:rtl w:val="0"/>
-        </w:rPr>
-      </w:r>
-    </w:p>
-    <w:p>
-      <w:pPr>
-        <w:rPr/>
-      </w:pPr>
-      <w:r>
-        <w:rPr>
-          <w:rtl w:val="0"/>
-        </w:rPr>
-      </w:r>
-    </w:p>
-    <w:p>
-      <w:pPr>
-        <w:rPr/>
-      </w:pPr>
-      <w:r>
-        <w:rPr>
-          <w:rtl w:val="0"/>
-        </w:rPr>
-      </w:r>
-    </w:p>
-    <w:p>
-      <w:pPr>
-        <w:rPr/>
-      </w:pPr>
-      <w:r>
-        <w:rPr>
-          <w:rtl w:val="0"/>
-        </w:rPr>
-        <w:tab/>
-        <w:t xml:space="preserve"> </w:t>
-        <w:tab/>
-      </w:r>
-    </w:p>
-    <w:p>
-      <w:pPr>
-        <w:rPr/>
-      </w:pPr>
-      <w:r>
-        <w:rPr>
-          <w:rtl w:val="0"/>
-        </w:rPr>
-        <w:tab/>
-        <w:t xml:space="preserve"> </w:t>
-        <w:tab/>
-      </w:r>
-    </w:p>
-    <w:p>
-      <w:pPr>
-        <w:spacing w:before="240" w:lineRule="auto"/>
-        <w:rPr/>
-      </w:pPr>
-      <w:r>
-        <w:rPr>
-          <w:rtl w:val="0"/>
-        </w:rPr>
-        <w:br w:type="textWrapping"/>
-      </w:r>
-    </w:p>
-    <w:p>
-      <w:pPr>
-        <w:spacing w:before="240" w:line="360" w:lineRule="auto"/>
+        <w:t xml:space="preserve">  </w:t>
+      </w:r>
+    </w:p>
+    <w:p>
+      <w:pPr>
+        <w:spacing w:line="360" w:lineRule="auto"/>
         <w:jc w:val="both"/>
         <w:rPr/>
       </w:pPr>
@@ -6361,1954 +6250,9 @@
         <w:rPr>
           <w:rtl w:val="0"/>
         </w:rPr>
-      </w:r>
-    </w:p>
-    <w:p>
-      <w:pPr>
-        <w:spacing w:before="240" w:line="360" w:lineRule="auto"/>
-        <w:jc w:val="both"/>
-        <w:rPr/>
-      </w:pPr>
-      <w:r>
-        <w:rPr>
-          <w:rtl w:val="0"/>
-        </w:rPr>
-      </w:r>
-    </w:p>
-    <w:p>
-      <w:pPr>
-        <w:spacing w:before="240" w:line="360" w:lineRule="auto"/>
-        <w:jc w:val="both"/>
-        <w:rPr/>
-      </w:pPr>
-      <w:r>
-        <w:rPr>
-          <w:rtl w:val="0"/>
-        </w:rPr>
-      </w:r>
-    </w:p>
-    <w:p>
-      <w:pPr>
-        <w:spacing w:before="240" w:line="360" w:lineRule="auto"/>
-        <w:jc w:val="both"/>
-        <w:rPr/>
-      </w:pPr>
-      <w:r>
-        <w:rPr>
-          <w:rtl w:val="0"/>
-        </w:rPr>
-      </w:r>
-    </w:p>
-    <w:p>
-      <w:pPr>
-        <w:spacing w:before="240" w:line="360" w:lineRule="auto"/>
-        <w:jc w:val="both"/>
-        <w:rPr/>
-      </w:pPr>
-      <w:r>
-        <w:rPr>
-          <w:rtl w:val="0"/>
-        </w:rPr>
-        <w:br w:type="textWrapping"/>
-      </w:r>
-    </w:p>
-    <w:p>
-      <w:pPr>
-        <w:spacing w:before="240" w:line="360" w:lineRule="auto"/>
-        <w:jc w:val="both"/>
-        <w:rPr/>
-      </w:pPr>
-      <w:r>
-        <w:rPr>
-          <w:rtl w:val="0"/>
-        </w:rPr>
-      </w:r>
-    </w:p>
-    <w:p>
-      <w:pPr>
-        <w:spacing w:before="240" w:line="360" w:lineRule="auto"/>
-        <w:jc w:val="both"/>
-        <w:rPr/>
-      </w:pPr>
-      <w:r>
-        <w:rPr>
-          <w:rtl w:val="0"/>
-        </w:rPr>
-      </w:r>
-    </w:p>
-    <w:p>
-      <w:pPr>
-        <w:spacing w:line="360" w:lineRule="auto"/>
-        <w:jc w:val="both"/>
-        <w:rPr>
-          <w:sz w:val="24"/>
-          <w:szCs w:val="24"/>
-        </w:rPr>
-      </w:pPr>
-      <w:r>
-        <w:rPr>
-          <w:rtl w:val="0"/>
-        </w:rPr>
-      </w:r>
-    </w:p>
-    <w:tbl>
-      <w:tblPr>
-        <w:tblStyle w:val="Table5"/>
-        <w:tblW w:w="14010.0" w:type="dxa"/>
-        <w:jc w:val="left"/>
-        <w:tblBorders>
-          <w:top w:color="000000" w:space="0" w:sz="8" w:val="single"/>
-          <w:left w:color="000000" w:space="0" w:sz="8" w:val="single"/>
-          <w:bottom w:color="000000" w:space="0" w:sz="8" w:val="single"/>
-          <w:right w:color="000000" w:space="0" w:sz="8" w:val="single"/>
-          <w:insideH w:color="000000" w:space="0" w:sz="8" w:val="single"/>
-          <w:insideV w:color="000000" w:space="0" w:sz="8" w:val="single"/>
-        </w:tblBorders>
-        <w:tblLayout w:type="fixed"/>
-        <w:tblLook w:val="0600"/>
-      </w:tblPr>
-      <w:tblGrid>
-        <w:gridCol w:w="2535"/>
-        <w:gridCol w:w="11475"/>
-        <w:tblGridChange w:id="0">
-          <w:tblGrid>
-            <w:gridCol w:w="2535"/>
-            <w:gridCol w:w="11475"/>
-          </w:tblGrid>
-        </w:tblGridChange>
-      </w:tblGrid>
-      <w:tr>
-        <w:trPr>
-          <w:cantSplit w:val="0"/>
-          <w:tblHeader w:val="0"/>
-        </w:trPr>
-        <w:tc>
-          <w:tcPr>
-            <w:shd w:fill="999999" w:val="clear"/>
-            <w:tcMar>
-              <w:top w:w="100.0" w:type="dxa"/>
-              <w:left w:w="100.0" w:type="dxa"/>
-              <w:bottom w:w="100.0" w:type="dxa"/>
-              <w:right w:w="100.0" w:type="dxa"/>
-            </w:tcMar>
-            <w:vAlign w:val="top"/>
-          </w:tcPr>
-          <w:p>
-            <w:pPr>
-              <w:widowControl w:val="0"/>
-              <w:spacing w:line="240" w:lineRule="auto"/>
-              <w:rPr>
-                <w:b w:val="1"/>
-                <w:bCs w:val="1"/>
-                <w:sz w:val="24"/>
-                <w:szCs w:val="24"/>
-              </w:rPr>
-            </w:pPr>
-            <w:r>
-              <w:rPr>
-                <w:b w:val="1"/>
-                <w:bCs w:val="1"/>
-                <w:sz w:val="24"/>
-                <w:szCs w:val="24"/>
-                <w:rtl w:val="0"/>
-              </w:rPr>
-              <w:t xml:space="preserve">CASO DE USO EXPANDIDO - 001</w:t>
-            </w:r>
-          </w:p>
-        </w:tc>
-        <w:tc>
-          <w:tcPr>
-            <w:shd w:fill="999999" w:val="clear"/>
-            <w:tcMar>
-              <w:top w:w="100.0" w:type="dxa"/>
-              <w:left w:w="100.0" w:type="dxa"/>
-              <w:bottom w:w="100.0" w:type="dxa"/>
-              <w:right w:w="100.0" w:type="dxa"/>
-            </w:tcMar>
-            <w:vAlign w:val="top"/>
-          </w:tcPr>
-          <w:p>
-            <w:pPr>
-              <w:widowControl w:val="0"/>
-              <w:spacing w:line="240" w:lineRule="auto"/>
-              <w:rPr>
-                <w:b w:val="1"/>
-                <w:bCs w:val="1"/>
-                <w:sz w:val="24"/>
-                <w:szCs w:val="24"/>
-              </w:rPr>
-            </w:pPr>
-            <w:r>
-              <w:rPr>
-                <w:b w:val="1"/>
-                <w:bCs w:val="1"/>
-                <w:sz w:val="24"/>
-                <w:szCs w:val="24"/>
-                <w:rtl w:val="0"/>
-              </w:rPr>
-              <w:t xml:space="preserve">   Dhaniel Moreira N:10</w:t>
-            </w:r>
-          </w:p>
-        </w:tc>
-      </w:tr>
-      <w:tr>
-        <w:trPr>
-          <w:cantSplit w:val="0"/>
-          <w:tblHeader w:val="0"/>
-        </w:trPr>
-        <w:tc>
-          <w:tcPr>
-            <w:shd w:fill="999999" w:val="clear"/>
-            <w:tcMar>
-              <w:top w:w="100.0" w:type="dxa"/>
-              <w:left w:w="100.0" w:type="dxa"/>
-              <w:bottom w:w="100.0" w:type="dxa"/>
-              <w:right w:w="100.0" w:type="dxa"/>
-            </w:tcMar>
-            <w:vAlign w:val="top"/>
-          </w:tcPr>
-          <w:p>
-            <w:pPr>
-              <w:widowControl w:val="0"/>
-              <w:spacing w:line="240" w:lineRule="auto"/>
-              <w:rPr>
-                <w:b w:val="1"/>
-                <w:bCs w:val="1"/>
-                <w:sz w:val="24"/>
-                <w:szCs w:val="24"/>
-              </w:rPr>
-            </w:pPr>
-            <w:r>
-              <w:rPr>
-                <w:b w:val="1"/>
-                <w:bCs w:val="1"/>
-                <w:sz w:val="24"/>
-                <w:szCs w:val="24"/>
-                <w:rtl w:val="0"/>
-              </w:rPr>
-              <w:t xml:space="preserve">Ator Principal: </w:t>
-            </w:r>
-          </w:p>
-        </w:tc>
-        <w:tc>
-          <w:tcPr>
-            <w:shd w:fill="auto" w:val="clear"/>
-            <w:tcMar>
-              <w:top w:w="100.0" w:type="dxa"/>
-              <w:left w:w="100.0" w:type="dxa"/>
-              <w:bottom w:w="100.0" w:type="dxa"/>
-              <w:right w:w="100.0" w:type="dxa"/>
-            </w:tcMar>
-            <w:vAlign w:val="top"/>
-          </w:tcPr>
-          <w:p>
-            <w:pPr>
-              <w:rPr>
-                <w:sz w:val="24"/>
-                <w:szCs w:val="24"/>
-              </w:rPr>
-            </w:pPr>
-            <w:r>
-              <w:rPr>
-                <w:rtl w:val="0"/>
-              </w:rPr>
-              <w:t xml:space="preserve">Viajante Solo (Cliente)</w:t>
-            </w:r>
-            <w:r>
-              <w:rPr>
-                <w:rtl w:val="0"/>
-              </w:rPr>
-            </w:r>
-          </w:p>
-        </w:tc>
-      </w:tr>
-      <w:tr>
-        <w:trPr>
-          <w:cantSplit w:val="0"/>
-          <w:tblHeader w:val="0"/>
-        </w:trPr>
-        <w:tc>
-          <w:tcPr>
-            <w:shd w:fill="999999" w:val="clear"/>
-            <w:tcMar>
-              <w:top w:w="100.0" w:type="dxa"/>
-              <w:left w:w="100.0" w:type="dxa"/>
-              <w:bottom w:w="100.0" w:type="dxa"/>
-              <w:right w:w="100.0" w:type="dxa"/>
-            </w:tcMar>
-            <w:vAlign w:val="top"/>
-          </w:tcPr>
-          <w:p>
-            <w:pPr>
-              <w:widowControl w:val="0"/>
-              <w:spacing w:line="240" w:lineRule="auto"/>
-              <w:rPr>
-                <w:b w:val="1"/>
-                <w:bCs w:val="1"/>
-                <w:sz w:val="24"/>
-                <w:szCs w:val="24"/>
-              </w:rPr>
-            </w:pPr>
-            <w:r>
-              <w:rPr>
-                <w:b w:val="1"/>
-                <w:bCs w:val="1"/>
-                <w:sz w:val="24"/>
-                <w:szCs w:val="24"/>
-                <w:rtl w:val="0"/>
-              </w:rPr>
-              <w:t xml:space="preserve">Resumo: </w:t>
-            </w:r>
-          </w:p>
-        </w:tc>
-        <w:tc>
-          <w:tcPr>
-            <w:shd w:fill="auto" w:val="clear"/>
-            <w:tcMar>
-              <w:top w:w="100.0" w:type="dxa"/>
-              <w:left w:w="100.0" w:type="dxa"/>
-              <w:bottom w:w="100.0" w:type="dxa"/>
-              <w:right w:w="100.0" w:type="dxa"/>
-            </w:tcMar>
-            <w:vAlign w:val="top"/>
-          </w:tcPr>
-          <w:p>
-            <w:pPr>
-              <w:rPr>
-                <w:sz w:val="24"/>
-                <w:szCs w:val="24"/>
-              </w:rPr>
-            </w:pPr>
-            <w:r>
-              <w:rPr>
-                <w:rtl w:val="0"/>
-              </w:rPr>
-              <w:t xml:space="preserve">O viajante informa os preços desejados de hospedagens e atrações. O app sugere opções mais baratas ou com melhor avaliação baseado no perfil de gastos. O sistema mostra locais turísticos próximos à hospedagem, como parques, shoppings, praças e zoológicos, com informações básicas. Gera automaticamente uma lista de itens para bagagem baseada no destino, clima, duração da viagem e perfil do usuário (lazer ou negócios).</w:t>
-            </w:r>
-            <w:r>
-              <w:rPr>
-                <w:rtl w:val="0"/>
-              </w:rPr>
-            </w:r>
-          </w:p>
-        </w:tc>
-      </w:tr>
-      <w:tr>
-        <w:trPr>
-          <w:cantSplit w:val="0"/>
-          <w:tblHeader w:val="0"/>
-        </w:trPr>
-        <w:tc>
-          <w:tcPr>
-            <w:shd w:fill="999999" w:val="clear"/>
-            <w:tcMar>
-              <w:top w:w="100.0" w:type="dxa"/>
-              <w:left w:w="100.0" w:type="dxa"/>
-              <w:bottom w:w="100.0" w:type="dxa"/>
-              <w:right w:w="100.0" w:type="dxa"/>
-            </w:tcMar>
-            <w:vAlign w:val="top"/>
-          </w:tcPr>
-          <w:p>
-            <w:pPr>
-              <w:widowControl w:val="0"/>
-              <w:spacing w:line="240" w:lineRule="auto"/>
-              <w:rPr>
-                <w:b w:val="1"/>
-                <w:bCs w:val="1"/>
-                <w:sz w:val="24"/>
-                <w:szCs w:val="24"/>
-              </w:rPr>
-            </w:pPr>
-            <w:r>
-              <w:rPr>
-                <w:b w:val="1"/>
-                <w:bCs w:val="1"/>
-                <w:sz w:val="24"/>
-                <w:szCs w:val="24"/>
-                <w:rtl w:val="0"/>
-              </w:rPr>
-              <w:t xml:space="preserve">Pré-condições: </w:t>
-            </w:r>
-          </w:p>
-        </w:tc>
-        <w:tc>
-          <w:tcPr>
-            <w:shd w:fill="auto" w:val="clear"/>
-            <w:tcMar>
-              <w:top w:w="100.0" w:type="dxa"/>
-              <w:left w:w="100.0" w:type="dxa"/>
-              <w:bottom w:w="100.0" w:type="dxa"/>
-              <w:right w:w="100.0" w:type="dxa"/>
-            </w:tcMar>
-            <w:vAlign w:val="top"/>
-          </w:tcPr>
-          <w:p>
-            <w:pPr>
-              <w:rPr/>
-            </w:pPr>
-            <w:r>
-              <w:rPr>
-                <w:rtl w:val="0"/>
-              </w:rPr>
-              <w:t xml:space="preserve">- O usuário está logado.</w:t>
-            </w:r>
-          </w:p>
-          <w:p>
-            <w:pPr>
-              <w:rPr>
-                <w:sz w:val="24"/>
-                <w:szCs w:val="24"/>
-              </w:rPr>
-            </w:pPr>
-            <w:r>
-              <w:rPr>
-                <w:rtl w:val="0"/>
-              </w:rPr>
-              <w:t xml:space="preserve">- Tem uma viagem selecionada.</w:t>
-            </w:r>
-            <w:r>
-              <w:rPr>
-                <w:rtl w:val="0"/>
-              </w:rPr>
-            </w:r>
-          </w:p>
-          <w:p>
-            <w:pPr>
-              <w:widowControl w:val="0"/>
-              <w:spacing w:line="240" w:lineRule="auto"/>
-              <w:rPr>
-                <w:sz w:val="24"/>
-                <w:szCs w:val="24"/>
-              </w:rPr>
-            </w:pPr>
-            <w:r>
-              <w:rPr>
-                <w:rtl w:val="0"/>
-              </w:rPr>
-            </w:r>
-          </w:p>
-        </w:tc>
-      </w:tr>
-      <w:tr>
-        <w:trPr>
-          <w:cantSplit w:val="0"/>
-          <w:tblHeader w:val="0"/>
-        </w:trPr>
-        <w:tc>
-          <w:tcPr>
-            <w:shd w:fill="999999" w:val="clear"/>
-            <w:tcMar>
-              <w:top w:w="100.0" w:type="dxa"/>
-              <w:left w:w="100.0" w:type="dxa"/>
-              <w:bottom w:w="100.0" w:type="dxa"/>
-              <w:right w:w="100.0" w:type="dxa"/>
-            </w:tcMar>
-            <w:vAlign w:val="top"/>
-          </w:tcPr>
-          <w:p>
-            <w:pPr>
-              <w:widowControl w:val="0"/>
-              <w:spacing w:line="240" w:lineRule="auto"/>
-              <w:rPr>
-                <w:b w:val="1"/>
-                <w:bCs w:val="1"/>
-                <w:sz w:val="24"/>
-                <w:szCs w:val="24"/>
-              </w:rPr>
-            </w:pPr>
-            <w:r>
-              <w:rPr>
-                <w:b w:val="1"/>
-                <w:bCs w:val="1"/>
-                <w:sz w:val="24"/>
-                <w:szCs w:val="24"/>
-                <w:rtl w:val="0"/>
-              </w:rPr>
-              <w:t xml:space="preserve">Pós-condições: </w:t>
-            </w:r>
-          </w:p>
-        </w:tc>
-        <w:tc>
-          <w:tcPr>
-            <w:shd w:fill="auto" w:val="clear"/>
-            <w:tcMar>
-              <w:top w:w="100.0" w:type="dxa"/>
-              <w:left w:w="100.0" w:type="dxa"/>
-              <w:bottom w:w="100.0" w:type="dxa"/>
-              <w:right w:w="100.0" w:type="dxa"/>
-            </w:tcMar>
-            <w:vAlign w:val="top"/>
-          </w:tcPr>
-          <w:p>
-            <w:pPr>
-              <w:rPr/>
-            </w:pPr>
-            <w:r>
-              <w:rPr>
-                <w:sz w:val="24"/>
-                <w:szCs w:val="24"/>
-                <w:rtl w:val="0"/>
-              </w:rPr>
-              <w:t xml:space="preserve">- </w:t>
-            </w:r>
-            <w:r>
-              <w:rPr>
-                <w:rtl w:val="0"/>
-              </w:rPr>
-              <w:t xml:space="preserve">As sugestões são exibidas com filtros de preço e avaliação.</w:t>
-            </w:r>
-          </w:p>
-          <w:p>
-            <w:pPr>
-              <w:rPr>
-                <w:sz w:val="24"/>
-                <w:szCs w:val="24"/>
-              </w:rPr>
-            </w:pPr>
-            <w:r>
-              <w:rPr>
-                <w:rtl w:val="0"/>
-              </w:rPr>
-              <w:t xml:space="preserve">- A lista de bagagem é gerada e salva.</w:t>
-            </w:r>
-            <w:r>
-              <w:rPr>
-                <w:rtl w:val="0"/>
-              </w:rPr>
-            </w:r>
-          </w:p>
-        </w:tc>
-      </w:tr>
-      <w:tr>
-        <w:trPr>
-          <w:cantSplit w:val="0"/>
-          <w:trHeight w:val="3074.2529296875" w:hRule="atLeast"/>
-          <w:tblHeader w:val="0"/>
-        </w:trPr>
-        <w:tc>
-          <w:tcPr>
-            <w:shd w:fill="999999" w:val="clear"/>
-            <w:tcMar>
-              <w:top w:w="100.0" w:type="dxa"/>
-              <w:left w:w="100.0" w:type="dxa"/>
-              <w:bottom w:w="100.0" w:type="dxa"/>
-              <w:right w:w="100.0" w:type="dxa"/>
-            </w:tcMar>
-            <w:vAlign w:val="top"/>
-          </w:tcPr>
-          <w:p>
-            <w:pPr>
-              <w:widowControl w:val="0"/>
-              <w:spacing w:line="240" w:lineRule="auto"/>
-              <w:rPr>
-                <w:b w:val="1"/>
-                <w:bCs w:val="1"/>
-                <w:sz w:val="24"/>
-                <w:szCs w:val="24"/>
-              </w:rPr>
-            </w:pPr>
-            <w:r>
-              <w:rPr>
-                <w:b w:val="1"/>
-                <w:bCs w:val="1"/>
-                <w:sz w:val="24"/>
-                <w:szCs w:val="24"/>
-                <w:rtl w:val="0"/>
-              </w:rPr>
-              <w:t xml:space="preserve">Fluxo Principal: </w:t>
-            </w:r>
-          </w:p>
-        </w:tc>
-        <w:tc>
-          <w:tcPr>
-            <w:shd w:fill="auto" w:val="clear"/>
-            <w:tcMar>
-              <w:top w:w="100.0" w:type="dxa"/>
-              <w:left w:w="100.0" w:type="dxa"/>
-              <w:bottom w:w="100.0" w:type="dxa"/>
-              <w:right w:w="100.0" w:type="dxa"/>
-            </w:tcMar>
-            <w:vAlign w:val="top"/>
-          </w:tcPr>
-          <w:p>
-            <w:pPr>
-              <w:numPr>
-                <w:ilvl w:val="0"/>
-                <w:numId w:val="14"/>
-              </w:numPr>
-              <w:ind w:left="720" w:hanging="360"/>
-              <w:rPr>
-                <w:u w:val="none"/>
-              </w:rPr>
-            </w:pPr>
-            <w:r>
-              <w:rPr>
-                <w:rtl w:val="0"/>
-              </w:rPr>
-              <w:t xml:space="preserve">1. O usuário seleciona uma viagem.</w:t>
-            </w:r>
-          </w:p>
-          <w:p>
-            <w:pPr>
-              <w:numPr>
-                <w:ilvl w:val="0"/>
-                <w:numId w:val="14"/>
-              </w:numPr>
-              <w:ind w:left="720" w:hanging="360"/>
-              <w:rPr>
-                <w:u w:val="none"/>
-              </w:rPr>
-            </w:pPr>
-            <w:r>
-              <w:rPr>
-                <w:rtl w:val="0"/>
-              </w:rPr>
-              <w:t xml:space="preserve">2. Clica na aba "Hospedagem" ou "Atrações".</w:t>
-            </w:r>
-          </w:p>
-          <w:p>
-            <w:pPr>
-              <w:numPr>
-                <w:ilvl w:val="0"/>
-                <w:numId w:val="14"/>
-              </w:numPr>
-              <w:ind w:left="720" w:hanging="360"/>
-              <w:rPr>
-                <w:u w:val="none"/>
-              </w:rPr>
-            </w:pPr>
-            <w:r>
-              <w:rPr>
-                <w:rtl w:val="0"/>
-              </w:rPr>
-              <w:t xml:space="preserve">3. Informa preço máximo e avaliação desejada.</w:t>
-            </w:r>
-          </w:p>
-          <w:p>
-            <w:pPr>
-              <w:numPr>
-                <w:ilvl w:val="0"/>
-                <w:numId w:val="14"/>
-              </w:numPr>
-              <w:ind w:left="720" w:hanging="360"/>
-              <w:rPr>
-                <w:u w:val="none"/>
-              </w:rPr>
-            </w:pPr>
-            <w:r>
-              <w:rPr>
-                <w:rtl w:val="0"/>
-              </w:rPr>
-              <w:t xml:space="preserve">4. O sistema filtra e sugere opções.</w:t>
-            </w:r>
-          </w:p>
-          <w:p>
-            <w:pPr>
-              <w:numPr>
-                <w:ilvl w:val="0"/>
-                <w:numId w:val="14"/>
-              </w:numPr>
-              <w:ind w:left="720" w:hanging="360"/>
-              <w:rPr>
-                <w:u w:val="none"/>
-              </w:rPr>
-            </w:pPr>
-            <w:r>
-              <w:rPr>
-                <w:rtl w:val="0"/>
-              </w:rPr>
-              <w:t xml:space="preserve">5. Exibe mapa e fotos + avaliações.</w:t>
-            </w:r>
-          </w:p>
-          <w:p>
-            <w:pPr>
-              <w:numPr>
-                <w:ilvl w:val="0"/>
-                <w:numId w:val="14"/>
-              </w:numPr>
-              <w:ind w:left="720" w:hanging="360"/>
-              <w:rPr>
-                <w:u w:val="none"/>
-              </w:rPr>
-            </w:pPr>
-            <w:r>
-              <w:rPr>
-                <w:rtl w:val="0"/>
-              </w:rPr>
-              <w:t xml:space="preserve">6. O usuário acessa a aba "Bagagem".</w:t>
-            </w:r>
-          </w:p>
-          <w:p>
-            <w:pPr>
-              <w:numPr>
-                <w:ilvl w:val="0"/>
-                <w:numId w:val="14"/>
-              </w:numPr>
-              <w:ind w:left="720" w:hanging="360"/>
-              <w:rPr>
-                <w:u w:val="none"/>
-              </w:rPr>
-            </w:pPr>
-            <w:r>
-              <w:rPr>
-                <w:rtl w:val="0"/>
-              </w:rPr>
-              <w:t xml:space="preserve">7. Seleciona tipo de viagem (lazer ou negócios).</w:t>
-            </w:r>
-          </w:p>
-          <w:p>
-            <w:pPr>
-              <w:numPr>
-                <w:ilvl w:val="0"/>
-                <w:numId w:val="14"/>
-              </w:numPr>
-              <w:ind w:left="720" w:hanging="360"/>
-              <w:rPr>
-                <w:u w:val="none"/>
-              </w:rPr>
-            </w:pPr>
-            <w:r>
-              <w:rPr>
-                <w:rtl w:val="0"/>
-              </w:rPr>
-              <w:t xml:space="preserve">8. Clica em "Gerar lista de bagagem".</w:t>
-            </w:r>
-          </w:p>
-          <w:p>
-            <w:pPr>
-              <w:numPr>
-                <w:ilvl w:val="0"/>
-                <w:numId w:val="14"/>
-              </w:numPr>
-              <w:ind w:left="720" w:hanging="360"/>
-              <w:rPr>
-                <w:u w:val="none"/>
-              </w:rPr>
-            </w:pPr>
-            <w:r>
-              <w:rPr>
-                <w:rtl w:val="0"/>
-              </w:rPr>
-              <w:t xml:space="preserve">9. Marque itens organizados e adicione lembretes.</w:t>
-            </w:r>
-          </w:p>
-          <w:p>
-            <w:pPr>
-              <w:numPr>
-                <w:ilvl w:val="0"/>
-                <w:numId w:val="14"/>
-              </w:numPr>
-              <w:ind w:left="720" w:hanging="360"/>
-              <w:rPr>
-                <w:u w:val="none"/>
-              </w:rPr>
-            </w:pPr>
-            <w:r>
-              <w:rPr>
-                <w:rtl w:val="0"/>
-              </w:rPr>
-              <w:t xml:space="preserve">10. Salva a lista.</w:t>
-            </w:r>
-            <w:r>
-              <w:rPr>
-                <w:rtl w:val="0"/>
-              </w:rPr>
-            </w:r>
-          </w:p>
-        </w:tc>
-      </w:tr>
-      <w:tr>
-        <w:trPr>
-          <w:cantSplit w:val="0"/>
-          <w:tblHeader w:val="0"/>
-        </w:trPr>
-        <w:tc>
-          <w:tcPr>
-            <w:shd w:fill="999999" w:val="clear"/>
-            <w:tcMar>
-              <w:top w:w="100.0" w:type="dxa"/>
-              <w:left w:w="100.0" w:type="dxa"/>
-              <w:bottom w:w="100.0" w:type="dxa"/>
-              <w:right w:w="100.0" w:type="dxa"/>
-            </w:tcMar>
-            <w:vAlign w:val="top"/>
-          </w:tcPr>
-          <w:p>
-            <w:pPr>
-              <w:widowControl w:val="0"/>
-              <w:spacing w:line="240" w:lineRule="auto"/>
-              <w:rPr>
-                <w:b w:val="1"/>
-                <w:bCs w:val="1"/>
-                <w:sz w:val="24"/>
-                <w:szCs w:val="24"/>
-              </w:rPr>
-            </w:pPr>
-            <w:r>
-              <w:rPr>
-                <w:b w:val="1"/>
-                <w:bCs w:val="1"/>
-                <w:sz w:val="24"/>
-                <w:szCs w:val="24"/>
-                <w:rtl w:val="0"/>
-              </w:rPr>
-              <w:t xml:space="preserve">Fluxos Alternativos: </w:t>
-            </w:r>
-          </w:p>
-        </w:tc>
-        <w:tc>
-          <w:tcPr>
-            <w:shd w:fill="auto" w:val="clear"/>
-            <w:tcMar>
-              <w:top w:w="100.0" w:type="dxa"/>
-              <w:left w:w="100.0" w:type="dxa"/>
-              <w:bottom w:w="100.0" w:type="dxa"/>
-              <w:right w:w="100.0" w:type="dxa"/>
-            </w:tcMar>
-            <w:vAlign w:val="top"/>
-          </w:tcPr>
-          <w:p>
-            <w:pPr>
-              <w:rPr/>
-            </w:pPr>
-            <w:r>
-              <w:rPr>
-                <w:rtl w:val="0"/>
-              </w:rPr>
-              <w:t xml:space="preserve">- FA01 - Sem opções disponíveis: exibe mensagem "Nenhuma opção encontrada".</w:t>
-            </w:r>
-          </w:p>
-          <w:p>
-            <w:pPr>
-              <w:rPr>
-                <w:sz w:val="24"/>
-                <w:szCs w:val="24"/>
-              </w:rPr>
-            </w:pPr>
-            <w:r>
-              <w:rPr>
-                <w:rtl w:val="0"/>
-              </w:rPr>
-              <w:t xml:space="preserve">- FA02 - Sem resultados: exibe mensagem "Nenhuma opção encontrada".</w:t>
-            </w:r>
-            <w:r>
-              <w:rPr>
-                <w:rtl w:val="0"/>
-              </w:rPr>
-            </w:r>
-          </w:p>
-        </w:tc>
-      </w:tr>
-      <w:tr>
-        <w:trPr>
-          <w:cantSplit w:val="0"/>
-          <w:tblHeader w:val="0"/>
-        </w:trPr>
-        <w:tc>
-          <w:tcPr>
-            <w:shd w:fill="999999" w:val="clear"/>
-            <w:tcMar>
-              <w:top w:w="100.0" w:type="dxa"/>
-              <w:left w:w="100.0" w:type="dxa"/>
-              <w:bottom w:w="100.0" w:type="dxa"/>
-              <w:right w:w="100.0" w:type="dxa"/>
-            </w:tcMar>
-            <w:vAlign w:val="top"/>
-          </w:tcPr>
-          <w:p>
-            <w:pPr>
-              <w:widowControl w:val="0"/>
-              <w:spacing w:line="240" w:lineRule="auto"/>
-              <w:rPr>
-                <w:b w:val="1"/>
-                <w:bCs w:val="1"/>
-                <w:sz w:val="24"/>
-                <w:szCs w:val="24"/>
-              </w:rPr>
-            </w:pPr>
-            <w:r>
-              <w:rPr>
-                <w:b w:val="1"/>
-                <w:bCs w:val="1"/>
-                <w:sz w:val="24"/>
-                <w:szCs w:val="24"/>
-                <w:rtl w:val="0"/>
-              </w:rPr>
-              <w:t xml:space="preserve">Fluxos de Exceção: </w:t>
-            </w:r>
-          </w:p>
-        </w:tc>
-        <w:tc>
-          <w:tcPr>
-            <w:shd w:fill="auto" w:val="clear"/>
-            <w:tcMar>
-              <w:top w:w="100.0" w:type="dxa"/>
-              <w:left w:w="100.0" w:type="dxa"/>
-              <w:bottom w:w="100.0" w:type="dxa"/>
-              <w:right w:w="100.0" w:type="dxa"/>
-            </w:tcMar>
-            <w:vAlign w:val="top"/>
-          </w:tcPr>
-          <w:p>
-            <w:pPr>
-              <w:rPr>
-                <w:sz w:val="24"/>
-                <w:szCs w:val="24"/>
-              </w:rPr>
-            </w:pPr>
-            <w:r>
-              <w:rPr>
-                <w:rtl w:val="0"/>
-              </w:rPr>
-              <w:t xml:space="preserve">- FE01 - Falha na API de localização: exibe erro "Verifique sua conexão".</w:t>
-            </w:r>
-            <w:r>
-              <w:rPr>
-                <w:rtl w:val="0"/>
-              </w:rPr>
-            </w:r>
-          </w:p>
-        </w:tc>
-      </w:tr>
-      <w:tr>
-        <w:trPr>
-          <w:cantSplit w:val="0"/>
-          <w:tblHeader w:val="0"/>
-        </w:trPr>
-        <w:tc>
-          <w:tcPr>
-            <w:shd w:fill="999999" w:val="clear"/>
-            <w:tcMar>
-              <w:top w:w="100.0" w:type="dxa"/>
-              <w:left w:w="100.0" w:type="dxa"/>
-              <w:bottom w:w="100.0" w:type="dxa"/>
-              <w:right w:w="100.0" w:type="dxa"/>
-            </w:tcMar>
-            <w:vAlign w:val="top"/>
-          </w:tcPr>
-          <w:p>
-            <w:pPr>
-              <w:widowControl w:val="0"/>
-              <w:spacing w:line="240" w:lineRule="auto"/>
-              <w:rPr>
-                <w:b w:val="1"/>
-                <w:bCs w:val="1"/>
-                <w:sz w:val="24"/>
-                <w:szCs w:val="24"/>
-              </w:rPr>
-            </w:pPr>
-            <w:r>
-              <w:rPr>
-                <w:b w:val="1"/>
-                <w:bCs w:val="1"/>
-                <w:sz w:val="24"/>
-                <w:szCs w:val="24"/>
-                <w:rtl w:val="0"/>
-              </w:rPr>
-              <w:t xml:space="preserve">Relações de Regras de Negócio: </w:t>
-            </w:r>
-          </w:p>
-        </w:tc>
-        <w:tc>
-          <w:tcPr>
-            <w:shd w:fill="auto" w:val="clear"/>
-            <w:tcMar>
-              <w:top w:w="100.0" w:type="dxa"/>
-              <w:left w:w="100.0" w:type="dxa"/>
-              <w:bottom w:w="100.0" w:type="dxa"/>
-              <w:right w:w="100.0" w:type="dxa"/>
-            </w:tcMar>
-            <w:vAlign w:val="top"/>
-          </w:tcPr>
-          <w:p>
-            <w:pPr>
-              <w:rPr/>
-            </w:pPr>
-            <w:r>
-              <w:rPr>
-                <w:rtl w:val="0"/>
-              </w:rPr>
-              <w:t xml:space="preserve">- RN01 - Sugestões baseadas no perfil de gastos do usuário.</w:t>
-            </w:r>
-          </w:p>
-          <w:p>
-            <w:pPr>
-              <w:rPr/>
-            </w:pPr>
-            <w:r>
-              <w:rPr>
-                <w:rtl w:val="0"/>
-              </w:rPr>
-              <w:t xml:space="preserve">- RN02 - Filtro por preço e avaliação deve ser dinâmico.</w:t>
-            </w:r>
-          </w:p>
-          <w:p>
-            <w:pPr>
-              <w:rPr>
-                <w:b w:val="1"/>
-                <w:bCs w:val="1"/>
-                <w:sz w:val="24"/>
-                <w:szCs w:val="24"/>
-              </w:rPr>
-            </w:pPr>
-            <w:r>
-              <w:rPr>
-                <w:rtl w:val="0"/>
-              </w:rPr>
-              <w:t xml:space="preserve">- RN03 - Lista é gerada automaticamente conforme perfil </w:t>
-            </w:r>
-            <w:r>
-              <w:rPr>
-                <w:rtl w:val="0"/>
-              </w:rPr>
-            </w:r>
-          </w:p>
-        </w:tc>
-      </w:tr>
-    </w:tbl>
-    <w:p>
-      <w:pPr>
-        <w:spacing w:before="240" w:line="360" w:lineRule="auto"/>
-        <w:jc w:val="both"/>
-        <w:rPr/>
-      </w:pPr>
-      <w:r>
-        <w:rPr>
-          <w:rtl w:val="0"/>
-        </w:rPr>
-        <w:br w:type="textWrapping"/>
-      </w:r>
-    </w:p>
-    <w:p>
-      <w:pPr>
-        <w:rPr/>
-      </w:pPr>
-      <w:r>
-        <w:rPr>
-          <w:rtl w:val="0"/>
-        </w:rPr>
-      </w:r>
-    </w:p>
-    <w:p>
-      <w:pPr>
-        <w:rPr/>
-      </w:pPr>
-      <w:r>
-        <w:rPr>
-          <w:rtl w:val="0"/>
-        </w:rPr>
-      </w:r>
-    </w:p>
-    <w:p>
-      <w:pPr>
-        <w:rPr/>
-      </w:pPr>
-      <w:r>
-        <w:rPr>
-          <w:rtl w:val="0"/>
-        </w:rPr>
-      </w:r>
-    </w:p>
-    <w:p>
-      <w:pPr>
-        <w:rPr/>
-      </w:pPr>
-      <w:r>
-        <w:rPr>
-          <w:rtl w:val="0"/>
-        </w:rPr>
-      </w:r>
-    </w:p>
-    <w:p>
-      <w:pPr>
-        <w:rPr/>
-      </w:pPr>
-      <w:r>
-        <w:rPr>
-          <w:rtl w:val="0"/>
-        </w:rPr>
-      </w:r>
-    </w:p>
-    <w:p>
-      <w:pPr>
-        <w:rPr/>
-      </w:pPr>
-      <w:r>
-        <w:rPr>
-          <w:rtl w:val="0"/>
-        </w:rPr>
-      </w:r>
-    </w:p>
-    <w:p>
-      <w:pPr>
-        <w:rPr/>
-      </w:pPr>
-      <w:r>
-        <w:rPr>
-          <w:rtl w:val="0"/>
-        </w:rPr>
-      </w:r>
-    </w:p>
-    <w:p>
-      <w:pPr>
-        <w:rPr/>
-      </w:pPr>
-      <w:r>
-        <w:rPr>
-          <w:rtl w:val="0"/>
-        </w:rPr>
-      </w:r>
-    </w:p>
-    <w:p>
-      <w:pPr>
-        <w:rPr/>
-      </w:pPr>
-      <w:r>
-        <w:rPr>
-          <w:rtl w:val="0"/>
-        </w:rPr>
-      </w:r>
-    </w:p>
-    <w:p>
-      <w:pPr>
-        <w:rPr/>
-      </w:pPr>
-      <w:r>
-        <w:rPr>
-          <w:rtl w:val="0"/>
-        </w:rPr>
-      </w:r>
-    </w:p>
-    <w:p>
-      <w:pPr>
-        <w:rPr/>
-      </w:pPr>
-      <w:r>
-        <w:rPr>
-          <w:rtl w:val="0"/>
-        </w:rPr>
-      </w:r>
-    </w:p>
-    <w:p>
-      <w:pPr>
-        <w:rPr/>
-      </w:pPr>
-      <w:r>
-        <w:rPr>
-          <w:rtl w:val="0"/>
-        </w:rPr>
-      </w:r>
-    </w:p>
-    <w:p>
-      <w:pPr>
-        <w:rPr/>
-      </w:pPr>
-      <w:r>
-        <w:rPr>
-          <w:rtl w:val="0"/>
-        </w:rPr>
-      </w:r>
-    </w:p>
-    <w:p>
-      <w:pPr>
-        <w:rPr/>
-      </w:pPr>
-      <w:r>
-        <w:rPr>
-          <w:rtl w:val="0"/>
-        </w:rPr>
-      </w:r>
-    </w:p>
-    <w:p>
-      <w:pPr>
-        <w:rPr/>
-      </w:pPr>
-      <w:r>
-        <w:rPr>
-          <w:rtl w:val="0"/>
-        </w:rPr>
-      </w:r>
-    </w:p>
-    <w:p>
-      <w:pPr>
-        <w:rPr/>
-      </w:pPr>
-      <w:r>
-        <w:rPr>
-          <w:rtl w:val="0"/>
-        </w:rPr>
-      </w:r>
-    </w:p>
-    <w:p>
-      <w:pPr>
-        <w:rPr/>
-      </w:pPr>
-      <w:r>
-        <w:rPr>
-          <w:rtl w:val="0"/>
-        </w:rPr>
-      </w:r>
-    </w:p>
-    <w:p>
-      <w:pPr>
-        <w:spacing w:line="360" w:lineRule="auto"/>
-        <w:jc w:val="both"/>
-        <w:rPr>
-          <w:sz w:val="24"/>
-          <w:szCs w:val="24"/>
-        </w:rPr>
-      </w:pPr>
-      <w:r>
-        <w:rPr>
-          <w:rtl w:val="0"/>
-        </w:rPr>
-      </w:r>
-    </w:p>
-    <w:tbl>
-      <w:tblPr>
-        <w:tblStyle w:val="Table6"/>
-        <w:tblW w:w="14010.0" w:type="dxa"/>
-        <w:jc w:val="left"/>
-        <w:tblBorders>
-          <w:top w:color="000000" w:space="0" w:sz="8" w:val="single"/>
-          <w:left w:color="000000" w:space="0" w:sz="8" w:val="single"/>
-          <w:bottom w:color="000000" w:space="0" w:sz="8" w:val="single"/>
-          <w:right w:color="000000" w:space="0" w:sz="8" w:val="single"/>
-          <w:insideH w:color="000000" w:space="0" w:sz="8" w:val="single"/>
-          <w:insideV w:color="000000" w:space="0" w:sz="8" w:val="single"/>
-        </w:tblBorders>
-        <w:tblLayout w:type="fixed"/>
-        <w:tblLook w:val="0600"/>
-      </w:tblPr>
-      <w:tblGrid>
-        <w:gridCol w:w="2535"/>
-        <w:gridCol w:w="11475"/>
-        <w:tblGridChange w:id="0">
-          <w:tblGrid>
-            <w:gridCol w:w="2535"/>
-            <w:gridCol w:w="11475"/>
-          </w:tblGrid>
-        </w:tblGridChange>
-      </w:tblGrid>
-      <w:tr>
-        <w:trPr>
-          <w:cantSplit w:val="0"/>
-          <w:tblHeader w:val="0"/>
-        </w:trPr>
-        <w:tc>
-          <w:tcPr>
-            <w:shd w:fill="999999" w:val="clear"/>
-            <w:tcMar>
-              <w:top w:w="100.0" w:type="dxa"/>
-              <w:left w:w="100.0" w:type="dxa"/>
-              <w:bottom w:w="100.0" w:type="dxa"/>
-              <w:right w:w="100.0" w:type="dxa"/>
-            </w:tcMar>
-            <w:vAlign w:val="top"/>
-          </w:tcPr>
-          <w:p>
-            <w:pPr>
-              <w:widowControl w:val="0"/>
-              <w:spacing w:line="240" w:lineRule="auto"/>
-              <w:rPr>
-                <w:b w:val="1"/>
-                <w:bCs w:val="1"/>
-                <w:sz w:val="24"/>
-                <w:szCs w:val="24"/>
-              </w:rPr>
-            </w:pPr>
-            <w:r>
-              <w:rPr>
-                <w:b w:val="1"/>
-                <w:bCs w:val="1"/>
-                <w:sz w:val="24"/>
-                <w:szCs w:val="24"/>
-                <w:rtl w:val="0"/>
-              </w:rPr>
-              <w:t xml:space="preserve">CASO DE USO EXPANDIDO - 001</w:t>
-            </w:r>
-          </w:p>
-        </w:tc>
-        <w:tc>
-          <w:tcPr>
-            <w:shd w:fill="999999" w:val="clear"/>
-            <w:tcMar>
-              <w:top w:w="100.0" w:type="dxa"/>
-              <w:left w:w="100.0" w:type="dxa"/>
-              <w:bottom w:w="100.0" w:type="dxa"/>
-              <w:right w:w="100.0" w:type="dxa"/>
-            </w:tcMar>
-            <w:vAlign w:val="top"/>
-          </w:tcPr>
-          <w:p>
-            <w:pPr>
-              <w:widowControl w:val="0"/>
-              <w:spacing w:line="240" w:lineRule="auto"/>
-              <w:rPr>
-                <w:b w:val="1"/>
-                <w:bCs w:val="1"/>
-                <w:sz w:val="24"/>
-                <w:szCs w:val="24"/>
-              </w:rPr>
-            </w:pPr>
-            <w:r>
-              <w:rPr>
-                <w:b w:val="1"/>
-                <w:bCs w:val="1"/>
-                <w:sz w:val="24"/>
-                <w:szCs w:val="24"/>
-                <w:rtl w:val="0"/>
-              </w:rPr>
-              <w:t xml:space="preserve">SARAH EMANUELLY </w:t>
-            </w:r>
-          </w:p>
-        </w:tc>
-      </w:tr>
-      <w:tr>
-        <w:trPr>
-          <w:cantSplit w:val="0"/>
-          <w:tblHeader w:val="0"/>
-        </w:trPr>
-        <w:tc>
-          <w:tcPr>
-            <w:shd w:fill="999999" w:val="clear"/>
-            <w:tcMar>
-              <w:top w:w="100.0" w:type="dxa"/>
-              <w:left w:w="100.0" w:type="dxa"/>
-              <w:bottom w:w="100.0" w:type="dxa"/>
-              <w:right w:w="100.0" w:type="dxa"/>
-            </w:tcMar>
-            <w:vAlign w:val="top"/>
-          </w:tcPr>
-          <w:p>
-            <w:pPr>
-              <w:widowControl w:val="0"/>
-              <w:spacing w:line="240" w:lineRule="auto"/>
-              <w:rPr>
-                <w:b w:val="1"/>
-                <w:bCs w:val="1"/>
-                <w:sz w:val="24"/>
-                <w:szCs w:val="24"/>
-              </w:rPr>
-            </w:pPr>
-            <w:r>
-              <w:rPr>
-                <w:b w:val="1"/>
-                <w:bCs w:val="1"/>
-                <w:sz w:val="24"/>
-                <w:szCs w:val="24"/>
-                <w:rtl w:val="0"/>
-              </w:rPr>
-              <w:t xml:space="preserve">Ator Principal: </w:t>
-            </w:r>
-          </w:p>
-        </w:tc>
-        <w:tc>
-          <w:tcPr>
-            <w:shd w:fill="auto" w:val="clear"/>
-            <w:tcMar>
-              <w:top w:w="100.0" w:type="dxa"/>
-              <w:left w:w="100.0" w:type="dxa"/>
-              <w:bottom w:w="100.0" w:type="dxa"/>
-              <w:right w:w="100.0" w:type="dxa"/>
-            </w:tcMar>
-            <w:vAlign w:val="top"/>
-          </w:tcPr>
-          <w:p>
-            <w:pPr>
-              <w:widowControl w:val="0"/>
-              <w:spacing w:after="240" w:before="240" w:line="240" w:lineRule="auto"/>
-              <w:rPr>
-                <w:sz w:val="24"/>
-                <w:szCs w:val="24"/>
-              </w:rPr>
-            </w:pPr>
-            <w:r>
-              <w:rPr>
-                <w:sz w:val="24"/>
-                <w:szCs w:val="24"/>
-                <w:rtl w:val="0"/>
-              </w:rPr>
-              <w:t xml:space="preserve">Viajante (Usuário Final)</w:t>
-            </w:r>
-          </w:p>
-        </w:tc>
-      </w:tr>
-      <w:tr>
-        <w:trPr>
-          <w:cantSplit w:val="0"/>
-          <w:tblHeader w:val="0"/>
-        </w:trPr>
-        <w:tc>
-          <w:tcPr>
-            <w:shd w:fill="999999" w:val="clear"/>
-            <w:tcMar>
-              <w:top w:w="100.0" w:type="dxa"/>
-              <w:left w:w="100.0" w:type="dxa"/>
-              <w:bottom w:w="100.0" w:type="dxa"/>
-              <w:right w:w="100.0" w:type="dxa"/>
-            </w:tcMar>
-            <w:vAlign w:val="top"/>
-          </w:tcPr>
-          <w:p>
-            <w:pPr>
-              <w:widowControl w:val="0"/>
-              <w:spacing w:line="240" w:lineRule="auto"/>
-              <w:rPr>
-                <w:b w:val="1"/>
-                <w:bCs w:val="1"/>
-                <w:sz w:val="24"/>
-                <w:szCs w:val="24"/>
-              </w:rPr>
-            </w:pPr>
-            <w:r>
-              <w:rPr>
-                <w:b w:val="1"/>
-                <w:bCs w:val="1"/>
-                <w:sz w:val="24"/>
-                <w:szCs w:val="24"/>
-                <w:rtl w:val="0"/>
-              </w:rPr>
-              <w:t xml:space="preserve">Resumo: </w:t>
-            </w:r>
-          </w:p>
-        </w:tc>
-        <w:tc>
-          <w:tcPr>
-            <w:shd w:fill="auto" w:val="clear"/>
-            <w:tcMar>
-              <w:top w:w="100.0" w:type="dxa"/>
-              <w:left w:w="100.0" w:type="dxa"/>
-              <w:bottom w:w="100.0" w:type="dxa"/>
-              <w:right w:w="100.0" w:type="dxa"/>
-            </w:tcMar>
-            <w:vAlign w:val="top"/>
-          </w:tcPr>
-          <w:p>
-            <w:pPr>
-              <w:widowControl w:val="0"/>
-              <w:spacing w:after="240" w:before="240" w:line="240" w:lineRule="auto"/>
-              <w:rPr>
-                <w:sz w:val="24"/>
-                <w:szCs w:val="24"/>
-              </w:rPr>
-            </w:pPr>
-            <w:r>
-              <w:rPr>
-                <w:sz w:val="24"/>
-                <w:szCs w:val="24"/>
-                <w:rtl w:val="0"/>
-              </w:rPr>
-              <w:t xml:space="preserve">Permitir que o viajante escolha o tipo de viagem (lazer ou negócios) para personalizar todas as sugestões, bagagem e recomendações do sistema</w:t>
-            </w:r>
-          </w:p>
-          <w:p>
-            <w:pPr>
-              <w:widowControl w:val="0"/>
-              <w:spacing w:after="240" w:before="240" w:line="240" w:lineRule="auto"/>
-              <w:rPr>
-                <w:sz w:val="24"/>
-                <w:szCs w:val="24"/>
-              </w:rPr>
-            </w:pPr>
-            <w:r>
-              <w:rPr>
-                <w:rtl w:val="0"/>
-              </w:rPr>
-            </w:r>
-          </w:p>
-        </w:tc>
-      </w:tr>
-      <w:tr>
-        <w:trPr>
-          <w:cantSplit w:val="0"/>
-          <w:tblHeader w:val="0"/>
-        </w:trPr>
-        <w:tc>
-          <w:tcPr>
-            <w:shd w:fill="999999" w:val="clear"/>
-            <w:tcMar>
-              <w:top w:w="100.0" w:type="dxa"/>
-              <w:left w:w="100.0" w:type="dxa"/>
-              <w:bottom w:w="100.0" w:type="dxa"/>
-              <w:right w:w="100.0" w:type="dxa"/>
-            </w:tcMar>
-            <w:vAlign w:val="top"/>
-          </w:tcPr>
-          <w:p>
-            <w:pPr>
-              <w:widowControl w:val="0"/>
-              <w:spacing w:line="240" w:lineRule="auto"/>
-              <w:rPr>
-                <w:b w:val="1"/>
-                <w:bCs w:val="1"/>
-                <w:sz w:val="24"/>
-                <w:szCs w:val="24"/>
-              </w:rPr>
-            </w:pPr>
-            <w:r>
-              <w:rPr>
-                <w:b w:val="1"/>
-                <w:bCs w:val="1"/>
-                <w:sz w:val="24"/>
-                <w:szCs w:val="24"/>
-                <w:rtl w:val="0"/>
-              </w:rPr>
-              <w:t xml:space="preserve">Pré-condições: </w:t>
-            </w:r>
-          </w:p>
-        </w:tc>
-        <w:tc>
-          <w:tcPr>
-            <w:shd w:fill="auto" w:val="clear"/>
-            <w:tcMar>
-              <w:top w:w="100.0" w:type="dxa"/>
-              <w:left w:w="100.0" w:type="dxa"/>
-              <w:bottom w:w="100.0" w:type="dxa"/>
-              <w:right w:w="100.0" w:type="dxa"/>
-            </w:tcMar>
-            <w:vAlign w:val="top"/>
-          </w:tcPr>
-          <w:p>
-            <w:pPr>
-              <w:widowControl w:val="0"/>
-              <w:spacing w:line="240" w:lineRule="auto"/>
-              <w:rPr>
-                <w:sz w:val="24"/>
-                <w:szCs w:val="24"/>
-              </w:rPr>
-            </w:pPr>
-            <w:r>
-              <w:rPr>
-                <w:rtl w:val="0"/>
-              </w:rPr>
-            </w:r>
-          </w:p>
-        </w:tc>
-      </w:tr>
-      <w:tr>
-        <w:trPr>
-          <w:cantSplit w:val="0"/>
-          <w:tblHeader w:val="0"/>
-        </w:trPr>
-        <w:tc>
-          <w:tcPr>
-            <w:shd w:fill="999999" w:val="clear"/>
-            <w:tcMar>
-              <w:top w:w="100.0" w:type="dxa"/>
-              <w:left w:w="100.0" w:type="dxa"/>
-              <w:bottom w:w="100.0" w:type="dxa"/>
-              <w:right w:w="100.0" w:type="dxa"/>
-            </w:tcMar>
-            <w:vAlign w:val="top"/>
-          </w:tcPr>
-          <w:p>
-            <w:pPr>
-              <w:widowControl w:val="0"/>
-              <w:spacing w:line="240" w:lineRule="auto"/>
-              <w:rPr>
-                <w:b w:val="1"/>
-                <w:bCs w:val="1"/>
-                <w:sz w:val="24"/>
-                <w:szCs w:val="24"/>
-              </w:rPr>
-            </w:pPr>
-            <w:r>
-              <w:rPr>
-                <w:b w:val="1"/>
-                <w:bCs w:val="1"/>
-                <w:sz w:val="24"/>
-                <w:szCs w:val="24"/>
-                <w:rtl w:val="0"/>
-              </w:rPr>
-              <w:t xml:space="preserve">Pós-condições: </w:t>
-            </w:r>
-          </w:p>
-        </w:tc>
-        <w:tc>
-          <w:tcPr>
-            <w:shd w:fill="auto" w:val="clear"/>
-            <w:tcMar>
-              <w:top w:w="100.0" w:type="dxa"/>
-              <w:left w:w="100.0" w:type="dxa"/>
-              <w:bottom w:w="100.0" w:type="dxa"/>
-              <w:right w:w="100.0" w:type="dxa"/>
-            </w:tcMar>
-            <w:vAlign w:val="top"/>
-          </w:tcPr>
-          <w:p>
-            <w:pPr>
-              <w:widowControl w:val="0"/>
-              <w:spacing w:line="240" w:lineRule="auto"/>
-              <w:rPr>
-                <w:sz w:val="24"/>
-                <w:szCs w:val="24"/>
-              </w:rPr>
-            </w:pPr>
-            <w:r>
-              <w:rPr>
-                <w:rtl w:val="0"/>
-              </w:rPr>
-            </w:r>
-          </w:p>
-        </w:tc>
-      </w:tr>
-      <w:tr>
-        <w:trPr>
-          <w:cantSplit w:val="0"/>
-          <w:tblHeader w:val="0"/>
-        </w:trPr>
-        <w:tc>
-          <w:tcPr>
-            <w:shd w:fill="999999" w:val="clear"/>
-            <w:tcMar>
-              <w:top w:w="100.0" w:type="dxa"/>
-              <w:left w:w="100.0" w:type="dxa"/>
-              <w:bottom w:w="100.0" w:type="dxa"/>
-              <w:right w:w="100.0" w:type="dxa"/>
-            </w:tcMar>
-            <w:vAlign w:val="top"/>
-          </w:tcPr>
-          <w:p>
-            <w:pPr>
-              <w:widowControl w:val="0"/>
-              <w:spacing w:line="240" w:lineRule="auto"/>
-              <w:rPr>
-                <w:b w:val="1"/>
-                <w:bCs w:val="1"/>
-                <w:sz w:val="24"/>
-                <w:szCs w:val="24"/>
-              </w:rPr>
-            </w:pPr>
-            <w:r>
-              <w:rPr>
-                <w:b w:val="1"/>
-                <w:bCs w:val="1"/>
-                <w:sz w:val="24"/>
-                <w:szCs w:val="24"/>
-                <w:rtl w:val="0"/>
-              </w:rPr>
-              <w:t xml:space="preserve">Fluxo Principal: </w:t>
-            </w:r>
-          </w:p>
-        </w:tc>
-        <w:tc>
-          <w:tcPr>
-            <w:shd w:fill="auto" w:val="clear"/>
-            <w:tcMar>
-              <w:top w:w="100.0" w:type="dxa"/>
-              <w:left w:w="100.0" w:type="dxa"/>
-              <w:bottom w:w="100.0" w:type="dxa"/>
-              <w:right w:w="100.0" w:type="dxa"/>
-            </w:tcMar>
-            <w:vAlign w:val="top"/>
-          </w:tcPr>
-          <w:p>
-            <w:pPr>
-              <w:widowControl w:val="0"/>
-              <w:numPr>
-                <w:ilvl w:val="0"/>
-                <w:numId w:val="8"/>
-              </w:numPr>
-              <w:spacing w:line="240" w:lineRule="auto"/>
-              <w:ind w:left="720" w:hanging="360"/>
-              <w:rPr>
-                <w:sz w:val="24"/>
-                <w:szCs w:val="24"/>
-                <w:u w:val="none"/>
-              </w:rPr>
-            </w:pPr>
-            <w:r>
-              <w:rPr>
-                <w:rtl w:val="0"/>
-              </w:rPr>
-            </w:r>
-          </w:p>
-        </w:tc>
-      </w:tr>
-      <w:tr>
-        <w:trPr>
-          <w:cantSplit w:val="0"/>
-          <w:tblHeader w:val="0"/>
-        </w:trPr>
-        <w:tc>
-          <w:tcPr>
-            <w:shd w:fill="999999" w:val="clear"/>
-            <w:tcMar>
-              <w:top w:w="100.0" w:type="dxa"/>
-              <w:left w:w="100.0" w:type="dxa"/>
-              <w:bottom w:w="100.0" w:type="dxa"/>
-              <w:right w:w="100.0" w:type="dxa"/>
-            </w:tcMar>
-            <w:vAlign w:val="top"/>
-          </w:tcPr>
-          <w:p>
-            <w:pPr>
-              <w:widowControl w:val="0"/>
-              <w:spacing w:line="240" w:lineRule="auto"/>
-              <w:rPr>
-                <w:b w:val="1"/>
-                <w:bCs w:val="1"/>
-                <w:sz w:val="24"/>
-                <w:szCs w:val="24"/>
-              </w:rPr>
-            </w:pPr>
-            <w:r>
-              <w:rPr>
-                <w:b w:val="1"/>
-                <w:bCs w:val="1"/>
-                <w:sz w:val="24"/>
-                <w:szCs w:val="24"/>
-                <w:rtl w:val="0"/>
-              </w:rPr>
-              <w:t xml:space="preserve">Fluxos Alternativos: </w:t>
-            </w:r>
-          </w:p>
-        </w:tc>
-        <w:tc>
-          <w:tcPr>
-            <w:shd w:fill="auto" w:val="clear"/>
-            <w:tcMar>
-              <w:top w:w="100.0" w:type="dxa"/>
-              <w:left w:w="100.0" w:type="dxa"/>
-              <w:bottom w:w="100.0" w:type="dxa"/>
-              <w:right w:w="100.0" w:type="dxa"/>
-            </w:tcMar>
-            <w:vAlign w:val="top"/>
-          </w:tcPr>
-          <w:p>
-            <w:pPr>
-              <w:widowControl w:val="0"/>
-              <w:numPr>
-                <w:ilvl w:val="0"/>
-                <w:numId w:val="6"/>
-              </w:numPr>
-              <w:spacing w:line="240" w:lineRule="auto"/>
-              <w:ind w:left="720" w:hanging="360"/>
-              <w:rPr>
-                <w:sz w:val="24"/>
-                <w:szCs w:val="24"/>
-              </w:rPr>
-            </w:pPr>
-            <w:r>
-              <w:rPr>
-                <w:rtl w:val="0"/>
-              </w:rPr>
-            </w:r>
-          </w:p>
-          <w:p>
-            <w:pPr>
-              <w:widowControl w:val="0"/>
-              <w:spacing w:line="240" w:lineRule="auto"/>
-              <w:rPr>
-                <w:sz w:val="24"/>
-                <w:szCs w:val="24"/>
-              </w:rPr>
-            </w:pPr>
-            <w:r>
-              <w:rPr>
-                <w:rtl w:val="0"/>
-              </w:rPr>
-            </w:r>
-          </w:p>
-        </w:tc>
-      </w:tr>
-      <w:tr>
-        <w:trPr>
-          <w:cantSplit w:val="0"/>
-          <w:tblHeader w:val="0"/>
-        </w:trPr>
-        <w:tc>
-          <w:tcPr>
-            <w:shd w:fill="999999" w:val="clear"/>
-            <w:tcMar>
-              <w:top w:w="100.0" w:type="dxa"/>
-              <w:left w:w="100.0" w:type="dxa"/>
-              <w:bottom w:w="100.0" w:type="dxa"/>
-              <w:right w:w="100.0" w:type="dxa"/>
-            </w:tcMar>
-            <w:vAlign w:val="top"/>
-          </w:tcPr>
-          <w:p>
-            <w:pPr>
-              <w:widowControl w:val="0"/>
-              <w:spacing w:line="240" w:lineRule="auto"/>
-              <w:rPr>
-                <w:b w:val="1"/>
-                <w:bCs w:val="1"/>
-                <w:sz w:val="24"/>
-                <w:szCs w:val="24"/>
-              </w:rPr>
-            </w:pPr>
-            <w:r>
-              <w:rPr>
-                <w:b w:val="1"/>
-                <w:bCs w:val="1"/>
-                <w:sz w:val="24"/>
-                <w:szCs w:val="24"/>
-                <w:rtl w:val="0"/>
-              </w:rPr>
-              <w:t xml:space="preserve">Fluxos de Exceção: </w:t>
-            </w:r>
-          </w:p>
-        </w:tc>
-        <w:tc>
-          <w:tcPr>
-            <w:shd w:fill="auto" w:val="clear"/>
-            <w:tcMar>
-              <w:top w:w="100.0" w:type="dxa"/>
-              <w:left w:w="100.0" w:type="dxa"/>
-              <w:bottom w:w="100.0" w:type="dxa"/>
-              <w:right w:w="100.0" w:type="dxa"/>
-            </w:tcMar>
-            <w:vAlign w:val="top"/>
-          </w:tcPr>
-          <w:p>
-            <w:pPr>
-              <w:widowControl w:val="0"/>
-              <w:spacing w:line="240" w:lineRule="auto"/>
-              <w:rPr>
-                <w:b w:val="1"/>
-                <w:bCs w:val="1"/>
-                <w:sz w:val="24"/>
-                <w:szCs w:val="24"/>
-              </w:rPr>
-            </w:pPr>
-            <w:r>
-              <w:rPr>
-                <w:rtl w:val="0"/>
-              </w:rPr>
-            </w:r>
-          </w:p>
-          <w:p>
-            <w:pPr>
-              <w:widowControl w:val="0"/>
-              <w:spacing w:line="240" w:lineRule="auto"/>
-              <w:rPr>
-                <w:sz w:val="24"/>
-                <w:szCs w:val="24"/>
-              </w:rPr>
-            </w:pPr>
-            <w:r>
-              <w:rPr>
-                <w:rtl w:val="0"/>
-              </w:rPr>
-            </w:r>
-          </w:p>
-          <w:p>
-            <w:pPr>
-              <w:widowControl w:val="0"/>
-              <w:spacing w:line="240" w:lineRule="auto"/>
-              <w:ind w:left="720" w:firstLine="0"/>
-              <w:rPr>
-                <w:sz w:val="24"/>
-                <w:szCs w:val="24"/>
-              </w:rPr>
-            </w:pPr>
-            <w:r>
-              <w:rPr>
-                <w:rtl w:val="0"/>
-              </w:rPr>
-            </w:r>
-          </w:p>
-          <w:p>
-            <w:pPr>
-              <w:widowControl w:val="0"/>
-              <w:numPr>
-                <w:ilvl w:val="0"/>
-                <w:numId w:val="1"/>
-              </w:numPr>
-              <w:spacing w:line="240" w:lineRule="auto"/>
-              <w:ind w:left="720" w:hanging="360"/>
-              <w:rPr>
-                <w:sz w:val="24"/>
-                <w:szCs w:val="24"/>
-              </w:rPr>
-            </w:pPr>
-            <w:r>
-              <w:rPr>
-                <w:rtl w:val="0"/>
-              </w:rPr>
-            </w:r>
-          </w:p>
-        </w:tc>
-      </w:tr>
-      <w:tr>
-        <w:trPr>
-          <w:cantSplit w:val="0"/>
-          <w:tblHeader w:val="0"/>
-        </w:trPr>
-        <w:tc>
-          <w:tcPr>
-            <w:shd w:fill="999999" w:val="clear"/>
-            <w:tcMar>
-              <w:top w:w="100.0" w:type="dxa"/>
-              <w:left w:w="100.0" w:type="dxa"/>
-              <w:bottom w:w="100.0" w:type="dxa"/>
-              <w:right w:w="100.0" w:type="dxa"/>
-            </w:tcMar>
-            <w:vAlign w:val="top"/>
-          </w:tcPr>
-          <w:p>
-            <w:pPr>
-              <w:widowControl w:val="0"/>
-              <w:spacing w:line="240" w:lineRule="auto"/>
-              <w:rPr>
-                <w:b w:val="1"/>
-                <w:bCs w:val="1"/>
-                <w:sz w:val="24"/>
-                <w:szCs w:val="24"/>
-              </w:rPr>
-            </w:pPr>
-            <w:r>
-              <w:rPr>
-                <w:b w:val="1"/>
-                <w:bCs w:val="1"/>
-                <w:sz w:val="24"/>
-                <w:szCs w:val="24"/>
-                <w:rtl w:val="0"/>
-              </w:rPr>
-              <w:t xml:space="preserve">Relações de Regras de Negócio: </w:t>
-            </w:r>
-          </w:p>
-        </w:tc>
-        <w:tc>
-          <w:tcPr>
-            <w:shd w:fill="auto" w:val="clear"/>
-            <w:tcMar>
-              <w:top w:w="100.0" w:type="dxa"/>
-              <w:left w:w="100.0" w:type="dxa"/>
-              <w:bottom w:w="100.0" w:type="dxa"/>
-              <w:right w:w="100.0" w:type="dxa"/>
-            </w:tcMar>
-            <w:vAlign w:val="top"/>
-          </w:tcPr>
-          <w:p>
-            <w:pPr>
-              <w:widowControl w:val="0"/>
-              <w:numPr>
-                <w:ilvl w:val="0"/>
-                <w:numId w:val="7"/>
-              </w:numPr>
-              <w:spacing w:line="240" w:lineRule="auto"/>
-              <w:ind w:left="720" w:hanging="360"/>
-              <w:rPr>
-                <w:b w:val="1"/>
-                <w:bCs w:val="1"/>
-                <w:sz w:val="24"/>
-                <w:szCs w:val="24"/>
-              </w:rPr>
-            </w:pPr>
-            <w:r>
-              <w:rPr>
-                <w:rtl w:val="0"/>
-              </w:rPr>
-            </w:r>
-          </w:p>
-        </w:tc>
-      </w:tr>
-    </w:tbl>
+        <w:t xml:space="preserve">-</w:t>
+      </w:r>
+    </w:p>
     <w:p>
       <w:pPr>
         <w:spacing w:line="360" w:lineRule="auto"/>
@@ -9826,556 +7770,6 @@
     </w:lvl>
   </w:abstractNum>
   <w:abstractNum w:abstractNumId="11">
-    <w:lvl w:ilvl="0">
-      <w:start w:val="1"/>
-      <w:numFmt w:val="bullet"/>
-      <w:lvlText w:val="●"/>
-      <w:lvlJc w:val="left"/>
-      <w:pPr>
-        <w:ind w:left="720" w:hanging="360"/>
-      </w:pPr>
-      <w:rPr>
-        <w:u w:val="none"/>
-      </w:rPr>
-    </w:lvl>
-    <w:lvl w:ilvl="1">
-      <w:start w:val="1"/>
-      <w:numFmt w:val="bullet"/>
-      <w:lvlText w:val="○"/>
-      <w:lvlJc w:val="left"/>
-      <w:pPr>
-        <w:ind w:left="1440" w:hanging="360"/>
-      </w:pPr>
-      <w:rPr>
-        <w:u w:val="none"/>
-      </w:rPr>
-    </w:lvl>
-    <w:lvl w:ilvl="2">
-      <w:start w:val="1"/>
-      <w:numFmt w:val="bullet"/>
-      <w:lvlText w:val="■"/>
-      <w:lvlJc w:val="left"/>
-      <w:pPr>
-        <w:ind w:left="2160" w:hanging="360"/>
-      </w:pPr>
-      <w:rPr>
-        <w:u w:val="none"/>
-      </w:rPr>
-    </w:lvl>
-    <w:lvl w:ilvl="3">
-      <w:start w:val="1"/>
-      <w:numFmt w:val="bullet"/>
-      <w:lvlText w:val="●"/>
-      <w:lvlJc w:val="left"/>
-      <w:pPr>
-        <w:ind w:left="2880" w:hanging="360"/>
-      </w:pPr>
-      <w:rPr>
-        <w:u w:val="none"/>
-      </w:rPr>
-    </w:lvl>
-    <w:lvl w:ilvl="4">
-      <w:start w:val="1"/>
-      <w:numFmt w:val="bullet"/>
-      <w:lvlText w:val="○"/>
-      <w:lvlJc w:val="left"/>
-      <w:pPr>
-        <w:ind w:left="3600" w:hanging="360"/>
-      </w:pPr>
-      <w:rPr>
-        <w:u w:val="none"/>
-      </w:rPr>
-    </w:lvl>
-    <w:lvl w:ilvl="5">
-      <w:start w:val="1"/>
-      <w:numFmt w:val="bullet"/>
-      <w:lvlText w:val="■"/>
-      <w:lvlJc w:val="left"/>
-      <w:pPr>
-        <w:ind w:left="4320" w:hanging="360"/>
-      </w:pPr>
-      <w:rPr>
-        <w:u w:val="none"/>
-      </w:rPr>
-    </w:lvl>
-    <w:lvl w:ilvl="6">
-      <w:start w:val="1"/>
-      <w:numFmt w:val="bullet"/>
-      <w:lvlText w:val="●"/>
-      <w:lvlJc w:val="left"/>
-      <w:pPr>
-        <w:ind w:left="5040" w:hanging="360"/>
-      </w:pPr>
-      <w:rPr>
-        <w:u w:val="none"/>
-      </w:rPr>
-    </w:lvl>
-    <w:lvl w:ilvl="7">
-      <w:start w:val="1"/>
-      <w:numFmt w:val="bullet"/>
-      <w:lvlText w:val="○"/>
-      <w:lvlJc w:val="left"/>
-      <w:pPr>
-        <w:ind w:left="5760" w:hanging="360"/>
-      </w:pPr>
-      <w:rPr>
-        <w:u w:val="none"/>
-      </w:rPr>
-    </w:lvl>
-    <w:lvl w:ilvl="8">
-      <w:start w:val="1"/>
-      <w:numFmt w:val="bullet"/>
-      <w:lvlText w:val="■"/>
-      <w:lvlJc w:val="left"/>
-      <w:pPr>
-        <w:ind w:left="6480" w:hanging="360"/>
-      </w:pPr>
-      <w:rPr>
-        <w:u w:val="none"/>
-      </w:rPr>
-    </w:lvl>
-  </w:abstractNum>
-  <w:abstractNum w:abstractNumId="12">
-    <w:lvl w:ilvl="0">
-      <w:start w:val="1"/>
-      <w:numFmt w:val="bullet"/>
-      <w:lvlText w:val="●"/>
-      <w:lvlJc w:val="left"/>
-      <w:pPr>
-        <w:ind w:left="720" w:hanging="360"/>
-      </w:pPr>
-      <w:rPr>
-        <w:u w:val="none"/>
-      </w:rPr>
-    </w:lvl>
-    <w:lvl w:ilvl="1">
-      <w:start w:val="1"/>
-      <w:numFmt w:val="bullet"/>
-      <w:lvlText w:val="○"/>
-      <w:lvlJc w:val="left"/>
-      <w:pPr>
-        <w:ind w:left="1440" w:hanging="360"/>
-      </w:pPr>
-      <w:rPr>
-        <w:u w:val="none"/>
-      </w:rPr>
-    </w:lvl>
-    <w:lvl w:ilvl="2">
-      <w:start w:val="1"/>
-      <w:numFmt w:val="bullet"/>
-      <w:lvlText w:val="■"/>
-      <w:lvlJc w:val="left"/>
-      <w:pPr>
-        <w:ind w:left="2160" w:hanging="360"/>
-      </w:pPr>
-      <w:rPr>
-        <w:u w:val="none"/>
-      </w:rPr>
-    </w:lvl>
-    <w:lvl w:ilvl="3">
-      <w:start w:val="1"/>
-      <w:numFmt w:val="bullet"/>
-      <w:lvlText w:val="●"/>
-      <w:lvlJc w:val="left"/>
-      <w:pPr>
-        <w:ind w:left="2880" w:hanging="360"/>
-      </w:pPr>
-      <w:rPr>
-        <w:u w:val="none"/>
-      </w:rPr>
-    </w:lvl>
-    <w:lvl w:ilvl="4">
-      <w:start w:val="1"/>
-      <w:numFmt w:val="bullet"/>
-      <w:lvlText w:val="○"/>
-      <w:lvlJc w:val="left"/>
-      <w:pPr>
-        <w:ind w:left="3600" w:hanging="360"/>
-      </w:pPr>
-      <w:rPr>
-        <w:u w:val="none"/>
-      </w:rPr>
-    </w:lvl>
-    <w:lvl w:ilvl="5">
-      <w:start w:val="1"/>
-      <w:numFmt w:val="bullet"/>
-      <w:lvlText w:val="■"/>
-      <w:lvlJc w:val="left"/>
-      <w:pPr>
-        <w:ind w:left="4320" w:hanging="360"/>
-      </w:pPr>
-      <w:rPr>
-        <w:u w:val="none"/>
-      </w:rPr>
-    </w:lvl>
-    <w:lvl w:ilvl="6">
-      <w:start w:val="1"/>
-      <w:numFmt w:val="bullet"/>
-      <w:lvlText w:val="●"/>
-      <w:lvlJc w:val="left"/>
-      <w:pPr>
-        <w:ind w:left="5040" w:hanging="360"/>
-      </w:pPr>
-      <w:rPr>
-        <w:u w:val="none"/>
-      </w:rPr>
-    </w:lvl>
-    <w:lvl w:ilvl="7">
-      <w:start w:val="1"/>
-      <w:numFmt w:val="bullet"/>
-      <w:lvlText w:val="○"/>
-      <w:lvlJc w:val="left"/>
-      <w:pPr>
-        <w:ind w:left="5760" w:hanging="360"/>
-      </w:pPr>
-      <w:rPr>
-        <w:u w:val="none"/>
-      </w:rPr>
-    </w:lvl>
-    <w:lvl w:ilvl="8">
-      <w:start w:val="1"/>
-      <w:numFmt w:val="bullet"/>
-      <w:lvlText w:val="■"/>
-      <w:lvlJc w:val="left"/>
-      <w:pPr>
-        <w:ind w:left="6480" w:hanging="360"/>
-      </w:pPr>
-      <w:rPr>
-        <w:u w:val="none"/>
-      </w:rPr>
-    </w:lvl>
-  </w:abstractNum>
-  <w:abstractNum w:abstractNumId="13">
-    <w:lvl w:ilvl="0">
-      <w:start w:val="1"/>
-      <w:numFmt w:val="bullet"/>
-      <w:lvlText w:val="●"/>
-      <w:lvlJc w:val="left"/>
-      <w:pPr>
-        <w:ind w:left="720" w:hanging="360"/>
-      </w:pPr>
-      <w:rPr>
-        <w:u w:val="none"/>
-      </w:rPr>
-    </w:lvl>
-    <w:lvl w:ilvl="1">
-      <w:start w:val="1"/>
-      <w:numFmt w:val="bullet"/>
-      <w:lvlText w:val="○"/>
-      <w:lvlJc w:val="left"/>
-      <w:pPr>
-        <w:ind w:left="1440" w:hanging="360"/>
-      </w:pPr>
-      <w:rPr>
-        <w:u w:val="none"/>
-      </w:rPr>
-    </w:lvl>
-    <w:lvl w:ilvl="2">
-      <w:start w:val="1"/>
-      <w:numFmt w:val="bullet"/>
-      <w:lvlText w:val="■"/>
-      <w:lvlJc w:val="left"/>
-      <w:pPr>
-        <w:ind w:left="2160" w:hanging="360"/>
-      </w:pPr>
-      <w:rPr>
-        <w:u w:val="none"/>
-      </w:rPr>
-    </w:lvl>
-    <w:lvl w:ilvl="3">
-      <w:start w:val="1"/>
-      <w:numFmt w:val="bullet"/>
-      <w:lvlText w:val="●"/>
-      <w:lvlJc w:val="left"/>
-      <w:pPr>
-        <w:ind w:left="2880" w:hanging="360"/>
-      </w:pPr>
-      <w:rPr>
-        <w:u w:val="none"/>
-      </w:rPr>
-    </w:lvl>
-    <w:lvl w:ilvl="4">
-      <w:start w:val="1"/>
-      <w:numFmt w:val="bullet"/>
-      <w:lvlText w:val="○"/>
-      <w:lvlJc w:val="left"/>
-      <w:pPr>
-        <w:ind w:left="3600" w:hanging="360"/>
-      </w:pPr>
-      <w:rPr>
-        <w:u w:val="none"/>
-      </w:rPr>
-    </w:lvl>
-    <w:lvl w:ilvl="5">
-      <w:start w:val="1"/>
-      <w:numFmt w:val="bullet"/>
-      <w:lvlText w:val="■"/>
-      <w:lvlJc w:val="left"/>
-      <w:pPr>
-        <w:ind w:left="4320" w:hanging="360"/>
-      </w:pPr>
-      <w:rPr>
-        <w:u w:val="none"/>
-      </w:rPr>
-    </w:lvl>
-    <w:lvl w:ilvl="6">
-      <w:start w:val="1"/>
-      <w:numFmt w:val="bullet"/>
-      <w:lvlText w:val="●"/>
-      <w:lvlJc w:val="left"/>
-      <w:pPr>
-        <w:ind w:left="5040" w:hanging="360"/>
-      </w:pPr>
-      <w:rPr>
-        <w:u w:val="none"/>
-      </w:rPr>
-    </w:lvl>
-    <w:lvl w:ilvl="7">
-      <w:start w:val="1"/>
-      <w:numFmt w:val="bullet"/>
-      <w:lvlText w:val="○"/>
-      <w:lvlJc w:val="left"/>
-      <w:pPr>
-        <w:ind w:left="5760" w:hanging="360"/>
-      </w:pPr>
-      <w:rPr>
-        <w:u w:val="none"/>
-      </w:rPr>
-    </w:lvl>
-    <w:lvl w:ilvl="8">
-      <w:start w:val="1"/>
-      <w:numFmt w:val="bullet"/>
-      <w:lvlText w:val="■"/>
-      <w:lvlJc w:val="left"/>
-      <w:pPr>
-        <w:ind w:left="6480" w:hanging="360"/>
-      </w:pPr>
-      <w:rPr>
-        <w:u w:val="none"/>
-      </w:rPr>
-    </w:lvl>
-  </w:abstractNum>
-  <w:abstractNum w:abstractNumId="14">
-    <w:lvl w:ilvl="0">
-      <w:start w:val="1"/>
-      <w:numFmt w:val="bullet"/>
-      <w:lvlText w:val="●"/>
-      <w:lvlJc w:val="left"/>
-      <w:pPr>
-        <w:ind w:left="720" w:hanging="360"/>
-      </w:pPr>
-      <w:rPr>
-        <w:u w:val="none"/>
-      </w:rPr>
-    </w:lvl>
-    <w:lvl w:ilvl="1">
-      <w:start w:val="1"/>
-      <w:numFmt w:val="bullet"/>
-      <w:lvlText w:val="○"/>
-      <w:lvlJc w:val="left"/>
-      <w:pPr>
-        <w:ind w:left="1440" w:hanging="360"/>
-      </w:pPr>
-      <w:rPr>
-        <w:u w:val="none"/>
-      </w:rPr>
-    </w:lvl>
-    <w:lvl w:ilvl="2">
-      <w:start w:val="1"/>
-      <w:numFmt w:val="bullet"/>
-      <w:lvlText w:val="■"/>
-      <w:lvlJc w:val="left"/>
-      <w:pPr>
-        <w:ind w:left="2160" w:hanging="360"/>
-      </w:pPr>
-      <w:rPr>
-        <w:u w:val="none"/>
-      </w:rPr>
-    </w:lvl>
-    <w:lvl w:ilvl="3">
-      <w:start w:val="1"/>
-      <w:numFmt w:val="bullet"/>
-      <w:lvlText w:val="●"/>
-      <w:lvlJc w:val="left"/>
-      <w:pPr>
-        <w:ind w:left="2880" w:hanging="360"/>
-      </w:pPr>
-      <w:rPr>
-        <w:u w:val="none"/>
-      </w:rPr>
-    </w:lvl>
-    <w:lvl w:ilvl="4">
-      <w:start w:val="1"/>
-      <w:numFmt w:val="bullet"/>
-      <w:lvlText w:val="○"/>
-      <w:lvlJc w:val="left"/>
-      <w:pPr>
-        <w:ind w:left="3600" w:hanging="360"/>
-      </w:pPr>
-      <w:rPr>
-        <w:u w:val="none"/>
-      </w:rPr>
-    </w:lvl>
-    <w:lvl w:ilvl="5">
-      <w:start w:val="1"/>
-      <w:numFmt w:val="bullet"/>
-      <w:lvlText w:val="■"/>
-      <w:lvlJc w:val="left"/>
-      <w:pPr>
-        <w:ind w:left="4320" w:hanging="360"/>
-      </w:pPr>
-      <w:rPr>
-        <w:u w:val="none"/>
-      </w:rPr>
-    </w:lvl>
-    <w:lvl w:ilvl="6">
-      <w:start w:val="1"/>
-      <w:numFmt w:val="bullet"/>
-      <w:lvlText w:val="●"/>
-      <w:lvlJc w:val="left"/>
-      <w:pPr>
-        <w:ind w:left="5040" w:hanging="360"/>
-      </w:pPr>
-      <w:rPr>
-        <w:u w:val="none"/>
-      </w:rPr>
-    </w:lvl>
-    <w:lvl w:ilvl="7">
-      <w:start w:val="1"/>
-      <w:numFmt w:val="bullet"/>
-      <w:lvlText w:val="○"/>
-      <w:lvlJc w:val="left"/>
-      <w:pPr>
-        <w:ind w:left="5760" w:hanging="360"/>
-      </w:pPr>
-      <w:rPr>
-        <w:u w:val="none"/>
-      </w:rPr>
-    </w:lvl>
-    <w:lvl w:ilvl="8">
-      <w:start w:val="1"/>
-      <w:numFmt w:val="bullet"/>
-      <w:lvlText w:val="■"/>
-      <w:lvlJc w:val="left"/>
-      <w:pPr>
-        <w:ind w:left="6480" w:hanging="360"/>
-      </w:pPr>
-      <w:rPr>
-        <w:u w:val="none"/>
-      </w:rPr>
-    </w:lvl>
-  </w:abstractNum>
-  <w:abstractNum w:abstractNumId="15">
-    <w:lvl w:ilvl="0">
-      <w:start w:val="1"/>
-      <w:numFmt w:val="bullet"/>
-      <w:lvlText w:val="●"/>
-      <w:lvlJc w:val="left"/>
-      <w:pPr>
-        <w:ind w:left="720" w:hanging="360"/>
-      </w:pPr>
-      <w:rPr>
-        <w:u w:val="none"/>
-      </w:rPr>
-    </w:lvl>
-    <w:lvl w:ilvl="1">
-      <w:start w:val="1"/>
-      <w:numFmt w:val="bullet"/>
-      <w:lvlText w:val="○"/>
-      <w:lvlJc w:val="left"/>
-      <w:pPr>
-        <w:ind w:left="1440" w:hanging="360"/>
-      </w:pPr>
-      <w:rPr>
-        <w:u w:val="none"/>
-      </w:rPr>
-    </w:lvl>
-    <w:lvl w:ilvl="2">
-      <w:start w:val="1"/>
-      <w:numFmt w:val="bullet"/>
-      <w:lvlText w:val="■"/>
-      <w:lvlJc w:val="left"/>
-      <w:pPr>
-        <w:ind w:left="2160" w:hanging="360"/>
-      </w:pPr>
-      <w:rPr>
-        <w:u w:val="none"/>
-      </w:rPr>
-    </w:lvl>
-    <w:lvl w:ilvl="3">
-      <w:start w:val="1"/>
-      <w:numFmt w:val="bullet"/>
-      <w:lvlText w:val="●"/>
-      <w:lvlJc w:val="left"/>
-      <w:pPr>
-        <w:ind w:left="2880" w:hanging="360"/>
-      </w:pPr>
-      <w:rPr>
-        <w:u w:val="none"/>
-      </w:rPr>
-    </w:lvl>
-    <w:lvl w:ilvl="4">
-      <w:start w:val="1"/>
-      <w:numFmt w:val="bullet"/>
-      <w:lvlText w:val="○"/>
-      <w:lvlJc w:val="left"/>
-      <w:pPr>
-        <w:ind w:left="3600" w:hanging="360"/>
-      </w:pPr>
-      <w:rPr>
-        <w:u w:val="none"/>
-      </w:rPr>
-    </w:lvl>
-    <w:lvl w:ilvl="5">
-      <w:start w:val="1"/>
-      <w:numFmt w:val="bullet"/>
-      <w:lvlText w:val="■"/>
-      <w:lvlJc w:val="left"/>
-      <w:pPr>
-        <w:ind w:left="4320" w:hanging="360"/>
-      </w:pPr>
-      <w:rPr>
-        <w:u w:val="none"/>
-      </w:rPr>
-    </w:lvl>
-    <w:lvl w:ilvl="6">
-      <w:start w:val="1"/>
-      <w:numFmt w:val="bullet"/>
-      <w:lvlText w:val="●"/>
-      <w:lvlJc w:val="left"/>
-      <w:pPr>
-        <w:ind w:left="5040" w:hanging="360"/>
-      </w:pPr>
-      <w:rPr>
-        <w:u w:val="none"/>
-      </w:rPr>
-    </w:lvl>
-    <w:lvl w:ilvl="7">
-      <w:start w:val="1"/>
-      <w:numFmt w:val="bullet"/>
-      <w:lvlText w:val="○"/>
-      <w:lvlJc w:val="left"/>
-      <w:pPr>
-        <w:ind w:left="5760" w:hanging="360"/>
-      </w:pPr>
-      <w:rPr>
-        <w:u w:val="none"/>
-      </w:rPr>
-    </w:lvl>
-    <w:lvl w:ilvl="8">
-      <w:start w:val="1"/>
-      <w:numFmt w:val="bullet"/>
-      <w:lvlText w:val="■"/>
-      <w:lvlJc w:val="left"/>
-      <w:pPr>
-        <w:ind w:left="6480" w:hanging="360"/>
-      </w:pPr>
-      <w:rPr>
-        <w:u w:val="none"/>
-      </w:rPr>
-    </w:lvl>
-  </w:abstractNum>
-  <w:abstractNum w:abstractNumId="16">
     <w:lvl w:ilvl="0">
       <w:start w:val="1"/>
       <w:numFmt w:val="bullet"/>
@@ -10517,21 +7911,6 @@
   </w:num>
   <w:num w:numId="11">
     <w:abstractNumId w:val="11"/>
-  </w:num>
-  <w:num w:numId="12">
-    <w:abstractNumId w:val="12"/>
-  </w:num>
-  <w:num w:numId="13">
-    <w:abstractNumId w:val="13"/>
-  </w:num>
-  <w:num w:numId="14">
-    <w:abstractNumId w:val="14"/>
-  </w:num>
-  <w:num w:numId="15">
-    <w:abstractNumId w:val="15"/>
-  </w:num>
-  <w:num w:numId="16">
-    <w:abstractNumId w:val="16"/>
   </w:num>
 </w:numbering>
 </file>
@@ -10723,20 +8102,6 @@
     </w:tblPr>
   </w:style>
   <w:style w:type="table" w:styleId="Table4">
-    <w:basedOn w:val="TableNormal"/>
-    <w:tblPr>
-      <w:tblStyleRowBandSize w:val="1"/>
-      <w:tblStyleColBandSize w:val="1"/>
-    </w:tblPr>
-  </w:style>
-  <w:style w:type="table" w:styleId="Table5">
-    <w:basedOn w:val="TableNormal"/>
-    <w:tblPr>
-      <w:tblStyleRowBandSize w:val="1"/>
-      <w:tblStyleColBandSize w:val="1"/>
-    </w:tblPr>
-  </w:style>
-  <w:style w:type="table" w:styleId="Table6">
     <w:basedOn w:val="TableNormal"/>
     <w:tblPr>
       <w:tblStyleRowBandSize w:val="1"/>

</xml_diff>

<commit_message>
Colocando a tabela do daniel com os dados completos.
</commit_message>
<xml_diff>
--- a/sleep_street.docx
+++ b/sleep_street.docx
@@ -4495,7 +4495,7 @@
               <w:widowControl w:val="0"/>
               <w:numPr>
                 <w:ilvl w:val="0"/>
-                <w:numId w:val="10"/>
+                <w:numId w:val="11"/>
               </w:numPr>
               <w:spacing w:line="240" w:lineRule="auto"/>
               <w:ind w:left="720" w:hanging="360"/>
@@ -4574,7 +4574,7 @@
               <w:widowControl w:val="0"/>
               <w:numPr>
                 <w:ilvl w:val="0"/>
-                <w:numId w:val="10"/>
+                <w:numId w:val="11"/>
               </w:numPr>
               <w:spacing w:line="240" w:lineRule="auto"/>
               <w:ind w:left="720" w:hanging="360"/>
@@ -6102,7 +6102,7 @@
               <w:widowControl w:val="0"/>
               <w:numPr>
                 <w:ilvl w:val="0"/>
-                <w:numId w:val="11"/>
+                <w:numId w:val="12"/>
               </w:numPr>
               <w:spacing w:line="240" w:lineRule="auto"/>
               <w:ind w:left="720" w:hanging="360"/>
@@ -6162,7 +6162,7 @@
               <w:widowControl w:val="0"/>
               <w:numPr>
                 <w:ilvl w:val="0"/>
-                <w:numId w:val="11"/>
+                <w:numId w:val="12"/>
               </w:numPr>
               <w:spacing w:line="240" w:lineRule="auto"/>
               <w:ind w:left="720" w:hanging="360"/>
@@ -6227,6 +6227,922 @@
         </w:rPr>
       </w:r>
     </w:p>
+    <w:tbl>
+      <w:tblPr>
+        <w:tblStyle w:val="Table5"/>
+        <w:tblW w:w="14010.0" w:type="dxa"/>
+        <w:jc w:val="left"/>
+        <w:tblBorders>
+          <w:top w:color="000000" w:space="0" w:sz="8" w:val="single"/>
+          <w:left w:color="000000" w:space="0" w:sz="8" w:val="single"/>
+          <w:bottom w:color="000000" w:space="0" w:sz="8" w:val="single"/>
+          <w:right w:color="000000" w:space="0" w:sz="8" w:val="single"/>
+          <w:insideH w:color="000000" w:space="0" w:sz="8" w:val="single"/>
+          <w:insideV w:color="000000" w:space="0" w:sz="8" w:val="single"/>
+        </w:tblBorders>
+        <w:tblLayout w:type="fixed"/>
+        <w:tblLook w:val="0600"/>
+      </w:tblPr>
+      <w:tblGrid>
+        <w:gridCol w:w="2535"/>
+        <w:gridCol w:w="11475"/>
+        <w:tblGridChange w:id="0">
+          <w:tblGrid>
+            <w:gridCol w:w="2535"/>
+            <w:gridCol w:w="11475"/>
+          </w:tblGrid>
+        </w:tblGridChange>
+      </w:tblGrid>
+      <w:tr>
+        <w:trPr>
+          <w:cantSplit w:val="0"/>
+          <w:tblHeader w:val="0"/>
+        </w:trPr>
+        <w:tc>
+          <w:tcPr>
+            <w:shd w:fill="999999" w:val="clear"/>
+            <w:tcMar>
+              <w:top w:w="100.0" w:type="dxa"/>
+              <w:left w:w="100.0" w:type="dxa"/>
+              <w:bottom w:w="100.0" w:type="dxa"/>
+              <w:right w:w="100.0" w:type="dxa"/>
+            </w:tcMar>
+            <w:vAlign w:val="top"/>
+          </w:tcPr>
+          <w:p>
+            <w:pPr>
+              <w:widowControl w:val="0"/>
+              <w:spacing w:line="240" w:lineRule="auto"/>
+              <w:rPr>
+                <w:b w:val="1"/>
+                <w:bCs w:val="1"/>
+                <w:sz w:val="24"/>
+                <w:szCs w:val="24"/>
+              </w:rPr>
+            </w:pPr>
+            <w:r>
+              <w:rPr>
+                <w:b w:val="1"/>
+                <w:bCs w:val="1"/>
+                <w:sz w:val="24"/>
+                <w:szCs w:val="24"/>
+                <w:rtl w:val="0"/>
+              </w:rPr>
+              <w:t xml:space="preserve">CASO DE USO EXPANDIDO - 003</w:t>
+            </w:r>
+          </w:p>
+        </w:tc>
+        <w:tc>
+          <w:tcPr>
+            <w:shd w:fill="999999" w:val="clear"/>
+            <w:tcMar>
+              <w:top w:w="100.0" w:type="dxa"/>
+              <w:left w:w="100.0" w:type="dxa"/>
+              <w:bottom w:w="100.0" w:type="dxa"/>
+              <w:right w:w="100.0" w:type="dxa"/>
+            </w:tcMar>
+            <w:vAlign w:val="top"/>
+          </w:tcPr>
+          <w:p>
+            <w:pPr>
+              <w:widowControl w:val="0"/>
+              <w:spacing w:line="240" w:lineRule="auto"/>
+              <w:rPr>
+                <w:b w:val="1"/>
+                <w:bCs w:val="1"/>
+                <w:sz w:val="24"/>
+                <w:szCs w:val="24"/>
+              </w:rPr>
+            </w:pPr>
+            <w:r>
+              <w:rPr>
+                <w:b w:val="1"/>
+                <w:bCs w:val="1"/>
+                <w:sz w:val="24"/>
+                <w:szCs w:val="24"/>
+                <w:rtl w:val="0"/>
+              </w:rPr>
+              <w:t xml:space="preserve">   Dhaniel Moreira N:10</w:t>
+            </w:r>
+          </w:p>
+        </w:tc>
+      </w:tr>
+      <w:tr>
+        <w:trPr>
+          <w:cantSplit w:val="0"/>
+          <w:tblHeader w:val="0"/>
+        </w:trPr>
+        <w:tc>
+          <w:tcPr>
+            <w:shd w:fill="999999" w:val="clear"/>
+            <w:tcMar>
+              <w:top w:w="100.0" w:type="dxa"/>
+              <w:left w:w="100.0" w:type="dxa"/>
+              <w:bottom w:w="100.0" w:type="dxa"/>
+              <w:right w:w="100.0" w:type="dxa"/>
+            </w:tcMar>
+            <w:vAlign w:val="top"/>
+          </w:tcPr>
+          <w:p>
+            <w:pPr>
+              <w:widowControl w:val="0"/>
+              <w:spacing w:line="240" w:lineRule="auto"/>
+              <w:rPr>
+                <w:b w:val="1"/>
+                <w:bCs w:val="1"/>
+                <w:sz w:val="24"/>
+                <w:szCs w:val="24"/>
+              </w:rPr>
+            </w:pPr>
+            <w:r>
+              <w:rPr>
+                <w:b w:val="1"/>
+                <w:bCs w:val="1"/>
+                <w:sz w:val="24"/>
+                <w:szCs w:val="24"/>
+                <w:rtl w:val="0"/>
+              </w:rPr>
+              <w:t xml:space="preserve">Ator Principal: </w:t>
+            </w:r>
+          </w:p>
+        </w:tc>
+        <w:tc>
+          <w:tcPr>
+            <w:shd w:fill="auto" w:val="clear"/>
+            <w:tcMar>
+              <w:top w:w="100.0" w:type="dxa"/>
+              <w:left w:w="100.0" w:type="dxa"/>
+              <w:bottom w:w="100.0" w:type="dxa"/>
+              <w:right w:w="100.0" w:type="dxa"/>
+            </w:tcMar>
+            <w:vAlign w:val="top"/>
+          </w:tcPr>
+          <w:p>
+            <w:pPr>
+              <w:rPr>
+                <w:sz w:val="24"/>
+                <w:szCs w:val="24"/>
+              </w:rPr>
+            </w:pPr>
+            <w:r>
+              <w:rPr>
+                <w:rtl w:val="0"/>
+              </w:rPr>
+              <w:t xml:space="preserve">Viajante Solo (Cliente)</w:t>
+            </w:r>
+            <w:r>
+              <w:rPr>
+                <w:rtl w:val="0"/>
+              </w:rPr>
+            </w:r>
+          </w:p>
+        </w:tc>
+      </w:tr>
+      <w:tr>
+        <w:trPr>
+          <w:cantSplit w:val="0"/>
+          <w:tblHeader w:val="0"/>
+        </w:trPr>
+        <w:tc>
+          <w:tcPr>
+            <w:shd w:fill="999999" w:val="clear"/>
+            <w:tcMar>
+              <w:top w:w="100.0" w:type="dxa"/>
+              <w:left w:w="100.0" w:type="dxa"/>
+              <w:bottom w:w="100.0" w:type="dxa"/>
+              <w:right w:w="100.0" w:type="dxa"/>
+            </w:tcMar>
+            <w:vAlign w:val="top"/>
+          </w:tcPr>
+          <w:p>
+            <w:pPr>
+              <w:widowControl w:val="0"/>
+              <w:spacing w:line="240" w:lineRule="auto"/>
+              <w:rPr>
+                <w:b w:val="1"/>
+                <w:bCs w:val="1"/>
+                <w:sz w:val="24"/>
+                <w:szCs w:val="24"/>
+              </w:rPr>
+            </w:pPr>
+            <w:r>
+              <w:rPr>
+                <w:b w:val="1"/>
+                <w:bCs w:val="1"/>
+                <w:sz w:val="24"/>
+                <w:szCs w:val="24"/>
+                <w:rtl w:val="0"/>
+              </w:rPr>
+              <w:t xml:space="preserve">Resumo: </w:t>
+            </w:r>
+          </w:p>
+        </w:tc>
+        <w:tc>
+          <w:tcPr>
+            <w:shd w:fill="auto" w:val="clear"/>
+            <w:tcMar>
+              <w:top w:w="100.0" w:type="dxa"/>
+              <w:left w:w="100.0" w:type="dxa"/>
+              <w:bottom w:w="100.0" w:type="dxa"/>
+              <w:right w:w="100.0" w:type="dxa"/>
+            </w:tcMar>
+            <w:vAlign w:val="top"/>
+          </w:tcPr>
+          <w:p>
+            <w:pPr>
+              <w:rPr>
+                <w:sz w:val="24"/>
+                <w:szCs w:val="24"/>
+              </w:rPr>
+            </w:pPr>
+            <w:r>
+              <w:rPr>
+                <w:rtl w:val="0"/>
+              </w:rPr>
+              <w:t xml:space="preserve">O viajante informa os preços desejados de hospedagens e atrações. O app sugere opções mais baratas ou com melhor avaliação baseado no perfil de gastos. O sistema mostra locais turísticos próximos à hospedagem, como parques, shoppings, praças e zoológicos, com informações básicas. Gera automaticamente uma lista de itens para bagagem baseada no destino, clima, duração da viagem e perfil do usuário (lazer ou negócios).</w:t>
+            </w:r>
+            <w:r>
+              <w:rPr>
+                <w:rtl w:val="0"/>
+              </w:rPr>
+            </w:r>
+          </w:p>
+        </w:tc>
+      </w:tr>
+      <w:tr>
+        <w:trPr>
+          <w:cantSplit w:val="0"/>
+          <w:tblHeader w:val="0"/>
+        </w:trPr>
+        <w:tc>
+          <w:tcPr>
+            <w:shd w:fill="999999" w:val="clear"/>
+            <w:tcMar>
+              <w:top w:w="100.0" w:type="dxa"/>
+              <w:left w:w="100.0" w:type="dxa"/>
+              <w:bottom w:w="100.0" w:type="dxa"/>
+              <w:right w:w="100.0" w:type="dxa"/>
+            </w:tcMar>
+            <w:vAlign w:val="top"/>
+          </w:tcPr>
+          <w:p>
+            <w:pPr>
+              <w:widowControl w:val="0"/>
+              <w:spacing w:line="240" w:lineRule="auto"/>
+              <w:rPr>
+                <w:b w:val="1"/>
+                <w:bCs w:val="1"/>
+                <w:sz w:val="24"/>
+                <w:szCs w:val="24"/>
+              </w:rPr>
+            </w:pPr>
+            <w:r>
+              <w:rPr>
+                <w:b w:val="1"/>
+                <w:bCs w:val="1"/>
+                <w:sz w:val="24"/>
+                <w:szCs w:val="24"/>
+                <w:rtl w:val="0"/>
+              </w:rPr>
+              <w:t xml:space="preserve">Pré-condições: </w:t>
+            </w:r>
+          </w:p>
+        </w:tc>
+        <w:tc>
+          <w:tcPr>
+            <w:shd w:fill="auto" w:val="clear"/>
+            <w:tcMar>
+              <w:top w:w="100.0" w:type="dxa"/>
+              <w:left w:w="100.0" w:type="dxa"/>
+              <w:bottom w:w="100.0" w:type="dxa"/>
+              <w:right w:w="100.0" w:type="dxa"/>
+            </w:tcMar>
+            <w:vAlign w:val="top"/>
+          </w:tcPr>
+          <w:p>
+            <w:pPr>
+              <w:rPr/>
+            </w:pPr>
+            <w:r>
+              <w:rPr>
+                <w:rtl w:val="0"/>
+              </w:rPr>
+              <w:t xml:space="preserve">- O usuário está logado.</w:t>
+            </w:r>
+          </w:p>
+          <w:p>
+            <w:pPr>
+              <w:rPr>
+                <w:sz w:val="24"/>
+                <w:szCs w:val="24"/>
+              </w:rPr>
+            </w:pPr>
+            <w:r>
+              <w:rPr>
+                <w:rtl w:val="0"/>
+              </w:rPr>
+              <w:t xml:space="preserve">- Tem uma viagem selecionada.</w:t>
+            </w:r>
+            <w:r>
+              <w:rPr>
+                <w:rtl w:val="0"/>
+              </w:rPr>
+            </w:r>
+          </w:p>
+          <w:p>
+            <w:pPr>
+              <w:widowControl w:val="0"/>
+              <w:spacing w:line="240" w:lineRule="auto"/>
+              <w:rPr>
+                <w:sz w:val="24"/>
+                <w:szCs w:val="24"/>
+              </w:rPr>
+            </w:pPr>
+            <w:r>
+              <w:rPr>
+                <w:rtl w:val="0"/>
+              </w:rPr>
+            </w:r>
+          </w:p>
+        </w:tc>
+      </w:tr>
+      <w:tr>
+        <w:trPr>
+          <w:cantSplit w:val="0"/>
+          <w:tblHeader w:val="0"/>
+        </w:trPr>
+        <w:tc>
+          <w:tcPr>
+            <w:shd w:fill="999999" w:val="clear"/>
+            <w:tcMar>
+              <w:top w:w="100.0" w:type="dxa"/>
+              <w:left w:w="100.0" w:type="dxa"/>
+              <w:bottom w:w="100.0" w:type="dxa"/>
+              <w:right w:w="100.0" w:type="dxa"/>
+            </w:tcMar>
+            <w:vAlign w:val="top"/>
+          </w:tcPr>
+          <w:p>
+            <w:pPr>
+              <w:widowControl w:val="0"/>
+              <w:spacing w:line="240" w:lineRule="auto"/>
+              <w:rPr>
+                <w:b w:val="1"/>
+                <w:bCs w:val="1"/>
+                <w:sz w:val="24"/>
+                <w:szCs w:val="24"/>
+              </w:rPr>
+            </w:pPr>
+            <w:r>
+              <w:rPr>
+                <w:b w:val="1"/>
+                <w:bCs w:val="1"/>
+                <w:sz w:val="24"/>
+                <w:szCs w:val="24"/>
+                <w:rtl w:val="0"/>
+              </w:rPr>
+              <w:t xml:space="preserve">Pós-condições: </w:t>
+            </w:r>
+          </w:p>
+        </w:tc>
+        <w:tc>
+          <w:tcPr>
+            <w:shd w:fill="auto" w:val="clear"/>
+            <w:tcMar>
+              <w:top w:w="100.0" w:type="dxa"/>
+              <w:left w:w="100.0" w:type="dxa"/>
+              <w:bottom w:w="100.0" w:type="dxa"/>
+              <w:right w:w="100.0" w:type="dxa"/>
+            </w:tcMar>
+            <w:vAlign w:val="top"/>
+          </w:tcPr>
+          <w:p>
+            <w:pPr>
+              <w:rPr/>
+            </w:pPr>
+            <w:r>
+              <w:rPr>
+                <w:sz w:val="24"/>
+                <w:szCs w:val="24"/>
+                <w:rtl w:val="0"/>
+              </w:rPr>
+              <w:t xml:space="preserve">- </w:t>
+            </w:r>
+            <w:r>
+              <w:rPr>
+                <w:rtl w:val="0"/>
+              </w:rPr>
+              <w:t xml:space="preserve">As sugestões são exibidas com filtros de preço e avaliação.</w:t>
+            </w:r>
+          </w:p>
+          <w:p>
+            <w:pPr>
+              <w:rPr>
+                <w:sz w:val="24"/>
+                <w:szCs w:val="24"/>
+              </w:rPr>
+            </w:pPr>
+            <w:r>
+              <w:rPr>
+                <w:rtl w:val="0"/>
+              </w:rPr>
+              <w:t xml:space="preserve">- A lista de bagagem é gerada e salva.</w:t>
+            </w:r>
+            <w:r>
+              <w:rPr>
+                <w:rtl w:val="0"/>
+              </w:rPr>
+            </w:r>
+          </w:p>
+        </w:tc>
+      </w:tr>
+      <w:tr>
+        <w:trPr>
+          <w:cantSplit w:val="0"/>
+          <w:trHeight w:val="3074.2529296875" w:hRule="atLeast"/>
+          <w:tblHeader w:val="0"/>
+        </w:trPr>
+        <w:tc>
+          <w:tcPr>
+            <w:shd w:fill="999999" w:val="clear"/>
+            <w:tcMar>
+              <w:top w:w="100.0" w:type="dxa"/>
+              <w:left w:w="100.0" w:type="dxa"/>
+              <w:bottom w:w="100.0" w:type="dxa"/>
+              <w:right w:w="100.0" w:type="dxa"/>
+            </w:tcMar>
+            <w:vAlign w:val="top"/>
+          </w:tcPr>
+          <w:p>
+            <w:pPr>
+              <w:widowControl w:val="0"/>
+              <w:spacing w:line="240" w:lineRule="auto"/>
+              <w:rPr>
+                <w:b w:val="1"/>
+                <w:bCs w:val="1"/>
+                <w:sz w:val="24"/>
+                <w:szCs w:val="24"/>
+              </w:rPr>
+            </w:pPr>
+            <w:r>
+              <w:rPr>
+                <w:b w:val="1"/>
+                <w:bCs w:val="1"/>
+                <w:sz w:val="24"/>
+                <w:szCs w:val="24"/>
+                <w:rtl w:val="0"/>
+              </w:rPr>
+              <w:t xml:space="preserve">Fluxo Principal: </w:t>
+            </w:r>
+          </w:p>
+        </w:tc>
+        <w:tc>
+          <w:tcPr>
+            <w:shd w:fill="auto" w:val="clear"/>
+            <w:tcMar>
+              <w:top w:w="100.0" w:type="dxa"/>
+              <w:left w:w="100.0" w:type="dxa"/>
+              <w:bottom w:w="100.0" w:type="dxa"/>
+              <w:right w:w="100.0" w:type="dxa"/>
+            </w:tcMar>
+            <w:vAlign w:val="top"/>
+          </w:tcPr>
+          <w:p>
+            <w:pPr>
+              <w:numPr>
+                <w:ilvl w:val="0"/>
+                <w:numId w:val="10"/>
+              </w:numPr>
+              <w:ind w:left="720" w:hanging="360"/>
+              <w:rPr>
+                <w:u w:val="none"/>
+              </w:rPr>
+            </w:pPr>
+            <w:r>
+              <w:rPr>
+                <w:rtl w:val="0"/>
+              </w:rPr>
+              <w:t xml:space="preserve">1. O usuário seleciona uma viagem.</w:t>
+            </w:r>
+          </w:p>
+          <w:p>
+            <w:pPr>
+              <w:numPr>
+                <w:ilvl w:val="0"/>
+                <w:numId w:val="10"/>
+              </w:numPr>
+              <w:ind w:left="720" w:hanging="360"/>
+              <w:rPr>
+                <w:u w:val="none"/>
+              </w:rPr>
+            </w:pPr>
+            <w:r>
+              <w:rPr>
+                <w:rtl w:val="0"/>
+              </w:rPr>
+              <w:t xml:space="preserve">2. Clica na aba "Hospedagem" ou "Atrações".</w:t>
+            </w:r>
+          </w:p>
+          <w:p>
+            <w:pPr>
+              <w:numPr>
+                <w:ilvl w:val="0"/>
+                <w:numId w:val="10"/>
+              </w:numPr>
+              <w:ind w:left="720" w:hanging="360"/>
+              <w:rPr>
+                <w:u w:val="none"/>
+              </w:rPr>
+            </w:pPr>
+            <w:r>
+              <w:rPr>
+                <w:rtl w:val="0"/>
+              </w:rPr>
+              <w:t xml:space="preserve">3. Informa preço máximo e avaliação desejada.</w:t>
+            </w:r>
+          </w:p>
+          <w:p>
+            <w:pPr>
+              <w:numPr>
+                <w:ilvl w:val="0"/>
+                <w:numId w:val="10"/>
+              </w:numPr>
+              <w:ind w:left="720" w:hanging="360"/>
+              <w:rPr>
+                <w:u w:val="none"/>
+              </w:rPr>
+            </w:pPr>
+            <w:r>
+              <w:rPr>
+                <w:rtl w:val="0"/>
+              </w:rPr>
+              <w:t xml:space="preserve">4. O sistema filtra e sugere opções.</w:t>
+            </w:r>
+          </w:p>
+          <w:p>
+            <w:pPr>
+              <w:numPr>
+                <w:ilvl w:val="0"/>
+                <w:numId w:val="10"/>
+              </w:numPr>
+              <w:ind w:left="720" w:hanging="360"/>
+              <w:rPr>
+                <w:u w:val="none"/>
+              </w:rPr>
+            </w:pPr>
+            <w:r>
+              <w:rPr>
+                <w:rtl w:val="0"/>
+              </w:rPr>
+              <w:t xml:space="preserve">5. Exibe mapa e fotos + avaliações.</w:t>
+            </w:r>
+          </w:p>
+          <w:p>
+            <w:pPr>
+              <w:numPr>
+                <w:ilvl w:val="0"/>
+                <w:numId w:val="10"/>
+              </w:numPr>
+              <w:ind w:left="720" w:hanging="360"/>
+              <w:rPr>
+                <w:u w:val="none"/>
+              </w:rPr>
+            </w:pPr>
+            <w:r>
+              <w:rPr>
+                <w:rtl w:val="0"/>
+              </w:rPr>
+              <w:t xml:space="preserve">6. O usuário acessa a aba "Bagagem".</w:t>
+            </w:r>
+          </w:p>
+          <w:p>
+            <w:pPr>
+              <w:numPr>
+                <w:ilvl w:val="0"/>
+                <w:numId w:val="10"/>
+              </w:numPr>
+              <w:ind w:left="720" w:hanging="360"/>
+              <w:rPr>
+                <w:u w:val="none"/>
+              </w:rPr>
+            </w:pPr>
+            <w:r>
+              <w:rPr>
+                <w:rtl w:val="0"/>
+              </w:rPr>
+              <w:t xml:space="preserve">7. Seleciona tipo de viagem (lazer ou negócios).</w:t>
+            </w:r>
+          </w:p>
+          <w:p>
+            <w:pPr>
+              <w:numPr>
+                <w:ilvl w:val="0"/>
+                <w:numId w:val="10"/>
+              </w:numPr>
+              <w:ind w:left="720" w:hanging="360"/>
+              <w:rPr>
+                <w:u w:val="none"/>
+              </w:rPr>
+            </w:pPr>
+            <w:r>
+              <w:rPr>
+                <w:rtl w:val="0"/>
+              </w:rPr>
+              <w:t xml:space="preserve">8. Clica em "Gerar lista de bagagem".</w:t>
+            </w:r>
+          </w:p>
+          <w:p>
+            <w:pPr>
+              <w:numPr>
+                <w:ilvl w:val="0"/>
+                <w:numId w:val="10"/>
+              </w:numPr>
+              <w:ind w:left="720" w:hanging="360"/>
+              <w:rPr>
+                <w:u w:val="none"/>
+              </w:rPr>
+            </w:pPr>
+            <w:r>
+              <w:rPr>
+                <w:rtl w:val="0"/>
+              </w:rPr>
+              <w:t xml:space="preserve">9. Marque itens organizados e adicione lembretes.</w:t>
+            </w:r>
+          </w:p>
+          <w:p>
+            <w:pPr>
+              <w:numPr>
+                <w:ilvl w:val="0"/>
+                <w:numId w:val="10"/>
+              </w:numPr>
+              <w:ind w:left="720" w:hanging="360"/>
+              <w:rPr>
+                <w:u w:val="none"/>
+              </w:rPr>
+            </w:pPr>
+            <w:r>
+              <w:rPr>
+                <w:rtl w:val="0"/>
+              </w:rPr>
+              <w:t xml:space="preserve">10. Salva a lista.</w:t>
+            </w:r>
+            <w:r>
+              <w:rPr>
+                <w:rtl w:val="0"/>
+              </w:rPr>
+            </w:r>
+          </w:p>
+        </w:tc>
+      </w:tr>
+      <w:tr>
+        <w:trPr>
+          <w:cantSplit w:val="0"/>
+          <w:tblHeader w:val="0"/>
+        </w:trPr>
+        <w:tc>
+          <w:tcPr>
+            <w:shd w:fill="999999" w:val="clear"/>
+            <w:tcMar>
+              <w:top w:w="100.0" w:type="dxa"/>
+              <w:left w:w="100.0" w:type="dxa"/>
+              <w:bottom w:w="100.0" w:type="dxa"/>
+              <w:right w:w="100.0" w:type="dxa"/>
+            </w:tcMar>
+            <w:vAlign w:val="top"/>
+          </w:tcPr>
+          <w:p>
+            <w:pPr>
+              <w:widowControl w:val="0"/>
+              <w:spacing w:line="240" w:lineRule="auto"/>
+              <w:rPr>
+                <w:b w:val="1"/>
+                <w:bCs w:val="1"/>
+                <w:sz w:val="24"/>
+                <w:szCs w:val="24"/>
+              </w:rPr>
+            </w:pPr>
+            <w:r>
+              <w:rPr>
+                <w:b w:val="1"/>
+                <w:bCs w:val="1"/>
+                <w:sz w:val="24"/>
+                <w:szCs w:val="24"/>
+                <w:rtl w:val="0"/>
+              </w:rPr>
+              <w:t xml:space="preserve">Fluxos Alternativos: </w:t>
+            </w:r>
+          </w:p>
+        </w:tc>
+        <w:tc>
+          <w:tcPr>
+            <w:shd w:fill="auto" w:val="clear"/>
+            <w:tcMar>
+              <w:top w:w="100.0" w:type="dxa"/>
+              <w:left w:w="100.0" w:type="dxa"/>
+              <w:bottom w:w="100.0" w:type="dxa"/>
+              <w:right w:w="100.0" w:type="dxa"/>
+            </w:tcMar>
+            <w:vAlign w:val="top"/>
+          </w:tcPr>
+          <w:p>
+            <w:pPr>
+              <w:rPr/>
+            </w:pPr>
+            <w:r>
+              <w:rPr>
+                <w:rtl w:val="0"/>
+              </w:rPr>
+              <w:t xml:space="preserve">- FA01 - Sem opções disponíveis: exibe mensagem "Nenhuma opção encontrada".</w:t>
+            </w:r>
+          </w:p>
+          <w:p>
+            <w:pPr>
+              <w:rPr>
+                <w:sz w:val="24"/>
+                <w:szCs w:val="24"/>
+              </w:rPr>
+            </w:pPr>
+            <w:r>
+              <w:rPr>
+                <w:rtl w:val="0"/>
+              </w:rPr>
+              <w:t xml:space="preserve">- FA02 - Sem resultados: exibe mensagem "Nenhuma opção encontrada".</w:t>
+            </w:r>
+            <w:r>
+              <w:rPr>
+                <w:rtl w:val="0"/>
+              </w:rPr>
+            </w:r>
+          </w:p>
+        </w:tc>
+      </w:tr>
+      <w:tr>
+        <w:trPr>
+          <w:cantSplit w:val="0"/>
+          <w:tblHeader w:val="0"/>
+        </w:trPr>
+        <w:tc>
+          <w:tcPr>
+            <w:shd w:fill="999999" w:val="clear"/>
+            <w:tcMar>
+              <w:top w:w="100.0" w:type="dxa"/>
+              <w:left w:w="100.0" w:type="dxa"/>
+              <w:bottom w:w="100.0" w:type="dxa"/>
+              <w:right w:w="100.0" w:type="dxa"/>
+            </w:tcMar>
+            <w:vAlign w:val="top"/>
+          </w:tcPr>
+          <w:p>
+            <w:pPr>
+              <w:widowControl w:val="0"/>
+              <w:spacing w:line="240" w:lineRule="auto"/>
+              <w:rPr>
+                <w:b w:val="1"/>
+                <w:bCs w:val="1"/>
+                <w:sz w:val="24"/>
+                <w:szCs w:val="24"/>
+              </w:rPr>
+            </w:pPr>
+            <w:r>
+              <w:rPr>
+                <w:b w:val="1"/>
+                <w:bCs w:val="1"/>
+                <w:sz w:val="24"/>
+                <w:szCs w:val="24"/>
+                <w:rtl w:val="0"/>
+              </w:rPr>
+              <w:t xml:space="preserve">Fluxos de Exceção: </w:t>
+            </w:r>
+          </w:p>
+        </w:tc>
+        <w:tc>
+          <w:tcPr>
+            <w:shd w:fill="auto" w:val="clear"/>
+            <w:tcMar>
+              <w:top w:w="100.0" w:type="dxa"/>
+              <w:left w:w="100.0" w:type="dxa"/>
+              <w:bottom w:w="100.0" w:type="dxa"/>
+              <w:right w:w="100.0" w:type="dxa"/>
+            </w:tcMar>
+            <w:vAlign w:val="top"/>
+          </w:tcPr>
+          <w:p>
+            <w:pPr>
+              <w:rPr>
+                <w:sz w:val="24"/>
+                <w:szCs w:val="24"/>
+              </w:rPr>
+            </w:pPr>
+            <w:r>
+              <w:rPr>
+                <w:rtl w:val="0"/>
+              </w:rPr>
+              <w:t xml:space="preserve">- FE01 - Falha na API de localização: exibe erro "Verifique sua conexão".</w:t>
+            </w:r>
+            <w:r>
+              <w:rPr>
+                <w:rtl w:val="0"/>
+              </w:rPr>
+            </w:r>
+          </w:p>
+        </w:tc>
+      </w:tr>
+      <w:tr>
+        <w:trPr>
+          <w:cantSplit w:val="0"/>
+          <w:tblHeader w:val="0"/>
+        </w:trPr>
+        <w:tc>
+          <w:tcPr>
+            <w:shd w:fill="999999" w:val="clear"/>
+            <w:tcMar>
+              <w:top w:w="100.0" w:type="dxa"/>
+              <w:left w:w="100.0" w:type="dxa"/>
+              <w:bottom w:w="100.0" w:type="dxa"/>
+              <w:right w:w="100.0" w:type="dxa"/>
+            </w:tcMar>
+            <w:vAlign w:val="top"/>
+          </w:tcPr>
+          <w:p>
+            <w:pPr>
+              <w:widowControl w:val="0"/>
+              <w:spacing w:line="240" w:lineRule="auto"/>
+              <w:rPr>
+                <w:b w:val="1"/>
+                <w:bCs w:val="1"/>
+                <w:sz w:val="24"/>
+                <w:szCs w:val="24"/>
+              </w:rPr>
+            </w:pPr>
+            <w:r>
+              <w:rPr>
+                <w:b w:val="1"/>
+                <w:bCs w:val="1"/>
+                <w:sz w:val="24"/>
+                <w:szCs w:val="24"/>
+                <w:rtl w:val="0"/>
+              </w:rPr>
+              <w:t xml:space="preserve">Relações de Regras de Negócio: </w:t>
+            </w:r>
+          </w:p>
+        </w:tc>
+        <w:tc>
+          <w:tcPr>
+            <w:shd w:fill="auto" w:val="clear"/>
+            <w:tcMar>
+              <w:top w:w="100.0" w:type="dxa"/>
+              <w:left w:w="100.0" w:type="dxa"/>
+              <w:bottom w:w="100.0" w:type="dxa"/>
+              <w:right w:w="100.0" w:type="dxa"/>
+            </w:tcMar>
+            <w:vAlign w:val="top"/>
+          </w:tcPr>
+          <w:p>
+            <w:pPr>
+              <w:rPr/>
+            </w:pPr>
+            <w:r>
+              <w:rPr>
+                <w:rtl w:val="0"/>
+              </w:rPr>
+              <w:t xml:space="preserve">- RN01 - Sugestões baseadas no perfil de gastos do usuário.</w:t>
+            </w:r>
+          </w:p>
+          <w:p>
+            <w:pPr>
+              <w:rPr/>
+            </w:pPr>
+            <w:r>
+              <w:rPr>
+                <w:rtl w:val="0"/>
+              </w:rPr>
+              <w:t xml:space="preserve">- RN02 - Filtro por preço e avaliação deve ser dinâmico.</w:t>
+            </w:r>
+          </w:p>
+          <w:p>
+            <w:pPr>
+              <w:rPr>
+                <w:b w:val="1"/>
+                <w:bCs w:val="1"/>
+                <w:sz w:val="24"/>
+                <w:szCs w:val="24"/>
+              </w:rPr>
+            </w:pPr>
+            <w:r>
+              <w:rPr>
+                <w:rtl w:val="0"/>
+              </w:rPr>
+              <w:t xml:space="preserve">- RN03 - Lista é gerada automaticamente conforme perfil </w:t>
+            </w:r>
+            <w:r>
+              <w:rPr>
+                <w:rtl w:val="0"/>
+              </w:rPr>
+            </w:r>
+          </w:p>
+        </w:tc>
+      </w:tr>
+    </w:tbl>
     <w:p>
       <w:pPr>
         <w:spacing w:line="360" w:lineRule="auto"/>
@@ -6251,178 +7167,6 @@
           <w:rtl w:val="0"/>
         </w:rPr>
         <w:t xml:space="preserve">-</w:t>
-      </w:r>
-    </w:p>
-    <w:p>
-      <w:pPr>
-        <w:spacing w:line="360" w:lineRule="auto"/>
-        <w:jc w:val="both"/>
-        <w:rPr>
-          <w:sz w:val="24"/>
-          <w:szCs w:val="24"/>
-        </w:rPr>
-      </w:pPr>
-      <w:r>
-        <w:rPr>
-          <w:rtl w:val="0"/>
-        </w:rPr>
-      </w:r>
-    </w:p>
-    <w:p>
-      <w:pPr>
-        <w:spacing w:line="360" w:lineRule="auto"/>
-        <w:jc w:val="both"/>
-        <w:rPr>
-          <w:sz w:val="24"/>
-          <w:szCs w:val="24"/>
-        </w:rPr>
-      </w:pPr>
-      <w:r>
-        <w:rPr>
-          <w:rtl w:val="0"/>
-        </w:rPr>
-      </w:r>
-    </w:p>
-    <w:p>
-      <w:pPr>
-        <w:rPr/>
-      </w:pPr>
-      <w:r>
-        <w:rPr>
-          <w:rtl w:val="0"/>
-        </w:rPr>
-      </w:r>
-    </w:p>
-    <w:p>
-      <w:pPr>
-        <w:rPr/>
-      </w:pPr>
-      <w:r>
-        <w:rPr>
-          <w:rtl w:val="0"/>
-        </w:rPr>
-      </w:r>
-    </w:p>
-    <w:p>
-      <w:pPr>
-        <w:spacing w:line="360" w:lineRule="auto"/>
-        <w:jc w:val="both"/>
-        <w:rPr>
-          <w:sz w:val="24"/>
-          <w:szCs w:val="24"/>
-        </w:rPr>
-      </w:pPr>
-      <w:r>
-        <w:rPr>
-          <w:rtl w:val="0"/>
-        </w:rPr>
-      </w:r>
-    </w:p>
-    <w:p>
-      <w:pPr>
-        <w:spacing w:line="360" w:lineRule="auto"/>
-        <w:jc w:val="both"/>
-        <w:rPr>
-          <w:sz w:val="24"/>
-          <w:szCs w:val="24"/>
-        </w:rPr>
-      </w:pPr>
-      <w:r>
-        <w:rPr>
-          <w:rtl w:val="0"/>
-        </w:rPr>
-      </w:r>
-    </w:p>
-    <w:p>
-      <w:pPr>
-        <w:spacing w:line="360" w:lineRule="auto"/>
-        <w:jc w:val="both"/>
-        <w:rPr>
-          <w:sz w:val="24"/>
-          <w:szCs w:val="24"/>
-        </w:rPr>
-      </w:pPr>
-      <w:r>
-        <w:rPr>
-          <w:rtl w:val="0"/>
-        </w:rPr>
-      </w:r>
-    </w:p>
-    <w:p>
-      <w:pPr>
-        <w:spacing w:line="360" w:lineRule="auto"/>
-        <w:jc w:val="both"/>
-        <w:rPr>
-          <w:sz w:val="24"/>
-          <w:szCs w:val="24"/>
-        </w:rPr>
-      </w:pPr>
-      <w:r>
-        <w:rPr>
-          <w:sz w:val="24"/>
-          <w:szCs w:val="24"/>
-          <w:rtl w:val="0"/>
-        </w:rPr>
-        <w:tab/>
-        <w:t xml:space="preserve"> </w:t>
-        <w:tab/>
-      </w:r>
-    </w:p>
-    <w:p>
-      <w:pPr>
-        <w:spacing w:line="360" w:lineRule="auto"/>
-        <w:jc w:val="both"/>
-        <w:rPr>
-          <w:sz w:val="24"/>
-          <w:szCs w:val="24"/>
-        </w:rPr>
-      </w:pPr>
-      <w:r>
-        <w:rPr>
-          <w:sz w:val="24"/>
-          <w:szCs w:val="24"/>
-          <w:rtl w:val="0"/>
-        </w:rPr>
-        <w:tab/>
-        <w:t xml:space="preserve"> </w:t>
-        <w:tab/>
-        <w:t xml:space="preserve"> </w:t>
-        <w:tab/>
-        <w:t xml:space="preserve"> </w:t>
-        <w:tab/>
-      </w:r>
-    </w:p>
-    <w:p>
-      <w:pPr>
-        <w:spacing w:before="240" w:line="360" w:lineRule="auto"/>
-        <w:jc w:val="both"/>
-        <w:rPr>
-          <w:sz w:val="24"/>
-          <w:szCs w:val="24"/>
-        </w:rPr>
-      </w:pPr>
-      <w:r>
-        <w:rPr>
-          <w:sz w:val="24"/>
-          <w:szCs w:val="24"/>
-          <w:rtl w:val="0"/>
-        </w:rPr>
-        <w:br w:type="textWrapping"/>
-      </w:r>
-    </w:p>
-    <w:p>
-      <w:pPr>
-        <w:spacing w:line="360" w:lineRule="auto"/>
-        <w:jc w:val="both"/>
-        <w:rPr>
-          <w:sz w:val="24"/>
-          <w:szCs w:val="24"/>
-        </w:rPr>
-      </w:pPr>
-      <w:r>
-        <w:rPr>
-          <w:rtl w:val="0"/>
-        </w:rPr>
       </w:r>
     </w:p>
     <w:p>
@@ -7770,6 +8514,116 @@
     </w:lvl>
   </w:abstractNum>
   <w:abstractNum w:abstractNumId="11">
+    <w:lvl w:ilvl="0">
+      <w:start w:val="1"/>
+      <w:numFmt w:val="bullet"/>
+      <w:lvlText w:val="●"/>
+      <w:lvlJc w:val="left"/>
+      <w:pPr>
+        <w:ind w:left="720" w:hanging="360"/>
+      </w:pPr>
+      <w:rPr>
+        <w:u w:val="none"/>
+      </w:rPr>
+    </w:lvl>
+    <w:lvl w:ilvl="1">
+      <w:start w:val="1"/>
+      <w:numFmt w:val="bullet"/>
+      <w:lvlText w:val="○"/>
+      <w:lvlJc w:val="left"/>
+      <w:pPr>
+        <w:ind w:left="1440" w:hanging="360"/>
+      </w:pPr>
+      <w:rPr>
+        <w:u w:val="none"/>
+      </w:rPr>
+    </w:lvl>
+    <w:lvl w:ilvl="2">
+      <w:start w:val="1"/>
+      <w:numFmt w:val="bullet"/>
+      <w:lvlText w:val="■"/>
+      <w:lvlJc w:val="left"/>
+      <w:pPr>
+        <w:ind w:left="2160" w:hanging="360"/>
+      </w:pPr>
+      <w:rPr>
+        <w:u w:val="none"/>
+      </w:rPr>
+    </w:lvl>
+    <w:lvl w:ilvl="3">
+      <w:start w:val="1"/>
+      <w:numFmt w:val="bullet"/>
+      <w:lvlText w:val="●"/>
+      <w:lvlJc w:val="left"/>
+      <w:pPr>
+        <w:ind w:left="2880" w:hanging="360"/>
+      </w:pPr>
+      <w:rPr>
+        <w:u w:val="none"/>
+      </w:rPr>
+    </w:lvl>
+    <w:lvl w:ilvl="4">
+      <w:start w:val="1"/>
+      <w:numFmt w:val="bullet"/>
+      <w:lvlText w:val="○"/>
+      <w:lvlJc w:val="left"/>
+      <w:pPr>
+        <w:ind w:left="3600" w:hanging="360"/>
+      </w:pPr>
+      <w:rPr>
+        <w:u w:val="none"/>
+      </w:rPr>
+    </w:lvl>
+    <w:lvl w:ilvl="5">
+      <w:start w:val="1"/>
+      <w:numFmt w:val="bullet"/>
+      <w:lvlText w:val="■"/>
+      <w:lvlJc w:val="left"/>
+      <w:pPr>
+        <w:ind w:left="4320" w:hanging="360"/>
+      </w:pPr>
+      <w:rPr>
+        <w:u w:val="none"/>
+      </w:rPr>
+    </w:lvl>
+    <w:lvl w:ilvl="6">
+      <w:start w:val="1"/>
+      <w:numFmt w:val="bullet"/>
+      <w:lvlText w:val="●"/>
+      <w:lvlJc w:val="left"/>
+      <w:pPr>
+        <w:ind w:left="5040" w:hanging="360"/>
+      </w:pPr>
+      <w:rPr>
+        <w:u w:val="none"/>
+      </w:rPr>
+    </w:lvl>
+    <w:lvl w:ilvl="7">
+      <w:start w:val="1"/>
+      <w:numFmt w:val="bullet"/>
+      <w:lvlText w:val="○"/>
+      <w:lvlJc w:val="left"/>
+      <w:pPr>
+        <w:ind w:left="5760" w:hanging="360"/>
+      </w:pPr>
+      <w:rPr>
+        <w:u w:val="none"/>
+      </w:rPr>
+    </w:lvl>
+    <w:lvl w:ilvl="8">
+      <w:start w:val="1"/>
+      <w:numFmt w:val="bullet"/>
+      <w:lvlText w:val="■"/>
+      <w:lvlJc w:val="left"/>
+      <w:pPr>
+        <w:ind w:left="6480" w:hanging="360"/>
+      </w:pPr>
+      <w:rPr>
+        <w:u w:val="none"/>
+      </w:rPr>
+    </w:lvl>
+  </w:abstractNum>
+  <w:abstractNum w:abstractNumId="12">
     <w:lvl w:ilvl="0">
       <w:start w:val="1"/>
       <w:numFmt w:val="bullet"/>
@@ -7911,6 +8765,9 @@
   </w:num>
   <w:num w:numId="11">
     <w:abstractNumId w:val="11"/>
+  </w:num>
+  <w:num w:numId="12">
+    <w:abstractNumId w:val="12"/>
   </w:num>
 </w:numbering>
 </file>
@@ -8102,6 +8959,13 @@
     </w:tblPr>
   </w:style>
   <w:style w:type="table" w:styleId="Table4">
+    <w:basedOn w:val="TableNormal"/>
+    <w:tblPr>
+      <w:tblStyleRowBandSize w:val="1"/>
+      <w:tblStyleColBandSize w:val="1"/>
+    </w:tblPr>
+  </w:style>
+  <w:style w:type="table" w:styleId="Table5">
     <w:basedOn w:val="TableNormal"/>
     <w:tblPr>
       <w:tblStyleRowBandSize w:val="1"/>

</xml_diff>

<commit_message>
Colocando tabela da sarah com os dados completos.
</commit_message>
<xml_diff>
--- a/sleep_street.docx
+++ b/sleep_street.docx
@@ -357,15 +357,7 @@
           <w:szCs w:val="24"/>
           <w:rtl w:val="0"/>
         </w:rPr>
-        <w:t xml:space="preserve">comentário.Registro</w:t>
-      </w:r>
-      <w:r>
-        <w:rPr>
-          <w:sz w:val="24"/>
-          <w:szCs w:val="24"/>
-          <w:rtl w:val="0"/>
-        </w:rPr>
-        <w:t xml:space="preserve"> e consolidação automatizada de despesas categorizadas (transporte,hospedagem, alimentação, passeios Busca e filtragem contextual de  estabelecimentos(restaurantes, mercados, hotéis, atrações) por Faixa de preço e avaliação.Gerador automático parametrizado de checklist de bagagem com base no destino, clima, duração e perfil da viagem.Módulo de registro e acompanhamento de solicitações de suporte e reembolso com consolidação de valores.</w:t>
+        <w:t xml:space="preserve">comentário.Registro e consolidação automatizada de despesas categorizadas (transporte,hospedagem, alimentação, passeios Busca e filtragem contextual de  estabelecimentos(restaurantes, mercados, hotéis, atrações) por Faixa de preço e avaliação.Gerador automático parametrizado de checklist de bagagem com base no destino, clima, duração e perfil da viagem.Módulo de registro e acompanhamento de solicitações de suporte e reembolso com consolidação de valores.</w:t>
       </w:r>
     </w:p>
     <w:p>
@@ -604,7 +596,7 @@
           <w:szCs w:val="24"/>
           <w:rtl w:val="0"/>
         </w:rPr>
-        <w:t xml:space="preserve">Cadastro e autenticação segura com validação obrigatória de maioridade (+18).Gerenciamento completo de viagens (lazer ou negócios) com estipulação de teto por</w:t>
+        <w:t xml:space="preserve">Cadastro e autenticação segura com validação obrigatória de maioridade (+18).Gerenciamento completo de viagens (lazer ou negócios) com estipulação de teto or</w:t>
       </w:r>
       <w:r>
         <w:rPr>
@@ -614,7 +606,7 @@
           <w:szCs w:val="24"/>
           <w:rtl w:val="0"/>
         </w:rPr>
-        <w:t xml:space="preserve"> período. </w:t>
+        <w:t xml:space="preserve"> por período. </w:t>
       </w:r>
     </w:p>
     <w:p>
@@ -662,7 +654,7 @@
           <w:szCs w:val="24"/>
           <w:rtl w:val="0"/>
         </w:rPr>
-        <w:t xml:space="preserve">RF04– Registro Financeiro e Consolidação de Despesas: Permitir o lançamento categorizado de gasto (transporte, hospedagem, alimentação, passeios) e calcular automaticamente o saldo do orçamento. </w:t>
+        <w:t xml:space="preserve">RF04 - - Registro Financeiro e Consolidação de Despesas: Permitir o lançamento categorizado de gasto (transporte, hospedagem, alimentação, passeios) e calcular automaticamente o saldo do orçamento. </w:t>
       </w:r>
     </w:p>
     <w:p>
@@ -913,7 +905,7 @@
           <w:szCs w:val="24"/>
           <w:rtl w:val="0"/>
         </w:rPr>
-        <w:t xml:space="preserve">descrição: O sistema deve permitir o cadastro autenticação de usuários via e-mail e senha, validando rigorosamente a idade do viajante para autorizar viagens solo apenas a maiores de 18 anos. </w:t>
+        <w:t xml:space="preserve">descrição: O sistema deve permitir o cadastro e autenticação de usuários via e-mail e senha, validando rigorosamente a idade do viajante para autorizar viagens solo apenas a maiores de 18 anos. </w:t>
       </w:r>
     </w:p>
     <w:p>
@@ -1381,35 +1373,73 @@
         <w:spacing w:before="12.921142578125" w:line="264.3717384338379" w:lineRule="auto"/>
         <w:ind w:left="982.9473876953125" w:right="45.054931640625" w:hanging="341.2800598144531"/>
         <w:rPr>
+          <w:sz w:val="24"/>
+          <w:szCs w:val="24"/>
+        </w:rPr>
+      </w:pPr>
+      <w:r>
+        <w:rPr>
+          <w:sz w:val="24"/>
+          <w:szCs w:val="24"/>
+          <w:rtl w:val="0"/>
+        </w:rPr>
+        <w:t xml:space="preserve">● </w:t>
+      </w:r>
+      <w:r>
+        <w:rPr>
           <w:b w:val="1"/>
           <w:bCs w:val="1"/>
-        </w:rPr>
-      </w:pPr>
-      <w:r>
-        <w:rPr>
-          <w:sz w:val="24"/>
-          <w:szCs w:val="24"/>
-          <w:rtl w:val="0"/>
-        </w:rPr>
-        <w:t xml:space="preserve">● </w:t>
-      </w:r>
-      <w:r>
+          <w:sz w:val="24"/>
+          <w:szCs w:val="24"/>
+          <w:rtl w:val="0"/>
+        </w:rPr>
+        <w:t xml:space="preserve">RFN 02.02:</w:t>
+      </w:r>
+      <w:r>
+        <w:rPr>
+          <w:sz w:val="24"/>
+          <w:szCs w:val="24"/>
+          <w:rtl w:val="0"/>
+        </w:rPr>
+        <w:t xml:space="preserve">O sistema não deve perder as configurações e locais salvos como favoritos ao alterar ou editar os parâmetros da viagem. </w:t>
+      </w:r>
+    </w:p>
+    <w:p>
+      <w:pPr>
+        <w:widowControl w:val="0"/>
+        <w:spacing w:before="252.921142578125" w:line="240" w:lineRule="auto"/>
+        <w:ind w:left="999.747314453125" w:firstLine="0"/>
+        <w:rPr>
+          <w:sz w:val="24"/>
+          <w:szCs w:val="24"/>
+        </w:rPr>
+      </w:pPr>
+      <w:r>
+        <w:rPr>
+          <w:sz w:val="24"/>
+          <w:szCs w:val="24"/>
+          <w:rtl w:val="0"/>
+        </w:rPr>
+        <w:t xml:space="preserve">RF </w:t>
+      </w:r>
+    </w:p>
+    <w:p>
+      <w:pPr>
+        <w:widowControl w:val="0"/>
+        <w:spacing w:before="834.6661376953125" w:line="265.4048538208008" w:lineRule="auto"/>
+        <w:ind w:left="521.1659240722656" w:right="1607.5396728515625" w:hanging="260.3785705566406"/>
         <w:rPr>
           <w:b w:val="1"/>
           <w:bCs w:val="1"/>
-          <w:sz w:val="24"/>
-          <w:szCs w:val="24"/>
-          <w:rtl w:val="0"/>
-        </w:rPr>
-        <w:t xml:space="preserve">RFN 02.02:</w:t>
-      </w:r>
-      <w:r>
-        <w:rPr>
-          <w:sz w:val="24"/>
-          <w:szCs w:val="24"/>
-          <w:rtl w:val="0"/>
-        </w:rPr>
-        <w:t xml:space="preserve">O sistema não deve perder as configurações e locais salvos como favoritos ao alterar ou editar os parâmetros da viagem.  </w:t>
+        </w:rPr>
+      </w:pPr>
+      <w:r>
+        <w:rPr>
+          <w:sz w:val="24"/>
+          <w:szCs w:val="24"/>
+          <w:rtl w:val="0"/>
+        </w:rPr>
+        <w:t xml:space="preserve"> </w:t>
       </w:r>
       <w:r>
         <w:rPr>
@@ -1435,26 +1465,38 @@
         <w:widowControl w:val="0"/>
         <w:spacing w:before="5.438232421875" w:line="264.3739700317383" w:lineRule="auto"/>
         <w:ind w:left="996.4073181152344" w:right="248.857421875" w:hanging="356.4799499511719"/>
-        <w:rPr/>
-      </w:pPr>
-      <w:r>
-        <w:rPr>
-          <w:rtl w:val="0"/>
-        </w:rPr>
-        <w:t xml:space="preserve">● </w:t>
-      </w:r>
-      <w:r>
         <w:rPr>
           <w:b w:val="1"/>
           <w:bCs w:val="1"/>
+        </w:rPr>
+      </w:pPr>
+      <w:r>
+        <w:rPr>
+          <w:rtl w:val="0"/>
+        </w:rPr>
+        <w:t xml:space="preserve">● </w:t>
+      </w:r>
+      <w:r>
+        <w:rPr>
+          <w:b w:val="1"/>
+          <w:bCs w:val="1"/>
           <w:rtl w:val="0"/>
         </w:rPr>
         <w:t xml:space="preserve">Descrição: O sistema deve realizar buscas e sugerir restaurantes, mercados, hospedagens e atrações próximos, </w:t>
       </w:r>
-      <w:r>
-        <w:rPr>
-          <w:rtl w:val="0"/>
-        </w:rPr>
+    </w:p>
+    <w:p>
+      <w:pPr>
+        <w:widowControl w:val="0"/>
+        <w:spacing w:before="11.8450927734375" w:line="240" w:lineRule="auto"/>
+        <w:ind w:left="639.9273681640625" w:firstLine="0"/>
+        <w:rPr/>
+      </w:pPr>
+      <w:r>
+        <w:rPr>
+          <w:rtl w:val="0"/>
+        </w:rPr>
+        <w:t xml:space="preserve">● </w:t>
       </w:r>
     </w:p>
     <w:p>
@@ -1471,7 +1513,7 @@
         <w:rPr>
           <w:rtl w:val="0"/>
         </w:rPr>
-        <w:t xml:space="preserve"> ● </w:t>
+        <w:t xml:space="preserve">● </w:t>
       </w:r>
       <w:r>
         <w:rPr>
@@ -1479,7 +1521,7 @@
           <w:bCs w:val="1"/>
           <w:rtl w:val="0"/>
         </w:rPr>
-        <w:t xml:space="preserve">filtrados pela faixa de preço          informada e melhor avaliação. </w:t>
+        <w:t xml:space="preserve">filtrados pela faixa de preço informada e melhor avaliação. </w:t>
       </w:r>
     </w:p>
     <w:p>
@@ -1496,12 +1538,6 @@
         <w:rPr>
           <w:rtl w:val="0"/>
         </w:rPr>
-        <w:t xml:space="preserve"> </w:t>
-      </w:r>
-      <w:r>
-        <w:rPr>
-          <w:rtl w:val="0"/>
-        </w:rPr>
         <w:t xml:space="preserve">● </w:t>
       </w:r>
       <w:r>
@@ -1529,7 +1565,7 @@
           <w:bCs w:val="1"/>
           <w:rtl w:val="0"/>
         </w:rPr>
-        <w:t xml:space="preserve"> ● Desejável sim estável </w:t>
+        <w:t xml:space="preserve">● Desejável sim estável </w:t>
       </w:r>
     </w:p>
     <w:p>
@@ -1548,7 +1584,7 @@
           <w:bCs w:val="1"/>
           <w:rtl w:val="0"/>
         </w:rPr>
-        <w:t xml:space="preserve"> ● RFN 03.01:O algoritmo de sugestão de estabelecimentos deve retornar os resultados formatados em um tempo máximo de 2,0 segundos sob carga normal. </w:t>
+        <w:t xml:space="preserve">● RFN 03.01:O algoritmo de sugestão de estabelecimentos deve retornar os resultados formatados em um tempo máximo de 2,0 segundos sob carga normal. </w:t>
       </w:r>
     </w:p>
     <w:p>
@@ -1567,7 +1603,7 @@
           <w:bCs w:val="1"/>
           <w:rtl w:val="0"/>
         </w:rPr>
-        <w:t xml:space="preserve"> ● RFN 03.02:A busca geolocalizada deve restringir a exibição de locais turísticos a um raio máximo personalizável de até 15 km da hospedagem para evitar distâncias excessivas. </w:t>
+        <w:t xml:space="preserve">● RFN 03.02:A busca geolocalizada deve restringir a exibição de locais turísticos a um raio máximo personalizável de até 15 km da hospedagem para evitar distâncias excessivas. </w:t>
       </w:r>
     </w:p>
     <w:p>
@@ -1592,7 +1628,7 @@
           <w:bCs w:val="1"/>
           <w:rtl w:val="0"/>
         </w:rPr>
-        <w:t xml:space="preserve"> ● RFN 03.03:O sistema deve garantir precisão de 100% na categorização dos filtros de preço estipulados pelo usuário.</w:t>
+        <w:t xml:space="preserve">● RFN 03.03:O sistema deve garantir precisão de 100% na categorização dos filtros de preço estipulados pelo usuário</w:t>
       </w:r>
     </w:p>
     <w:p>
@@ -1880,25 +1916,6 @@
               </w:rPr>
               <w:t xml:space="preserve">Nome </w:t>
             </w:r>
-            <w:hyperlink r:id="rId7">
-              <w:r>
-                <w:rPr>
-                  <w:b w:val="1"/>
-                  <w:bCs w:val="1"/>
-                  <w:color w:val="0000ee"/>
-                  <w:sz w:val="24"/>
-                  <w:szCs w:val="24"/>
-                  <w:u w:val="single"/>
-                  <w:rtl w:val="0"/>
-                </w:rPr>
-                <w:t xml:space="preserve">Emanuel Carvalho correria</w:t>
-              </w:r>
-            </w:hyperlink>
-            <w:r>
-              <w:rPr>
-                <w:rtl w:val="0"/>
-              </w:rPr>
-            </w:r>
           </w:p>
         </w:tc>
         <w:tc>
@@ -2880,7 +2897,7 @@
                 <w:szCs w:val="24"/>
                 <w:rtl w:val="0"/>
               </w:rPr>
-              <w:t xml:space="preserve">Nome : Daniel Moreira </w:t>
+              <w:t xml:space="preserve">Nome </w:t>
             </w:r>
           </w:p>
         </w:tc>
@@ -4005,14 +4022,13 @@
               <w:widowControl w:val="0"/>
               <w:numPr>
                 <w:ilvl w:val="0"/>
-                <w:numId w:val="6"/>
+                <w:numId w:val="3"/>
               </w:numPr>
               <w:spacing w:line="240" w:lineRule="auto"/>
               <w:ind w:left="720" w:hanging="360"/>
               <w:rPr>
                 <w:sz w:val="24"/>
                 <w:szCs w:val="24"/>
-                <w:u w:val="none"/>
               </w:rPr>
             </w:pPr>
             <w:r>
@@ -4022,6 +4038,11 @@
                 <w:rtl w:val="0"/>
               </w:rPr>
               <w:t xml:space="preserve"> O usuário está logado e acessou a tela de registro e criação de viagem.</w:t>
+            </w:r>
+            <w:r>
+              <w:rPr>
+                <w:rtl w:val="0"/>
+              </w:rPr>
             </w:r>
           </w:p>
           <w:p>
@@ -4029,14 +4050,13 @@
               <w:widowControl w:val="0"/>
               <w:numPr>
                 <w:ilvl w:val="0"/>
-                <w:numId w:val="6"/>
+                <w:numId w:val="3"/>
               </w:numPr>
               <w:spacing w:line="240" w:lineRule="auto"/>
               <w:ind w:left="720" w:hanging="360"/>
               <w:rPr>
                 <w:sz w:val="24"/>
                 <w:szCs w:val="24"/>
-                <w:u w:val="none"/>
               </w:rPr>
             </w:pPr>
             <w:r>
@@ -4046,6 +4066,11 @@
                 <w:rtl w:val="0"/>
               </w:rPr>
               <w:t xml:space="preserve"> Tem os dados de cadastro e uma viagem selecionada.</w:t>
+            </w:r>
+            <w:r>
+              <w:rPr>
+                <w:rtl w:val="0"/>
+              </w:rPr>
             </w:r>
           </w:p>
           <w:p>
@@ -4120,14 +4145,13 @@
               <w:widowControl w:val="0"/>
               <w:numPr>
                 <w:ilvl w:val="0"/>
-                <w:numId w:val="3"/>
+                <w:numId w:val="12"/>
               </w:numPr>
               <w:spacing w:line="240" w:lineRule="auto"/>
               <w:ind w:left="720" w:hanging="360"/>
               <w:rPr>
                 <w:sz w:val="24"/>
                 <w:szCs w:val="24"/>
-                <w:u w:val="none"/>
               </w:rPr>
             </w:pPr>
             <w:r>
@@ -4137,6 +4161,11 @@
                 <w:rtl w:val="0"/>
               </w:rPr>
               <w:t xml:space="preserve">A conta é criada e ativada com sucesso.</w:t>
+            </w:r>
+            <w:r>
+              <w:rPr>
+                <w:rtl w:val="0"/>
+              </w:rPr>
             </w:r>
           </w:p>
           <w:p>
@@ -4144,14 +4173,13 @@
               <w:widowControl w:val="0"/>
               <w:numPr>
                 <w:ilvl w:val="0"/>
-                <w:numId w:val="3"/>
+                <w:numId w:val="12"/>
               </w:numPr>
               <w:spacing w:line="240" w:lineRule="auto"/>
               <w:ind w:left="720" w:hanging="360"/>
               <w:rPr>
                 <w:sz w:val="24"/>
                 <w:szCs w:val="24"/>
-                <w:u w:val="none"/>
               </w:rPr>
             </w:pPr>
             <w:r>
@@ -4161,6 +4189,11 @@
                 <w:rtl w:val="0"/>
               </w:rPr>
               <w:t xml:space="preserve"> A viagem é criada, editada ou cancelada com sucesso.</w:t>
+            </w:r>
+            <w:r>
+              <w:rPr>
+                <w:rtl w:val="0"/>
+              </w:rPr>
             </w:r>
           </w:p>
           <w:p>
@@ -4168,14 +4201,13 @@
               <w:widowControl w:val="0"/>
               <w:numPr>
                 <w:ilvl w:val="0"/>
-                <w:numId w:val="3"/>
+                <w:numId w:val="12"/>
               </w:numPr>
               <w:spacing w:line="240" w:lineRule="auto"/>
               <w:ind w:left="720" w:hanging="360"/>
               <w:rPr>
                 <w:sz w:val="24"/>
                 <w:szCs w:val="24"/>
-                <w:u w:val="none"/>
               </w:rPr>
             </w:pPr>
             <w:r>
@@ -4185,6 +4217,11 @@
                 <w:rtl w:val="0"/>
               </w:rPr>
               <w:t xml:space="preserve"> Os gastos são salvos e o total atualizado.</w:t>
+            </w:r>
+            <w:r>
+              <w:rPr>
+                <w:rtl w:val="0"/>
+              </w:rPr>
             </w:r>
           </w:p>
           <w:p>
@@ -4192,14 +4229,13 @@
               <w:widowControl w:val="0"/>
               <w:numPr>
                 <w:ilvl w:val="0"/>
-                <w:numId w:val="3"/>
+                <w:numId w:val="12"/>
               </w:numPr>
               <w:spacing w:line="240" w:lineRule="auto"/>
               <w:ind w:left="720" w:hanging="360"/>
               <w:rPr>
                 <w:sz w:val="24"/>
                 <w:szCs w:val="24"/>
-                <w:u w:val="none"/>
               </w:rPr>
             </w:pPr>
             <w:r>
@@ -4209,6 +4245,11 @@
                 <w:rtl w:val="0"/>
               </w:rPr>
               <w:t xml:space="preserve"> O tipo de viagem é salvo e usado para bagagem e sugestões.</w:t>
+            </w:r>
+            <w:r>
+              <w:rPr>
+                <w:rtl w:val="0"/>
+              </w:rPr>
             </w:r>
           </w:p>
           <w:p>
@@ -4283,23 +4324,27 @@
               <w:widowControl w:val="0"/>
               <w:numPr>
                 <w:ilvl w:val="0"/>
-                <w:numId w:val="2"/>
+                <w:numId w:val="11"/>
               </w:numPr>
               <w:spacing w:line="240" w:lineRule="auto"/>
               <w:ind w:left="720" w:hanging="360"/>
               <w:rPr>
                 <w:sz w:val="24"/>
                 <w:szCs w:val="24"/>
-                <w:u w:val="none"/>
-              </w:rPr>
-            </w:pPr>
-            <w:r>
-              <w:rPr>
-                <w:sz w:val="24"/>
-                <w:szCs w:val="24"/>
-                <w:rtl w:val="0"/>
-              </w:rPr>
-              <w:t xml:space="preserve">1.O usuário preenche um cadastro (nome, e-mail, senha forte) é válida idade 18+.</w:t>
+              </w:rPr>
+            </w:pPr>
+            <w:r>
+              <w:rPr>
+                <w:sz w:val="24"/>
+                <w:szCs w:val="24"/>
+                <w:rtl w:val="0"/>
+              </w:rPr>
+              <w:t xml:space="preserve"> 1. O usuário preenche um cadastro (nome, e-mail, senha forte) é válida idade 18+.</w:t>
+            </w:r>
+            <w:r>
+              <w:rPr>
+                <w:rtl w:val="0"/>
+              </w:rPr>
             </w:r>
           </w:p>
           <w:p>
@@ -4307,14 +4352,13 @@
               <w:widowControl w:val="0"/>
               <w:numPr>
                 <w:ilvl w:val="0"/>
-                <w:numId w:val="2"/>
+                <w:numId w:val="11"/>
               </w:numPr>
               <w:spacing w:line="240" w:lineRule="auto"/>
               <w:ind w:left="720" w:hanging="360"/>
               <w:rPr>
                 <w:sz w:val="24"/>
                 <w:szCs w:val="24"/>
-                <w:u w:val="none"/>
               </w:rPr>
             </w:pPr>
             <w:r>
@@ -4324,6 +4368,11 @@
                 <w:rtl w:val="0"/>
               </w:rPr>
               <w:t xml:space="preserve">2. Clica em "Salvar" e realiza login.</w:t>
+            </w:r>
+            <w:r>
+              <w:rPr>
+                <w:rtl w:val="0"/>
+              </w:rPr>
             </w:r>
           </w:p>
           <w:p>
@@ -4331,14 +4380,13 @@
               <w:widowControl w:val="0"/>
               <w:numPr>
                 <w:ilvl w:val="0"/>
-                <w:numId w:val="2"/>
+                <w:numId w:val="11"/>
               </w:numPr>
               <w:spacing w:line="240" w:lineRule="auto"/>
               <w:ind w:left="720" w:hanging="360"/>
               <w:rPr>
                 <w:sz w:val="24"/>
                 <w:szCs w:val="24"/>
-                <w:u w:val="none"/>
               </w:rPr>
             </w:pPr>
             <w:r>
@@ -4348,6 +4396,11 @@
                 <w:rtl w:val="0"/>
               </w:rPr>
               <w:t xml:space="preserve">3. Acesse a tela de "Minhas Viagens" e clique em "+" para criar uma nova viagem.</w:t>
+            </w:r>
+            <w:r>
+              <w:rPr>
+                <w:rtl w:val="0"/>
+              </w:rPr>
             </w:r>
           </w:p>
           <w:p>
@@ -4355,14 +4408,13 @@
               <w:widowControl w:val="0"/>
               <w:numPr>
                 <w:ilvl w:val="0"/>
-                <w:numId w:val="2"/>
+                <w:numId w:val="11"/>
               </w:numPr>
               <w:spacing w:line="240" w:lineRule="auto"/>
               <w:ind w:left="720" w:hanging="360"/>
               <w:rPr>
                 <w:sz w:val="24"/>
                 <w:szCs w:val="24"/>
-                <w:u w:val="none"/>
               </w:rPr>
             </w:pPr>
             <w:r>
@@ -4372,6 +4424,11 @@
                 <w:rtl w:val="0"/>
               </w:rPr>
               <w:t xml:space="preserve">4. Preenche destino, datas e orçamento, salva.</w:t>
+            </w:r>
+            <w:r>
+              <w:rPr>
+                <w:rtl w:val="0"/>
+              </w:rPr>
             </w:r>
           </w:p>
           <w:p>
@@ -4379,14 +4436,13 @@
               <w:widowControl w:val="0"/>
               <w:numPr>
                 <w:ilvl w:val="0"/>
-                <w:numId w:val="2"/>
+                <w:numId w:val="11"/>
               </w:numPr>
               <w:spacing w:line="240" w:lineRule="auto"/>
               <w:ind w:left="720" w:hanging="360"/>
               <w:rPr>
                 <w:sz w:val="24"/>
                 <w:szCs w:val="24"/>
-                <w:u w:val="none"/>
               </w:rPr>
             </w:pPr>
             <w:r>
@@ -4396,6 +4452,11 @@
                 <w:rtl w:val="0"/>
               </w:rPr>
               <w:t xml:space="preserve">5. Acessar aba "Gastos", adiciona gasto por categoria, salva e total atualiza.</w:t>
+            </w:r>
+            <w:r>
+              <w:rPr>
+                <w:rtl w:val="0"/>
+              </w:rPr>
             </w:r>
           </w:p>
           <w:p>
@@ -4403,14 +4464,13 @@
               <w:widowControl w:val="0"/>
               <w:numPr>
                 <w:ilvl w:val="0"/>
-                <w:numId w:val="2"/>
+                <w:numId w:val="11"/>
               </w:numPr>
               <w:spacing w:line="240" w:lineRule="auto"/>
               <w:ind w:left="720" w:hanging="360"/>
               <w:rPr>
                 <w:sz w:val="24"/>
                 <w:szCs w:val="24"/>
-                <w:u w:val="none"/>
               </w:rPr>
             </w:pPr>
             <w:r>
@@ -4420,6 +4480,11 @@
                 <w:rtl w:val="0"/>
               </w:rPr>
               <w:t xml:space="preserve">6. Acessa "Configurações da viagem", escolhe "Lazer" ou "Negócios" e salva.</w:t>
+            </w:r>
+            <w:r>
+              <w:rPr>
+                <w:rtl w:val="0"/>
+              </w:rPr>
             </w:r>
           </w:p>
           <w:p>
@@ -4495,14 +4560,13 @@
               <w:widowControl w:val="0"/>
               <w:numPr>
                 <w:ilvl w:val="0"/>
-                <w:numId w:val="11"/>
+                <w:numId w:val="8"/>
               </w:numPr>
               <w:spacing w:line="240" w:lineRule="auto"/>
               <w:ind w:left="720" w:hanging="360"/>
               <w:rPr>
                 <w:sz w:val="24"/>
                 <w:szCs w:val="24"/>
-                <w:u w:val="none"/>
               </w:rPr>
             </w:pPr>
             <w:r>
@@ -4512,6 +4576,11 @@
                 <w:rtl w:val="0"/>
               </w:rPr>
               <w:t xml:space="preserve">FA01 - Dados inválidos: exibe erros em tempo real e não salva.</w:t>
+            </w:r>
+            <w:r>
+              <w:rPr>
+                <w:rtl w:val="0"/>
+              </w:rPr>
             </w:r>
           </w:p>
           <w:p>
@@ -4535,23 +4604,27 @@
               <w:widowControl w:val="0"/>
               <w:numPr>
                 <w:ilvl w:val="0"/>
-                <w:numId w:val="4"/>
+                <w:numId w:val="13"/>
               </w:numPr>
               <w:spacing w:line="240" w:lineRule="auto"/>
               <w:ind w:left="720" w:hanging="360"/>
               <w:rPr>
                 <w:sz w:val="24"/>
                 <w:szCs w:val="24"/>
-                <w:u w:val="none"/>
-              </w:rPr>
-            </w:pPr>
-            <w:r>
-              <w:rPr>
-                <w:sz w:val="24"/>
-                <w:szCs w:val="24"/>
-                <w:rtl w:val="0"/>
-              </w:rPr>
-              <w:t xml:space="preserve"> FA02 - Usuário clica em "Cancelar": exibe confirmação.</w:t>
+              </w:rPr>
+            </w:pPr>
+            <w:r>
+              <w:rPr>
+                <w:sz w:val="24"/>
+                <w:szCs w:val="24"/>
+                <w:rtl w:val="0"/>
+              </w:rPr>
+              <w:t xml:space="preserve">  FA02 - Usuário clica em "Cancelar": exibe confirmação.</w:t>
+            </w:r>
+            <w:r>
+              <w:rPr>
+                <w:rtl w:val="0"/>
+              </w:rPr>
             </w:r>
           </w:p>
           <w:p>
@@ -4574,14 +4647,13 @@
               <w:widowControl w:val="0"/>
               <w:numPr>
                 <w:ilvl w:val="0"/>
-                <w:numId w:val="11"/>
+                <w:numId w:val="8"/>
               </w:numPr>
               <w:spacing w:line="240" w:lineRule="auto"/>
               <w:ind w:left="720" w:hanging="360"/>
               <w:rPr>
                 <w:sz w:val="24"/>
                 <w:szCs w:val="24"/>
-                <w:u w:val="none"/>
               </w:rPr>
             </w:pPr>
             <w:r>
@@ -4591,6 +4663,11 @@
                 <w:rtl w:val="0"/>
               </w:rPr>
               <w:t xml:space="preserve"> FA03 - Senha fraca ou inválida: validação em tempo real e nova senha.</w:t>
+            </w:r>
+            <w:r>
+              <w:rPr>
+                <w:rtl w:val="0"/>
+              </w:rPr>
             </w:r>
           </w:p>
           <w:p>
@@ -4681,14 +4758,13 @@
               <w:widowControl w:val="0"/>
               <w:numPr>
                 <w:ilvl w:val="0"/>
-                <w:numId w:val="5"/>
+                <w:numId w:val="15"/>
               </w:numPr>
               <w:spacing w:line="240" w:lineRule="auto"/>
               <w:ind w:left="720" w:hanging="360"/>
               <w:rPr>
                 <w:sz w:val="24"/>
                 <w:szCs w:val="24"/>
-                <w:u w:val="none"/>
               </w:rPr>
             </w:pPr>
             <w:r>
@@ -4698,6 +4774,11 @@
                 <w:rtl w:val="0"/>
               </w:rPr>
               <w:t xml:space="preserve">FE01 - Falha na conexão com o banco de dados: exibe "Erro de conexão". Tente novamente mais tarde." e redireciona para a tela de login.</w:t>
+            </w:r>
+            <w:r>
+              <w:rPr>
+                <w:rtl w:val="0"/>
+              </w:rPr>
             </w:r>
           </w:p>
           <w:p>
@@ -4721,14 +4802,13 @@
               <w:widowControl w:val="0"/>
               <w:numPr>
                 <w:ilvl w:val="0"/>
-                <w:numId w:val="5"/>
+                <w:numId w:val="15"/>
               </w:numPr>
               <w:spacing w:line="240" w:lineRule="auto"/>
               <w:ind w:left="720" w:hanging="360"/>
               <w:rPr>
                 <w:sz w:val="24"/>
                 <w:szCs w:val="24"/>
-                <w:u w:val="none"/>
               </w:rPr>
             </w:pPr>
             <w:r>
@@ -4738,6 +4818,11 @@
                 <w:rtl w:val="0"/>
               </w:rPr>
               <w:t xml:space="preserve">-FE02 - Sistema bloqueado por idade: exibe "Acesso bloqueado". Você deve ter 18 anos ou mais para criar viagens independentes." e redireciona para a tela de login.</w:t>
+            </w:r>
+            <w:r>
+              <w:rPr>
+                <w:rtl w:val="0"/>
+              </w:rPr>
             </w:r>
           </w:p>
           <w:p>
@@ -4761,14 +4846,13 @@
               <w:widowControl w:val="0"/>
               <w:numPr>
                 <w:ilvl w:val="0"/>
-                <w:numId w:val="5"/>
+                <w:numId w:val="15"/>
               </w:numPr>
               <w:spacing w:line="240" w:lineRule="auto"/>
               <w:ind w:left="720" w:hanging="360"/>
               <w:rPr>
                 <w:sz w:val="24"/>
                 <w:szCs w:val="24"/>
-                <w:u w:val="none"/>
               </w:rPr>
             </w:pPr>
             <w:r>
@@ -4778,6 +4862,11 @@
                 <w:rtl w:val="0"/>
               </w:rPr>
               <w:t xml:space="preserve">-FE03 - Falha no cálculo de total: exibe "Erro ao calcular o total". Verifique os valores." e redirecione para a aba "Gastos".</w:t>
+            </w:r>
+            <w:r>
+              <w:rPr>
+                <w:rtl w:val="0"/>
+              </w:rPr>
             </w:r>
           </w:p>
           <w:p>
@@ -4801,14 +4890,13 @@
               <w:widowControl w:val="0"/>
               <w:numPr>
                 <w:ilvl w:val="0"/>
-                <w:numId w:val="5"/>
+                <w:numId w:val="15"/>
               </w:numPr>
               <w:spacing w:line="240" w:lineRule="auto"/>
               <w:ind w:left="720" w:hanging="360"/>
               <w:rPr>
                 <w:sz w:val="24"/>
                 <w:szCs w:val="24"/>
-                <w:u w:val="none"/>
               </w:rPr>
             </w:pPr>
             <w:r>
@@ -4818,6 +4906,11 @@
                 <w:rtl w:val="0"/>
               </w:rPr>
               <w:t xml:space="preserve"> FE04 - Falha ao salvar tipo de viagem: exibe "Erro ao salvar a configuração". Tente novamente." e mantém a tela.</w:t>
+            </w:r>
+            <w:r>
+              <w:rPr>
+                <w:rtl w:val="0"/>
+              </w:rPr>
             </w:r>
           </w:p>
           <w:p>
@@ -4893,7 +4986,7 @@
               <w:widowControl w:val="0"/>
               <w:numPr>
                 <w:ilvl w:val="0"/>
-                <w:numId w:val="1"/>
+                <w:numId w:val="10"/>
               </w:numPr>
               <w:spacing w:line="240" w:lineRule="auto"/>
               <w:ind w:left="720" w:hanging="360"/>
@@ -4902,18 +4995,22 @@
                 <w:bCs w:val="1"/>
                 <w:sz w:val="24"/>
                 <w:szCs w:val="24"/>
-                <w:u w:val="none"/>
-              </w:rPr>
-            </w:pPr>
-            <w:r>
-              <w:rPr>
-                <w:b w:val="1"/>
-                <w:bCs w:val="1"/>
-                <w:sz w:val="24"/>
-                <w:szCs w:val="24"/>
-                <w:rtl w:val="0"/>
-              </w:rPr>
-              <w:t xml:space="preserve">- RN01 - Cadastro só para maiores de 18 anos;</w:t>
+              </w:rPr>
+            </w:pPr>
+            <w:r>
+              <w:rPr>
+                <w:b w:val="1"/>
+                <w:bCs w:val="1"/>
+                <w:sz w:val="24"/>
+                <w:szCs w:val="24"/>
+                <w:rtl w:val="0"/>
+              </w:rPr>
+              <w:t xml:space="preserve">- RN01 - Cadastro só para maiores de 18 anos.</w:t>
+            </w:r>
+            <w:r>
+              <w:rPr>
+                <w:rtl w:val="0"/>
+              </w:rPr>
             </w:r>
           </w:p>
           <w:p>
@@ -4921,7 +5018,7 @@
               <w:widowControl w:val="0"/>
               <w:numPr>
                 <w:ilvl w:val="0"/>
-                <w:numId w:val="1"/>
+                <w:numId w:val="10"/>
               </w:numPr>
               <w:spacing w:line="240" w:lineRule="auto"/>
               <w:ind w:left="720" w:hanging="360"/>
@@ -4930,18 +5027,12 @@
                 <w:bCs w:val="1"/>
                 <w:sz w:val="24"/>
                 <w:szCs w:val="24"/>
-                <w:u w:val="none"/>
-              </w:rPr>
-            </w:pPr>
-            <w:r>
-              <w:rPr>
-                <w:b w:val="1"/>
-                <w:bCs w:val="1"/>
-                <w:sz w:val="24"/>
-                <w:szCs w:val="24"/>
-                <w:rtl w:val="0"/>
-              </w:rPr>
-              <w:t xml:space="preserve">- RN02 - Senhas devem ter no mínimo 8 caracteres, 1 número e 1 caractere especial;</w:t>
+              </w:rPr>
+            </w:pPr>
+            <w:r>
+              <w:rPr>
+                <w:rtl w:val="0"/>
+              </w:rPr>
             </w:r>
           </w:p>
           <w:p>
@@ -4949,7 +5040,7 @@
               <w:widowControl w:val="0"/>
               <w:numPr>
                 <w:ilvl w:val="0"/>
-                <w:numId w:val="1"/>
+                <w:numId w:val="10"/>
               </w:numPr>
               <w:spacing w:line="240" w:lineRule="auto"/>
               <w:ind w:left="720" w:hanging="360"/>
@@ -4958,18 +5049,22 @@
                 <w:bCs w:val="1"/>
                 <w:sz w:val="24"/>
                 <w:szCs w:val="24"/>
-                <w:u w:val="none"/>
-              </w:rPr>
-            </w:pPr>
-            <w:r>
-              <w:rPr>
-                <w:b w:val="1"/>
-                <w:bCs w:val="1"/>
-                <w:sz w:val="24"/>
-                <w:szCs w:val="24"/>
-                <w:rtl w:val="0"/>
-              </w:rPr>
-              <w:t xml:space="preserve">- RN03 - Uma viagem deve ter data de início e fim;</w:t>
+              </w:rPr>
+            </w:pPr>
+            <w:r>
+              <w:rPr>
+                <w:b w:val="1"/>
+                <w:bCs w:val="1"/>
+                <w:sz w:val="24"/>
+                <w:szCs w:val="24"/>
+                <w:rtl w:val="0"/>
+              </w:rPr>
+              <w:t xml:space="preserve">- RN02 - Senhas devem ter no mínimo 8 caracteres, 1 número e 1 caractere especial.</w:t>
+            </w:r>
+            <w:r>
+              <w:rPr>
+                <w:rtl w:val="0"/>
+              </w:rPr>
             </w:r>
           </w:p>
           <w:p>
@@ -4977,7 +5072,7 @@
               <w:widowControl w:val="0"/>
               <w:numPr>
                 <w:ilvl w:val="0"/>
-                <w:numId w:val="1"/>
+                <w:numId w:val="10"/>
               </w:numPr>
               <w:spacing w:line="240" w:lineRule="auto"/>
               <w:ind w:left="720" w:hanging="360"/>
@@ -4986,18 +5081,22 @@
                 <w:bCs w:val="1"/>
                 <w:sz w:val="24"/>
                 <w:szCs w:val="24"/>
-                <w:u w:val="none"/>
-              </w:rPr>
-            </w:pPr>
-            <w:r>
-              <w:rPr>
-                <w:b w:val="1"/>
-                <w:bCs w:val="1"/>
-                <w:sz w:val="24"/>
-                <w:szCs w:val="24"/>
-                <w:rtl w:val="0"/>
-              </w:rPr>
-              <w:t xml:space="preserve">- RN04 - O orçamento total não pode ser negativo;</w:t>
+              </w:rPr>
+            </w:pPr>
+            <w:r>
+              <w:rPr>
+                <w:b w:val="1"/>
+                <w:bCs w:val="1"/>
+                <w:sz w:val="24"/>
+                <w:szCs w:val="24"/>
+                <w:rtl w:val="0"/>
+              </w:rPr>
+              <w:t xml:space="preserve">- RN03 - Uma viagem deve ter data de início e fim.</w:t>
+            </w:r>
+            <w:r>
+              <w:rPr>
+                <w:rtl w:val="0"/>
+              </w:rPr>
             </w:r>
           </w:p>
           <w:p>
@@ -5005,7 +5104,7 @@
               <w:widowControl w:val="0"/>
               <w:numPr>
                 <w:ilvl w:val="0"/>
-                <w:numId w:val="1"/>
+                <w:numId w:val="10"/>
               </w:numPr>
               <w:spacing w:line="240" w:lineRule="auto"/>
               <w:ind w:left="720" w:hanging="360"/>
@@ -5014,18 +5113,22 @@
                 <w:bCs w:val="1"/>
                 <w:sz w:val="24"/>
                 <w:szCs w:val="24"/>
-                <w:u w:val="none"/>
-              </w:rPr>
-            </w:pPr>
-            <w:r>
-              <w:rPr>
-                <w:b w:val="1"/>
-                <w:bCs w:val="1"/>
-                <w:sz w:val="24"/>
-                <w:szCs w:val="24"/>
-                <w:rtl w:val="0"/>
-              </w:rPr>
-              <w:t xml:space="preserve">- RN05 - Custo por categoria deve ser somado automaticamente;</w:t>
+              </w:rPr>
+            </w:pPr>
+            <w:r>
+              <w:rPr>
+                <w:b w:val="1"/>
+                <w:bCs w:val="1"/>
+                <w:sz w:val="24"/>
+                <w:szCs w:val="24"/>
+                <w:rtl w:val="0"/>
+              </w:rPr>
+              <w:t xml:space="preserve">- RN04 - O orçamento total não pode ser negativo.</w:t>
+            </w:r>
+            <w:r>
+              <w:rPr>
+                <w:rtl w:val="0"/>
+              </w:rPr>
             </w:r>
           </w:p>
           <w:p>
@@ -5033,7 +5136,7 @@
               <w:widowControl w:val="0"/>
               <w:numPr>
                 <w:ilvl w:val="0"/>
-                <w:numId w:val="1"/>
+                <w:numId w:val="10"/>
               </w:numPr>
               <w:spacing w:line="240" w:lineRule="auto"/>
               <w:ind w:left="720" w:hanging="360"/>
@@ -5042,18 +5145,22 @@
                 <w:bCs w:val="1"/>
                 <w:sz w:val="24"/>
                 <w:szCs w:val="24"/>
-                <w:u w:val="none"/>
-              </w:rPr>
-            </w:pPr>
-            <w:r>
-              <w:rPr>
-                <w:b w:val="1"/>
-                <w:bCs w:val="1"/>
-                <w:sz w:val="24"/>
-                <w:szCs w:val="24"/>
-                <w:rtl w:val="0"/>
-              </w:rPr>
-              <w:t xml:space="preserve">- RN06 - O tipo de viagem influencia todas as sugestões e bagagem;</w:t>
+              </w:rPr>
+            </w:pPr>
+            <w:r>
+              <w:rPr>
+                <w:b w:val="1"/>
+                <w:bCs w:val="1"/>
+                <w:sz w:val="24"/>
+                <w:szCs w:val="24"/>
+                <w:rtl w:val="0"/>
+              </w:rPr>
+              <w:t xml:space="preserve">- RN05 - Custo por categoria deve ser somado automaticamente.</w:t>
+            </w:r>
+            <w:r>
+              <w:rPr>
+                <w:rtl w:val="0"/>
+              </w:rPr>
             </w:r>
           </w:p>
           <w:p>
@@ -5061,7 +5168,7 @@
               <w:widowControl w:val="0"/>
               <w:numPr>
                 <w:ilvl w:val="0"/>
-                <w:numId w:val="1"/>
+                <w:numId w:val="10"/>
               </w:numPr>
               <w:spacing w:line="240" w:lineRule="auto"/>
               <w:ind w:left="720" w:hanging="360"/>
@@ -5070,7 +5177,38 @@
                 <w:bCs w:val="1"/>
                 <w:sz w:val="24"/>
                 <w:szCs w:val="24"/>
-                <w:u w:val="none"/>
+              </w:rPr>
+            </w:pPr>
+            <w:r>
+              <w:rPr>
+                <w:b w:val="1"/>
+                <w:bCs w:val="1"/>
+                <w:sz w:val="24"/>
+                <w:szCs w:val="24"/>
+                <w:rtl w:val="0"/>
+              </w:rPr>
+              <w:t xml:space="preserve">- RN06 - O tipo de viagem influencia todas as sugestões e bagagem.</w:t>
+            </w:r>
+            <w:r>
+              <w:rPr>
+                <w:rtl w:val="0"/>
+              </w:rPr>
+            </w:r>
+          </w:p>
+          <w:p>
+            <w:pPr>
+              <w:widowControl w:val="0"/>
+              <w:numPr>
+                <w:ilvl w:val="0"/>
+                <w:numId w:val="10"/>
+              </w:numPr>
+              <w:spacing w:line="240" w:lineRule="auto"/>
+              <w:ind w:left="720" w:hanging="360"/>
+              <w:rPr>
+                <w:b w:val="1"/>
+                <w:bCs w:val="1"/>
+                <w:sz w:val="24"/>
+                <w:szCs w:val="24"/>
               </w:rPr>
             </w:pPr>
             <w:r>
@@ -5082,6 +5220,11 @@
                 <w:rtl w:val="0"/>
               </w:rPr>
               <w:t xml:space="preserve">- RN07 - Autenticação deve respeitar consistência ACID na base de dados.</w:t>
+            </w:r>
+            <w:r>
+              <w:rPr>
+                <w:rtl w:val="0"/>
+              </w:rPr>
             </w:r>
           </w:p>
         </w:tc>
@@ -5100,24 +5243,6 @@
         <w:rPr>
           <w:rtl w:val="0"/>
         </w:rPr>
-      </w:r>
-    </w:p>
-    <w:p>
-      <w:pPr>
-        <w:spacing w:line="360" w:lineRule="auto"/>
-        <w:jc w:val="both"/>
-        <w:rPr>
-          <w:sz w:val="24"/>
-          <w:szCs w:val="24"/>
-        </w:rPr>
-      </w:pPr>
-      <w:r>
-        <w:rPr>
-          <w:sz w:val="24"/>
-          <w:szCs w:val="24"/>
-          <w:rtl w:val="0"/>
-        </w:rPr>
-        <w:t xml:space="preserve">-</w:t>
       </w:r>
     </w:p>
     <w:p>
@@ -5190,7 +5315,7 @@
                 <w:szCs w:val="24"/>
                 <w:rtl w:val="0"/>
               </w:rPr>
-              <w:t xml:space="preserve">CASO DE USO EXPANDIDO - 002</w:t>
+              <w:t xml:space="preserve">CASO DE USO EXPANDIDO - 001</w:t>
             </w:r>
           </w:p>
         </w:tc>
@@ -5540,180 +5665,210 @@
             <w:pPr>
               <w:numPr>
                 <w:ilvl w:val="0"/>
-                <w:numId w:val="9"/>
+                <w:numId w:val="6"/>
               </w:numPr>
               <w:ind w:left="720" w:hanging="360"/>
-              <w:rPr>
-                <w:u w:val="none"/>
-              </w:rPr>
-            </w:pPr>
-            <w:r>
-              <w:rPr>
-                <w:rtl w:val="0"/>
-              </w:rPr>
-              <w:t xml:space="preserve">1. Durante a viagem, o usuário clica em "Problemas" no card local.</w:t>
+              <w:rPr/>
+            </w:pPr>
+            <w:r>
+              <w:rPr>
+                <w:rtl w:val="0"/>
+              </w:rPr>
+              <w:t xml:space="preserve">1. Durante a viagem, o usuário clica em "Problemas" no card do local.</w:t>
+            </w:r>
+            <w:r>
+              <w:rPr>
+                <w:rtl w:val="0"/>
+              </w:rPr>
             </w:r>
           </w:p>
           <w:p>
             <w:pPr>
               <w:numPr>
                 <w:ilvl w:val="0"/>
-                <w:numId w:val="9"/>
+                <w:numId w:val="6"/>
               </w:numPr>
               <w:ind w:left="720" w:hanging="360"/>
-              <w:rPr>
-                <w:u w:val="none"/>
-              </w:rPr>
+              <w:rPr/>
             </w:pPr>
             <w:r>
               <w:rPr>
                 <w:rtl w:val="0"/>
               </w:rPr>
               <w:t xml:space="preserve">2. Escolha o motivo do problema.</w:t>
+            </w:r>
+            <w:r>
+              <w:rPr>
+                <w:rtl w:val="0"/>
+              </w:rPr>
             </w:r>
           </w:p>
           <w:p>
             <w:pPr>
               <w:numPr>
                 <w:ilvl w:val="0"/>
-                <w:numId w:val="9"/>
+                <w:numId w:val="6"/>
               </w:numPr>
               <w:ind w:left="720" w:hanging="360"/>
-              <w:rPr>
-                <w:u w:val="none"/>
-              </w:rPr>
+              <w:rPr/>
             </w:pPr>
             <w:r>
               <w:rPr>
                 <w:rtl w:val="0"/>
               </w:rPr>
               <w:t xml:space="preserve">3. Enviar foto e descrição.</w:t>
+            </w:r>
+            <w:r>
+              <w:rPr>
+                <w:rtl w:val="0"/>
+              </w:rPr>
             </w:r>
           </w:p>
           <w:p>
             <w:pPr>
               <w:numPr>
                 <w:ilvl w:val="0"/>
-                <w:numId w:val="9"/>
+                <w:numId w:val="6"/>
               </w:numPr>
               <w:ind w:left="720" w:hanging="360"/>
-              <w:rPr>
-                <w:u w:val="none"/>
-              </w:rPr>
+              <w:rPr/>
             </w:pPr>
             <w:r>
               <w:rPr>
                 <w:rtl w:val="0"/>
               </w:rPr>
               <w:t xml:space="preserve">4. O sistema calcula o reembolso e mostra valor total.</w:t>
+            </w:r>
+            <w:r>
+              <w:rPr>
+                <w:rtl w:val="0"/>
+              </w:rPr>
             </w:r>
           </w:p>
           <w:p>
             <w:pPr>
               <w:numPr>
                 <w:ilvl w:val="0"/>
-                <w:numId w:val="9"/>
+                <w:numId w:val="6"/>
               </w:numPr>
               <w:ind w:left="720" w:hanging="360"/>
-              <w:rPr>
-                <w:u w:val="none"/>
-              </w:rPr>
+              <w:rPr/>
             </w:pPr>
             <w:r>
               <w:rPr>
                 <w:rtl w:val="0"/>
               </w:rPr>
               <w:t xml:space="preserve">5. Clica em "Solicitar".</w:t>
+            </w:r>
+            <w:r>
+              <w:rPr>
+                <w:rtl w:val="0"/>
+              </w:rPr>
             </w:r>
           </w:p>
           <w:p>
             <w:pPr>
               <w:numPr>
                 <w:ilvl w:val="0"/>
-                <w:numId w:val="9"/>
+                <w:numId w:val="6"/>
               </w:numPr>
               <w:ind w:left="720" w:hanging="360"/>
-              <w:rPr>
-                <w:u w:val="none"/>
-              </w:rPr>
+              <w:rPr/>
             </w:pPr>
             <w:r>
               <w:rPr>
                 <w:rtl w:val="0"/>
               </w:rPr>
               <w:t xml:space="preserve">6. O usuário acessa o cartão do local na viagem.</w:t>
+            </w:r>
+            <w:r>
+              <w:rPr>
+                <w:rtl w:val="0"/>
+              </w:rPr>
             </w:r>
           </w:p>
           <w:p>
             <w:pPr>
               <w:numPr>
                 <w:ilvl w:val="0"/>
-                <w:numId w:val="9"/>
+                <w:numId w:val="6"/>
               </w:numPr>
               <w:ind w:left="720" w:hanging="360"/>
-              <w:rPr>
-                <w:u w:val="none"/>
-              </w:rPr>
+              <w:rPr/>
             </w:pPr>
             <w:r>
               <w:rPr>
                 <w:rtl w:val="0"/>
               </w:rPr>
               <w:t xml:space="preserve">7. Clica em "Dar nota".</w:t>
+            </w:r>
+            <w:r>
+              <w:rPr>
+                <w:rtl w:val="0"/>
+              </w:rPr>
             </w:r>
           </w:p>
           <w:p>
             <w:pPr>
               <w:numPr>
                 <w:ilvl w:val="0"/>
-                <w:numId w:val="9"/>
+                <w:numId w:val="6"/>
               </w:numPr>
               <w:ind w:left="720" w:hanging="360"/>
-              <w:rPr>
-                <w:u w:val="none"/>
-              </w:rPr>
+              <w:rPr/>
             </w:pPr>
             <w:r>
               <w:rPr>
                 <w:rtl w:val="0"/>
               </w:rPr>
               <w:t xml:space="preserve">8. Escolhe nota de 1 a 5.</w:t>
+            </w:r>
+            <w:r>
+              <w:rPr>
+                <w:rtl w:val="0"/>
+              </w:rPr>
             </w:r>
           </w:p>
           <w:p>
             <w:pPr>
               <w:numPr>
                 <w:ilvl w:val="0"/>
-                <w:numId w:val="9"/>
+                <w:numId w:val="6"/>
               </w:numPr>
               <w:ind w:left="720" w:hanging="360"/>
-              <w:rPr>
-                <w:u w:val="none"/>
-              </w:rPr>
+              <w:rPr/>
             </w:pPr>
             <w:r>
               <w:rPr>
                 <w:rtl w:val="0"/>
               </w:rPr>
               <w:t xml:space="preserve">9. Clica em "Salvar".</w:t>
+            </w:r>
+            <w:r>
+              <w:rPr>
+                <w:rtl w:val="0"/>
+              </w:rPr>
             </w:r>
           </w:p>
           <w:p>
             <w:pPr>
               <w:numPr>
                 <w:ilvl w:val="0"/>
-                <w:numId w:val="9"/>
+                <w:numId w:val="6"/>
               </w:numPr>
               <w:ind w:left="720" w:hanging="360"/>
-              <w:rPr>
-                <w:u w:val="none"/>
-              </w:rPr>
+              <w:rPr/>
             </w:pPr>
             <w:r>
               <w:rPr>
                 <w:rtl w:val="0"/>
               </w:rPr>
               <w:t xml:space="preserve">10. O sistema mostra horário, fechamento e faixa de preço.</w:t>
+            </w:r>
+            <w:r>
+              <w:rPr>
+                <w:rtl w:val="0"/>
+              </w:rPr>
             </w:r>
           </w:p>
           <w:p>
@@ -5814,7 +5969,7 @@
               <w:widowControl w:val="0"/>
               <w:numPr>
                 <w:ilvl w:val="0"/>
-                <w:numId w:val="7"/>
+                <w:numId w:val="4"/>
               </w:numPr>
               <w:spacing w:line="240" w:lineRule="auto"/>
               <w:ind w:left="720" w:hanging="360"/>
@@ -5863,7 +6018,7 @@
               <w:widowControl w:val="0"/>
               <w:numPr>
                 <w:ilvl w:val="0"/>
-                <w:numId w:val="7"/>
+                <w:numId w:val="4"/>
               </w:numPr>
               <w:spacing w:line="240" w:lineRule="auto"/>
               <w:ind w:left="720" w:hanging="360"/>
@@ -5984,7 +6139,7 @@
               <w:widowControl w:val="0"/>
               <w:numPr>
                 <w:ilvl w:val="0"/>
-                <w:numId w:val="8"/>
+                <w:numId w:val="5"/>
               </w:numPr>
               <w:spacing w:line="240" w:lineRule="auto"/>
               <w:ind w:left="720" w:hanging="360"/>
@@ -6033,7 +6188,7 @@
               <w:widowControl w:val="0"/>
               <w:numPr>
                 <w:ilvl w:val="0"/>
-                <w:numId w:val="8"/>
+                <w:numId w:val="5"/>
               </w:numPr>
               <w:spacing w:line="240" w:lineRule="auto"/>
               <w:ind w:left="720" w:hanging="360"/>
@@ -6102,7 +6257,7 @@
               <w:widowControl w:val="0"/>
               <w:numPr>
                 <w:ilvl w:val="0"/>
-                <w:numId w:val="12"/>
+                <w:numId w:val="9"/>
               </w:numPr>
               <w:spacing w:line="240" w:lineRule="auto"/>
               <w:ind w:left="720" w:hanging="360"/>
@@ -6162,7 +6317,7 @@
               <w:widowControl w:val="0"/>
               <w:numPr>
                 <w:ilvl w:val="0"/>
-                <w:numId w:val="12"/>
+                <w:numId w:val="9"/>
               </w:numPr>
               <w:spacing w:line="240" w:lineRule="auto"/>
               <w:ind w:left="720" w:hanging="360"/>
@@ -6200,22 +6355,216 @@
     </w:tbl>
     <w:p>
       <w:pPr>
-        <w:rPr>
-          <w:sz w:val="24"/>
-          <w:szCs w:val="24"/>
-        </w:rPr>
-      </w:pPr>
-      <w:r>
-        <w:rPr>
-          <w:sz w:val="24"/>
-          <w:szCs w:val="24"/>
-          <w:rtl w:val="0"/>
-        </w:rPr>
-        <w:t xml:space="preserve">- </w:t>
-      </w:r>
-    </w:p>
-    <w:p>
-      <w:pPr>
+        <w:spacing w:line="360" w:lineRule="auto"/>
+        <w:jc w:val="both"/>
+        <w:rPr>
+          <w:sz w:val="24"/>
+          <w:szCs w:val="24"/>
+        </w:rPr>
+      </w:pPr>
+      <w:r>
+        <w:rPr>
+          <w:rtl w:val="0"/>
+        </w:rPr>
+      </w:r>
+    </w:p>
+    <w:p>
+      <w:pPr>
+        <w:rPr/>
+      </w:pPr>
+      <w:r>
+        <w:rPr>
+          <w:rtl w:val="0"/>
+        </w:rPr>
+      </w:r>
+    </w:p>
+    <w:p>
+      <w:pPr>
+        <w:rPr/>
+      </w:pPr>
+      <w:r>
+        <w:rPr>
+          <w:rtl w:val="0"/>
+        </w:rPr>
+      </w:r>
+    </w:p>
+    <w:p>
+      <w:pPr>
+        <w:rPr/>
+      </w:pPr>
+      <w:r>
+        <w:rPr>
+          <w:rtl w:val="0"/>
+        </w:rPr>
+      </w:r>
+    </w:p>
+    <w:p>
+      <w:pPr>
+        <w:rPr/>
+      </w:pPr>
+      <w:r>
+        <w:rPr>
+          <w:rtl w:val="0"/>
+        </w:rPr>
+      </w:r>
+    </w:p>
+    <w:p>
+      <w:pPr>
+        <w:rPr/>
+      </w:pPr>
+      <w:r>
+        <w:rPr>
+          <w:rtl w:val="0"/>
+        </w:rPr>
+      </w:r>
+    </w:p>
+    <w:p>
+      <w:pPr>
+        <w:rPr/>
+      </w:pPr>
+      <w:r>
+        <w:rPr>
+          <w:rtl w:val="0"/>
+        </w:rPr>
+      </w:r>
+    </w:p>
+    <w:p>
+      <w:pPr>
+        <w:rPr/>
+      </w:pPr>
+      <w:r>
+        <w:rPr>
+          <w:rtl w:val="0"/>
+        </w:rPr>
+      </w:r>
+    </w:p>
+    <w:p>
+      <w:pPr>
+        <w:rPr/>
+      </w:pPr>
+      <w:r>
+        <w:rPr>
+          <w:rtl w:val="0"/>
+        </w:rPr>
+        <w:tab/>
+        <w:t xml:space="preserve"> </w:t>
+        <w:tab/>
+      </w:r>
+    </w:p>
+    <w:p>
+      <w:pPr>
+        <w:rPr/>
+      </w:pPr>
+      <w:r>
+        <w:rPr>
+          <w:rtl w:val="0"/>
+        </w:rPr>
+        <w:tab/>
+        <w:t xml:space="preserve"> </w:t>
+        <w:tab/>
+      </w:r>
+    </w:p>
+    <w:p>
+      <w:pPr>
+        <w:spacing w:before="240" w:lineRule="auto"/>
+        <w:rPr/>
+      </w:pPr>
+      <w:r>
+        <w:rPr>
+          <w:rtl w:val="0"/>
+        </w:rPr>
+        <w:br w:type="textWrapping"/>
+      </w:r>
+    </w:p>
+    <w:p>
+      <w:pPr>
+        <w:spacing w:before="240" w:line="360" w:lineRule="auto"/>
+        <w:jc w:val="both"/>
+        <w:rPr/>
+      </w:pPr>
+      <w:r>
+        <w:rPr>
+          <w:rtl w:val="0"/>
+        </w:rPr>
+      </w:r>
+    </w:p>
+    <w:p>
+      <w:pPr>
+        <w:spacing w:before="240" w:line="360" w:lineRule="auto"/>
+        <w:jc w:val="both"/>
+        <w:rPr/>
+      </w:pPr>
+      <w:r>
+        <w:rPr>
+          <w:rtl w:val="0"/>
+        </w:rPr>
+      </w:r>
+    </w:p>
+    <w:p>
+      <w:pPr>
+        <w:spacing w:before="240" w:line="360" w:lineRule="auto"/>
+        <w:jc w:val="both"/>
+        <w:rPr/>
+      </w:pPr>
+      <w:r>
+        <w:rPr>
+          <w:rtl w:val="0"/>
+        </w:rPr>
+      </w:r>
+    </w:p>
+    <w:p>
+      <w:pPr>
+        <w:spacing w:before="240" w:line="360" w:lineRule="auto"/>
+        <w:jc w:val="both"/>
+        <w:rPr/>
+      </w:pPr>
+      <w:r>
+        <w:rPr>
+          <w:rtl w:val="0"/>
+        </w:rPr>
+      </w:r>
+    </w:p>
+    <w:p>
+      <w:pPr>
+        <w:spacing w:before="240" w:line="360" w:lineRule="auto"/>
+        <w:jc w:val="both"/>
+        <w:rPr/>
+      </w:pPr>
+      <w:r>
+        <w:rPr>
+          <w:rtl w:val="0"/>
+        </w:rPr>
+        <w:br w:type="textWrapping"/>
+      </w:r>
+    </w:p>
+    <w:p>
+      <w:pPr>
+        <w:spacing w:before="240" w:line="360" w:lineRule="auto"/>
+        <w:jc w:val="both"/>
+        <w:rPr/>
+      </w:pPr>
+      <w:r>
+        <w:rPr>
+          <w:rtl w:val="0"/>
+        </w:rPr>
+      </w:r>
+    </w:p>
+    <w:p>
+      <w:pPr>
+        <w:spacing w:before="240" w:line="360" w:lineRule="auto"/>
+        <w:jc w:val="both"/>
+        <w:rPr/>
+      </w:pPr>
+      <w:r>
+        <w:rPr>
+          <w:rtl w:val="0"/>
+        </w:rPr>
+      </w:r>
+    </w:p>
+    <w:p>
+      <w:pPr>
+        <w:spacing w:line="360" w:lineRule="auto"/>
+        <w:jc w:val="both"/>
         <w:rPr>
           <w:sz w:val="24"/>
           <w:szCs w:val="24"/>
@@ -6288,7 +6637,7 @@
                 <w:szCs w:val="24"/>
                 <w:rtl w:val="0"/>
               </w:rPr>
-              <w:t xml:space="preserve">CASO DE USO EXPANDIDO - 003</w:t>
+              <w:t xml:space="preserve">CASO DE USO EXPANDIDO - 001</w:t>
             </w:r>
           </w:p>
         </w:tc>
@@ -6711,174 +7060,199 @@
             <w:pPr>
               <w:numPr>
                 <w:ilvl w:val="0"/>
-                <w:numId w:val="10"/>
+                <w:numId w:val="7"/>
               </w:numPr>
               <w:ind w:left="720" w:hanging="360"/>
-              <w:rPr>
-                <w:u w:val="none"/>
-              </w:rPr>
+              <w:rPr/>
             </w:pPr>
             <w:r>
               <w:rPr>
                 <w:rtl w:val="0"/>
               </w:rPr>
               <w:t xml:space="preserve">1. O usuário seleciona uma viagem.</w:t>
+            </w:r>
+            <w:r>
+              <w:rPr>
+                <w:rtl w:val="0"/>
+              </w:rPr>
             </w:r>
           </w:p>
           <w:p>
             <w:pPr>
               <w:numPr>
                 <w:ilvl w:val="0"/>
-                <w:numId w:val="10"/>
+                <w:numId w:val="7"/>
               </w:numPr>
               <w:ind w:left="720" w:hanging="360"/>
-              <w:rPr>
-                <w:u w:val="none"/>
-              </w:rPr>
+              <w:rPr/>
             </w:pPr>
             <w:r>
               <w:rPr>
                 <w:rtl w:val="0"/>
               </w:rPr>
               <w:t xml:space="preserve">2. Clica na aba "Hospedagem" ou "Atrações".</w:t>
+            </w:r>
+            <w:r>
+              <w:rPr>
+                <w:rtl w:val="0"/>
+              </w:rPr>
             </w:r>
           </w:p>
           <w:p>
             <w:pPr>
               <w:numPr>
                 <w:ilvl w:val="0"/>
-                <w:numId w:val="10"/>
+                <w:numId w:val="7"/>
               </w:numPr>
               <w:ind w:left="720" w:hanging="360"/>
-              <w:rPr>
-                <w:u w:val="none"/>
-              </w:rPr>
+              <w:rPr/>
             </w:pPr>
             <w:r>
               <w:rPr>
                 <w:rtl w:val="0"/>
               </w:rPr>
               <w:t xml:space="preserve">3. Informa preço máximo e avaliação desejada.</w:t>
+            </w:r>
+            <w:r>
+              <w:rPr>
+                <w:rtl w:val="0"/>
+              </w:rPr>
             </w:r>
           </w:p>
           <w:p>
             <w:pPr>
               <w:numPr>
                 <w:ilvl w:val="0"/>
-                <w:numId w:val="10"/>
+                <w:numId w:val="7"/>
               </w:numPr>
               <w:ind w:left="720" w:hanging="360"/>
-              <w:rPr>
-                <w:u w:val="none"/>
-              </w:rPr>
+              <w:rPr/>
             </w:pPr>
             <w:r>
               <w:rPr>
                 <w:rtl w:val="0"/>
               </w:rPr>
               <w:t xml:space="preserve">4. O sistema filtra e sugere opções.</w:t>
+            </w:r>
+            <w:r>
+              <w:rPr>
+                <w:rtl w:val="0"/>
+              </w:rPr>
             </w:r>
           </w:p>
           <w:p>
             <w:pPr>
               <w:numPr>
                 <w:ilvl w:val="0"/>
-                <w:numId w:val="10"/>
+                <w:numId w:val="7"/>
               </w:numPr>
               <w:ind w:left="720" w:hanging="360"/>
-              <w:rPr>
-                <w:u w:val="none"/>
-              </w:rPr>
+              <w:rPr/>
             </w:pPr>
             <w:r>
               <w:rPr>
                 <w:rtl w:val="0"/>
               </w:rPr>
               <w:t xml:space="preserve">5. Exibe mapa e fotos + avaliações.</w:t>
+            </w:r>
+            <w:r>
+              <w:rPr>
+                <w:rtl w:val="0"/>
+              </w:rPr>
             </w:r>
           </w:p>
           <w:p>
             <w:pPr>
               <w:numPr>
                 <w:ilvl w:val="0"/>
-                <w:numId w:val="10"/>
+                <w:numId w:val="7"/>
               </w:numPr>
               <w:ind w:left="720" w:hanging="360"/>
-              <w:rPr>
-                <w:u w:val="none"/>
-              </w:rPr>
+              <w:rPr/>
             </w:pPr>
             <w:r>
               <w:rPr>
                 <w:rtl w:val="0"/>
               </w:rPr>
               <w:t xml:space="preserve">6. O usuário acessa a aba "Bagagem".</w:t>
+            </w:r>
+            <w:r>
+              <w:rPr>
+                <w:rtl w:val="0"/>
+              </w:rPr>
             </w:r>
           </w:p>
           <w:p>
             <w:pPr>
               <w:numPr>
                 <w:ilvl w:val="0"/>
-                <w:numId w:val="10"/>
+                <w:numId w:val="7"/>
               </w:numPr>
               <w:ind w:left="720" w:hanging="360"/>
-              <w:rPr>
-                <w:u w:val="none"/>
-              </w:rPr>
+              <w:rPr/>
             </w:pPr>
             <w:r>
               <w:rPr>
                 <w:rtl w:val="0"/>
               </w:rPr>
               <w:t xml:space="preserve">7. Seleciona tipo de viagem (lazer ou negócios).</w:t>
+            </w:r>
+            <w:r>
+              <w:rPr>
+                <w:rtl w:val="0"/>
+              </w:rPr>
             </w:r>
           </w:p>
           <w:p>
             <w:pPr>
               <w:numPr>
                 <w:ilvl w:val="0"/>
-                <w:numId w:val="10"/>
+                <w:numId w:val="7"/>
               </w:numPr>
               <w:ind w:left="720" w:hanging="360"/>
-              <w:rPr>
-                <w:u w:val="none"/>
-              </w:rPr>
+              <w:rPr/>
             </w:pPr>
             <w:r>
               <w:rPr>
                 <w:rtl w:val="0"/>
               </w:rPr>
               <w:t xml:space="preserve">8. Clica em "Gerar lista de bagagem".</w:t>
+            </w:r>
+            <w:r>
+              <w:rPr>
+                <w:rtl w:val="0"/>
+              </w:rPr>
             </w:r>
           </w:p>
           <w:p>
             <w:pPr>
               <w:numPr>
                 <w:ilvl w:val="0"/>
-                <w:numId w:val="10"/>
+                <w:numId w:val="7"/>
               </w:numPr>
               <w:ind w:left="720" w:hanging="360"/>
-              <w:rPr>
-                <w:u w:val="none"/>
-              </w:rPr>
+              <w:rPr/>
             </w:pPr>
             <w:r>
               <w:rPr>
                 <w:rtl w:val="0"/>
               </w:rPr>
               <w:t xml:space="preserve">9. Marque itens organizados e adicione lembretes.</w:t>
+            </w:r>
+            <w:r>
+              <w:rPr>
+                <w:rtl w:val="0"/>
+              </w:rPr>
             </w:r>
           </w:p>
           <w:p>
             <w:pPr>
               <w:numPr>
                 <w:ilvl w:val="0"/>
-                <w:numId w:val="10"/>
+                <w:numId w:val="7"/>
               </w:numPr>
               <w:ind w:left="720" w:hanging="360"/>
-              <w:rPr>
-                <w:u w:val="none"/>
-              </w:rPr>
+              <w:rPr/>
             </w:pPr>
             <w:r>
               <w:rPr>
@@ -7145,28 +7519,1444 @@
     </w:tbl>
     <w:p>
       <w:pPr>
+        <w:spacing w:before="240" w:line="360" w:lineRule="auto"/>
+        <w:jc w:val="both"/>
+        <w:rPr/>
+      </w:pPr>
+      <w:r>
+        <w:rPr>
+          <w:rtl w:val="0"/>
+        </w:rPr>
+        <w:br w:type="textWrapping"/>
+      </w:r>
+    </w:p>
+    <w:p>
+      <w:pPr>
+        <w:rPr/>
+      </w:pPr>
+      <w:r>
+        <w:rPr>
+          <w:rtl w:val="0"/>
+        </w:rPr>
+      </w:r>
+    </w:p>
+    <w:p>
+      <w:pPr>
+        <w:rPr/>
+      </w:pPr>
+      <w:r>
+        <w:rPr>
+          <w:rtl w:val="0"/>
+        </w:rPr>
+      </w:r>
+    </w:p>
+    <w:p>
+      <w:pPr>
+        <w:rPr/>
+      </w:pPr>
+      <w:r>
+        <w:rPr>
+          <w:rtl w:val="0"/>
+        </w:rPr>
+      </w:r>
+    </w:p>
+    <w:p>
+      <w:pPr>
+        <w:rPr/>
+      </w:pPr>
+      <w:r>
+        <w:rPr>
+          <w:rtl w:val="0"/>
+        </w:rPr>
+      </w:r>
+    </w:p>
+    <w:p>
+      <w:pPr>
+        <w:rPr/>
+      </w:pPr>
+      <w:r>
+        <w:rPr>
+          <w:rtl w:val="0"/>
+        </w:rPr>
+      </w:r>
+    </w:p>
+    <w:p>
+      <w:pPr>
+        <w:rPr/>
+      </w:pPr>
+      <w:r>
+        <w:rPr>
+          <w:rtl w:val="0"/>
+        </w:rPr>
+      </w:r>
+    </w:p>
+    <w:p>
+      <w:pPr>
+        <w:rPr/>
+      </w:pPr>
+      <w:r>
+        <w:rPr>
+          <w:rtl w:val="0"/>
+        </w:rPr>
+      </w:r>
+    </w:p>
+    <w:p>
+      <w:pPr>
+        <w:rPr/>
+      </w:pPr>
+      <w:r>
+        <w:rPr>
+          <w:rtl w:val="0"/>
+        </w:rPr>
+      </w:r>
+    </w:p>
+    <w:p>
+      <w:pPr>
+        <w:rPr/>
+      </w:pPr>
+      <w:r>
+        <w:rPr>
+          <w:rtl w:val="0"/>
+        </w:rPr>
+      </w:r>
+    </w:p>
+    <w:p>
+      <w:pPr>
+        <w:rPr/>
+      </w:pPr>
+      <w:r>
+        <w:rPr>
+          <w:rtl w:val="0"/>
+        </w:rPr>
+      </w:r>
+    </w:p>
+    <w:p>
+      <w:pPr>
+        <w:rPr/>
+      </w:pPr>
+      <w:r>
+        <w:rPr>
+          <w:rtl w:val="0"/>
+        </w:rPr>
+      </w:r>
+    </w:p>
+    <w:p>
+      <w:pPr>
+        <w:rPr/>
+      </w:pPr>
+      <w:r>
+        <w:rPr>
+          <w:rtl w:val="0"/>
+        </w:rPr>
+      </w:r>
+    </w:p>
+    <w:p>
+      <w:pPr>
+        <w:rPr/>
+      </w:pPr>
+      <w:r>
+        <w:rPr>
+          <w:rtl w:val="0"/>
+        </w:rPr>
+      </w:r>
+    </w:p>
+    <w:p>
+      <w:pPr>
+        <w:rPr/>
+      </w:pPr>
+      <w:r>
+        <w:rPr>
+          <w:rtl w:val="0"/>
+        </w:rPr>
+      </w:r>
+    </w:p>
+    <w:p>
+      <w:pPr>
+        <w:rPr/>
+      </w:pPr>
+      <w:r>
+        <w:rPr>
+          <w:rtl w:val="0"/>
+        </w:rPr>
+      </w:r>
+    </w:p>
+    <w:p>
+      <w:pPr>
+        <w:rPr/>
+      </w:pPr>
+      <w:r>
+        <w:rPr>
+          <w:rtl w:val="0"/>
+        </w:rPr>
+      </w:r>
+    </w:p>
+    <w:p>
+      <w:pPr>
+        <w:rPr/>
+      </w:pPr>
+      <w:r>
+        <w:rPr>
+          <w:rtl w:val="0"/>
+        </w:rPr>
+      </w:r>
+    </w:p>
+    <w:p>
+      <w:pPr>
         <w:spacing w:line="360" w:lineRule="auto"/>
         <w:jc w:val="both"/>
-        <w:rPr/>
-      </w:pPr>
-      <w:r>
-        <w:rPr>
-          <w:rtl w:val="0"/>
-        </w:rPr>
-        <w:t xml:space="preserve">  </w:t>
-      </w:r>
-    </w:p>
+        <w:rPr>
+          <w:sz w:val="24"/>
+          <w:szCs w:val="24"/>
+        </w:rPr>
+      </w:pPr>
+      <w:r>
+        <w:rPr>
+          <w:rtl w:val="0"/>
+        </w:rPr>
+      </w:r>
+    </w:p>
+    <w:tbl>
+      <w:tblPr>
+        <w:tblStyle w:val="Table6"/>
+        <w:tblW w:w="14010.0" w:type="dxa"/>
+        <w:jc w:val="left"/>
+        <w:tblBorders>
+          <w:top w:color="000000" w:space="0" w:sz="8" w:val="single"/>
+          <w:left w:color="000000" w:space="0" w:sz="8" w:val="single"/>
+          <w:bottom w:color="000000" w:space="0" w:sz="8" w:val="single"/>
+          <w:right w:color="000000" w:space="0" w:sz="8" w:val="single"/>
+          <w:insideH w:color="000000" w:space="0" w:sz="8" w:val="single"/>
+          <w:insideV w:color="000000" w:space="0" w:sz="8" w:val="single"/>
+        </w:tblBorders>
+        <w:tblLayout w:type="fixed"/>
+        <w:tblLook w:val="0600"/>
+      </w:tblPr>
+      <w:tblGrid>
+        <w:gridCol w:w="2535"/>
+        <w:gridCol w:w="11475"/>
+        <w:tblGridChange w:id="0">
+          <w:tblGrid>
+            <w:gridCol w:w="2535"/>
+            <w:gridCol w:w="11475"/>
+          </w:tblGrid>
+        </w:tblGridChange>
+      </w:tblGrid>
+      <w:tr>
+        <w:trPr>
+          <w:cantSplit w:val="0"/>
+          <w:tblHeader w:val="0"/>
+        </w:trPr>
+        <w:tc>
+          <w:tcPr>
+            <w:shd w:fill="999999" w:val="clear"/>
+            <w:tcMar>
+              <w:top w:w="100.0" w:type="dxa"/>
+              <w:left w:w="100.0" w:type="dxa"/>
+              <w:bottom w:w="100.0" w:type="dxa"/>
+              <w:right w:w="100.0" w:type="dxa"/>
+            </w:tcMar>
+            <w:vAlign w:val="top"/>
+          </w:tcPr>
+          <w:p>
+            <w:pPr>
+              <w:widowControl w:val="0"/>
+              <w:spacing w:line="240" w:lineRule="auto"/>
+              <w:rPr>
+                <w:b w:val="1"/>
+                <w:bCs w:val="1"/>
+                <w:sz w:val="24"/>
+                <w:szCs w:val="24"/>
+              </w:rPr>
+            </w:pPr>
+            <w:r>
+              <w:rPr>
+                <w:b w:val="1"/>
+                <w:bCs w:val="1"/>
+                <w:sz w:val="24"/>
+                <w:szCs w:val="24"/>
+                <w:rtl w:val="0"/>
+              </w:rPr>
+              <w:t xml:space="preserve">CASO DE USO EXPANDIDO - 001</w:t>
+            </w:r>
+          </w:p>
+        </w:tc>
+        <w:tc>
+          <w:tcPr>
+            <w:shd w:fill="999999" w:val="clear"/>
+            <w:tcMar>
+              <w:top w:w="100.0" w:type="dxa"/>
+              <w:left w:w="100.0" w:type="dxa"/>
+              <w:bottom w:w="100.0" w:type="dxa"/>
+              <w:right w:w="100.0" w:type="dxa"/>
+            </w:tcMar>
+            <w:vAlign w:val="top"/>
+          </w:tcPr>
+          <w:p>
+            <w:pPr>
+              <w:widowControl w:val="0"/>
+              <w:spacing w:line="240" w:lineRule="auto"/>
+              <w:rPr>
+                <w:b w:val="1"/>
+                <w:bCs w:val="1"/>
+                <w:sz w:val="24"/>
+                <w:szCs w:val="24"/>
+              </w:rPr>
+            </w:pPr>
+            <w:r>
+              <w:rPr>
+                <w:b w:val="1"/>
+                <w:bCs w:val="1"/>
+                <w:sz w:val="24"/>
+                <w:szCs w:val="24"/>
+                <w:rtl w:val="0"/>
+              </w:rPr>
+              <w:t xml:space="preserve">SARAH EMANUELLY </w:t>
+            </w:r>
+          </w:p>
+        </w:tc>
+      </w:tr>
+      <w:tr>
+        <w:trPr>
+          <w:cantSplit w:val="0"/>
+          <w:tblHeader w:val="0"/>
+        </w:trPr>
+        <w:tc>
+          <w:tcPr>
+            <w:shd w:fill="999999" w:val="clear"/>
+            <w:tcMar>
+              <w:top w:w="100.0" w:type="dxa"/>
+              <w:left w:w="100.0" w:type="dxa"/>
+              <w:bottom w:w="100.0" w:type="dxa"/>
+              <w:right w:w="100.0" w:type="dxa"/>
+            </w:tcMar>
+            <w:vAlign w:val="top"/>
+          </w:tcPr>
+          <w:p>
+            <w:pPr>
+              <w:widowControl w:val="0"/>
+              <w:spacing w:line="240" w:lineRule="auto"/>
+              <w:rPr>
+                <w:b w:val="1"/>
+                <w:bCs w:val="1"/>
+                <w:sz w:val="24"/>
+                <w:szCs w:val="24"/>
+              </w:rPr>
+            </w:pPr>
+            <w:r>
+              <w:rPr>
+                <w:b w:val="1"/>
+                <w:bCs w:val="1"/>
+                <w:sz w:val="24"/>
+                <w:szCs w:val="24"/>
+                <w:rtl w:val="0"/>
+              </w:rPr>
+              <w:t xml:space="preserve">Ator Principal: </w:t>
+            </w:r>
+          </w:p>
+        </w:tc>
+        <w:tc>
+          <w:tcPr>
+            <w:shd w:fill="auto" w:val="clear"/>
+            <w:tcMar>
+              <w:top w:w="100.0" w:type="dxa"/>
+              <w:left w:w="100.0" w:type="dxa"/>
+              <w:bottom w:w="100.0" w:type="dxa"/>
+              <w:right w:w="100.0" w:type="dxa"/>
+            </w:tcMar>
+            <w:vAlign w:val="top"/>
+          </w:tcPr>
+          <w:p>
+            <w:pPr>
+              <w:widowControl w:val="0"/>
+              <w:spacing w:after="240" w:before="240" w:line="240" w:lineRule="auto"/>
+              <w:rPr>
+                <w:sz w:val="24"/>
+                <w:szCs w:val="24"/>
+              </w:rPr>
+            </w:pPr>
+            <w:r>
+              <w:rPr>
+                <w:sz w:val="24"/>
+                <w:szCs w:val="24"/>
+                <w:rtl w:val="0"/>
+              </w:rPr>
+              <w:t xml:space="preserve">Viajante (Usuário Final)</w:t>
+            </w:r>
+          </w:p>
+        </w:tc>
+      </w:tr>
+      <w:tr>
+        <w:trPr>
+          <w:cantSplit w:val="0"/>
+          <w:tblHeader w:val="0"/>
+        </w:trPr>
+        <w:tc>
+          <w:tcPr>
+            <w:shd w:fill="999999" w:val="clear"/>
+            <w:tcMar>
+              <w:top w:w="100.0" w:type="dxa"/>
+              <w:left w:w="100.0" w:type="dxa"/>
+              <w:bottom w:w="100.0" w:type="dxa"/>
+              <w:right w:w="100.0" w:type="dxa"/>
+            </w:tcMar>
+            <w:vAlign w:val="top"/>
+          </w:tcPr>
+          <w:p>
+            <w:pPr>
+              <w:widowControl w:val="0"/>
+              <w:spacing w:line="240" w:lineRule="auto"/>
+              <w:rPr>
+                <w:b w:val="1"/>
+                <w:bCs w:val="1"/>
+                <w:sz w:val="24"/>
+                <w:szCs w:val="24"/>
+              </w:rPr>
+            </w:pPr>
+            <w:r>
+              <w:rPr>
+                <w:b w:val="1"/>
+                <w:bCs w:val="1"/>
+                <w:sz w:val="24"/>
+                <w:szCs w:val="24"/>
+                <w:rtl w:val="0"/>
+              </w:rPr>
+              <w:t xml:space="preserve">Resumo: </w:t>
+            </w:r>
+          </w:p>
+        </w:tc>
+        <w:tc>
+          <w:tcPr>
+            <w:shd w:fill="auto" w:val="clear"/>
+            <w:tcMar>
+              <w:top w:w="100.0" w:type="dxa"/>
+              <w:left w:w="100.0" w:type="dxa"/>
+              <w:bottom w:w="100.0" w:type="dxa"/>
+              <w:right w:w="100.0" w:type="dxa"/>
+            </w:tcMar>
+            <w:vAlign w:val="top"/>
+          </w:tcPr>
+          <w:p>
+            <w:pPr>
+              <w:widowControl w:val="0"/>
+              <w:spacing w:after="240" w:before="240" w:line="240" w:lineRule="auto"/>
+              <w:rPr>
+                <w:sz w:val="24"/>
+                <w:szCs w:val="24"/>
+              </w:rPr>
+            </w:pPr>
+            <w:r>
+              <w:rPr>
+                <w:sz w:val="24"/>
+                <w:szCs w:val="24"/>
+                <w:rtl w:val="0"/>
+              </w:rPr>
+              <w:t xml:space="preserve">Permitir que o viajante escolha o tipo de viagem (lazer ou negócios) para personalizar todas as sugestões, bagagem e recomendações do sistema</w:t>
+            </w:r>
+          </w:p>
+          <w:p>
+            <w:pPr>
+              <w:widowControl w:val="0"/>
+              <w:spacing w:after="240" w:before="240" w:line="240" w:lineRule="auto"/>
+              <w:rPr>
+                <w:sz w:val="24"/>
+                <w:szCs w:val="24"/>
+              </w:rPr>
+            </w:pPr>
+            <w:r>
+              <w:rPr>
+                <w:rtl w:val="0"/>
+              </w:rPr>
+            </w:r>
+          </w:p>
+        </w:tc>
+      </w:tr>
+      <w:tr>
+        <w:trPr>
+          <w:cantSplit w:val="0"/>
+          <w:tblHeader w:val="0"/>
+        </w:trPr>
+        <w:tc>
+          <w:tcPr>
+            <w:shd w:fill="999999" w:val="clear"/>
+            <w:tcMar>
+              <w:top w:w="100.0" w:type="dxa"/>
+              <w:left w:w="100.0" w:type="dxa"/>
+              <w:bottom w:w="100.0" w:type="dxa"/>
+              <w:right w:w="100.0" w:type="dxa"/>
+            </w:tcMar>
+            <w:vAlign w:val="top"/>
+          </w:tcPr>
+          <w:p>
+            <w:pPr>
+              <w:widowControl w:val="0"/>
+              <w:spacing w:line="240" w:lineRule="auto"/>
+              <w:rPr>
+                <w:b w:val="1"/>
+                <w:bCs w:val="1"/>
+                <w:sz w:val="24"/>
+                <w:szCs w:val="24"/>
+              </w:rPr>
+            </w:pPr>
+            <w:r>
+              <w:rPr>
+                <w:b w:val="1"/>
+                <w:bCs w:val="1"/>
+                <w:sz w:val="24"/>
+                <w:szCs w:val="24"/>
+                <w:rtl w:val="0"/>
+              </w:rPr>
+              <w:t xml:space="preserve">Pré-condições: </w:t>
+            </w:r>
+          </w:p>
+        </w:tc>
+        <w:tc>
+          <w:tcPr>
+            <w:shd w:fill="auto" w:val="clear"/>
+            <w:tcMar>
+              <w:top w:w="100.0" w:type="dxa"/>
+              <w:left w:w="100.0" w:type="dxa"/>
+              <w:bottom w:w="100.0" w:type="dxa"/>
+              <w:right w:w="100.0" w:type="dxa"/>
+            </w:tcMar>
+            <w:vAlign w:val="top"/>
+          </w:tcPr>
+          <w:p>
+            <w:pPr>
+              <w:widowControl w:val="0"/>
+              <w:spacing w:line="240" w:lineRule="auto"/>
+              <w:rPr>
+                <w:sz w:val="24"/>
+                <w:szCs w:val="24"/>
+              </w:rPr>
+            </w:pPr>
+            <w:r>
+              <w:rPr>
+                <w:sz w:val="24"/>
+                <w:szCs w:val="24"/>
+                <w:rtl w:val="0"/>
+              </w:rPr>
+              <w:t xml:space="preserve">O usuário deve estar logado no sistema.Dados básicos do perfil já preenchidos (idade, e-mail, etc.).Conexão com internet ativa.</w:t>
+            </w:r>
+          </w:p>
+        </w:tc>
+      </w:tr>
+      <w:tr>
+        <w:trPr>
+          <w:cantSplit w:val="0"/>
+          <w:tblHeader w:val="0"/>
+        </w:trPr>
+        <w:tc>
+          <w:tcPr>
+            <w:shd w:fill="999999" w:val="clear"/>
+            <w:tcMar>
+              <w:top w:w="100.0" w:type="dxa"/>
+              <w:left w:w="100.0" w:type="dxa"/>
+              <w:bottom w:w="100.0" w:type="dxa"/>
+              <w:right w:w="100.0" w:type="dxa"/>
+            </w:tcMar>
+            <w:vAlign w:val="top"/>
+          </w:tcPr>
+          <w:p>
+            <w:pPr>
+              <w:widowControl w:val="0"/>
+              <w:spacing w:line="240" w:lineRule="auto"/>
+              <w:rPr>
+                <w:b w:val="1"/>
+                <w:bCs w:val="1"/>
+                <w:sz w:val="24"/>
+                <w:szCs w:val="24"/>
+              </w:rPr>
+            </w:pPr>
+            <w:r>
+              <w:rPr>
+                <w:b w:val="1"/>
+                <w:bCs w:val="1"/>
+                <w:sz w:val="24"/>
+                <w:szCs w:val="24"/>
+                <w:rtl w:val="0"/>
+              </w:rPr>
+              <w:t xml:space="preserve">Pós-condições: </w:t>
+            </w:r>
+          </w:p>
+        </w:tc>
+        <w:tc>
+          <w:tcPr>
+            <w:shd w:fill="auto" w:val="clear"/>
+            <w:tcMar>
+              <w:top w:w="100.0" w:type="dxa"/>
+              <w:left w:w="100.0" w:type="dxa"/>
+              <w:bottom w:w="100.0" w:type="dxa"/>
+              <w:right w:w="100.0" w:type="dxa"/>
+            </w:tcMar>
+            <w:vAlign w:val="top"/>
+          </w:tcPr>
+          <w:p>
+            <w:pPr>
+              <w:widowControl w:val="0"/>
+              <w:spacing w:line="240" w:lineRule="auto"/>
+              <w:rPr>
+                <w:sz w:val="24"/>
+                <w:szCs w:val="24"/>
+              </w:rPr>
+            </w:pPr>
+            <w:r>
+              <w:rPr>
+                <w:sz w:val="24"/>
+                <w:szCs w:val="24"/>
+                <w:rtl w:val="0"/>
+              </w:rPr>
+              <w:t xml:space="preserve">Tipo de viagem definido permanentemente.Todas as recomendações futuras respeitam o tipo escolhido.Botão de edição aparece no menu do perfil</w:t>
+            </w:r>
+          </w:p>
+        </w:tc>
+      </w:tr>
+      <w:tr>
+        <w:trPr>
+          <w:cantSplit w:val="0"/>
+          <w:tblHeader w:val="0"/>
+        </w:trPr>
+        <w:tc>
+          <w:tcPr>
+            <w:shd w:fill="999999" w:val="clear"/>
+            <w:tcMar>
+              <w:top w:w="100.0" w:type="dxa"/>
+              <w:left w:w="100.0" w:type="dxa"/>
+              <w:bottom w:w="100.0" w:type="dxa"/>
+              <w:right w:w="100.0" w:type="dxa"/>
+            </w:tcMar>
+            <w:vAlign w:val="top"/>
+          </w:tcPr>
+          <w:p>
+            <w:pPr>
+              <w:widowControl w:val="0"/>
+              <w:spacing w:line="240" w:lineRule="auto"/>
+              <w:rPr>
+                <w:b w:val="1"/>
+                <w:bCs w:val="1"/>
+                <w:sz w:val="24"/>
+                <w:szCs w:val="24"/>
+              </w:rPr>
+            </w:pPr>
+            <w:r>
+              <w:rPr>
+                <w:b w:val="1"/>
+                <w:bCs w:val="1"/>
+                <w:sz w:val="24"/>
+                <w:szCs w:val="24"/>
+                <w:rtl w:val="0"/>
+              </w:rPr>
+              <w:t xml:space="preserve">Fluxo Principal: </w:t>
+            </w:r>
+          </w:p>
+        </w:tc>
+        <w:tc>
+          <w:tcPr>
+            <w:shd w:fill="auto" w:val="clear"/>
+            <w:tcMar>
+              <w:top w:w="100.0" w:type="dxa"/>
+              <w:left w:w="100.0" w:type="dxa"/>
+              <w:bottom w:w="100.0" w:type="dxa"/>
+              <w:right w:w="100.0" w:type="dxa"/>
+            </w:tcMar>
+            <w:vAlign w:val="top"/>
+          </w:tcPr>
+          <w:p>
+            <w:pPr>
+              <w:widowControl w:val="0"/>
+              <w:numPr>
+                <w:ilvl w:val="0"/>
+                <w:numId w:val="14"/>
+              </w:numPr>
+              <w:spacing w:line="240" w:lineRule="auto"/>
+              <w:ind w:left="720" w:hanging="360"/>
+              <w:rPr>
+                <w:sz w:val="24"/>
+                <w:szCs w:val="24"/>
+              </w:rPr>
+            </w:pPr>
+            <w:r>
+              <w:rPr>
+                <w:sz w:val="24"/>
+                <w:szCs w:val="24"/>
+                <w:rtl w:val="0"/>
+              </w:rPr>
+              <w:t xml:space="preserve">1. O viajante acessa a tela de configuração inicial do perfil. </w:t>
+            </w:r>
+          </w:p>
+          <w:p>
+            <w:pPr>
+              <w:widowControl w:val="0"/>
+              <w:numPr>
+                <w:ilvl w:val="0"/>
+                <w:numId w:val="14"/>
+              </w:numPr>
+              <w:spacing w:line="240" w:lineRule="auto"/>
+              <w:ind w:left="720" w:hanging="360"/>
+              <w:rPr>
+                <w:sz w:val="24"/>
+                <w:szCs w:val="24"/>
+              </w:rPr>
+            </w:pPr>
+            <w:r>
+              <w:rPr>
+                <w:sz w:val="24"/>
+                <w:szCs w:val="24"/>
+                <w:rtl w:val="0"/>
+              </w:rPr>
+              <w:t xml:space="preserve">2. Vê a pergunta: “Qual o tipo de viagem?”</w:t>
+            </w:r>
+          </w:p>
+          <w:p>
+            <w:pPr>
+              <w:widowControl w:val="0"/>
+              <w:numPr>
+                <w:ilvl w:val="0"/>
+                <w:numId w:val="14"/>
+              </w:numPr>
+              <w:spacing w:line="240" w:lineRule="auto"/>
+              <w:ind w:left="720" w:hanging="360"/>
+              <w:rPr>
+                <w:sz w:val="24"/>
+                <w:szCs w:val="24"/>
+              </w:rPr>
+            </w:pPr>
+            <w:r>
+              <w:rPr>
+                <w:sz w:val="24"/>
+                <w:szCs w:val="24"/>
+                <w:rtl w:val="0"/>
+              </w:rPr>
+              <w:t xml:space="preserve">3. Seleciona um dos dois botões grandes e coloridos:   - “Viagem de Lazer” (ícone de sol e praia)   “Viagem de Negócios” (ícone de pasta e trabalho)</w:t>
+            </w:r>
+          </w:p>
+          <w:p>
+            <w:pPr>
+              <w:widowControl w:val="0"/>
+              <w:numPr>
+                <w:ilvl w:val="0"/>
+                <w:numId w:val="14"/>
+              </w:numPr>
+              <w:spacing w:line="240" w:lineRule="auto"/>
+              <w:ind w:left="720" w:hanging="360"/>
+              <w:rPr>
+                <w:sz w:val="24"/>
+                <w:szCs w:val="24"/>
+              </w:rPr>
+            </w:pPr>
+            <w:r>
+              <w:rPr>
+                <w:sz w:val="24"/>
+                <w:szCs w:val="24"/>
+                <w:rtl w:val="0"/>
+              </w:rPr>
+              <w:t xml:space="preserve">4. Clica em “Confirmar” (botão verde destacado).</w:t>
+            </w:r>
+          </w:p>
+          <w:p>
+            <w:pPr>
+              <w:widowControl w:val="0"/>
+              <w:numPr>
+                <w:ilvl w:val="0"/>
+                <w:numId w:val="14"/>
+              </w:numPr>
+              <w:spacing w:line="240" w:lineRule="auto"/>
+              <w:ind w:left="720" w:hanging="360"/>
+              <w:rPr>
+                <w:sz w:val="24"/>
+                <w:szCs w:val="24"/>
+              </w:rPr>
+            </w:pPr>
+            <w:r>
+              <w:rPr>
+                <w:sz w:val="24"/>
+                <w:szCs w:val="24"/>
+                <w:rtl w:val="0"/>
+              </w:rPr>
+              <w:t xml:space="preserve">5. O sistema realiza validações de segurança e perfil.</w:t>
+            </w:r>
+          </w:p>
+          <w:p>
+            <w:pPr>
+              <w:widowControl w:val="0"/>
+              <w:numPr>
+                <w:ilvl w:val="0"/>
+                <w:numId w:val="14"/>
+              </w:numPr>
+              <w:spacing w:line="240" w:lineRule="auto"/>
+              <w:ind w:left="720" w:hanging="360"/>
+              <w:rPr>
+                <w:sz w:val="24"/>
+                <w:szCs w:val="24"/>
+              </w:rPr>
+            </w:pPr>
+            <w:r>
+              <w:rPr>
+                <w:sz w:val="24"/>
+                <w:szCs w:val="24"/>
+                <w:rtl w:val="0"/>
+              </w:rPr>
+              <w:t xml:space="preserve">6. Atualiza o perfil do usuário no banco de dados.</w:t>
+            </w:r>
+          </w:p>
+          <w:p>
+            <w:pPr>
+              <w:widowControl w:val="0"/>
+              <w:numPr>
+                <w:ilvl w:val="0"/>
+                <w:numId w:val="14"/>
+              </w:numPr>
+              <w:spacing w:line="240" w:lineRule="auto"/>
+              <w:ind w:left="720" w:hanging="360"/>
+              <w:rPr>
+                <w:sz w:val="24"/>
+                <w:szCs w:val="24"/>
+              </w:rPr>
+            </w:pPr>
+            <w:r>
+              <w:rPr>
+                <w:sz w:val="24"/>
+                <w:szCs w:val="24"/>
+                <w:rtl w:val="0"/>
+              </w:rPr>
+              <w:t xml:space="preserve">7. Reconfigura filtros de sugestões, lista de bagagem e lembretes conforme o tipo escolhido.</w:t>
+            </w:r>
+          </w:p>
+          <w:p>
+            <w:pPr>
+              <w:widowControl w:val="0"/>
+              <w:numPr>
+                <w:ilvl w:val="0"/>
+                <w:numId w:val="14"/>
+              </w:numPr>
+              <w:spacing w:line="240" w:lineRule="auto"/>
+              <w:ind w:left="720" w:hanging="360"/>
+              <w:rPr>
+                <w:sz w:val="24"/>
+                <w:szCs w:val="24"/>
+              </w:rPr>
+            </w:pPr>
+            <w:r>
+              <w:rPr>
+                <w:sz w:val="24"/>
+                <w:szCs w:val="24"/>
+                <w:rtl w:val="0"/>
+              </w:rPr>
+              <w:t xml:space="preserve">8. Personaliza notificações (ex: mais foco em horários para lazer).</w:t>
+            </w:r>
+          </w:p>
+          <w:p>
+            <w:pPr>
+              <w:widowControl w:val="0"/>
+              <w:numPr>
+                <w:ilvl w:val="0"/>
+                <w:numId w:val="14"/>
+              </w:numPr>
+              <w:spacing w:line="240" w:lineRule="auto"/>
+              <w:ind w:left="720" w:hanging="360"/>
+              <w:rPr>
+                <w:sz w:val="24"/>
+                <w:szCs w:val="24"/>
+              </w:rPr>
+            </w:pPr>
+            <w:r>
+              <w:rPr>
+                <w:sz w:val="24"/>
+                <w:szCs w:val="24"/>
+                <w:rtl w:val="0"/>
+              </w:rPr>
+              <w:t xml:space="preserve">9. Redireciona automaticamente para a tela de planejamento com as novas configurações já carregadas.</w:t>
+            </w:r>
+            <w:r>
+              <w:rPr>
+                <w:rtl w:val="0"/>
+              </w:rPr>
+            </w:r>
+          </w:p>
+        </w:tc>
+      </w:tr>
+      <w:tr>
+        <w:trPr>
+          <w:cantSplit w:val="0"/>
+          <w:tblHeader w:val="0"/>
+        </w:trPr>
+        <w:tc>
+          <w:tcPr>
+            <w:shd w:fill="999999" w:val="clear"/>
+            <w:tcMar>
+              <w:top w:w="100.0" w:type="dxa"/>
+              <w:left w:w="100.0" w:type="dxa"/>
+              <w:bottom w:w="100.0" w:type="dxa"/>
+              <w:right w:w="100.0" w:type="dxa"/>
+            </w:tcMar>
+            <w:vAlign w:val="top"/>
+          </w:tcPr>
+          <w:p>
+            <w:pPr>
+              <w:widowControl w:val="0"/>
+              <w:spacing w:line="240" w:lineRule="auto"/>
+              <w:rPr>
+                <w:b w:val="1"/>
+                <w:bCs w:val="1"/>
+                <w:sz w:val="24"/>
+                <w:szCs w:val="24"/>
+              </w:rPr>
+            </w:pPr>
+            <w:r>
+              <w:rPr>
+                <w:b w:val="1"/>
+                <w:bCs w:val="1"/>
+                <w:sz w:val="24"/>
+                <w:szCs w:val="24"/>
+                <w:rtl w:val="0"/>
+              </w:rPr>
+              <w:t xml:space="preserve">Fluxos Alternativos: </w:t>
+            </w:r>
+          </w:p>
+        </w:tc>
+        <w:tc>
+          <w:tcPr>
+            <w:shd w:fill="auto" w:val="clear"/>
+            <w:tcMar>
+              <w:top w:w="100.0" w:type="dxa"/>
+              <w:left w:w="100.0" w:type="dxa"/>
+              <w:bottom w:w="100.0" w:type="dxa"/>
+              <w:right w:w="100.0" w:type="dxa"/>
+            </w:tcMar>
+            <w:vAlign w:val="top"/>
+          </w:tcPr>
+          <w:p>
+            <w:pPr>
+              <w:widowControl w:val="0"/>
+              <w:numPr>
+                <w:ilvl w:val="0"/>
+                <w:numId w:val="2"/>
+              </w:numPr>
+              <w:spacing w:line="240" w:lineRule="auto"/>
+              <w:ind w:left="720" w:hanging="360"/>
+              <w:rPr>
+                <w:sz w:val="24"/>
+                <w:szCs w:val="24"/>
+                <w:u w:val="none"/>
+              </w:rPr>
+            </w:pPr>
+            <w:r>
+              <w:rPr>
+                <w:sz w:val="24"/>
+                <w:szCs w:val="24"/>
+                <w:rtl w:val="0"/>
+              </w:rPr>
+              <w:t xml:space="preserve">FA01 - Sem opções disponíveis: exibe mensagem de erro e sugere redução de preço ou filtro.- </w:t>
+            </w:r>
+          </w:p>
+          <w:p>
+            <w:pPr>
+              <w:widowControl w:val="0"/>
+              <w:numPr>
+                <w:ilvl w:val="0"/>
+                <w:numId w:val="2"/>
+              </w:numPr>
+              <w:spacing w:line="240" w:lineRule="auto"/>
+              <w:ind w:left="720" w:hanging="360"/>
+              <w:rPr>
+                <w:sz w:val="24"/>
+                <w:szCs w:val="24"/>
+                <w:u w:val="none"/>
+              </w:rPr>
+            </w:pPr>
+            <w:r>
+              <w:rPr>
+                <w:sz w:val="24"/>
+                <w:szCs w:val="24"/>
+                <w:rtl w:val="0"/>
+              </w:rPr>
+              <w:t xml:space="preserve">FA02 - Sem resultados: exibe mensagem “Nenhuma opção encontrada” com sugestões alternativas.</w:t>
+            </w:r>
+          </w:p>
+          <w:p>
+            <w:pPr>
+              <w:widowControl w:val="0"/>
+              <w:spacing w:line="240" w:lineRule="auto"/>
+              <w:rPr>
+                <w:sz w:val="24"/>
+                <w:szCs w:val="24"/>
+              </w:rPr>
+            </w:pPr>
+            <w:r>
+              <w:rPr>
+                <w:rtl w:val="0"/>
+              </w:rPr>
+            </w:r>
+          </w:p>
+        </w:tc>
+      </w:tr>
+      <w:tr>
+        <w:trPr>
+          <w:cantSplit w:val="0"/>
+          <w:tblHeader w:val="0"/>
+        </w:trPr>
+        <w:tc>
+          <w:tcPr>
+            <w:shd w:fill="999999" w:val="clear"/>
+            <w:tcMar>
+              <w:top w:w="100.0" w:type="dxa"/>
+              <w:left w:w="100.0" w:type="dxa"/>
+              <w:bottom w:w="100.0" w:type="dxa"/>
+              <w:right w:w="100.0" w:type="dxa"/>
+            </w:tcMar>
+            <w:vAlign w:val="top"/>
+          </w:tcPr>
+          <w:p>
+            <w:pPr>
+              <w:widowControl w:val="0"/>
+              <w:spacing w:line="240" w:lineRule="auto"/>
+              <w:rPr>
+                <w:b w:val="1"/>
+                <w:bCs w:val="1"/>
+                <w:sz w:val="24"/>
+                <w:szCs w:val="24"/>
+              </w:rPr>
+            </w:pPr>
+            <w:r>
+              <w:rPr>
+                <w:b w:val="1"/>
+                <w:bCs w:val="1"/>
+                <w:sz w:val="24"/>
+                <w:szCs w:val="24"/>
+                <w:rtl w:val="0"/>
+              </w:rPr>
+              <w:t xml:space="preserve">Fluxos de Exceção: </w:t>
+            </w:r>
+          </w:p>
+        </w:tc>
+        <w:tc>
+          <w:tcPr>
+            <w:shd w:fill="auto" w:val="clear"/>
+            <w:tcMar>
+              <w:top w:w="100.0" w:type="dxa"/>
+              <w:left w:w="100.0" w:type="dxa"/>
+              <w:bottom w:w="100.0" w:type="dxa"/>
+              <w:right w:w="100.0" w:type="dxa"/>
+            </w:tcMar>
+            <w:vAlign w:val="top"/>
+          </w:tcPr>
+          <w:p>
+            <w:pPr>
+              <w:widowControl w:val="0"/>
+              <w:spacing w:line="240" w:lineRule="auto"/>
+              <w:rPr>
+                <w:b w:val="1"/>
+                <w:bCs w:val="1"/>
+                <w:sz w:val="24"/>
+                <w:szCs w:val="24"/>
+              </w:rPr>
+            </w:pPr>
+            <w:r>
+              <w:rPr>
+                <w:rtl w:val="0"/>
+              </w:rPr>
+            </w:r>
+          </w:p>
+          <w:p>
+            <w:pPr>
+              <w:widowControl w:val="0"/>
+              <w:numPr>
+                <w:ilvl w:val="0"/>
+                <w:numId w:val="16"/>
+              </w:numPr>
+              <w:spacing w:line="240" w:lineRule="auto"/>
+              <w:ind w:left="720" w:hanging="360"/>
+              <w:rPr>
+                <w:b w:val="1"/>
+                <w:bCs w:val="1"/>
+                <w:sz w:val="24"/>
+                <w:szCs w:val="24"/>
+                <w:u w:val="none"/>
+              </w:rPr>
+            </w:pPr>
+            <w:r>
+              <w:rPr>
+                <w:b w:val="1"/>
+                <w:bCs w:val="1"/>
+                <w:sz w:val="24"/>
+                <w:szCs w:val="24"/>
+                <w:rtl w:val="0"/>
+              </w:rPr>
+              <w:t xml:space="preserve"> FE01 - Falha na API de localização: exibe mensagem “Localização indisponível” com opção de usar cidade manualmente.</w:t>
+            </w:r>
+          </w:p>
+          <w:p>
+            <w:pPr>
+              <w:widowControl w:val="0"/>
+              <w:numPr>
+                <w:ilvl w:val="0"/>
+                <w:numId w:val="16"/>
+              </w:numPr>
+              <w:spacing w:line="240" w:lineRule="auto"/>
+              <w:ind w:left="720" w:hanging="360"/>
+              <w:rPr>
+                <w:sz w:val="24"/>
+                <w:szCs w:val="24"/>
+                <w:u w:val="none"/>
+              </w:rPr>
+            </w:pPr>
+            <w:r>
+              <w:rPr>
+                <w:sz w:val="24"/>
+                <w:szCs w:val="24"/>
+                <w:rtl w:val="0"/>
+              </w:rPr>
+              <w:t xml:space="preserve">FE02 - Erro ao filtrar sugestões (banco lento ou indisponível): exibe “Carregando sugestões…” com barra de progresso e botão “Tentar Novamente”.-</w:t>
+            </w:r>
+          </w:p>
+          <w:p>
+            <w:pPr>
+              <w:widowControl w:val="0"/>
+              <w:numPr>
+                <w:ilvl w:val="0"/>
+                <w:numId w:val="16"/>
+              </w:numPr>
+              <w:spacing w:line="240" w:lineRule="auto"/>
+              <w:ind w:left="720" w:hanging="360"/>
+              <w:rPr>
+                <w:sz w:val="24"/>
+                <w:szCs w:val="24"/>
+                <w:u w:val="none"/>
+              </w:rPr>
+            </w:pPr>
+            <w:r>
+              <w:rPr>
+                <w:sz w:val="24"/>
+                <w:szCs w:val="24"/>
+                <w:rtl w:val="0"/>
+              </w:rPr>
+              <w:t xml:space="preserve">FE03 - Erro de conexão com servidor (timeout &gt; 5s): exibe mensagem “Não foi possível buscar opções. Verifique sua internet e tente novamente” com botão de retry</w:t>
+            </w:r>
+          </w:p>
+          <w:p>
+            <w:pPr>
+              <w:widowControl w:val="0"/>
+              <w:spacing w:line="240" w:lineRule="auto"/>
+              <w:ind w:left="720" w:firstLine="0"/>
+              <w:rPr>
+                <w:sz w:val="24"/>
+                <w:szCs w:val="24"/>
+              </w:rPr>
+            </w:pPr>
+            <w:r>
+              <w:rPr>
+                <w:rtl w:val="0"/>
+              </w:rPr>
+            </w:r>
+          </w:p>
+        </w:tc>
+      </w:tr>
+      <w:tr>
+        <w:trPr>
+          <w:cantSplit w:val="0"/>
+          <w:tblHeader w:val="0"/>
+        </w:trPr>
+        <w:tc>
+          <w:tcPr>
+            <w:shd w:fill="999999" w:val="clear"/>
+            <w:tcMar>
+              <w:top w:w="100.0" w:type="dxa"/>
+              <w:left w:w="100.0" w:type="dxa"/>
+              <w:bottom w:w="100.0" w:type="dxa"/>
+              <w:right w:w="100.0" w:type="dxa"/>
+            </w:tcMar>
+            <w:vAlign w:val="top"/>
+          </w:tcPr>
+          <w:p>
+            <w:pPr>
+              <w:widowControl w:val="0"/>
+              <w:spacing w:line="240" w:lineRule="auto"/>
+              <w:rPr>
+                <w:b w:val="1"/>
+                <w:bCs w:val="1"/>
+                <w:sz w:val="24"/>
+                <w:szCs w:val="24"/>
+              </w:rPr>
+            </w:pPr>
+            <w:r>
+              <w:rPr>
+                <w:b w:val="1"/>
+                <w:bCs w:val="1"/>
+                <w:sz w:val="24"/>
+                <w:szCs w:val="24"/>
+                <w:rtl w:val="0"/>
+              </w:rPr>
+              <w:t xml:space="preserve">Relações de Regras de Negócio: </w:t>
+            </w:r>
+          </w:p>
+        </w:tc>
+        <w:tc>
+          <w:tcPr>
+            <w:shd w:fill="auto" w:val="clear"/>
+            <w:tcMar>
+              <w:top w:w="100.0" w:type="dxa"/>
+              <w:left w:w="100.0" w:type="dxa"/>
+              <w:bottom w:w="100.0" w:type="dxa"/>
+              <w:right w:w="100.0" w:type="dxa"/>
+            </w:tcMar>
+            <w:vAlign w:val="top"/>
+          </w:tcPr>
+          <w:p>
+            <w:pPr>
+              <w:widowControl w:val="0"/>
+              <w:numPr>
+                <w:ilvl w:val="0"/>
+                <w:numId w:val="1"/>
+              </w:numPr>
+              <w:spacing w:line="240" w:lineRule="auto"/>
+              <w:ind w:left="720" w:hanging="360"/>
+              <w:rPr>
+                <w:b w:val="1"/>
+                <w:bCs w:val="1"/>
+                <w:sz w:val="24"/>
+                <w:szCs w:val="24"/>
+                <w:u w:val="none"/>
+              </w:rPr>
+            </w:pPr>
+            <w:r>
+              <w:rPr>
+                <w:b w:val="1"/>
+                <w:bCs w:val="1"/>
+                <w:sz w:val="24"/>
+                <w:szCs w:val="24"/>
+                <w:rtl w:val="0"/>
+              </w:rPr>
+              <w:t xml:space="preserve">RN01 - Sugestões baseadas no perfil do usuário (idade, tipo de viagem e histórico).- </w:t>
+            </w:r>
+          </w:p>
+          <w:p>
+            <w:pPr>
+              <w:widowControl w:val="0"/>
+              <w:numPr>
+                <w:ilvl w:val="0"/>
+                <w:numId w:val="1"/>
+              </w:numPr>
+              <w:spacing w:line="240" w:lineRule="auto"/>
+              <w:ind w:left="720" w:hanging="360"/>
+              <w:rPr>
+                <w:b w:val="1"/>
+                <w:bCs w:val="1"/>
+                <w:sz w:val="24"/>
+                <w:szCs w:val="24"/>
+                <w:u w:val="none"/>
+              </w:rPr>
+            </w:pPr>
+            <w:r>
+              <w:rPr>
+                <w:b w:val="1"/>
+                <w:bCs w:val="1"/>
+                <w:sz w:val="24"/>
+                <w:szCs w:val="24"/>
+                <w:rtl w:val="0"/>
+              </w:rPr>
+              <w:t xml:space="preserve">RN02 - Filtro por preço e avaliação desenvolvidos automaticamente.- </w:t>
+            </w:r>
+          </w:p>
+          <w:p>
+            <w:pPr>
+              <w:widowControl w:val="0"/>
+              <w:numPr>
+                <w:ilvl w:val="0"/>
+                <w:numId w:val="1"/>
+              </w:numPr>
+              <w:spacing w:line="240" w:lineRule="auto"/>
+              <w:ind w:left="720" w:hanging="360"/>
+              <w:rPr>
+                <w:b w:val="1"/>
+                <w:bCs w:val="1"/>
+                <w:sz w:val="24"/>
+                <w:szCs w:val="24"/>
+                <w:u w:val="none"/>
+              </w:rPr>
+            </w:pPr>
+            <w:r>
+              <w:rPr>
+                <w:b w:val="1"/>
+                <w:bCs w:val="1"/>
+                <w:sz w:val="24"/>
+                <w:szCs w:val="24"/>
+                <w:rtl w:val="0"/>
+              </w:rPr>
+              <w:t xml:space="preserve">RN03 - Lista é gerada automaticamente e salva no banco de dados.</w:t>
+            </w:r>
+          </w:p>
+        </w:tc>
+      </w:tr>
+    </w:tbl>
     <w:p>
       <w:pPr>
         <w:spacing w:line="360" w:lineRule="auto"/>
         <w:jc w:val="both"/>
+        <w:rPr>
+          <w:sz w:val="24"/>
+          <w:szCs w:val="24"/>
+        </w:rPr>
+      </w:pPr>
+      <w:r>
+        <w:rPr>
+          <w:rtl w:val="0"/>
+        </w:rPr>
+      </w:r>
+    </w:p>
+    <w:p>
+      <w:pPr>
+        <w:spacing w:line="360" w:lineRule="auto"/>
+        <w:jc w:val="both"/>
+        <w:rPr>
+          <w:sz w:val="24"/>
+          <w:szCs w:val="24"/>
+        </w:rPr>
+      </w:pPr>
+      <w:r>
+        <w:rPr>
+          <w:rtl w:val="0"/>
+        </w:rPr>
+      </w:r>
+    </w:p>
+    <w:p>
+      <w:pPr>
         <w:rPr/>
       </w:pPr>
       <w:r>
         <w:rPr>
           <w:rtl w:val="0"/>
         </w:rPr>
-        <w:t xml:space="preserve">-</w:t>
+      </w:r>
+    </w:p>
+    <w:p>
+      <w:pPr>
+        <w:rPr/>
+      </w:pPr>
+      <w:r>
+        <w:rPr>
+          <w:rtl w:val="0"/>
+        </w:rPr>
+      </w:r>
+    </w:p>
+    <w:p>
+      <w:pPr>
+        <w:spacing w:line="360" w:lineRule="auto"/>
+        <w:jc w:val="both"/>
+        <w:rPr>
+          <w:sz w:val="24"/>
+          <w:szCs w:val="24"/>
+        </w:rPr>
+      </w:pPr>
+      <w:r>
+        <w:rPr>
+          <w:rtl w:val="0"/>
+        </w:rPr>
+      </w:r>
+    </w:p>
+    <w:p>
+      <w:pPr>
+        <w:spacing w:line="360" w:lineRule="auto"/>
+        <w:jc w:val="both"/>
+        <w:rPr>
+          <w:sz w:val="24"/>
+          <w:szCs w:val="24"/>
+        </w:rPr>
+      </w:pPr>
+      <w:r>
+        <w:rPr>
+          <w:rtl w:val="0"/>
+        </w:rPr>
+      </w:r>
+    </w:p>
+    <w:p>
+      <w:pPr>
+        <w:spacing w:line="360" w:lineRule="auto"/>
+        <w:jc w:val="both"/>
+        <w:rPr>
+          <w:sz w:val="24"/>
+          <w:szCs w:val="24"/>
+        </w:rPr>
+      </w:pPr>
+      <w:r>
+        <w:rPr>
+          <w:rtl w:val="0"/>
+        </w:rPr>
+      </w:r>
+    </w:p>
+    <w:p>
+      <w:pPr>
+        <w:spacing w:line="360" w:lineRule="auto"/>
+        <w:jc w:val="both"/>
+        <w:rPr>
+          <w:sz w:val="24"/>
+          <w:szCs w:val="24"/>
+        </w:rPr>
+      </w:pPr>
+      <w:r>
+        <w:rPr>
+          <w:sz w:val="24"/>
+          <w:szCs w:val="24"/>
+          <w:rtl w:val="0"/>
+        </w:rPr>
+        <w:tab/>
+        <w:t xml:space="preserve"> </w:t>
+        <w:tab/>
+      </w:r>
+    </w:p>
+    <w:p>
+      <w:pPr>
+        <w:spacing w:line="360" w:lineRule="auto"/>
+        <w:jc w:val="both"/>
+        <w:rPr>
+          <w:sz w:val="24"/>
+          <w:szCs w:val="24"/>
+        </w:rPr>
+      </w:pPr>
+      <w:r>
+        <w:rPr>
+          <w:sz w:val="24"/>
+          <w:szCs w:val="24"/>
+          <w:rtl w:val="0"/>
+        </w:rPr>
+        <w:tab/>
+        <w:t xml:space="preserve"> </w:t>
+        <w:tab/>
+        <w:t xml:space="preserve"> </w:t>
+        <w:tab/>
+        <w:t xml:space="preserve"> </w:t>
+        <w:tab/>
+      </w:r>
+    </w:p>
+    <w:p>
+      <w:pPr>
+        <w:spacing w:before="240" w:line="360" w:lineRule="auto"/>
+        <w:jc w:val="both"/>
+        <w:rPr>
+          <w:sz w:val="24"/>
+          <w:szCs w:val="24"/>
+        </w:rPr>
+      </w:pPr>
+      <w:r>
+        <w:rPr>
+          <w:sz w:val="24"/>
+          <w:szCs w:val="24"/>
+          <w:rtl w:val="0"/>
+        </w:rPr>
+        <w:br w:type="textWrapping"/>
+      </w:r>
+    </w:p>
+    <w:p>
+      <w:pPr>
+        <w:spacing w:line="360" w:lineRule="auto"/>
+        <w:jc w:val="both"/>
+        <w:rPr>
+          <w:sz w:val="24"/>
+          <w:szCs w:val="24"/>
+        </w:rPr>
+      </w:pPr>
+      <w:r>
+        <w:rPr>
+          <w:rtl w:val="0"/>
+        </w:rPr>
       </w:r>
     </w:p>
     <w:p>
@@ -7388,9 +9178,6 @@
       <w:type w:val="continuous"/>
       <w:pgSz w:h="11909" w:w="16834" w:orient="landscape"/>
       <w:pgMar w:bottom="1440.0000000000002" w:top="1683.7795275590554" w:left="1440.0000000000002" w:right="1440.0000000000002" w:header="720" w:footer="720"/>
-      <w:cols w:equalWidth="0" w:num="1">
-        <w:col w:space="0" w:w="13957.78"/>
-      </w:cols>
     </w:sectPr>
   </w:body>
 </w:document>
@@ -8624,6 +10411,446 @@
     </w:lvl>
   </w:abstractNum>
   <w:abstractNum w:abstractNumId="12">
+    <w:lvl w:ilvl="0">
+      <w:start w:val="1"/>
+      <w:numFmt w:val="bullet"/>
+      <w:lvlText w:val="●"/>
+      <w:lvlJc w:val="left"/>
+      <w:pPr>
+        <w:ind w:left="720" w:hanging="360"/>
+      </w:pPr>
+      <w:rPr>
+        <w:u w:val="none"/>
+      </w:rPr>
+    </w:lvl>
+    <w:lvl w:ilvl="1">
+      <w:start w:val="1"/>
+      <w:numFmt w:val="bullet"/>
+      <w:lvlText w:val="○"/>
+      <w:lvlJc w:val="left"/>
+      <w:pPr>
+        <w:ind w:left="1440" w:hanging="360"/>
+      </w:pPr>
+      <w:rPr>
+        <w:u w:val="none"/>
+      </w:rPr>
+    </w:lvl>
+    <w:lvl w:ilvl="2">
+      <w:start w:val="1"/>
+      <w:numFmt w:val="bullet"/>
+      <w:lvlText w:val="■"/>
+      <w:lvlJc w:val="left"/>
+      <w:pPr>
+        <w:ind w:left="2160" w:hanging="360"/>
+      </w:pPr>
+      <w:rPr>
+        <w:u w:val="none"/>
+      </w:rPr>
+    </w:lvl>
+    <w:lvl w:ilvl="3">
+      <w:start w:val="1"/>
+      <w:numFmt w:val="bullet"/>
+      <w:lvlText w:val="●"/>
+      <w:lvlJc w:val="left"/>
+      <w:pPr>
+        <w:ind w:left="2880" w:hanging="360"/>
+      </w:pPr>
+      <w:rPr>
+        <w:u w:val="none"/>
+      </w:rPr>
+    </w:lvl>
+    <w:lvl w:ilvl="4">
+      <w:start w:val="1"/>
+      <w:numFmt w:val="bullet"/>
+      <w:lvlText w:val="○"/>
+      <w:lvlJc w:val="left"/>
+      <w:pPr>
+        <w:ind w:left="3600" w:hanging="360"/>
+      </w:pPr>
+      <w:rPr>
+        <w:u w:val="none"/>
+      </w:rPr>
+    </w:lvl>
+    <w:lvl w:ilvl="5">
+      <w:start w:val="1"/>
+      <w:numFmt w:val="bullet"/>
+      <w:lvlText w:val="■"/>
+      <w:lvlJc w:val="left"/>
+      <w:pPr>
+        <w:ind w:left="4320" w:hanging="360"/>
+      </w:pPr>
+      <w:rPr>
+        <w:u w:val="none"/>
+      </w:rPr>
+    </w:lvl>
+    <w:lvl w:ilvl="6">
+      <w:start w:val="1"/>
+      <w:numFmt w:val="bullet"/>
+      <w:lvlText w:val="●"/>
+      <w:lvlJc w:val="left"/>
+      <w:pPr>
+        <w:ind w:left="5040" w:hanging="360"/>
+      </w:pPr>
+      <w:rPr>
+        <w:u w:val="none"/>
+      </w:rPr>
+    </w:lvl>
+    <w:lvl w:ilvl="7">
+      <w:start w:val="1"/>
+      <w:numFmt w:val="bullet"/>
+      <w:lvlText w:val="○"/>
+      <w:lvlJc w:val="left"/>
+      <w:pPr>
+        <w:ind w:left="5760" w:hanging="360"/>
+      </w:pPr>
+      <w:rPr>
+        <w:u w:val="none"/>
+      </w:rPr>
+    </w:lvl>
+    <w:lvl w:ilvl="8">
+      <w:start w:val="1"/>
+      <w:numFmt w:val="bullet"/>
+      <w:lvlText w:val="■"/>
+      <w:lvlJc w:val="left"/>
+      <w:pPr>
+        <w:ind w:left="6480" w:hanging="360"/>
+      </w:pPr>
+      <w:rPr>
+        <w:u w:val="none"/>
+      </w:rPr>
+    </w:lvl>
+  </w:abstractNum>
+  <w:abstractNum w:abstractNumId="13">
+    <w:lvl w:ilvl="0">
+      <w:start w:val="1"/>
+      <w:numFmt w:val="bullet"/>
+      <w:lvlText w:val="●"/>
+      <w:lvlJc w:val="left"/>
+      <w:pPr>
+        <w:ind w:left="720" w:hanging="360"/>
+      </w:pPr>
+      <w:rPr>
+        <w:u w:val="none"/>
+      </w:rPr>
+    </w:lvl>
+    <w:lvl w:ilvl="1">
+      <w:start w:val="1"/>
+      <w:numFmt w:val="bullet"/>
+      <w:lvlText w:val="○"/>
+      <w:lvlJc w:val="left"/>
+      <w:pPr>
+        <w:ind w:left="1440" w:hanging="360"/>
+      </w:pPr>
+      <w:rPr>
+        <w:u w:val="none"/>
+      </w:rPr>
+    </w:lvl>
+    <w:lvl w:ilvl="2">
+      <w:start w:val="1"/>
+      <w:numFmt w:val="bullet"/>
+      <w:lvlText w:val="■"/>
+      <w:lvlJc w:val="left"/>
+      <w:pPr>
+        <w:ind w:left="2160" w:hanging="360"/>
+      </w:pPr>
+      <w:rPr>
+        <w:u w:val="none"/>
+      </w:rPr>
+    </w:lvl>
+    <w:lvl w:ilvl="3">
+      <w:start w:val="1"/>
+      <w:numFmt w:val="bullet"/>
+      <w:lvlText w:val="●"/>
+      <w:lvlJc w:val="left"/>
+      <w:pPr>
+        <w:ind w:left="2880" w:hanging="360"/>
+      </w:pPr>
+      <w:rPr>
+        <w:u w:val="none"/>
+      </w:rPr>
+    </w:lvl>
+    <w:lvl w:ilvl="4">
+      <w:start w:val="1"/>
+      <w:numFmt w:val="bullet"/>
+      <w:lvlText w:val="○"/>
+      <w:lvlJc w:val="left"/>
+      <w:pPr>
+        <w:ind w:left="3600" w:hanging="360"/>
+      </w:pPr>
+      <w:rPr>
+        <w:u w:val="none"/>
+      </w:rPr>
+    </w:lvl>
+    <w:lvl w:ilvl="5">
+      <w:start w:val="1"/>
+      <w:numFmt w:val="bullet"/>
+      <w:lvlText w:val="■"/>
+      <w:lvlJc w:val="left"/>
+      <w:pPr>
+        <w:ind w:left="4320" w:hanging="360"/>
+      </w:pPr>
+      <w:rPr>
+        <w:u w:val="none"/>
+      </w:rPr>
+    </w:lvl>
+    <w:lvl w:ilvl="6">
+      <w:start w:val="1"/>
+      <w:numFmt w:val="bullet"/>
+      <w:lvlText w:val="●"/>
+      <w:lvlJc w:val="left"/>
+      <w:pPr>
+        <w:ind w:left="5040" w:hanging="360"/>
+      </w:pPr>
+      <w:rPr>
+        <w:u w:val="none"/>
+      </w:rPr>
+    </w:lvl>
+    <w:lvl w:ilvl="7">
+      <w:start w:val="1"/>
+      <w:numFmt w:val="bullet"/>
+      <w:lvlText w:val="○"/>
+      <w:lvlJc w:val="left"/>
+      <w:pPr>
+        <w:ind w:left="5760" w:hanging="360"/>
+      </w:pPr>
+      <w:rPr>
+        <w:u w:val="none"/>
+      </w:rPr>
+    </w:lvl>
+    <w:lvl w:ilvl="8">
+      <w:start w:val="1"/>
+      <w:numFmt w:val="bullet"/>
+      <w:lvlText w:val="■"/>
+      <w:lvlJc w:val="left"/>
+      <w:pPr>
+        <w:ind w:left="6480" w:hanging="360"/>
+      </w:pPr>
+      <w:rPr>
+        <w:u w:val="none"/>
+      </w:rPr>
+    </w:lvl>
+  </w:abstractNum>
+  <w:abstractNum w:abstractNumId="14">
+    <w:lvl w:ilvl="0">
+      <w:start w:val="1"/>
+      <w:numFmt w:val="bullet"/>
+      <w:lvlText w:val="●"/>
+      <w:lvlJc w:val="left"/>
+      <w:pPr>
+        <w:ind w:left="720" w:hanging="360"/>
+      </w:pPr>
+      <w:rPr>
+        <w:u w:val="none"/>
+      </w:rPr>
+    </w:lvl>
+    <w:lvl w:ilvl="1">
+      <w:start w:val="1"/>
+      <w:numFmt w:val="bullet"/>
+      <w:lvlText w:val="○"/>
+      <w:lvlJc w:val="left"/>
+      <w:pPr>
+        <w:ind w:left="1440" w:hanging="360"/>
+      </w:pPr>
+      <w:rPr>
+        <w:u w:val="none"/>
+      </w:rPr>
+    </w:lvl>
+    <w:lvl w:ilvl="2">
+      <w:start w:val="1"/>
+      <w:numFmt w:val="bullet"/>
+      <w:lvlText w:val="■"/>
+      <w:lvlJc w:val="left"/>
+      <w:pPr>
+        <w:ind w:left="2160" w:hanging="360"/>
+      </w:pPr>
+      <w:rPr>
+        <w:u w:val="none"/>
+      </w:rPr>
+    </w:lvl>
+    <w:lvl w:ilvl="3">
+      <w:start w:val="1"/>
+      <w:numFmt w:val="bullet"/>
+      <w:lvlText w:val="●"/>
+      <w:lvlJc w:val="left"/>
+      <w:pPr>
+        <w:ind w:left="2880" w:hanging="360"/>
+      </w:pPr>
+      <w:rPr>
+        <w:u w:val="none"/>
+      </w:rPr>
+    </w:lvl>
+    <w:lvl w:ilvl="4">
+      <w:start w:val="1"/>
+      <w:numFmt w:val="bullet"/>
+      <w:lvlText w:val="○"/>
+      <w:lvlJc w:val="left"/>
+      <w:pPr>
+        <w:ind w:left="3600" w:hanging="360"/>
+      </w:pPr>
+      <w:rPr>
+        <w:u w:val="none"/>
+      </w:rPr>
+    </w:lvl>
+    <w:lvl w:ilvl="5">
+      <w:start w:val="1"/>
+      <w:numFmt w:val="bullet"/>
+      <w:lvlText w:val="■"/>
+      <w:lvlJc w:val="left"/>
+      <w:pPr>
+        <w:ind w:left="4320" w:hanging="360"/>
+      </w:pPr>
+      <w:rPr>
+        <w:u w:val="none"/>
+      </w:rPr>
+    </w:lvl>
+    <w:lvl w:ilvl="6">
+      <w:start w:val="1"/>
+      <w:numFmt w:val="bullet"/>
+      <w:lvlText w:val="●"/>
+      <w:lvlJc w:val="left"/>
+      <w:pPr>
+        <w:ind w:left="5040" w:hanging="360"/>
+      </w:pPr>
+      <w:rPr>
+        <w:u w:val="none"/>
+      </w:rPr>
+    </w:lvl>
+    <w:lvl w:ilvl="7">
+      <w:start w:val="1"/>
+      <w:numFmt w:val="bullet"/>
+      <w:lvlText w:val="○"/>
+      <w:lvlJc w:val="left"/>
+      <w:pPr>
+        <w:ind w:left="5760" w:hanging="360"/>
+      </w:pPr>
+      <w:rPr>
+        <w:u w:val="none"/>
+      </w:rPr>
+    </w:lvl>
+    <w:lvl w:ilvl="8">
+      <w:start w:val="1"/>
+      <w:numFmt w:val="bullet"/>
+      <w:lvlText w:val="■"/>
+      <w:lvlJc w:val="left"/>
+      <w:pPr>
+        <w:ind w:left="6480" w:hanging="360"/>
+      </w:pPr>
+      <w:rPr>
+        <w:u w:val="none"/>
+      </w:rPr>
+    </w:lvl>
+  </w:abstractNum>
+  <w:abstractNum w:abstractNumId="15">
+    <w:lvl w:ilvl="0">
+      <w:start w:val="1"/>
+      <w:numFmt w:val="bullet"/>
+      <w:lvlText w:val="●"/>
+      <w:lvlJc w:val="left"/>
+      <w:pPr>
+        <w:ind w:left="720" w:hanging="360"/>
+      </w:pPr>
+      <w:rPr>
+        <w:u w:val="none"/>
+      </w:rPr>
+    </w:lvl>
+    <w:lvl w:ilvl="1">
+      <w:start w:val="1"/>
+      <w:numFmt w:val="bullet"/>
+      <w:lvlText w:val="○"/>
+      <w:lvlJc w:val="left"/>
+      <w:pPr>
+        <w:ind w:left="1440" w:hanging="360"/>
+      </w:pPr>
+      <w:rPr>
+        <w:u w:val="none"/>
+      </w:rPr>
+    </w:lvl>
+    <w:lvl w:ilvl="2">
+      <w:start w:val="1"/>
+      <w:numFmt w:val="bullet"/>
+      <w:lvlText w:val="■"/>
+      <w:lvlJc w:val="left"/>
+      <w:pPr>
+        <w:ind w:left="2160" w:hanging="360"/>
+      </w:pPr>
+      <w:rPr>
+        <w:u w:val="none"/>
+      </w:rPr>
+    </w:lvl>
+    <w:lvl w:ilvl="3">
+      <w:start w:val="1"/>
+      <w:numFmt w:val="bullet"/>
+      <w:lvlText w:val="●"/>
+      <w:lvlJc w:val="left"/>
+      <w:pPr>
+        <w:ind w:left="2880" w:hanging="360"/>
+      </w:pPr>
+      <w:rPr>
+        <w:u w:val="none"/>
+      </w:rPr>
+    </w:lvl>
+    <w:lvl w:ilvl="4">
+      <w:start w:val="1"/>
+      <w:numFmt w:val="bullet"/>
+      <w:lvlText w:val="○"/>
+      <w:lvlJc w:val="left"/>
+      <w:pPr>
+        <w:ind w:left="3600" w:hanging="360"/>
+      </w:pPr>
+      <w:rPr>
+        <w:u w:val="none"/>
+      </w:rPr>
+    </w:lvl>
+    <w:lvl w:ilvl="5">
+      <w:start w:val="1"/>
+      <w:numFmt w:val="bullet"/>
+      <w:lvlText w:val="■"/>
+      <w:lvlJc w:val="left"/>
+      <w:pPr>
+        <w:ind w:left="4320" w:hanging="360"/>
+      </w:pPr>
+      <w:rPr>
+        <w:u w:val="none"/>
+      </w:rPr>
+    </w:lvl>
+    <w:lvl w:ilvl="6">
+      <w:start w:val="1"/>
+      <w:numFmt w:val="bullet"/>
+      <w:lvlText w:val="●"/>
+      <w:lvlJc w:val="left"/>
+      <w:pPr>
+        <w:ind w:left="5040" w:hanging="360"/>
+      </w:pPr>
+      <w:rPr>
+        <w:u w:val="none"/>
+      </w:rPr>
+    </w:lvl>
+    <w:lvl w:ilvl="7">
+      <w:start w:val="1"/>
+      <w:numFmt w:val="bullet"/>
+      <w:lvlText w:val="○"/>
+      <w:lvlJc w:val="left"/>
+      <w:pPr>
+        <w:ind w:left="5760" w:hanging="360"/>
+      </w:pPr>
+      <w:rPr>
+        <w:u w:val="none"/>
+      </w:rPr>
+    </w:lvl>
+    <w:lvl w:ilvl="8">
+      <w:start w:val="1"/>
+      <w:numFmt w:val="bullet"/>
+      <w:lvlText w:val="■"/>
+      <w:lvlJc w:val="left"/>
+      <w:pPr>
+        <w:ind w:left="6480" w:hanging="360"/>
+      </w:pPr>
+      <w:rPr>
+        <w:u w:val="none"/>
+      </w:rPr>
+    </w:lvl>
+  </w:abstractNum>
+  <w:abstractNum w:abstractNumId="16">
     <w:lvl w:ilvl="0">
       <w:start w:val="1"/>
       <w:numFmt w:val="bullet"/>
@@ -8768,6 +10995,18 @@
   </w:num>
   <w:num w:numId="12">
     <w:abstractNumId w:val="12"/>
+  </w:num>
+  <w:num w:numId="13">
+    <w:abstractNumId w:val="13"/>
+  </w:num>
+  <w:num w:numId="14">
+    <w:abstractNumId w:val="14"/>
+  </w:num>
+  <w:num w:numId="15">
+    <w:abstractNumId w:val="15"/>
+  </w:num>
+  <w:num w:numId="16">
+    <w:abstractNumId w:val="16"/>
   </w:num>
 </w:numbering>
 </file>
@@ -8966,6 +11205,13 @@
     </w:tblPr>
   </w:style>
   <w:style w:type="table" w:styleId="Table5">
+    <w:basedOn w:val="TableNormal"/>
+    <w:tblPr>
+      <w:tblStyleRowBandSize w:val="1"/>
+      <w:tblStyleColBandSize w:val="1"/>
+    </w:tblPr>
+  </w:style>
+  <w:style w:type="table" w:styleId="Table6">
     <w:basedOn w:val="TableNormal"/>
     <w:tblPr>
       <w:tblStyleRowBandSize w:val="1"/>

</xml_diff>

<commit_message>
Corrigindo os títulos do caso de uso e finalizando os casos de uso por enquanto.
</commit_message>
<xml_diff>
--- a/sleep_street.docx
+++ b/sleep_street.docx
@@ -5238,7 +5238,7 @@
                 <w:szCs w:val="24"/>
                 <w:rtl w:val="0"/>
               </w:rPr>
-              <w:t xml:space="preserve">CASO DE USO EXPANDIDO - 001</w:t>
+              <w:t xml:space="preserve">CASO DE USO EXPANDIDO - 002</w:t>
             </w:r>
           </w:p>
         </w:tc>
@@ -6772,7 +6772,7 @@
                 <w:szCs w:val="24"/>
                 <w:rtl w:val="0"/>
               </w:rPr>
-              <w:t xml:space="preserve">CASO DE USO EXPANDIDO - 001</w:t>
+              <w:t xml:space="preserve">CASO DE USO EXPANDIDO - 003</w:t>
             </w:r>
           </w:p>
         </w:tc>
@@ -7719,7 +7719,7 @@
                 <w:szCs w:val="24"/>
                 <w:rtl w:val="0"/>
               </w:rPr>
-              <w:t xml:space="preserve">CASO DE USO EXPANDIDO - 001</w:t>
+              <w:t xml:space="preserve">CASO DE USO EXPANDIDO - 004</w:t>
             </w:r>
           </w:p>
         </w:tc>

</xml_diff>